<commit_message>
Produktionsleiter: Themenblöcke 1-5 ins working-DOCX einarbeiten
Abschnitt 7.5.3.1 nach AKV (Verantwortung/Aufgaben/Kompetenzen) gegliedert
und mit den bereits abgestimmten Inhalten (Kapazitäts-/Planungsabstimmung,
IKK, Wirtschaftlichkeit, Personalverantwortung, Korrekturmaßnahmen/QS)
befüllt. Noch offene Originalpunkte aus Version k bleiben unverändert unter
eigener Zwischenüberschrift stehen.

Co-Authored-By: Claude Sonnet 5 <noreply@anthropic.com>
Claude-Session: https://claude.ai/code/session_01RGUMW1xe7QmP9yunCbCqHi
</commit_message>
<xml_diff>
--- a/working/7V-5-1_Auftragsabwicklung_Produktion_ENTWURF.docx
+++ b/working/7V-5-1_Auftragsabwicklung_Produktion_ENTWURF.docx
@@ -139,39 +139,24 @@
           <w:sz w:val="22"/>
           <w:szCs w:val="22"/>
         </w:rPr>
-        <w:t xml:space="preserve">7.5.3.1 Aufgaben des Produktionsleiters</w:t>
-      </w:r>
-    </w:p>
-    <w:p>
-      <w:pPr>
-        <w:pStyle w:val="ListParagraph"/>
-        <w:numPr>
-          <w:ilvl w:val="0"/>
-          <w:numId w:val="2"/>
-        </w:numPr>
-        <w:spacing w:after="60"/>
-      </w:pPr>
-      <w:r>
-        <w:rPr>
-          <w:rFonts w:ascii="Calibri" w:cs="Calibri" w:eastAsia="Calibri" w:hAnsi="Calibri"/>
-        </w:rPr>
-        <w:t xml:space="preserve">Auftragsbesprechung mit LVK, Verwaltung der Produktionsplanung</w:t>
-      </w:r>
-    </w:p>
-    <w:p>
-      <w:pPr>
-        <w:pStyle w:val="ListParagraph"/>
-        <w:numPr>
-          <w:ilvl w:val="0"/>
-          <w:numId w:val="2"/>
-        </w:numPr>
-        <w:spacing w:after="60"/>
-      </w:pPr>
-      <w:r>
-        <w:rPr>
-          <w:rFonts w:ascii="Calibri" w:cs="Calibri" w:eastAsia="Calibri" w:hAnsi="Calibri"/>
-        </w:rPr>
-        <w:t xml:space="preserve">Produktionsbesprechung mit Abteilungsleitern</w:t>
+        <w:t xml:space="preserve">7.5.3.1 Produktionsleiter (Aufgaben, Kompetenzen, Verantwortung)</w:t>
+      </w:r>
+    </w:p>
+    <w:p>
+      <w:pPr>
+        <w:spacing w:after="60" w:before="220"/>
+      </w:pPr>
+      <w:r>
+        <w:rPr>
+          <w:rFonts w:ascii="Calibri" w:cs="Calibri" w:eastAsia="Calibri" w:hAnsi="Calibri"/>
+          <w:b/>
+          <w:bCs/>
+          <w:i/>
+          <w:iCs/>
+          <w:sz w:val="21"/>
+          <w:szCs w:val="21"/>
+        </w:rPr>
+        <w:t xml:space="preserve">Verantwortung</w:t>
       </w:r>
     </w:p>
     <w:p>
@@ -203,39 +188,395 @@
         <w:rPr>
           <w:rFonts w:ascii="Calibri" w:cs="Calibri" w:eastAsia="Calibri" w:hAnsi="Calibri"/>
         </w:rPr>
-        <w:t xml:space="preserve">Personalplanung</w:t>
-      </w:r>
-    </w:p>
-    <w:p>
-      <w:pPr>
-        <w:pStyle w:val="ListParagraph"/>
-        <w:numPr>
-          <w:ilvl w:val="0"/>
-          <w:numId w:val="2"/>
-        </w:numPr>
-        <w:spacing w:after="60"/>
-      </w:pPr>
-      <w:r>
-        <w:rPr>
-          <w:rFonts w:ascii="Calibri" w:cs="Calibri" w:eastAsia="Calibri" w:hAnsi="Calibri"/>
-        </w:rPr>
-        <w:t xml:space="preserve">Verantwortlich der jeweilig unterstellten Mitarbeiter</w:t>
-      </w:r>
-    </w:p>
-    <w:p>
-      <w:pPr>
-        <w:pStyle w:val="ListParagraph"/>
-        <w:numPr>
-          <w:ilvl w:val="0"/>
-          <w:numId w:val="2"/>
-        </w:numPr>
-        <w:spacing w:after="60"/>
-      </w:pPr>
-      <w:r>
-        <w:rPr>
-          <w:rFonts w:ascii="Calibri" w:cs="Calibri" w:eastAsia="Calibri" w:hAnsi="Calibri"/>
-        </w:rPr>
-        <w:t xml:space="preserve">Einleiten von Korrekturmaßnahmen in Absprache mit QMB</w:t>
+        <w:t xml:space="preserve">Personalverantwortung für die Mitarbeiter der Produktion inkl. Werkzeugbau und Instandhaltung</w:t>
+      </w:r>
+    </w:p>
+    <w:p>
+      <w:pPr>
+        <w:pStyle w:val="ListParagraph"/>
+        <w:numPr>
+          <w:ilvl w:val="0"/>
+          <w:numId w:val="2"/>
+        </w:numPr>
+        <w:spacing w:after="60"/>
+      </w:pPr>
+      <w:r>
+        <w:rPr>
+          <w:rFonts w:ascii="Calibri" w:cs="Calibri" w:eastAsia="Calibri" w:hAnsi="Calibri"/>
+        </w:rPr>
+        <w:t xml:space="preserve">Einhaltung aller relevanten Gesetze, insbesondere des Arbeitszeitgesetzes und des ArbeitnehmerInnenschutzgesetzes (ASchG)</w:t>
+      </w:r>
+    </w:p>
+    <w:p>
+      <w:pPr>
+        <w:pStyle w:val="ListParagraph"/>
+        <w:numPr>
+          <w:ilvl w:val="0"/>
+          <w:numId w:val="2"/>
+        </w:numPr>
+        <w:spacing w:after="60"/>
+      </w:pPr>
+      <w:r>
+        <w:rPr>
+          <w:rFonts w:ascii="Calibri" w:cs="Calibri" w:eastAsia="Calibri" w:hAnsi="Calibri"/>
+        </w:rPr>
+        <w:t xml:space="preserve">Disziplinarische Verantwortung bei WerkerInnen und Sachbearbeitern als Eskalationsstufe (Erstverantwortung liegt bei den jeweiligen Teamleitern, sofern im Organigramm zugeordnet)</w:t>
+      </w:r>
+    </w:p>
+    <w:p>
+      <w:pPr>
+        <w:spacing w:after="60" w:before="220"/>
+      </w:pPr>
+      <w:r>
+        <w:rPr>
+          <w:rFonts w:ascii="Calibri" w:cs="Calibri" w:eastAsia="Calibri" w:hAnsi="Calibri"/>
+          <w:b/>
+          <w:bCs/>
+          <w:i/>
+          <w:iCs/>
+          <w:sz w:val="21"/>
+          <w:szCs w:val="21"/>
+        </w:rPr>
+        <w:t xml:space="preserve">Aufgaben</w:t>
+      </w:r>
+    </w:p>
+    <w:p>
+      <w:pPr>
+        <w:pStyle w:val="ListParagraph"/>
+        <w:numPr>
+          <w:ilvl w:val="0"/>
+          <w:numId w:val="2"/>
+        </w:numPr>
+        <w:spacing w:after="60"/>
+      </w:pPr>
+      <w:r>
+        <w:rPr>
+          <w:rFonts w:ascii="Calibri" w:cs="Calibri" w:eastAsia="Calibri" w:hAnsi="Calibri"/>
+        </w:rPr>
+        <w:t xml:space="preserve">Teilnahme an der Kapazitäts- und Planungsabstimmung Produktion/Logistik (aktuell: wöchentliches Meeting KPLI)</w:t>
+      </w:r>
+    </w:p>
+    <w:p>
+      <w:pPr>
+        <w:pStyle w:val="ListParagraph"/>
+        <w:numPr>
+          <w:ilvl w:val="0"/>
+          <w:numId w:val="2"/>
+        </w:numPr>
+        <w:spacing w:after="60"/>
+      </w:pPr>
+      <w:r>
+        <w:rPr>
+          <w:rFonts w:ascii="Calibri" w:cs="Calibri" w:eastAsia="Calibri" w:hAnsi="Calibri"/>
+        </w:rPr>
+        <w:t xml:space="preserve">Kontrolle/Prüfung der von der Rolle „Produktionsplanung“ erstellten Pläne</w:t>
+      </w:r>
+    </w:p>
+    <w:p>
+      <w:pPr>
+        <w:pStyle w:val="ListParagraph"/>
+        <w:numPr>
+          <w:ilvl w:val="0"/>
+          <w:numId w:val="2"/>
+        </w:numPr>
+        <w:spacing w:after="60"/>
+      </w:pPr>
+      <w:r>
+        <w:rPr>
+          <w:rFonts w:ascii="Calibri" w:cs="Calibri" w:eastAsia="Calibri" w:hAnsi="Calibri"/>
+        </w:rPr>
+        <w:t xml:space="preserve">Mitwirkung bei der Umsetzung kurzfristiger, ungeplanter Kapazitätsmaßnahmen (z.B.: Einsatz alternativer Anlagen, zusätzliche Schichten)</w:t>
+      </w:r>
+    </w:p>
+    <w:p>
+      <w:pPr>
+        <w:pStyle w:val="ListParagraph"/>
+        <w:numPr>
+          <w:ilvl w:val="0"/>
+          <w:numId w:val="2"/>
+        </w:numPr>
+        <w:spacing w:after="60"/>
+      </w:pPr>
+      <w:r>
+        <w:rPr>
+          <w:rFonts w:ascii="Calibri" w:cs="Calibri" w:eastAsia="Calibri" w:hAnsi="Calibri"/>
+        </w:rPr>
+        <w:t xml:space="preserve">Weiterentwicklung der Planungsmethodik und der eingesetzten Systeme</w:t>
+      </w:r>
+    </w:p>
+    <w:p>
+      <w:pPr>
+        <w:pStyle w:val="ListParagraph"/>
+        <w:numPr>
+          <w:ilvl w:val="0"/>
+          <w:numId w:val="2"/>
+        </w:numPr>
+        <w:spacing w:after="60"/>
+      </w:pPr>
+      <w:r>
+        <w:rPr>
+          <w:rFonts w:ascii="Calibri" w:cs="Calibri" w:eastAsia="Calibri" w:hAnsi="Calibri"/>
+        </w:rPr>
+        <w:t xml:space="preserve">Leitung der IKK (Interdisziplinäre Koordinationsrunde Kernprozesse) mit den Bereichen Produktion, Logistik, Produkt-/Projekttechnik, Business Development und Qualitätsmanagement: Top-Down Vorbereitung auf anstehende externe Themen (z.B.: Audits, neue Kundenprojekte/Werkzeuge, TISAX-Einführung); Bottom-Up Ableitung verallgemeinerter, systemischer Maßnahmen aus aktuellen operativen Problemen (Reklamationen, Werkzeug-/Ablaufschwierigkeiten, Ausschuss); Fokus auf den Kernprozess der Leistungserbringung inkl. vorgelagertem Vorserienprozess</w:t>
+      </w:r>
+    </w:p>
+    <w:p>
+      <w:pPr>
+        <w:pStyle w:val="ListParagraph"/>
+        <w:numPr>
+          <w:ilvl w:val="0"/>
+          <w:numId w:val="2"/>
+        </w:numPr>
+        <w:spacing w:after="60"/>
+      </w:pPr>
+      <w:r>
+        <w:rPr>
+          <w:rFonts w:ascii="Calibri" w:cs="Calibri" w:eastAsia="Calibri" w:hAnsi="Calibri"/>
+        </w:rPr>
+        <w:t xml:space="preserve">Sicherstellung des wirtschaftlichen Einsatzes von Personal und Ressourcen (laufende Steuerung/Überwachung im operativen Betrieb)</w:t>
+      </w:r>
+    </w:p>
+    <w:p>
+      <w:pPr>
+        <w:pStyle w:val="ListParagraph"/>
+        <w:numPr>
+          <w:ilvl w:val="0"/>
+          <w:numId w:val="2"/>
+        </w:numPr>
+        <w:spacing w:after="60"/>
+      </w:pPr>
+      <w:r>
+        <w:rPr>
+          <w:rFonts w:ascii="Calibri" w:cs="Calibri" w:eastAsia="Calibri" w:hAnsi="Calibri"/>
+        </w:rPr>
+        <w:t xml:space="preserve">Personalanforderung</w:t>
+      </w:r>
+    </w:p>
+    <w:p>
+      <w:pPr>
+        <w:pStyle w:val="ListParagraph"/>
+        <w:numPr>
+          <w:ilvl w:val="0"/>
+          <w:numId w:val="2"/>
+        </w:numPr>
+        <w:spacing w:after="60"/>
+      </w:pPr>
+      <w:r>
+        <w:rPr>
+          <w:rFonts w:ascii="Calibri" w:cs="Calibri" w:eastAsia="Calibri" w:hAnsi="Calibri"/>
+        </w:rPr>
+        <w:t xml:space="preserve">Führung von Mitarbeitergesprächen</w:t>
+      </w:r>
+    </w:p>
+    <w:p>
+      <w:pPr>
+        <w:pStyle w:val="ListParagraph"/>
+        <w:numPr>
+          <w:ilvl w:val="0"/>
+          <w:numId w:val="2"/>
+        </w:numPr>
+        <w:spacing w:after="60"/>
+      </w:pPr>
+      <w:r>
+        <w:rPr>
+          <w:rFonts w:ascii="Calibri" w:cs="Calibri" w:eastAsia="Calibri" w:hAnsi="Calibri"/>
+        </w:rPr>
+        <w:t xml:space="preserve">Bildungsbedarfsermittlung</w:t>
+      </w:r>
+    </w:p>
+    <w:p>
+      <w:pPr>
+        <w:pStyle w:val="ListParagraph"/>
+        <w:numPr>
+          <w:ilvl w:val="0"/>
+          <w:numId w:val="2"/>
+        </w:numPr>
+        <w:spacing w:after="60"/>
+      </w:pPr>
+      <w:r>
+        <w:rPr>
+          <w:rFonts w:ascii="Calibri" w:cs="Calibri" w:eastAsia="Calibri" w:hAnsi="Calibri"/>
+        </w:rPr>
+        <w:t xml:space="preserve">Sicherstellung der produktionsrelevanten Schulungen</w:t>
+      </w:r>
+    </w:p>
+    <w:p>
+      <w:pPr>
+        <w:pStyle w:val="ListParagraph"/>
+        <w:numPr>
+          <w:ilvl w:val="0"/>
+          <w:numId w:val="2"/>
+        </w:numPr>
+        <w:spacing w:after="60"/>
+      </w:pPr>
+      <w:r>
+        <w:rPr>
+          <w:rFonts w:ascii="Calibri" w:cs="Calibri" w:eastAsia="Calibri" w:hAnsi="Calibri"/>
+        </w:rPr>
+        <w:t xml:space="preserve">Mitwirkung an der Einführung geeigneter (flexibler) Arbeitszeitmodelle (gemeinsam mit HR)</w:t>
+      </w:r>
+    </w:p>
+    <w:p>
+      <w:pPr>
+        <w:pStyle w:val="ListParagraph"/>
+        <w:numPr>
+          <w:ilvl w:val="0"/>
+          <w:numId w:val="2"/>
+        </w:numPr>
+        <w:spacing w:after="60"/>
+      </w:pPr>
+      <w:r>
+        <w:rPr>
+          <w:rFonts w:ascii="Calibri" w:cs="Calibri" w:eastAsia="Calibri" w:hAnsi="Calibri"/>
+        </w:rPr>
+        <w:t xml:space="preserve">Sicherstellung der Urlaubsplanung</w:t>
+      </w:r>
+    </w:p>
+    <w:p>
+      <w:pPr>
+        <w:pStyle w:val="ListParagraph"/>
+        <w:numPr>
+          <w:ilvl w:val="0"/>
+          <w:numId w:val="2"/>
+        </w:numPr>
+        <w:spacing w:after="60"/>
+      </w:pPr>
+      <w:r>
+        <w:rPr>
+          <w:rFonts w:ascii="Calibri" w:cs="Calibri" w:eastAsia="Calibri" w:hAnsi="Calibri"/>
+        </w:rPr>
+        <w:t xml:space="preserve">Entscheidung über Art und Umsetzung von Korrekturmaßnahmen bei durch QS festgestelltem Handlungsbedarf (gesamtheitliche Ebene)</w:t>
+      </w:r>
+    </w:p>
+    <w:p>
+      <w:pPr>
+        <w:spacing w:after="60" w:before="220"/>
+      </w:pPr>
+      <w:r>
+        <w:rPr>
+          <w:rFonts w:ascii="Calibri" w:cs="Calibri" w:eastAsia="Calibri" w:hAnsi="Calibri"/>
+          <w:b/>
+          <w:bCs/>
+          <w:i/>
+          <w:iCs/>
+          <w:sz w:val="21"/>
+          <w:szCs w:val="21"/>
+        </w:rPr>
+        <w:t xml:space="preserve">Kompetenzen</w:t>
+      </w:r>
+    </w:p>
+    <w:p>
+      <w:pPr>
+        <w:pStyle w:val="ListParagraph"/>
+        <w:numPr>
+          <w:ilvl w:val="0"/>
+          <w:numId w:val="2"/>
+        </w:numPr>
+        <w:spacing w:after="60"/>
+      </w:pPr>
+      <w:r>
+        <w:rPr>
+          <w:rFonts w:ascii="Calibri" w:cs="Calibri" w:eastAsia="Calibri" w:hAnsi="Calibri"/>
+        </w:rPr>
+        <w:t xml:space="preserve">Freigabe-/Entscheidungsbefugnis über die Produktionsplanung (Kontrollfunktion gegenüber der Rolle Produktionsplanung)</w:t>
+      </w:r>
+    </w:p>
+    <w:p>
+      <w:pPr>
+        <w:pStyle w:val="ListParagraph"/>
+        <w:numPr>
+          <w:ilvl w:val="0"/>
+          <w:numId w:val="2"/>
+        </w:numPr>
+        <w:spacing w:after="60"/>
+      </w:pPr>
+      <w:r>
+        <w:rPr>
+          <w:rFonts w:ascii="Calibri" w:cs="Calibri" w:eastAsia="Calibri" w:hAnsi="Calibri"/>
+        </w:rPr>
+        <w:t xml:space="preserve">Entscheidungsbefugnis bei ungeplanten Kapazitätskonflikten (z.B.: Freigabe alternativer Anlagen, Anordnung zusätzlicher Schichten)</w:t>
+      </w:r>
+    </w:p>
+    <w:p>
+      <w:pPr>
+        <w:pStyle w:val="ListParagraph"/>
+        <w:numPr>
+          <w:ilvl w:val="0"/>
+          <w:numId w:val="2"/>
+        </w:numPr>
+        <w:spacing w:after="60"/>
+      </w:pPr>
+      <w:r>
+        <w:rPr>
+          <w:rFonts w:ascii="Calibri" w:cs="Calibri" w:eastAsia="Calibri" w:hAnsi="Calibri"/>
+        </w:rPr>
+        <w:t xml:space="preserve">Entscheidungsbefugnis über die aus der IKK abgeleiteten Maßnahmen</w:t>
+      </w:r>
+    </w:p>
+    <w:p>
+      <w:pPr>
+        <w:pStyle w:val="ListParagraph"/>
+        <w:numPr>
+          <w:ilvl w:val="0"/>
+          <w:numId w:val="2"/>
+        </w:numPr>
+        <w:spacing w:after="60"/>
+      </w:pPr>
+      <w:r>
+        <w:rPr>
+          <w:rFonts w:ascii="Calibri" w:cs="Calibri" w:eastAsia="Calibri" w:hAnsi="Calibri"/>
+        </w:rPr>
+        <w:t xml:space="preserve">Entscheidung über Einstellung/Kündigung</w:t>
+      </w:r>
+    </w:p>
+    <w:p>
+      <w:pPr>
+        <w:pStyle w:val="ListParagraph"/>
+        <w:numPr>
+          <w:ilvl w:val="0"/>
+          <w:numId w:val="2"/>
+        </w:numPr>
+        <w:spacing w:after="60"/>
+      </w:pPr>
+      <w:r>
+        <w:rPr>
+          <w:rFonts w:ascii="Calibri" w:cs="Calibri" w:eastAsia="Calibri" w:hAnsi="Calibri"/>
+        </w:rPr>
+        <w:t xml:space="preserve">Disziplinarische Maßnahmen bei WerkerInnen/Sachbearbeitern (als Eskalationsinstanz – Teamleiter sind primär zuständig, wo zugeordnet)</w:t>
+      </w:r>
+    </w:p>
+    <w:p>
+      <w:pPr>
+        <w:pStyle w:val="ListParagraph"/>
+        <w:numPr>
+          <w:ilvl w:val="0"/>
+          <w:numId w:val="2"/>
+        </w:numPr>
+        <w:spacing w:after="60"/>
+      </w:pPr>
+      <w:r>
+        <w:rPr>
+          <w:rFonts w:ascii="Calibri" w:cs="Calibri" w:eastAsia="Calibri" w:hAnsi="Calibri"/>
+        </w:rPr>
+        <w:t xml:space="preserve">Entscheidungsbefugnis über die konkrete Maßnahmenwahl bei Korrekturmaßnahmen</w:t>
+      </w:r>
+    </w:p>
+    <w:p>
+      <w:pPr>
+        <w:spacing w:after="60" w:before="220"/>
+      </w:pPr>
+      <w:r>
+        <w:rPr>
+          <w:rFonts w:ascii="Calibri" w:cs="Calibri" w:eastAsia="Calibri" w:hAnsi="Calibri"/>
+          <w:b/>
+          <w:bCs/>
+          <w:i/>
+          <w:iCs/>
+          <w:color w:val="8A6D00"/>
+          <w:sz w:val="21"/>
+          <w:szCs w:val="21"/>
+        </w:rPr>
+        <w:t xml:space="preserve">Noch offen – Diskussion ausständig (Version k, unverändert)</w:t>
       </w:r>
     </w:p>
     <w:p>
@@ -379,7 +720,7 @@
         <w:rPr>
           <w:rFonts w:ascii="Calibri" w:cs="Calibri" w:eastAsia="Calibri" w:hAnsi="Calibri"/>
         </w:rPr>
-        <w:t xml:space="preserve">Schulungsplanung der Schichtführer u Einsteller</w:t>
+        <w:t xml:space="preserve">Schulungsplanung der Schichtführer u. Einsteller</w:t>
       </w:r>
     </w:p>
     <w:p>

</xml_diff>

<commit_message>
Working-Entwurf aktualisieren: Produktionsleiter und Schichtführer einarbeiten
Ersetzt in scripts/build.js die unveränderten Version-k-Platzhalter für
7.5.3.1 Produktionsleiter und 7.5.3.2 Teamleitung Spritzguss-Produktion
(Schichtführer) durch die im Diskussionsprozess abgestimmten
AKV-Inhalte (Produktionsleiter: Themenblöcke 1-14 + Vertretung;
Schichtführer: Themenblöcke 1-9, siehe notes/PRODUKTIONSLEITER.md und
notes/SCHICHTFUEHRER.md). Fügt AKV-Hilfsfunktionen (blockHeading, akv,
akvLabel, note) hinzu und korrigiert den Ausgabepfad auf working/.
Die übrigen Rollen bleiben vorerst unverändertes Version-k-Rohgerüst.

Ergänzt package.json/package-lock.json für die docx-Abhängigkeit, die
zur Generierung des Word-Dokuments benötigt wird.

Co-Authored-By: Claude Sonnet 5 <noreply@anthropic.com>
Claude-Session: https://claude.ai/code/session_01KTGUGVaPm39C5Y3H1dpETj
</commit_message>
<xml_diff>
--- a/working/7V-5-1_Auftragsabwicklung_Produktion_ENTWURF.docx
+++ b/working/7V-5-1_Auftragsabwicklung_Produktion_ENTWURF.docx
@@ -129,6 +129,21 @@
     </w:p>
     <w:p>
       <w:pPr>
+        <w:spacing w:after="100"/>
+      </w:pPr>
+      <w:r>
+        <w:rPr>
+          <w:rFonts w:ascii="Calibri" w:cs="Calibri" w:eastAsia="Calibri" w:hAnsi="Calibri"/>
+          <w:i/>
+          <w:iCs/>
+          <w:sz w:val="18"/>
+          <w:szCs w:val="18"/>
+        </w:rPr>
+        <w:t xml:space="preserve">Struktur je Rolle: AKV-Prinzip (Aufgaben / Kompetenzen / Verantwortung), gegliedert nach Themenblöcken. Details und Diskussionsstand siehe notes/PRODUKTIONSLEITER.md bzw. notes/SCHICHTFUEHRER.md.</w:t>
+      </w:r>
+    </w:p>
+    <w:p>
+      <w:pPr>
         <w:spacing w:after="100" w:before="200"/>
       </w:pPr>
       <w:r>
@@ -139,247 +154,1630 @@
           <w:sz w:val="22"/>
           <w:szCs w:val="22"/>
         </w:rPr>
-        <w:t xml:space="preserve">7.5.3.1 Aufgaben des Produktionsleiters</w:t>
-      </w:r>
-    </w:p>
-    <w:p>
-      <w:pPr>
-        <w:pStyle w:val="ListParagraph"/>
-        <w:numPr>
-          <w:ilvl w:val="0"/>
-          <w:numId w:val="2"/>
-        </w:numPr>
-        <w:spacing w:after="60"/>
-      </w:pPr>
-      <w:r>
-        <w:rPr>
-          <w:rFonts w:ascii="Calibri" w:cs="Calibri" w:eastAsia="Calibri" w:hAnsi="Calibri"/>
-        </w:rPr>
-        <w:t xml:space="preserve">Auftragsbesprechung mit LVK, Verwaltung der Produktionsplanung</w:t>
-      </w:r>
-    </w:p>
-    <w:p>
-      <w:pPr>
-        <w:pStyle w:val="ListParagraph"/>
-        <w:numPr>
-          <w:ilvl w:val="0"/>
-          <w:numId w:val="2"/>
-        </w:numPr>
-        <w:spacing w:after="60"/>
-      </w:pPr>
-      <w:r>
-        <w:rPr>
-          <w:rFonts w:ascii="Calibri" w:cs="Calibri" w:eastAsia="Calibri" w:hAnsi="Calibri"/>
-        </w:rPr>
-        <w:t xml:space="preserve">Produktionsbesprechung mit Abteilungsleitern</w:t>
-      </w:r>
-    </w:p>
-    <w:p>
-      <w:pPr>
-        <w:pStyle w:val="ListParagraph"/>
-        <w:numPr>
-          <w:ilvl w:val="0"/>
-          <w:numId w:val="2"/>
-        </w:numPr>
-        <w:spacing w:after="60"/>
-      </w:pPr>
-      <w:r>
-        <w:rPr>
-          <w:rFonts w:ascii="Calibri" w:cs="Calibri" w:eastAsia="Calibri" w:hAnsi="Calibri"/>
-        </w:rPr>
-        <w:t xml:space="preserve">Wirtschaftlicher Einsatz von Personal und Ressourcen</w:t>
-      </w:r>
-    </w:p>
-    <w:p>
-      <w:pPr>
-        <w:pStyle w:val="ListParagraph"/>
-        <w:numPr>
-          <w:ilvl w:val="0"/>
-          <w:numId w:val="2"/>
-        </w:numPr>
-        <w:spacing w:after="60"/>
-      </w:pPr>
-      <w:r>
-        <w:rPr>
-          <w:rFonts w:ascii="Calibri" w:cs="Calibri" w:eastAsia="Calibri" w:hAnsi="Calibri"/>
-        </w:rPr>
-        <w:t xml:space="preserve">Personalplanung</w:t>
-      </w:r>
-    </w:p>
-    <w:p>
-      <w:pPr>
-        <w:pStyle w:val="ListParagraph"/>
-        <w:numPr>
-          <w:ilvl w:val="0"/>
-          <w:numId w:val="2"/>
-        </w:numPr>
-        <w:spacing w:after="60"/>
-      </w:pPr>
-      <w:r>
-        <w:rPr>
-          <w:rFonts w:ascii="Calibri" w:cs="Calibri" w:eastAsia="Calibri" w:hAnsi="Calibri"/>
-        </w:rPr>
-        <w:t xml:space="preserve">Verantwortlich der jeweilig unterstellten Mitarbeiter</w:t>
-      </w:r>
-    </w:p>
-    <w:p>
-      <w:pPr>
-        <w:pStyle w:val="ListParagraph"/>
-        <w:numPr>
-          <w:ilvl w:val="0"/>
-          <w:numId w:val="2"/>
-        </w:numPr>
-        <w:spacing w:after="60"/>
-      </w:pPr>
-      <w:r>
-        <w:rPr>
-          <w:rFonts w:ascii="Calibri" w:cs="Calibri" w:eastAsia="Calibri" w:hAnsi="Calibri"/>
-        </w:rPr>
-        <w:t xml:space="preserve">Einleiten von Korrekturmaßnahmen in Absprache mit QMB</w:t>
-      </w:r>
-    </w:p>
-    <w:p>
-      <w:pPr>
-        <w:pStyle w:val="ListParagraph"/>
-        <w:numPr>
-          <w:ilvl w:val="0"/>
-          <w:numId w:val="2"/>
-        </w:numPr>
-        <w:spacing w:after="60"/>
-      </w:pPr>
-      <w:r>
-        <w:rPr>
-          <w:rFonts w:ascii="Calibri" w:cs="Calibri" w:eastAsia="Calibri" w:hAnsi="Calibri"/>
-        </w:rPr>
-        <w:t xml:space="preserve">Organisation / Überwachung der Wartung und Instandhaltung</w:t>
-      </w:r>
-    </w:p>
-    <w:p>
-      <w:pPr>
-        <w:pStyle w:val="ListParagraph"/>
-        <w:numPr>
-          <w:ilvl w:val="0"/>
-          <w:numId w:val="2"/>
-        </w:numPr>
-        <w:spacing w:after="60"/>
-      </w:pPr>
-      <w:r>
-        <w:rPr>
-          <w:rFonts w:ascii="Calibri" w:cs="Calibri" w:eastAsia="Calibri" w:hAnsi="Calibri"/>
-        </w:rPr>
-        <w:t xml:space="preserve">Prüfung der Produktionsaufzeichnungen</w:t>
-      </w:r>
-    </w:p>
-    <w:p>
-      <w:pPr>
-        <w:pStyle w:val="ListParagraph"/>
-        <w:numPr>
-          <w:ilvl w:val="0"/>
-          <w:numId w:val="2"/>
-        </w:numPr>
-        <w:spacing w:after="60"/>
-      </w:pPr>
-      <w:r>
-        <w:rPr>
-          <w:rFonts w:ascii="Calibri" w:cs="Calibri" w:eastAsia="Calibri" w:hAnsi="Calibri"/>
-        </w:rPr>
-        <w:t xml:space="preserve">In Zusammenarbeit mit QMB Maßnahmen nach Reklamationen durchführen</w:t>
-      </w:r>
-    </w:p>
-    <w:p>
-      <w:pPr>
-        <w:pStyle w:val="ListParagraph"/>
-        <w:numPr>
-          <w:ilvl w:val="0"/>
-          <w:numId w:val="2"/>
-        </w:numPr>
-        <w:spacing w:after="60"/>
-      </w:pPr>
-      <w:r>
-        <w:rPr>
-          <w:rFonts w:ascii="Calibri" w:cs="Calibri" w:eastAsia="Calibri" w:hAnsi="Calibri"/>
-        </w:rPr>
-        <w:t xml:space="preserve">Verantwortlich für die Lehrlingsausbildung</w:t>
-      </w:r>
-    </w:p>
-    <w:p>
-      <w:pPr>
-        <w:pStyle w:val="ListParagraph"/>
-        <w:numPr>
-          <w:ilvl w:val="0"/>
-          <w:numId w:val="2"/>
-        </w:numPr>
-        <w:spacing w:after="60"/>
-      </w:pPr>
-      <w:r>
-        <w:rPr>
-          <w:rFonts w:ascii="Calibri" w:cs="Calibri" w:eastAsia="Calibri" w:hAnsi="Calibri"/>
-        </w:rPr>
-        <w:t xml:space="preserve">Sperren von fehlerhaften Produkten</w:t>
-      </w:r>
-    </w:p>
-    <w:p>
-      <w:pPr>
-        <w:pStyle w:val="ListParagraph"/>
-        <w:numPr>
-          <w:ilvl w:val="0"/>
-          <w:numId w:val="2"/>
-        </w:numPr>
-        <w:spacing w:after="60"/>
-      </w:pPr>
-      <w:r>
-        <w:rPr>
-          <w:rFonts w:ascii="Calibri" w:cs="Calibri" w:eastAsia="Calibri" w:hAnsi="Calibri"/>
-        </w:rPr>
-        <w:t xml:space="preserve">Bemusterungs Nachbesprechung mit Technik</w:t>
-      </w:r>
-    </w:p>
-    <w:p>
-      <w:pPr>
-        <w:pStyle w:val="ListParagraph"/>
-        <w:numPr>
-          <w:ilvl w:val="0"/>
-          <w:numId w:val="2"/>
-        </w:numPr>
-        <w:spacing w:after="60"/>
-      </w:pPr>
-      <w:r>
-        <w:rPr>
-          <w:rFonts w:ascii="Calibri" w:cs="Calibri" w:eastAsia="Calibri" w:hAnsi="Calibri"/>
-        </w:rPr>
-        <w:t xml:space="preserve">Werkzeugoptimierungen in Absprache mit PT</w:t>
-      </w:r>
-    </w:p>
-    <w:p>
-      <w:pPr>
-        <w:pStyle w:val="ListParagraph"/>
-        <w:numPr>
-          <w:ilvl w:val="0"/>
-          <w:numId w:val="2"/>
-        </w:numPr>
-        <w:spacing w:after="60"/>
-      </w:pPr>
-      <w:r>
-        <w:rPr>
-          <w:rFonts w:ascii="Calibri" w:cs="Calibri" w:eastAsia="Calibri" w:hAnsi="Calibri"/>
-        </w:rPr>
-        <w:t xml:space="preserve">Optimieren der technischen Produktprozessentwicklung</w:t>
-      </w:r>
-    </w:p>
-    <w:p>
-      <w:pPr>
-        <w:pStyle w:val="ListParagraph"/>
-        <w:numPr>
-          <w:ilvl w:val="0"/>
-          <w:numId w:val="2"/>
-        </w:numPr>
-        <w:spacing w:after="60"/>
-      </w:pPr>
-      <w:r>
-        <w:rPr>
-          <w:rFonts w:ascii="Calibri" w:cs="Calibri" w:eastAsia="Calibri" w:hAnsi="Calibri"/>
-        </w:rPr>
-        <w:t xml:space="preserve">Schulungsplanung der Schichtführer u Einsteller</w:t>
+        <w:t xml:space="preserve">7.5.3.1 Produktionsleiter</w:t>
+      </w:r>
+    </w:p>
+    <w:p>
+      <w:pPr>
+        <w:spacing w:after="80" w:before="220"/>
+      </w:pPr>
+      <w:r>
+        <w:rPr>
+          <w:rFonts w:ascii="Calibri" w:cs="Calibri" w:eastAsia="Calibri" w:hAnsi="Calibri"/>
+          <w:b/>
+          <w:bCs/>
+          <w:sz w:val="20"/>
+          <w:szCs w:val="20"/>
+          <w:u w:val="single"/>
+        </w:rPr>
+        <w:t xml:space="preserve">1. Kapazitäts-/Planungsabstimmung</w:t>
+      </w:r>
+    </w:p>
+    <w:p>
+      <w:pPr>
+        <w:spacing w:after="40" w:before="40"/>
+      </w:pPr>
+      <w:r>
+        <w:rPr>
+          <w:rFonts w:ascii="Calibri" w:cs="Calibri" w:eastAsia="Calibri" w:hAnsi="Calibri"/>
+          <w:b/>
+          <w:bCs/>
+          <w:sz w:val="20"/>
+          <w:szCs w:val="20"/>
+        </w:rPr>
+        <w:t xml:space="preserve">Aufgaben:</w:t>
+      </w:r>
+    </w:p>
+    <w:p>
+      <w:pPr>
+        <w:pStyle w:val="ListParagraph"/>
+        <w:numPr>
+          <w:ilvl w:val="0"/>
+          <w:numId w:val="2"/>
+        </w:numPr>
+        <w:spacing w:after="60"/>
+      </w:pPr>
+      <w:r>
+        <w:rPr>
+          <w:rFonts w:ascii="Calibri" w:cs="Calibri" w:eastAsia="Calibri" w:hAnsi="Calibri"/>
+        </w:rPr>
+        <w:t xml:space="preserve">Teilnahme an der Kapazitäts- und Planungsabstimmung Produktion/Logistik (aktuell: wöchentliches Meeting „KPLI“)</w:t>
+      </w:r>
+    </w:p>
+    <w:p>
+      <w:pPr>
+        <w:pStyle w:val="ListParagraph"/>
+        <w:numPr>
+          <w:ilvl w:val="0"/>
+          <w:numId w:val="2"/>
+        </w:numPr>
+        <w:spacing w:after="60"/>
+      </w:pPr>
+      <w:r>
+        <w:rPr>
+          <w:rFonts w:ascii="Calibri" w:cs="Calibri" w:eastAsia="Calibri" w:hAnsi="Calibri"/>
+        </w:rPr>
+        <w:t xml:space="preserve">Kontrolle/Prüfung der von der Rolle „Produktionsplanung“ erstellten Pläne</w:t>
+      </w:r>
+    </w:p>
+    <w:p>
+      <w:pPr>
+        <w:pStyle w:val="ListParagraph"/>
+        <w:numPr>
+          <w:ilvl w:val="0"/>
+          <w:numId w:val="2"/>
+        </w:numPr>
+        <w:spacing w:after="60"/>
+      </w:pPr>
+      <w:r>
+        <w:rPr>
+          <w:rFonts w:ascii="Calibri" w:cs="Calibri" w:eastAsia="Calibri" w:hAnsi="Calibri"/>
+        </w:rPr>
+        <w:t xml:space="preserve">Mitwirkung bei der Umsetzung kurzfristiger, ungeplanter Kapazitätsmaßnahmen (z. B. Einsatz alternativer Anlagen, zusätzliche Schichten)</w:t>
+      </w:r>
+    </w:p>
+    <w:p>
+      <w:pPr>
+        <w:pStyle w:val="ListParagraph"/>
+        <w:numPr>
+          <w:ilvl w:val="0"/>
+          <w:numId w:val="2"/>
+        </w:numPr>
+        <w:spacing w:after="60"/>
+      </w:pPr>
+      <w:r>
+        <w:rPr>
+          <w:rFonts w:ascii="Calibri" w:cs="Calibri" w:eastAsia="Calibri" w:hAnsi="Calibri"/>
+        </w:rPr>
+        <w:t xml:space="preserve">Weiterentwicklung der Planungsmethodik und der eingesetzten Systeme</w:t>
+      </w:r>
+    </w:p>
+    <w:p>
+      <w:pPr>
+        <w:spacing w:after="40" w:before="40"/>
+      </w:pPr>
+      <w:r>
+        <w:rPr>
+          <w:rFonts w:ascii="Calibri" w:cs="Calibri" w:eastAsia="Calibri" w:hAnsi="Calibri"/>
+          <w:b/>
+          <w:bCs/>
+          <w:sz w:val="20"/>
+          <w:szCs w:val="20"/>
+        </w:rPr>
+        <w:t xml:space="preserve">Kompetenzen:</w:t>
+      </w:r>
+    </w:p>
+    <w:p>
+      <w:pPr>
+        <w:pStyle w:val="ListParagraph"/>
+        <w:numPr>
+          <w:ilvl w:val="0"/>
+          <w:numId w:val="2"/>
+        </w:numPr>
+        <w:spacing w:after="60"/>
+      </w:pPr>
+      <w:r>
+        <w:rPr>
+          <w:rFonts w:ascii="Calibri" w:cs="Calibri" w:eastAsia="Calibri" w:hAnsi="Calibri"/>
+        </w:rPr>
+        <w:t xml:space="preserve">Freigabe-/Entscheidungsbefugnis über die Produktionsplanung</w:t>
+      </w:r>
+    </w:p>
+    <w:p>
+      <w:pPr>
+        <w:pStyle w:val="ListParagraph"/>
+        <w:numPr>
+          <w:ilvl w:val="0"/>
+          <w:numId w:val="2"/>
+        </w:numPr>
+        <w:spacing w:after="60"/>
+      </w:pPr>
+      <w:r>
+        <w:rPr>
+          <w:rFonts w:ascii="Calibri" w:cs="Calibri" w:eastAsia="Calibri" w:hAnsi="Calibri"/>
+        </w:rPr>
+        <w:t xml:space="preserve">Entscheidungsbefugnis bei ungeplanten Kapazitätskonflikten</w:t>
+      </w:r>
+    </w:p>
+    <w:p>
+      <w:pPr>
+        <w:spacing w:after="80" w:before="220"/>
+      </w:pPr>
+      <w:r>
+        <w:rPr>
+          <w:rFonts w:ascii="Calibri" w:cs="Calibri" w:eastAsia="Calibri" w:hAnsi="Calibri"/>
+          <w:b/>
+          <w:bCs/>
+          <w:sz w:val="20"/>
+          <w:szCs w:val="20"/>
+          <w:u w:val="single"/>
+        </w:rPr>
+        <w:t xml:space="preserve">2. IKK – Interdisziplinäre Koordinationsrunde Kernprozesse</w:t>
+      </w:r>
+    </w:p>
+    <w:p>
+      <w:pPr>
+        <w:spacing w:after="120"/>
+      </w:pPr>
+      <w:r>
+        <w:rPr>
+          <w:rFonts w:ascii="Calibri" w:cs="Calibri" w:eastAsia="Calibri" w:hAnsi="Calibri"/>
+        </w:rPr>
+        <w:t xml:space="preserve">Teilnehmer (Abteilungsleiter): Produktion, Logistik, Produkt-/Projekttechnik, Business Development (Schwerpunkt Digitalisierung), Qualitätsmanagement. Fokus: Kernprozess der Leistungserbringung inkl. vorgelagertem Vorserienprozess. Charakter: taktisch.</w:t>
+      </w:r>
+    </w:p>
+    <w:p>
+      <w:pPr>
+        <w:spacing w:after="40" w:before="40"/>
+      </w:pPr>
+      <w:r>
+        <w:rPr>
+          <w:rFonts w:ascii="Calibri" w:cs="Calibri" w:eastAsia="Calibri" w:hAnsi="Calibri"/>
+          <w:b/>
+          <w:bCs/>
+          <w:sz w:val="20"/>
+          <w:szCs w:val="20"/>
+        </w:rPr>
+        <w:t xml:space="preserve">Aufgabe:</w:t>
+      </w:r>
+    </w:p>
+    <w:p>
+      <w:pPr>
+        <w:pStyle w:val="ListParagraph"/>
+        <w:numPr>
+          <w:ilvl w:val="0"/>
+          <w:numId w:val="2"/>
+        </w:numPr>
+        <w:spacing w:after="60"/>
+      </w:pPr>
+      <w:r>
+        <w:rPr>
+          <w:rFonts w:ascii="Calibri" w:cs="Calibri" w:eastAsia="Calibri" w:hAnsi="Calibri"/>
+        </w:rPr>
+        <w:t xml:space="preserve">Leitung der IKK mit den genannten Bereichen</w:t>
+      </w:r>
+    </w:p>
+    <w:p>
+      <w:pPr>
+        <w:pStyle w:val="ListParagraph"/>
+        <w:numPr>
+          <w:ilvl w:val="1"/>
+          <w:numId w:val="2"/>
+        </w:numPr>
+        <w:spacing w:after="60"/>
+      </w:pPr>
+      <w:r>
+        <w:rPr>
+          <w:rFonts w:ascii="Calibri" w:cs="Calibri" w:eastAsia="Calibri" w:hAnsi="Calibri"/>
+        </w:rPr>
+        <w:t xml:space="preserve">Top-Down: Vorbereitung auf anstehende externe Themen (z. B. Audits, neue Kundenprojekte/Werkzeuge, TISAX-Einführung)</w:t>
+      </w:r>
+    </w:p>
+    <w:p>
+      <w:pPr>
+        <w:pStyle w:val="ListParagraph"/>
+        <w:numPr>
+          <w:ilvl w:val="1"/>
+          <w:numId w:val="2"/>
+        </w:numPr>
+        <w:spacing w:after="60"/>
+      </w:pPr>
+      <w:r>
+        <w:rPr>
+          <w:rFonts w:ascii="Calibri" w:cs="Calibri" w:eastAsia="Calibri" w:hAnsi="Calibri"/>
+        </w:rPr>
+        <w:t xml:space="preserve">Bottom-Up: Ableitung verallgemeinerter, systemischer Maßnahmen aus aktuellen operativen Problemen (Reklamationen, Werkzeug-/Ablaufschwierigkeiten, Ausschuss)</w:t>
+      </w:r>
+    </w:p>
+    <w:p>
+      <w:pPr>
+        <w:spacing w:after="80"/>
+      </w:pPr>
+      <w:r>
+        <w:rPr>
+          <w:rFonts w:ascii="Calibri" w:cs="Calibri" w:eastAsia="Calibri" w:hAnsi="Calibri"/>
+          <w:b/>
+          <w:bCs/>
+          <w:sz w:val="20"/>
+          <w:szCs w:val="20"/>
+        </w:rPr>
+        <w:t xml:space="preserve">Kompetenz: </w:t>
+      </w:r>
+      <w:r>
+        <w:rPr>
+          <w:rFonts w:ascii="Calibri" w:cs="Calibri" w:eastAsia="Calibri" w:hAnsi="Calibri"/>
+          <w:sz w:val="20"/>
+          <w:szCs w:val="20"/>
+        </w:rPr>
+        <w:t xml:space="preserve">Entscheidungsbefugnis über die aus der Runde abgeleiteten Maßnahmen.</w:t>
+      </w:r>
+    </w:p>
+    <w:p>
+      <w:pPr>
+        <w:spacing w:after="80"/>
+      </w:pPr>
+      <w:r>
+        <w:rPr>
+          <w:rFonts w:ascii="Calibri" w:cs="Calibri" w:eastAsia="Calibri" w:hAnsi="Calibri"/>
+          <w:b/>
+          <w:bCs/>
+          <w:sz w:val="20"/>
+          <w:szCs w:val="20"/>
+        </w:rPr>
+        <w:t xml:space="preserve">Führung: </w:t>
+      </w:r>
+      <w:r>
+        <w:rPr>
+          <w:rFonts w:ascii="Calibri" w:cs="Calibri" w:eastAsia="Calibri" w:hAnsi="Calibri"/>
+          <w:sz w:val="20"/>
+          <w:szCs w:val="20"/>
+        </w:rPr>
+        <w:t xml:space="preserve">Leitung eines interdisziplinären Teams über Abteilungsgrenzen hinweg.</w:t>
+      </w:r>
+    </w:p>
+    <w:p>
+      <w:pPr>
+        <w:spacing w:after="80" w:before="220"/>
+      </w:pPr>
+      <w:r>
+        <w:rPr>
+          <w:rFonts w:ascii="Calibri" w:cs="Calibri" w:eastAsia="Calibri" w:hAnsi="Calibri"/>
+          <w:b/>
+          <w:bCs/>
+          <w:sz w:val="20"/>
+          <w:szCs w:val="20"/>
+          <w:u w:val="single"/>
+        </w:rPr>
+        <w:t xml:space="preserve">3. Wirtschaftlichkeit</w:t>
+      </w:r>
+    </w:p>
+    <w:p>
+      <w:pPr>
+        <w:spacing w:after="80"/>
+      </w:pPr>
+      <w:r>
+        <w:rPr>
+          <w:rFonts w:ascii="Calibri" w:cs="Calibri" w:eastAsia="Calibri" w:hAnsi="Calibri"/>
+          <w:b/>
+          <w:bCs/>
+          <w:sz w:val="20"/>
+          <w:szCs w:val="20"/>
+        </w:rPr>
+        <w:t xml:space="preserve">Verantwortung: </w:t>
+      </w:r>
+      <w:r>
+        <w:rPr>
+          <w:rFonts w:ascii="Calibri" w:cs="Calibri" w:eastAsia="Calibri" w:hAnsi="Calibri"/>
+          <w:sz w:val="20"/>
+          <w:szCs w:val="20"/>
+        </w:rPr>
+        <w:t xml:space="preserve">Wirtschaftlicher Einsatz von Personal und Ressourcen.</w:t>
+      </w:r>
+    </w:p>
+    <w:p>
+      <w:pPr>
+        <w:spacing w:after="80"/>
+      </w:pPr>
+      <w:r>
+        <w:rPr>
+          <w:rFonts w:ascii="Calibri" w:cs="Calibri" w:eastAsia="Calibri" w:hAnsi="Calibri"/>
+          <w:b/>
+          <w:bCs/>
+          <w:sz w:val="20"/>
+          <w:szCs w:val="20"/>
+        </w:rPr>
+        <w:t xml:space="preserve">Aufgabe: </w:t>
+      </w:r>
+      <w:r>
+        <w:rPr>
+          <w:rFonts w:ascii="Calibri" w:cs="Calibri" w:eastAsia="Calibri" w:hAnsi="Calibri"/>
+          <w:sz w:val="20"/>
+          <w:szCs w:val="20"/>
+        </w:rPr>
+        <w:t xml:space="preserve">Sicherstellung des wirtschaftlichen Einsatzes von Personal und Ressourcen (laufende Steuerung/Überwachung im operativen Betrieb).</w:t>
+      </w:r>
+    </w:p>
+    <w:p>
+      <w:pPr>
+        <w:spacing w:after="80" w:before="220"/>
+      </w:pPr>
+      <w:r>
+        <w:rPr>
+          <w:rFonts w:ascii="Calibri" w:cs="Calibri" w:eastAsia="Calibri" w:hAnsi="Calibri"/>
+          <w:b/>
+          <w:bCs/>
+          <w:sz w:val="20"/>
+          <w:szCs w:val="20"/>
+          <w:u w:val="single"/>
+        </w:rPr>
+        <w:t xml:space="preserve">4. Personalverantwortung</w:t>
+      </w:r>
+    </w:p>
+    <w:p>
+      <w:pPr>
+        <w:spacing w:after="120"/>
+      </w:pPr>
+      <w:r>
+        <w:rPr>
+          <w:rFonts w:ascii="Calibri" w:cs="Calibri" w:eastAsia="Calibri" w:hAnsi="Calibri"/>
+        </w:rPr>
+        <w:t xml:space="preserve">Personalverantwortung für die Mitarbeiter der Produktion inkl. Werkzeugbau und Instandhaltung.</w:t>
+      </w:r>
+    </w:p>
+    <w:p>
+      <w:pPr>
+        <w:spacing w:after="40" w:before="40"/>
+      </w:pPr>
+      <w:r>
+        <w:rPr>
+          <w:rFonts w:ascii="Calibri" w:cs="Calibri" w:eastAsia="Calibri" w:hAnsi="Calibri"/>
+          <w:b/>
+          <w:bCs/>
+          <w:sz w:val="20"/>
+          <w:szCs w:val="20"/>
+        </w:rPr>
+        <w:t xml:space="preserve">Verantwortung:</w:t>
+      </w:r>
+    </w:p>
+    <w:p>
+      <w:pPr>
+        <w:pStyle w:val="ListParagraph"/>
+        <w:numPr>
+          <w:ilvl w:val="0"/>
+          <w:numId w:val="2"/>
+        </w:numPr>
+        <w:spacing w:after="60"/>
+      </w:pPr>
+      <w:r>
+        <w:rPr>
+          <w:rFonts w:ascii="Calibri" w:cs="Calibri" w:eastAsia="Calibri" w:hAnsi="Calibri"/>
+        </w:rPr>
+        <w:t xml:space="preserve">Personalverantwortung für die Mitarbeiter der Produktion inkl. Werkzeugbau und Instandhaltung</w:t>
+      </w:r>
+    </w:p>
+    <w:p>
+      <w:pPr>
+        <w:pStyle w:val="ListParagraph"/>
+        <w:numPr>
+          <w:ilvl w:val="0"/>
+          <w:numId w:val="2"/>
+        </w:numPr>
+        <w:spacing w:after="60"/>
+      </w:pPr>
+      <w:r>
+        <w:rPr>
+          <w:rFonts w:ascii="Calibri" w:cs="Calibri" w:eastAsia="Calibri" w:hAnsi="Calibri"/>
+        </w:rPr>
+        <w:t xml:space="preserve">Einhaltung aller relevanten Gesetze, insbesondere Arbeitszeitgesetz und ArbeitnehmerInnenschutzgesetz (ASchG) – Themenfeld Sicherheit</w:t>
+      </w:r>
+    </w:p>
+    <w:p>
+      <w:pPr>
+        <w:pStyle w:val="ListParagraph"/>
+        <w:numPr>
+          <w:ilvl w:val="0"/>
+          <w:numId w:val="2"/>
+        </w:numPr>
+        <w:spacing w:after="60"/>
+      </w:pPr>
+      <w:r>
+        <w:rPr>
+          <w:rFonts w:ascii="Calibri" w:cs="Calibri" w:eastAsia="Calibri" w:hAnsi="Calibri"/>
+        </w:rPr>
+        <w:t xml:space="preserve">Disziplinarische Verantwortung bei WerkerInnen und Sachbearbeitern als Eskalationsstufe (Erstverantwortung liegt bei den jeweiligen Teamleitern)</w:t>
+      </w:r>
+    </w:p>
+    <w:p>
+      <w:pPr>
+        <w:spacing w:after="40" w:before="40"/>
+      </w:pPr>
+      <w:r>
+        <w:rPr>
+          <w:rFonts w:ascii="Calibri" w:cs="Calibri" w:eastAsia="Calibri" w:hAnsi="Calibri"/>
+          <w:b/>
+          <w:bCs/>
+          <w:sz w:val="20"/>
+          <w:szCs w:val="20"/>
+        </w:rPr>
+        <w:t xml:space="preserve">Aufgaben:</w:t>
+      </w:r>
+    </w:p>
+    <w:p>
+      <w:pPr>
+        <w:pStyle w:val="ListParagraph"/>
+        <w:numPr>
+          <w:ilvl w:val="0"/>
+          <w:numId w:val="2"/>
+        </w:numPr>
+        <w:spacing w:after="60"/>
+      </w:pPr>
+      <w:r>
+        <w:rPr>
+          <w:rFonts w:ascii="Calibri" w:cs="Calibri" w:eastAsia="Calibri" w:hAnsi="Calibri"/>
+        </w:rPr>
+        <w:t xml:space="preserve">Personalanforderung</w:t>
+      </w:r>
+    </w:p>
+    <w:p>
+      <w:pPr>
+        <w:pStyle w:val="ListParagraph"/>
+        <w:numPr>
+          <w:ilvl w:val="0"/>
+          <w:numId w:val="2"/>
+        </w:numPr>
+        <w:spacing w:after="60"/>
+      </w:pPr>
+      <w:r>
+        <w:rPr>
+          <w:rFonts w:ascii="Calibri" w:cs="Calibri" w:eastAsia="Calibri" w:hAnsi="Calibri"/>
+        </w:rPr>
+        <w:t xml:space="preserve">Führung von Mitarbeitergesprächen</w:t>
+      </w:r>
+    </w:p>
+    <w:p>
+      <w:pPr>
+        <w:pStyle w:val="ListParagraph"/>
+        <w:numPr>
+          <w:ilvl w:val="0"/>
+          <w:numId w:val="2"/>
+        </w:numPr>
+        <w:spacing w:after="60"/>
+      </w:pPr>
+      <w:r>
+        <w:rPr>
+          <w:rFonts w:ascii="Calibri" w:cs="Calibri" w:eastAsia="Calibri" w:hAnsi="Calibri"/>
+        </w:rPr>
+        <w:t xml:space="preserve">Bildungsbedarfsermittlung</w:t>
+      </w:r>
+    </w:p>
+    <w:p>
+      <w:pPr>
+        <w:pStyle w:val="ListParagraph"/>
+        <w:numPr>
+          <w:ilvl w:val="0"/>
+          <w:numId w:val="2"/>
+        </w:numPr>
+        <w:spacing w:after="60"/>
+      </w:pPr>
+      <w:r>
+        <w:rPr>
+          <w:rFonts w:ascii="Calibri" w:cs="Calibri" w:eastAsia="Calibri" w:hAnsi="Calibri"/>
+        </w:rPr>
+        <w:t xml:space="preserve">Aus- und Weiterbildung sowie Unterweisung der unterstellten Mitarbeiter: Details siehe Themenblock 14</w:t>
+      </w:r>
+    </w:p>
+    <w:p>
+      <w:pPr>
+        <w:pStyle w:val="ListParagraph"/>
+        <w:numPr>
+          <w:ilvl w:val="0"/>
+          <w:numId w:val="2"/>
+        </w:numPr>
+        <w:spacing w:after="60"/>
+      </w:pPr>
+      <w:r>
+        <w:rPr>
+          <w:rFonts w:ascii="Calibri" w:cs="Calibri" w:eastAsia="Calibri" w:hAnsi="Calibri"/>
+        </w:rPr>
+        <w:t xml:space="preserve">Mitwirkung an der Einführung geeigneter (flexibler) Arbeitszeitmodelle (gemeinsam mit HR)</w:t>
+      </w:r>
+    </w:p>
+    <w:p>
+      <w:pPr>
+        <w:pStyle w:val="ListParagraph"/>
+        <w:numPr>
+          <w:ilvl w:val="0"/>
+          <w:numId w:val="2"/>
+        </w:numPr>
+        <w:spacing w:after="60"/>
+      </w:pPr>
+      <w:r>
+        <w:rPr>
+          <w:rFonts w:ascii="Calibri" w:cs="Calibri" w:eastAsia="Calibri" w:hAnsi="Calibri"/>
+        </w:rPr>
+        <w:t xml:space="preserve">Sicherstellung der Urlaubsplanung</w:t>
+      </w:r>
+    </w:p>
+    <w:p>
+      <w:pPr>
+        <w:spacing w:after="40" w:before="40"/>
+      </w:pPr>
+      <w:r>
+        <w:rPr>
+          <w:rFonts w:ascii="Calibri" w:cs="Calibri" w:eastAsia="Calibri" w:hAnsi="Calibri"/>
+          <w:b/>
+          <w:bCs/>
+          <w:sz w:val="20"/>
+          <w:szCs w:val="20"/>
+        </w:rPr>
+        <w:t xml:space="preserve">Kompetenzen:</w:t>
+      </w:r>
+    </w:p>
+    <w:p>
+      <w:pPr>
+        <w:pStyle w:val="ListParagraph"/>
+        <w:numPr>
+          <w:ilvl w:val="0"/>
+          <w:numId w:val="2"/>
+        </w:numPr>
+        <w:spacing w:after="60"/>
+      </w:pPr>
+      <w:r>
+        <w:rPr>
+          <w:rFonts w:ascii="Calibri" w:cs="Calibri" w:eastAsia="Calibri" w:hAnsi="Calibri"/>
+        </w:rPr>
+        <w:t xml:space="preserve">Entscheidung über Einstellung/Kündigung</w:t>
+      </w:r>
+    </w:p>
+    <w:p>
+      <w:pPr>
+        <w:pStyle w:val="ListParagraph"/>
+        <w:numPr>
+          <w:ilvl w:val="0"/>
+          <w:numId w:val="2"/>
+        </w:numPr>
+        <w:spacing w:after="60"/>
+      </w:pPr>
+      <w:r>
+        <w:rPr>
+          <w:rFonts w:ascii="Calibri" w:cs="Calibri" w:eastAsia="Calibri" w:hAnsi="Calibri"/>
+        </w:rPr>
+        <w:t xml:space="preserve">Disziplinarische Maßnahmen bei WerkerInnen/Sachbearbeitern (als Eskalationsinstanz)</w:t>
+      </w:r>
+    </w:p>
+    <w:p>
+      <w:pPr>
+        <w:spacing w:after="80" w:before="220"/>
+      </w:pPr>
+      <w:r>
+        <w:rPr>
+          <w:rFonts w:ascii="Calibri" w:cs="Calibri" w:eastAsia="Calibri" w:hAnsi="Calibri"/>
+          <w:b/>
+          <w:bCs/>
+          <w:sz w:val="20"/>
+          <w:szCs w:val="20"/>
+          <w:u w:val="single"/>
+        </w:rPr>
+        <w:t xml:space="preserve">5. Korrekturmaßnahmen / QS-Zusammenarbeit</w:t>
+      </w:r>
+    </w:p>
+    <w:p>
+      <w:pPr>
+        <w:spacing w:after="120"/>
+      </w:pPr>
+      <w:r>
+        <w:rPr>
+          <w:rFonts w:ascii="Calibri" w:cs="Calibri" w:eastAsia="Calibri" w:hAnsi="Calibri"/>
+        </w:rPr>
+        <w:t xml:space="preserve">Das direkte Gegenüber der Produktionsleitung bei Korrekturmaßnahmen auf Gesamtebene ist die Rolle QS (Qualitätssicherung Produktion). QMB bleibt Korrespondenzfunktion auf Schicht-/Team-Ebene. Ablauf: QS stellt Bedarf fest → Produktionsleitung entscheidet Maßnahme → QS prüft und gibt frei.</w:t>
+      </w:r>
+    </w:p>
+    <w:p>
+      <w:pPr>
+        <w:spacing w:after="80"/>
+      </w:pPr>
+      <w:r>
+        <w:rPr>
+          <w:rFonts w:ascii="Calibri" w:cs="Calibri" w:eastAsia="Calibri" w:hAnsi="Calibri"/>
+          <w:b/>
+          <w:bCs/>
+          <w:sz w:val="20"/>
+          <w:szCs w:val="20"/>
+        </w:rPr>
+        <w:t xml:space="preserve">Aufgabe: </w:t>
+      </w:r>
+      <w:r>
+        <w:rPr>
+          <w:rFonts w:ascii="Calibri" w:cs="Calibri" w:eastAsia="Calibri" w:hAnsi="Calibri"/>
+          <w:sz w:val="20"/>
+          <w:szCs w:val="20"/>
+        </w:rPr>
+        <w:t xml:space="preserve">Entscheidung über Art und Umsetzung von Korrekturmaßnahmen bei durch QS festgestelltem Handlungsbedarf (gesamtheitliche Ebene).</w:t>
+      </w:r>
+    </w:p>
+    <w:p>
+      <w:pPr>
+        <w:spacing w:after="80"/>
+      </w:pPr>
+      <w:r>
+        <w:rPr>
+          <w:rFonts w:ascii="Calibri" w:cs="Calibri" w:eastAsia="Calibri" w:hAnsi="Calibri"/>
+          <w:b/>
+          <w:bCs/>
+          <w:sz w:val="20"/>
+          <w:szCs w:val="20"/>
+        </w:rPr>
+        <w:t xml:space="preserve">Kompetenz: </w:t>
+      </w:r>
+      <w:r>
+        <w:rPr>
+          <w:rFonts w:ascii="Calibri" w:cs="Calibri" w:eastAsia="Calibri" w:hAnsi="Calibri"/>
+          <w:sz w:val="20"/>
+          <w:szCs w:val="20"/>
+        </w:rPr>
+        <w:t xml:space="preserve">Entscheidungsbefugnis über die konkrete Maßnahmenwahl bei Korrekturmaßnahmen.</w:t>
+      </w:r>
+    </w:p>
+    <w:p>
+      <w:pPr>
+        <w:spacing w:after="80" w:before="220"/>
+      </w:pPr>
+      <w:r>
+        <w:rPr>
+          <w:rFonts w:ascii="Calibri" w:cs="Calibri" w:eastAsia="Calibri" w:hAnsi="Calibri"/>
+          <w:b/>
+          <w:bCs/>
+          <w:sz w:val="20"/>
+          <w:szCs w:val="20"/>
+          <w:u w:val="single"/>
+        </w:rPr>
+        <w:t xml:space="preserve">6. Wartung und Instandhaltung</w:t>
+      </w:r>
+    </w:p>
+    <w:p>
+      <w:pPr>
+        <w:spacing w:after="120"/>
+      </w:pPr>
+      <w:r>
+        <w:rPr>
+          <w:rFonts w:ascii="Calibri" w:cs="Calibri" w:eastAsia="Calibri" w:hAnsi="Calibri"/>
+        </w:rPr>
+        <w:t xml:space="preserve">Zwei getrennte Teams mit eigener Teamleitung, beide berichten im Regelbetrieb direkt an den Produktionsleiter: Teamleitung Instandhaltung (Maschinen, Anlagen, Infrastruktur inkl. Betriebsmittel, Fertigungshilfsmittel, Roboter, automatisierte Anlagen) und Teamleitung Werkzeugbau (Werkzeugbau sowie Werkzeugwartung, -reparatur und -instandhaltung).</w:t>
+      </w:r>
+    </w:p>
+    <w:p>
+      <w:pPr>
+        <w:spacing w:after="80"/>
+      </w:pPr>
+      <w:r>
+        <w:rPr>
+          <w:rFonts w:ascii="Calibri" w:cs="Calibri" w:eastAsia="Calibri" w:hAnsi="Calibri"/>
+          <w:b/>
+          <w:bCs/>
+          <w:sz w:val="20"/>
+          <w:szCs w:val="20"/>
+        </w:rPr>
+        <w:t xml:space="preserve">Aufgabe: </w:t>
+      </w:r>
+      <w:r>
+        <w:rPr>
+          <w:rFonts w:ascii="Calibri" w:cs="Calibri" w:eastAsia="Calibri" w:hAnsi="Calibri"/>
+          <w:sz w:val="20"/>
+          <w:szCs w:val="20"/>
+        </w:rPr>
+        <w:t xml:space="preserve">Überwachung der Wartung und Instandhaltung von Maschinen, Anlagen und Infrastruktur (Teamleitung Instandhaltung) sowie von Werkzeugen (Teamleitung Werkzeugbau). Bei technischen Eskalationsfällen: Priorisierung der erforderlichen Maßnahmen.</w:t>
+      </w:r>
+    </w:p>
+    <w:p>
+      <w:pPr>
+        <w:spacing w:after="80"/>
+      </w:pPr>
+      <w:r>
+        <w:rPr>
+          <w:rFonts w:ascii="Calibri" w:cs="Calibri" w:eastAsia="Calibri" w:hAnsi="Calibri"/>
+          <w:b/>
+          <w:bCs/>
+          <w:sz w:val="20"/>
+          <w:szCs w:val="20"/>
+        </w:rPr>
+        <w:t xml:space="preserve">Kompetenz: </w:t>
+      </w:r>
+      <w:r>
+        <w:rPr>
+          <w:rFonts w:ascii="Calibri" w:cs="Calibri" w:eastAsia="Calibri" w:hAnsi="Calibri"/>
+          <w:sz w:val="20"/>
+          <w:szCs w:val="20"/>
+        </w:rPr>
+        <w:t xml:space="preserve">Entscheidungsbefugnis über die Umsetzung der bestgeeigneten Variante bei Eskalationsthemen (keine Terminierung/Ressourcenzuteilung im Regelbetrieb).</w:t>
+      </w:r>
+    </w:p>
+    <w:p>
+      <w:pPr>
+        <w:spacing w:after="80" w:before="220"/>
+      </w:pPr>
+      <w:r>
+        <w:rPr>
+          <w:rFonts w:ascii="Calibri" w:cs="Calibri" w:eastAsia="Calibri" w:hAnsi="Calibri"/>
+          <w:b/>
+          <w:bCs/>
+          <w:sz w:val="20"/>
+          <w:szCs w:val="20"/>
+          <w:u w:val="single"/>
+        </w:rPr>
+        <w:t xml:space="preserve">7. Produktionsaufzeichnungen</w:t>
+      </w:r>
+    </w:p>
+    <w:p>
+      <w:pPr>
+        <w:spacing w:after="40" w:before="40"/>
+      </w:pPr>
+      <w:r>
+        <w:rPr>
+          <w:rFonts w:ascii="Calibri" w:cs="Calibri" w:eastAsia="Calibri" w:hAnsi="Calibri"/>
+          <w:b/>
+          <w:bCs/>
+          <w:sz w:val="20"/>
+          <w:szCs w:val="20"/>
+        </w:rPr>
+        <w:t xml:space="preserve">Verantwortung: Organisatorische Sicherstellung, dass Produktionsaufzeichnungen den Anforderungen aus ISO 9001 (§7.5.2/7.5.3) und IATF 16949 (§7.5.3.2.1) entsprechen:</w:t>
+      </w:r>
+    </w:p>
+    <w:p>
+      <w:pPr>
+        <w:pStyle w:val="ListParagraph"/>
+        <w:numPr>
+          <w:ilvl w:val="0"/>
+          <w:numId w:val="2"/>
+        </w:numPr>
+        <w:spacing w:after="60"/>
+      </w:pPr>
+      <w:r>
+        <w:rPr>
+          <w:rFonts w:ascii="Calibri" w:cs="Calibri" w:eastAsia="Calibri" w:hAnsi="Calibri"/>
+        </w:rPr>
+        <w:t xml:space="preserve">Vorhanden/vollständig – erforderliche Aufzeichnungen werden tatsächlich erstellt und geführt</w:t>
+      </w:r>
+    </w:p>
+    <w:p>
+      <w:pPr>
+        <w:pStyle w:val="ListParagraph"/>
+        <w:numPr>
+          <w:ilvl w:val="0"/>
+          <w:numId w:val="2"/>
+        </w:numPr>
+        <w:spacing w:after="60"/>
+      </w:pPr>
+      <w:r>
+        <w:rPr>
+          <w:rFonts w:ascii="Calibri" w:cs="Calibri" w:eastAsia="Calibri" w:hAnsi="Calibri"/>
+        </w:rPr>
+        <w:t xml:space="preserve">Eindeutig/korrekt identifizierbar – Kennzeichnung (Titel, Datum, Ersteller, Referenznummer)</w:t>
+      </w:r>
+    </w:p>
+    <w:p>
+      <w:pPr>
+        <w:pStyle w:val="ListParagraph"/>
+        <w:numPr>
+          <w:ilvl w:val="0"/>
+          <w:numId w:val="2"/>
+        </w:numPr>
+        <w:spacing w:after="60"/>
+      </w:pPr>
+      <w:r>
+        <w:rPr>
+          <w:rFonts w:ascii="Calibri" w:cs="Calibri" w:eastAsia="Calibri" w:hAnsi="Calibri"/>
+        </w:rPr>
+        <w:t xml:space="preserve">Versioniert – Änderungen sind nachvollziehbar</w:t>
+      </w:r>
+    </w:p>
+    <w:p>
+      <w:pPr>
+        <w:pStyle w:val="ListParagraph"/>
+        <w:numPr>
+          <w:ilvl w:val="0"/>
+          <w:numId w:val="2"/>
+        </w:numPr>
+        <w:spacing w:after="60"/>
+      </w:pPr>
+      <w:r>
+        <w:rPr>
+          <w:rFonts w:ascii="Calibri" w:cs="Calibri" w:eastAsia="Calibri" w:hAnsi="Calibri"/>
+        </w:rPr>
+        <w:t xml:space="preserve">Aufbewahrung – gemäß Record-Retention-Policy (IATF 16949 §7.5.3.2.1)</w:t>
+      </w:r>
+    </w:p>
+    <w:p>
+      <w:pPr>
+        <w:pStyle w:val="ListParagraph"/>
+        <w:numPr>
+          <w:ilvl w:val="0"/>
+          <w:numId w:val="2"/>
+        </w:numPr>
+        <w:spacing w:after="60"/>
+      </w:pPr>
+      <w:r>
+        <w:rPr>
+          <w:rFonts w:ascii="Calibri" w:cs="Calibri" w:eastAsia="Calibri" w:hAnsi="Calibri"/>
+        </w:rPr>
+        <w:t xml:space="preserve">Zugänglich/lesbar/geschützt – auffindbar und geschützt vor Verlust/unbefugtem Zugriff</w:t>
+      </w:r>
+    </w:p>
+    <w:p>
+      <w:pPr>
+        <w:spacing w:after="80"/>
+      </w:pPr>
+      <w:r>
+        <w:rPr>
+          <w:rFonts w:ascii="Calibri" w:cs="Calibri" w:eastAsia="Calibri" w:hAnsi="Calibri"/>
+          <w:b/>
+          <w:bCs/>
+          <w:sz w:val="20"/>
+          <w:szCs w:val="20"/>
+        </w:rPr>
+        <w:t xml:space="preserve">Aufgabe: </w:t>
+      </w:r>
+      <w:r>
+        <w:rPr>
+          <w:rFonts w:ascii="Calibri" w:cs="Calibri" w:eastAsia="Calibri" w:hAnsi="Calibri"/>
+          <w:sz w:val="20"/>
+          <w:szCs w:val="20"/>
+        </w:rPr>
+        <w:t xml:space="preserve">Regelmäßige/stichprobenhafte Kontrolle der produktionsrelevanten Aufzeichnungen (z. B. Prüfbegleitkarte, Schichtlogbuch [Schichtführer], Maschinen-/Prozessdaten, Wartungsprotokolle) auf diese Kriterien; Veranlassung von Korrekturen bei Abweichungen.</w:t>
+      </w:r>
+    </w:p>
+    <w:p>
+      <w:pPr>
+        <w:spacing w:after="100"/>
+      </w:pPr>
+      <w:r>
+        <w:rPr>
+          <w:rFonts w:ascii="Calibri" w:cs="Calibri" w:eastAsia="Calibri" w:hAnsi="Calibri"/>
+          <w:i/>
+          <w:iCs/>
+          <w:sz w:val="18"/>
+          <w:szCs w:val="18"/>
+        </w:rPr>
+        <w:t xml:space="preserve">Abgrenzung: Vorserienbezogene Dokumente (z. B. Erstmusterprüfberichte, FMEAs) sind nicht Teil dieser Aufgabe – sie sind in der Produkt-/Projekttechnik verortet.</w:t>
+      </w:r>
+    </w:p>
+    <w:p>
+      <w:pPr>
+        <w:spacing w:after="80" w:before="220"/>
+      </w:pPr>
+      <w:r>
+        <w:rPr>
+          <w:rFonts w:ascii="Calibri" w:cs="Calibri" w:eastAsia="Calibri" w:hAnsi="Calibri"/>
+          <w:b/>
+          <w:bCs/>
+          <w:sz w:val="20"/>
+          <w:szCs w:val="20"/>
+          <w:u w:val="single"/>
+        </w:rPr>
+        <w:t xml:space="preserve">8. Reklamationen / QMB-Zusammenarbeit</w:t>
+      </w:r>
+    </w:p>
+    <w:p>
+      <w:pPr>
+        <w:spacing w:after="120"/>
+      </w:pPr>
+      <w:r>
+        <w:rPr>
+          <w:rFonts w:ascii="Calibri" w:cs="Calibri" w:eastAsia="Calibri" w:hAnsi="Calibri"/>
+        </w:rPr>
+        <w:t xml:space="preserve">QMB ist eine normativ geforderte Funktion (IATF 16949 §5.3.1/§5.3.2) und vertritt die Organisation nach außen in Qualitätsangelegenheiten – nicht nur gegenüber Kunden, sondern auch gegenüber Lieferanten und bei der Überwachung von Partnern im Produktionsnetzwerk (Lohnfertigung). QS deckt demgegenüber die internen Qualitätsbelange ab: Sperren, Beurteilung, Grenzmusterkataloge, Erststückfreigaben sowie interne Maßnahmen zur Verbesserung und Vermeidung von Reklamationen.</w:t>
+      </w:r>
+    </w:p>
+    <w:p>
+      <w:pPr>
+        <w:spacing w:after="80"/>
+      </w:pPr>
+      <w:r>
+        <w:rPr>
+          <w:rFonts w:ascii="Calibri" w:cs="Calibri" w:eastAsia="Calibri" w:hAnsi="Calibri"/>
+          <w:b/>
+          <w:bCs/>
+          <w:sz w:val="20"/>
+          <w:szCs w:val="20"/>
+        </w:rPr>
+        <w:t xml:space="preserve">Aufgabe: </w:t>
+      </w:r>
+      <w:r>
+        <w:rPr>
+          <w:rFonts w:ascii="Calibri" w:cs="Calibri" w:eastAsia="Calibri" w:hAnsi="Calibri"/>
+          <w:sz w:val="20"/>
+          <w:szCs w:val="20"/>
+        </w:rPr>
+        <w:t xml:space="preserve">Unterstützung von QMB bei der Bearbeitung von Reklamationen (Kunden, Lieferanten, Netzwerkpartner/Lohnfertiger) durch Bereitstellung produktionsseitiger Informationen (Ursachenanalyse, Sofort-/Korrekturmaßnahmen) für die externe Kommunikation. Die inhaltliche Entscheidung über und Umsetzung von Korrekturmaßnahmen auf Produktionsseite erfolgt gemäß Themenblock 5.</w:t>
+      </w:r>
+    </w:p>
+    <w:p>
+      <w:pPr>
+        <w:spacing w:after="80" w:before="220"/>
+      </w:pPr>
+      <w:r>
+        <w:rPr>
+          <w:rFonts w:ascii="Calibri" w:cs="Calibri" w:eastAsia="Calibri" w:hAnsi="Calibri"/>
+          <w:b/>
+          <w:bCs/>
+          <w:sz w:val="20"/>
+          <w:szCs w:val="20"/>
+          <w:u w:val="single"/>
+        </w:rPr>
+        <w:t xml:space="preserve">9. Lehrlingsausbildung</w:t>
+      </w:r>
+    </w:p>
+    <w:p>
+      <w:pPr>
+        <w:spacing w:after="80"/>
+      </w:pPr>
+      <w:r>
+        <w:rPr>
+          <w:rFonts w:ascii="Calibri" w:cs="Calibri" w:eastAsia="Calibri" w:hAnsi="Calibri"/>
+          <w:b/>
+          <w:bCs/>
+          <w:sz w:val="20"/>
+          <w:szCs w:val="20"/>
+        </w:rPr>
+        <w:t xml:space="preserve">Verantwortung (keine operative Aufgabe): </w:t>
+      </w:r>
+      <w:r>
+        <w:rPr>
+          <w:rFonts w:ascii="Calibri" w:cs="Calibri" w:eastAsia="Calibri" w:hAnsi="Calibri"/>
+          <w:sz w:val="20"/>
+          <w:szCs w:val="20"/>
+        </w:rPr>
+        <w:t xml:space="preserve">Verantwortlich für die Lehrlingsausbildung im Bereich Produktion. Operativ wird die Ausbildung durch zwei separate Lehrlingsausbildner wahrgenommen: Kunststofftechniker – Ausbildner: Techniker im Bereich Automatisierung/Instandhaltung; Werkzeugbautechniker – Ausbildner: Teamleitung Werkzeugbau.</w:t>
+      </w:r>
+    </w:p>
+    <w:p>
+      <w:pPr>
+        <w:spacing w:after="80" w:before="220"/>
+      </w:pPr>
+      <w:r>
+        <w:rPr>
+          <w:rFonts w:ascii="Calibri" w:cs="Calibri" w:eastAsia="Calibri" w:hAnsi="Calibri"/>
+          <w:b/>
+          <w:bCs/>
+          <w:sz w:val="20"/>
+          <w:szCs w:val="20"/>
+          <w:u w:val="single"/>
+        </w:rPr>
+        <w:t xml:space="preserve">10. Sperren von fehlerhaften Produkten</w:t>
+      </w:r>
+    </w:p>
+    <w:p>
+      <w:pPr>
+        <w:spacing w:after="80"/>
+      </w:pPr>
+      <w:r>
+        <w:rPr>
+          <w:rFonts w:ascii="Calibri" w:cs="Calibri" w:eastAsia="Calibri" w:hAnsi="Calibri"/>
+          <w:b/>
+          <w:bCs/>
+          <w:sz w:val="20"/>
+          <w:szCs w:val="20"/>
+        </w:rPr>
+        <w:t xml:space="preserve">Regelfall (Aufgabe): </w:t>
+      </w:r>
+      <w:r>
+        <w:rPr>
+          <w:rFonts w:ascii="Calibri" w:cs="Calibri" w:eastAsia="Calibri" w:hAnsi="Calibri"/>
+          <w:sz w:val="20"/>
+          <w:szCs w:val="20"/>
+        </w:rPr>
+        <w:t xml:space="preserve">Umsetzung der Sperrentscheidung von QS/PQB – der Produktionsleiter folgt hier zu 100 % der fachlichen Beurteilung durch QS/PQB.</w:t>
+      </w:r>
+    </w:p>
+    <w:p>
+      <w:pPr>
+        <w:spacing w:after="40" w:before="40"/>
+      </w:pPr>
+      <w:r>
+        <w:rPr>
+          <w:rFonts w:ascii="Calibri" w:cs="Calibri" w:eastAsia="Calibri" w:hAnsi="Calibri"/>
+          <w:b/>
+          <w:bCs/>
+          <w:sz w:val="20"/>
+          <w:szCs w:val="20"/>
+        </w:rPr>
+        <w:t xml:space="preserve">Unklare/strittige Fälle (Kompetenz, gemeinsame Entscheidung mit QS/PQB): Abwägung zwischen Reklamationsrisiko und Sperrkosten:</w:t>
+      </w:r>
+    </w:p>
+    <w:p>
+      <w:pPr>
+        <w:pStyle w:val="ListParagraph"/>
+        <w:numPr>
+          <w:ilvl w:val="0"/>
+          <w:numId w:val="2"/>
+        </w:numPr>
+        <w:spacing w:after="60"/>
+      </w:pPr>
+      <w:r>
+        <w:rPr>
+          <w:rFonts w:ascii="Calibri" w:cs="Calibri" w:eastAsia="Calibri" w:hAnsi="Calibri"/>
+        </w:rPr>
+        <w:t xml:space="preserve">Vertagung der endgültigen Entscheidung (z. B. Rücksprache mit Kunde/GF am Folgetag), Produktion läuft in der Zwischenzeit weiter</w:t>
+      </w:r>
+    </w:p>
+    <w:p>
+      <w:pPr>
+        <w:pStyle w:val="ListParagraph"/>
+        <w:numPr>
+          <w:ilvl w:val="0"/>
+          <w:numId w:val="2"/>
+        </w:numPr>
+        <w:spacing w:after="60"/>
+      </w:pPr>
+      <w:r>
+        <w:rPr>
+          <w:rFonts w:ascii="Calibri" w:cs="Calibri" w:eastAsia="Calibri" w:hAnsi="Calibri"/>
+        </w:rPr>
+        <w:t xml:space="preserve">Trennung zwischen Produktions- und Lieferfreigabe: Teile werden weiterproduziert (z. B. Engpassanlage), aber zunächst nur für die Auslieferung gesperrt</w:t>
+      </w:r>
+    </w:p>
+    <w:p>
+      <w:pPr>
+        <w:spacing w:after="80" w:before="220"/>
+      </w:pPr>
+      <w:r>
+        <w:rPr>
+          <w:rFonts w:ascii="Calibri" w:cs="Calibri" w:eastAsia="Calibri" w:hAnsi="Calibri"/>
+          <w:b/>
+          <w:bCs/>
+          <w:sz w:val="20"/>
+          <w:szCs w:val="20"/>
+          <w:u w:val="single"/>
+        </w:rPr>
+        <w:t xml:space="preserve">11. Bemusterungs-Eskalation (multidisziplinäre Abstimmung)</w:t>
+      </w:r>
+    </w:p>
+    <w:p>
+      <w:pPr>
+        <w:spacing w:after="120"/>
+      </w:pPr>
+      <w:r>
+        <w:rPr>
+          <w:rFonts w:ascii="Calibri" w:cs="Calibri" w:eastAsia="Calibri" w:hAnsi="Calibri"/>
+        </w:rPr>
+        <w:t xml:space="preserve">Bemusterung (Werkzeug, Automatisierung, Material, Spritzgussparameter) obliegt der Rolle Prozesstechnik und Bemusterung. Die Kundenfreigabe nach Vorstellung serienfallender Teile entspricht dem normativ geforderten Produktfreigabeprozess (IATF 16949 §8.3.4.4). Danach ist Prozess/Referenznummer/Werkzeug zur Vorserie frei (z. B. für Run@Rate) – das Herstellungsrisiko einer etwaigen Vorproduktion liegt bei der Produktion (vergleichbar der „Interim Approval“ im PPAP-Prozess).</w:t>
+      </w:r>
+    </w:p>
+    <w:p>
+      <w:pPr>
+        <w:spacing w:after="80"/>
+      </w:pPr>
+      <w:r>
+        <w:rPr>
+          <w:rFonts w:ascii="Calibri" w:cs="Calibri" w:eastAsia="Calibri" w:hAnsi="Calibri"/>
+          <w:b/>
+          <w:bCs/>
+          <w:sz w:val="20"/>
+          <w:szCs w:val="20"/>
+        </w:rPr>
+        <w:t xml:space="preserve">Aufgabe: </w:t>
+      </w:r>
+      <w:r>
+        <w:rPr>
+          <w:rFonts w:ascii="Calibri" w:cs="Calibri" w:eastAsia="Calibri" w:hAnsi="Calibri"/>
+          <w:sz w:val="20"/>
+          <w:szCs w:val="20"/>
+        </w:rPr>
+        <w:t xml:space="preserve">Kontrolle des Bemusterungsprozesses aus Produktionssicht.</w:t>
+      </w:r>
+    </w:p>
+    <w:p>
+      <w:pPr>
+        <w:spacing w:after="40" w:before="40"/>
+      </w:pPr>
+      <w:r>
+        <w:rPr>
+          <w:rFonts w:ascii="Calibri" w:cs="Calibri" w:eastAsia="Calibri" w:hAnsi="Calibri"/>
+          <w:b/>
+          <w:bCs/>
+          <w:sz w:val="20"/>
+          <w:szCs w:val="20"/>
+        </w:rPr>
+        <w:t xml:space="preserve">Kompetenz: Eskalationsinstanz bei mehreren Varianten oder Risikofragen – multidisziplinäre Abstimmung (IATF 16949 §8.3.2.1) zwischen:</w:t>
+      </w:r>
+    </w:p>
+    <w:p>
+      <w:pPr>
+        <w:pStyle w:val="ListParagraph"/>
+        <w:numPr>
+          <w:ilvl w:val="0"/>
+          <w:numId w:val="2"/>
+        </w:numPr>
+        <w:spacing w:after="60"/>
+      </w:pPr>
+      <w:r>
+        <w:rPr>
+          <w:rFonts w:ascii="Calibri" w:cs="Calibri" w:eastAsia="Calibri" w:hAnsi="Calibri"/>
+        </w:rPr>
+        <w:t xml:space="preserve">Produktionsleitung</w:t>
+      </w:r>
+    </w:p>
+    <w:p>
+      <w:pPr>
+        <w:pStyle w:val="ListParagraph"/>
+        <w:numPr>
+          <w:ilvl w:val="0"/>
+          <w:numId w:val="2"/>
+        </w:numPr>
+        <w:spacing w:after="60"/>
+      </w:pPr>
+      <w:r>
+        <w:rPr>
+          <w:rFonts w:ascii="Calibri" w:cs="Calibri" w:eastAsia="Calibri" w:hAnsi="Calibri"/>
+        </w:rPr>
+        <w:t xml:space="preserve">Abteilungsleitung Produkt-/Projekttechnik</w:t>
+      </w:r>
+    </w:p>
+    <w:p>
+      <w:pPr>
+        <w:pStyle w:val="ListParagraph"/>
+        <w:numPr>
+          <w:ilvl w:val="0"/>
+          <w:numId w:val="2"/>
+        </w:numPr>
+        <w:spacing w:after="60"/>
+      </w:pPr>
+      <w:r>
+        <w:rPr>
+          <w:rFonts w:ascii="Calibri" w:cs="Calibri" w:eastAsia="Calibri" w:hAnsi="Calibri"/>
+        </w:rPr>
+        <w:t xml:space="preserve">ggf. QMB</w:t>
+      </w:r>
+    </w:p>
+    <w:p>
+      <w:pPr>
+        <w:pStyle w:val="ListParagraph"/>
+        <w:numPr>
+          <w:ilvl w:val="0"/>
+          <w:numId w:val="2"/>
+        </w:numPr>
+        <w:spacing w:after="60"/>
+      </w:pPr>
+      <w:r>
+        <w:rPr>
+          <w:rFonts w:ascii="Calibri" w:cs="Calibri" w:eastAsia="Calibri" w:hAnsi="Calibri"/>
+        </w:rPr>
+        <w:t xml:space="preserve">in seltenen Fällen Leitung SCM (z. B. Auslieferbehälter, Verpackungsvorschriften)</w:t>
+      </w:r>
+    </w:p>
+    <w:p>
+      <w:pPr>
+        <w:spacing w:after="100"/>
+      </w:pPr>
+      <w:r>
+        <w:rPr>
+          <w:rFonts w:ascii="Calibri" w:cs="Calibri" w:eastAsia="Calibri" w:hAnsi="Calibri"/>
+          <w:i/>
+          <w:iCs/>
+          <w:sz w:val="18"/>
+          <w:szCs w:val="18"/>
+        </w:rPr>
+        <w:t xml:space="preserve">Der formale Projektabschluss (Prozessreview/Workflow aller Abteilungsleiter, dokumentiert in DocuWare) ist ein separater, bereits etablierter Schritt.</w:t>
+      </w:r>
+    </w:p>
+    <w:p>
+      <w:pPr>
+        <w:spacing w:after="80" w:before="220"/>
+      </w:pPr>
+      <w:r>
+        <w:rPr>
+          <w:rFonts w:ascii="Calibri" w:cs="Calibri" w:eastAsia="Calibri" w:hAnsi="Calibri"/>
+          <w:b/>
+          <w:bCs/>
+          <w:sz w:val="20"/>
+          <w:szCs w:val="20"/>
+          <w:u w:val="single"/>
+        </w:rPr>
+        <w:t xml:space="preserve">12. Werkzeugoptimierungen in Absprache mit PT (Prozesstechnik und Bemusterung)</w:t>
+      </w:r>
+    </w:p>
+    <w:p>
+      <w:pPr>
+        <w:spacing w:after="120"/>
+      </w:pPr>
+      <w:r>
+        <w:rPr>
+          <w:rFonts w:ascii="Calibri" w:cs="Calibri" w:eastAsia="Calibri" w:hAnsi="Calibri"/>
+        </w:rPr>
+        <w:t xml:space="preserve">Fall 1 – vor Serienstart: läuft im Rahmen des Vorserienprozesses (siehe Themenblock 11).</w:t>
+      </w:r>
+    </w:p>
+    <w:p>
+      <w:pPr>
+        <w:spacing w:after="40" w:before="40"/>
+      </w:pPr>
+      <w:r>
+        <w:rPr>
+          <w:rFonts w:ascii="Calibri" w:cs="Calibri" w:eastAsia="Calibri" w:hAnsi="Calibri"/>
+          <w:b/>
+          <w:bCs/>
+          <w:sz w:val="20"/>
+          <w:szCs w:val="20"/>
+        </w:rPr>
+        <w:t xml:space="preserve">Fall 2 – nach Serienstart, aus Produktionssicht (Qualitäts-/Kostengründe, technische Werkzeugänderung und/oder erneute Kundenfreigabe erforderlich) – Aufgabe:</w:t>
+      </w:r>
+    </w:p>
+    <w:p>
+      <w:pPr>
+        <w:pStyle w:val="ListParagraph"/>
+        <w:numPr>
+          <w:ilvl w:val="0"/>
+          <w:numId w:val="2"/>
+        </w:numPr>
+        <w:spacing w:after="60"/>
+      </w:pPr>
+      <w:r>
+        <w:rPr>
+          <w:rFonts w:ascii="Calibri" w:cs="Calibri" w:eastAsia="Calibri" w:hAnsi="Calibri"/>
+        </w:rPr>
+        <w:t xml:space="preserve">Entgegennahme des Optimierungsbedarfs, herangetragen von Prozesstechnik und Bemusterung, Werkzeugbau oder (seltener) Schichtführern</w:t>
+      </w:r>
+    </w:p>
+    <w:p>
+      <w:pPr>
+        <w:pStyle w:val="ListParagraph"/>
+        <w:numPr>
+          <w:ilvl w:val="0"/>
+          <w:numId w:val="2"/>
+        </w:numPr>
+        <w:spacing w:after="60"/>
+      </w:pPr>
+      <w:r>
+        <w:rPr>
+          <w:rFonts w:ascii="Calibri" w:cs="Calibri" w:eastAsia="Calibri" w:hAnsi="Calibri"/>
+        </w:rPr>
+        <w:t xml:space="preserve">Grobe Nutzen-/Kostenbewertung als Gesamtkosten- und Qualitätsverantwortlicher der Produktion</w:t>
+      </w:r>
+    </w:p>
+    <w:p>
+      <w:pPr>
+        <w:spacing w:after="80"/>
+      </w:pPr>
+      <w:r>
+        <w:rPr>
+          <w:rFonts w:ascii="Calibri" w:cs="Calibri" w:eastAsia="Calibri" w:hAnsi="Calibri"/>
+          <w:b/>
+          <w:bCs/>
+          <w:sz w:val="20"/>
+          <w:szCs w:val="20"/>
+        </w:rPr>
+        <w:t xml:space="preserve">Kompetenz: </w:t>
+      </w:r>
+      <w:r>
+        <w:rPr>
+          <w:rFonts w:ascii="Calibri" w:cs="Calibri" w:eastAsia="Calibri" w:hAnsi="Calibri"/>
+          <w:sz w:val="20"/>
+          <w:szCs w:val="20"/>
+        </w:rPr>
+        <w:t xml:space="preserve">Entscheidung, ob das Thema bei der Produkt-/Projekttechnik eingesteuert wird.</w:t>
+      </w:r>
+    </w:p>
+    <w:p>
+      <w:pPr>
+        <w:spacing w:after="80" w:before="220"/>
+      </w:pPr>
+      <w:r>
+        <w:rPr>
+          <w:rFonts w:ascii="Calibri" w:cs="Calibri" w:eastAsia="Calibri" w:hAnsi="Calibri"/>
+          <w:b/>
+          <w:bCs/>
+          <w:sz w:val="20"/>
+          <w:szCs w:val="20"/>
+          <w:u w:val="single"/>
+        </w:rPr>
+        <w:t xml:space="preserve">13. Optimieren der technischen Produktprozessentwicklung</w:t>
+      </w:r>
+    </w:p>
+    <w:p>
+      <w:pPr>
+        <w:spacing w:after="80"/>
+      </w:pPr>
+      <w:r>
+        <w:rPr>
+          <w:rFonts w:ascii="Calibri" w:cs="Calibri" w:eastAsia="Calibri" w:hAnsi="Calibri"/>
+          <w:b/>
+          <w:bCs/>
+          <w:sz w:val="20"/>
+          <w:szCs w:val="20"/>
+        </w:rPr>
+        <w:t xml:space="preserve">Aufgabe (Top-Down): </w:t>
+      </w:r>
+      <w:r>
+        <w:rPr>
+          <w:rFonts w:ascii="Calibri" w:cs="Calibri" w:eastAsia="Calibri" w:hAnsi="Calibri"/>
+          <w:sz w:val="20"/>
+          <w:szCs w:val="20"/>
+        </w:rPr>
+        <w:t xml:space="preserve">Vorgabe von Optimierungszielen/-schwerpunkten (z. B. Zykluszeiten, Verfahrens-/Prozessparameter, Automatisierungsgrad o. Ä.) an Prozesstechnik und Bemusterung, Automatisierung bzw. Digitale Prozessentwicklung &amp; Lean Management, je nach Thema.</w:t>
+      </w:r>
+    </w:p>
+    <w:p>
+      <w:pPr>
+        <w:spacing w:after="80"/>
+      </w:pPr>
+      <w:r>
+        <w:rPr>
+          <w:rFonts w:ascii="Calibri" w:cs="Calibri" w:eastAsia="Calibri" w:hAnsi="Calibri"/>
+          <w:b/>
+          <w:bCs/>
+          <w:sz w:val="20"/>
+          <w:szCs w:val="20"/>
+        </w:rPr>
+        <w:t xml:space="preserve">Kompetenz (Bottom-Up): </w:t>
+      </w:r>
+      <w:r>
+        <w:rPr>
+          <w:rFonts w:ascii="Calibri" w:cs="Calibri" w:eastAsia="Calibri" w:hAnsi="Calibri"/>
+          <w:sz w:val="20"/>
+          <w:szCs w:val="20"/>
+        </w:rPr>
+        <w:t xml:space="preserve">Bewertung, Priorisierung und Freigabe von Optimierungsvorschlägen, die von diesen drei Disziplinen herangetragen werden.</w:t>
+      </w:r>
+    </w:p>
+    <w:p>
+      <w:pPr>
+        <w:spacing w:after="80" w:before="220"/>
+      </w:pPr>
+      <w:r>
+        <w:rPr>
+          <w:rFonts w:ascii="Calibri" w:cs="Calibri" w:eastAsia="Calibri" w:hAnsi="Calibri"/>
+          <w:b/>
+          <w:bCs/>
+          <w:sz w:val="20"/>
+          <w:szCs w:val="20"/>
+          <w:u w:val="single"/>
+        </w:rPr>
+        <w:t xml:space="preserve">14. Aus- und Weiterbildung / Unterweisung</w:t>
+      </w:r>
+    </w:p>
+    <w:p>
+      <w:pPr>
+        <w:spacing w:after="120"/>
+      </w:pPr>
+      <w:r>
+        <w:rPr>
+          <w:rFonts w:ascii="Calibri" w:cs="Calibri" w:eastAsia="Calibri" w:hAnsi="Calibri"/>
+        </w:rPr>
+        <w:t xml:space="preserve">Klarstellung: Schichtführer sind eine Teamleitungsfunktion, keine eigene Hierarchieebene.</w:t>
+      </w:r>
+    </w:p>
+    <w:p>
+      <w:pPr>
+        <w:spacing w:after="40" w:before="40"/>
+      </w:pPr>
+      <w:r>
+        <w:rPr>
+          <w:rFonts w:ascii="Calibri" w:cs="Calibri" w:eastAsia="Calibri" w:hAnsi="Calibri"/>
+          <w:b/>
+          <w:bCs/>
+          <w:sz w:val="20"/>
+          <w:szCs w:val="20"/>
+        </w:rPr>
+        <w:t xml:space="preserve">Aufgabe (direkt unterstellte Mitarbeiter = TeamleiterInnen):</w:t>
+      </w:r>
+    </w:p>
+    <w:p>
+      <w:pPr>
+        <w:pStyle w:val="ListParagraph"/>
+        <w:numPr>
+          <w:ilvl w:val="0"/>
+          <w:numId w:val="2"/>
+        </w:numPr>
+        <w:spacing w:after="60"/>
+      </w:pPr>
+      <w:r>
+        <w:rPr>
+          <w:rFonts w:ascii="Calibri" w:cs="Calibri" w:eastAsia="Calibri" w:hAnsi="Calibri"/>
+        </w:rPr>
+        <w:t xml:space="preserve">Konkrete Schulungsbedarfsermittlung</w:t>
+      </w:r>
+    </w:p>
+    <w:p>
+      <w:pPr>
+        <w:pStyle w:val="ListParagraph"/>
+        <w:numPr>
+          <w:ilvl w:val="0"/>
+          <w:numId w:val="2"/>
+        </w:numPr>
+        <w:spacing w:after="60"/>
+      </w:pPr>
+      <w:r>
+        <w:rPr>
+          <w:rFonts w:ascii="Calibri" w:cs="Calibri" w:eastAsia="Calibri" w:hAnsi="Calibri"/>
+        </w:rPr>
+        <w:t xml:space="preserve">Sicherstellung der Aus- und Weiterbildung sowie Unterweisung</w:t>
+      </w:r>
+    </w:p>
+    <w:p>
+      <w:pPr>
+        <w:pStyle w:val="ListParagraph"/>
+        <w:numPr>
+          <w:ilvl w:val="0"/>
+          <w:numId w:val="2"/>
+        </w:numPr>
+        <w:spacing w:after="60"/>
+      </w:pPr>
+      <w:r>
+        <w:rPr>
+          <w:rFonts w:ascii="Calibri" w:cs="Calibri" w:eastAsia="Calibri" w:hAnsi="Calibri"/>
+        </w:rPr>
+        <w:t xml:space="preserve">Kontrolle der Umsetzung im Sinne einer Wirksamkeitsprüfung</w:t>
+      </w:r>
+    </w:p>
+    <w:p>
+      <w:pPr>
+        <w:spacing w:after="80"/>
+      </w:pPr>
+      <w:r>
+        <w:rPr>
+          <w:rFonts w:ascii="Calibri" w:cs="Calibri" w:eastAsia="Calibri" w:hAnsi="Calibri"/>
+          <w:b/>
+          <w:bCs/>
+          <w:sz w:val="20"/>
+          <w:szCs w:val="20"/>
+        </w:rPr>
+        <w:t xml:space="preserve">Verantwortung (alle unterstellten Mitarbeiter, auch die der TeamleiterInnen, z. B. Einsteller): </w:t>
+      </w:r>
+      <w:r>
+        <w:rPr>
+          <w:rFonts w:ascii="Calibri" w:cs="Calibri" w:eastAsia="Calibri" w:hAnsi="Calibri"/>
+          <w:sz w:val="20"/>
+          <w:szCs w:val="20"/>
+        </w:rPr>
+        <w:t xml:space="preserve">Grundsätzliche Verantwortung für Aus- und Weiterbildung sowie Unterweisung – Schwerpunkt auf Sicherstellung, dass die Durchführung durch die TeamleiterInnen oder andere Fachabteilungen (z. B. HR, QS, SVP, SFK) erfolgt.</w:t>
+      </w:r>
+    </w:p>
+    <w:p>
+      <w:pPr>
+        <w:spacing w:after="80" w:before="220"/>
+      </w:pPr>
+      <w:r>
+        <w:rPr>
+          <w:rFonts w:ascii="Calibri" w:cs="Calibri" w:eastAsia="Calibri" w:hAnsi="Calibri"/>
+          <w:b/>
+          <w:bCs/>
+          <w:sz w:val="20"/>
+          <w:szCs w:val="20"/>
+          <w:u w:val="single"/>
+        </w:rPr>
+        <w:t xml:space="preserve">Vertretung</w:t>
+      </w:r>
+    </w:p>
+    <w:p>
+      <w:pPr>
+        <w:spacing w:after="40" w:before="40"/>
+      </w:pPr>
+      <w:r>
+        <w:rPr>
+          <w:rFonts w:ascii="Calibri" w:cs="Calibri" w:eastAsia="Calibri" w:hAnsi="Calibri"/>
+          <w:b/>
+          <w:bCs/>
+          <w:sz w:val="20"/>
+          <w:szCs w:val="20"/>
+        </w:rPr>
+        <w:t xml:space="preserve">Struktur: dreiteilige, fest zugeordnete Vertretung nach Fachbereichen:</w:t>
+      </w:r>
+    </w:p>
+    <w:p>
+      <w:pPr>
+        <w:pStyle w:val="ListParagraph"/>
+        <w:numPr>
+          <w:ilvl w:val="0"/>
+          <w:numId w:val="2"/>
+        </w:numPr>
+        <w:spacing w:after="60"/>
+      </w:pPr>
+      <w:r>
+        <w:rPr>
+          <w:rFonts w:ascii="Calibri" w:cs="Calibri" w:eastAsia="Calibri" w:hAnsi="Calibri"/>
+        </w:rPr>
+        <w:t xml:space="preserve">Organisation/Personal → Produktionskoordination</w:t>
+      </w:r>
+    </w:p>
+    <w:p>
+      <w:pPr>
+        <w:pStyle w:val="ListParagraph"/>
+        <w:numPr>
+          <w:ilvl w:val="0"/>
+          <w:numId w:val="2"/>
+        </w:numPr>
+        <w:spacing w:after="60"/>
+      </w:pPr>
+      <w:r>
+        <w:rPr>
+          <w:rFonts w:ascii="Calibri" w:cs="Calibri" w:eastAsia="Calibri" w:hAnsi="Calibri"/>
+        </w:rPr>
+        <w:t xml:space="preserve">Technik → Prozesstechnik und Bemusterung</w:t>
+      </w:r>
+    </w:p>
+    <w:p>
+      <w:pPr>
+        <w:pStyle w:val="ListParagraph"/>
+        <w:numPr>
+          <w:ilvl w:val="0"/>
+          <w:numId w:val="2"/>
+        </w:numPr>
+        <w:spacing w:after="60"/>
+      </w:pPr>
+      <w:r>
+        <w:rPr>
+          <w:rFonts w:ascii="Calibri" w:cs="Calibri" w:eastAsia="Calibri" w:hAnsi="Calibri"/>
+        </w:rPr>
+        <w:t xml:space="preserve">Qualität → QS Produktion</w:t>
+      </w:r>
+    </w:p>
+    <w:p>
+      <w:pPr>
+        <w:spacing w:after="80"/>
+      </w:pPr>
+      <w:r>
+        <w:rPr>
+          <w:rFonts w:ascii="Calibri" w:cs="Calibri" w:eastAsia="Calibri" w:hAnsi="Calibri"/>
+          <w:b/>
+          <w:bCs/>
+          <w:sz w:val="20"/>
+          <w:szCs w:val="20"/>
+        </w:rPr>
+        <w:t xml:space="preserve">Kompetenz: </w:t>
+      </w:r>
+      <w:r>
+        <w:rPr>
+          <w:rFonts w:ascii="Calibri" w:cs="Calibri" w:eastAsia="Calibri" w:hAnsi="Calibri"/>
+          <w:sz w:val="20"/>
+          <w:szCs w:val="20"/>
+        </w:rPr>
+        <w:t xml:space="preserve">Festlegung dieser Vertretungsregelung sowie Übertragung der jeweiligen Teilbefugnisse an die drei Vertretungsfunktionen.</w:t>
+      </w:r>
+    </w:p>
+    <w:p>
+      <w:pPr>
+        <w:spacing w:after="40" w:before="40"/>
+      </w:pPr>
+      <w:r>
+        <w:rPr>
+          <w:rFonts w:ascii="Calibri" w:cs="Calibri" w:eastAsia="Calibri" w:hAnsi="Calibri"/>
+          <w:b/>
+          <w:bCs/>
+          <w:sz w:val="20"/>
+          <w:szCs w:val="20"/>
+        </w:rPr>
+        <w:t xml:space="preserve">Umfang der übertragenen Befugnisse:</w:t>
+      </w:r>
+    </w:p>
+    <w:p>
+      <w:pPr>
+        <w:pStyle w:val="ListParagraph"/>
+        <w:numPr>
+          <w:ilvl w:val="0"/>
+          <w:numId w:val="2"/>
+        </w:numPr>
+        <w:spacing w:after="60"/>
+      </w:pPr>
+      <w:r>
+        <w:rPr>
+          <w:rFonts w:ascii="Calibri" w:cs="Calibri" w:eastAsia="Calibri" w:hAnsi="Calibri"/>
+        </w:rPr>
+        <w:t xml:space="preserve">Regelfall (kurzfristige Abwesenheit): Vertretung übt die Aufgaben/Kompetenzen des Fachbereichs aus, jedoch nicht die weitreichendsten Entscheidungsbefugnisse (z. B. Neueinstellungen)</w:t>
+      </w:r>
+    </w:p>
+    <w:p>
+      <w:pPr>
+        <w:pStyle w:val="ListParagraph"/>
+        <w:numPr>
+          <w:ilvl w:val="0"/>
+          <w:numId w:val="2"/>
+        </w:numPr>
+        <w:spacing w:after="60"/>
+      </w:pPr>
+      <w:r>
+        <w:rPr>
+          <w:rFonts w:ascii="Calibri" w:cs="Calibri" w:eastAsia="Calibri" w:hAnsi="Calibri"/>
+        </w:rPr>
+        <w:t xml:space="preserve">Bei längerer Abwesenheit (Richtwert 4–6 Wochen): erweiterte Befugnisse – auch weitreichende Entscheidungen gehen auf die Vertretung über</w:t>
       </w:r>
     </w:p>
     <w:p>
@@ -394,183 +1792,518 @@
           <w:sz w:val="22"/>
           <w:szCs w:val="22"/>
         </w:rPr>
-        <w:t xml:space="preserve">7.5.3.2 Aufgaben der Schichtführer</w:t>
-      </w:r>
-    </w:p>
-    <w:p>
-      <w:pPr>
-        <w:pStyle w:val="ListParagraph"/>
-        <w:numPr>
-          <w:ilvl w:val="0"/>
-          <w:numId w:val="2"/>
-        </w:numPr>
-        <w:spacing w:after="60"/>
-      </w:pPr>
-      <w:r>
-        <w:rPr>
-          <w:rFonts w:ascii="Calibri" w:cs="Calibri" w:eastAsia="Calibri" w:hAnsi="Calibri"/>
-        </w:rPr>
-        <w:t xml:space="preserve">Überwachen der Produktionsmaschinen und richtige Materialförderung</w:t>
-      </w:r>
-    </w:p>
-    <w:p>
-      <w:pPr>
-        <w:pStyle w:val="ListParagraph"/>
-        <w:numPr>
-          <w:ilvl w:val="0"/>
-          <w:numId w:val="2"/>
-        </w:numPr>
-        <w:spacing w:after="60"/>
-      </w:pPr>
-      <w:r>
-        <w:rPr>
-          <w:rFonts w:ascii="Calibri" w:cs="Calibri" w:eastAsia="Calibri" w:hAnsi="Calibri"/>
-        </w:rPr>
-        <w:t xml:space="preserve">Umbau und Einstellung der Produktionsmaschinen und Produktionsfreigabe</w:t>
-      </w:r>
-    </w:p>
-    <w:p>
-      <w:pPr>
-        <w:pStyle w:val="ListParagraph"/>
-        <w:numPr>
-          <w:ilvl w:val="0"/>
-          <w:numId w:val="2"/>
-        </w:numPr>
-        <w:spacing w:after="60"/>
-      </w:pPr>
-      <w:r>
-        <w:rPr>
-          <w:rFonts w:ascii="Calibri" w:cs="Calibri" w:eastAsia="Calibri" w:hAnsi="Calibri"/>
-        </w:rPr>
-        <w:t xml:space="preserve">Sicherstellen der produzierten Qualität und Quantität</w:t>
-      </w:r>
-    </w:p>
-    <w:p>
-      <w:pPr>
-        <w:pStyle w:val="ListParagraph"/>
-        <w:numPr>
-          <w:ilvl w:val="0"/>
-          <w:numId w:val="2"/>
-        </w:numPr>
-        <w:spacing w:after="60"/>
-      </w:pPr>
-      <w:r>
-        <w:rPr>
-          <w:rFonts w:ascii="Calibri" w:cs="Calibri" w:eastAsia="Calibri" w:hAnsi="Calibri"/>
-        </w:rPr>
-        <w:t xml:space="preserve">Fehlerbewertung bei Fehlermeldung, Sperren von fehlerhaften Produkten</w:t>
-      </w:r>
-    </w:p>
-    <w:p>
-      <w:pPr>
-        <w:pStyle w:val="ListParagraph"/>
-        <w:numPr>
-          <w:ilvl w:val="0"/>
-          <w:numId w:val="2"/>
-        </w:numPr>
-        <w:spacing w:after="60"/>
-      </w:pPr>
-      <w:r>
-        <w:rPr>
-          <w:rFonts w:ascii="Calibri" w:cs="Calibri" w:eastAsia="Calibri" w:hAnsi="Calibri"/>
-        </w:rPr>
-        <w:t xml:space="preserve">Anweisung an den Lagerarbeiter / Produktionslogistiker zum Transport der gesperrten Ware ins gesperrte Lager</w:t>
-      </w:r>
-    </w:p>
-    <w:p>
-      <w:pPr>
-        <w:pStyle w:val="ListParagraph"/>
-        <w:numPr>
-          <w:ilvl w:val="0"/>
-          <w:numId w:val="2"/>
-        </w:numPr>
-        <w:spacing w:after="60"/>
-      </w:pPr>
-      <w:r>
-        <w:rPr>
-          <w:rFonts w:ascii="Calibri" w:cs="Calibri" w:eastAsia="Calibri" w:hAnsi="Calibri"/>
-        </w:rPr>
-        <w:t xml:space="preserve">Verantwortlich der jeweilig unterstellten Werker einschl. Sicherheit, Ordnung und Sauberkeit</w:t>
-      </w:r>
-    </w:p>
-    <w:p>
-      <w:pPr>
-        <w:pStyle w:val="ListParagraph"/>
-        <w:numPr>
-          <w:ilvl w:val="0"/>
-          <w:numId w:val="2"/>
-        </w:numPr>
-        <w:spacing w:after="60"/>
-      </w:pPr>
-      <w:r>
-        <w:rPr>
-          <w:rFonts w:ascii="Calibri" w:cs="Calibri" w:eastAsia="Calibri" w:hAnsi="Calibri"/>
-        </w:rPr>
-        <w:t xml:space="preserve">Durchführen der vereinbarten Produktions- u. Qualitätsaufzeichnungen</w:t>
-      </w:r>
-    </w:p>
-    <w:p>
-      <w:pPr>
-        <w:pStyle w:val="ListParagraph"/>
-        <w:numPr>
-          <w:ilvl w:val="0"/>
-          <w:numId w:val="2"/>
-        </w:numPr>
-        <w:spacing w:after="60"/>
-      </w:pPr>
-      <w:r>
-        <w:rPr>
-          <w:rFonts w:ascii="Calibri" w:cs="Calibri" w:eastAsia="Calibri" w:hAnsi="Calibri"/>
-        </w:rPr>
-        <w:t xml:space="preserve">Werkzeug Wartungstätigkeiten durchführen</w:t>
-      </w:r>
-    </w:p>
-    <w:p>
-      <w:pPr>
-        <w:pStyle w:val="ListParagraph"/>
-        <w:numPr>
-          <w:ilvl w:val="0"/>
-          <w:numId w:val="2"/>
-        </w:numPr>
-        <w:spacing w:after="60"/>
-      </w:pPr>
-      <w:r>
-        <w:rPr>
-          <w:rFonts w:ascii="Calibri" w:cs="Calibri" w:eastAsia="Calibri" w:hAnsi="Calibri"/>
-        </w:rPr>
-        <w:t xml:space="preserve">Ausgespritztes Material in Restmüllgebinde und vorgeschriebene Container</w:t>
-      </w:r>
-    </w:p>
-    <w:p>
-      <w:pPr>
-        <w:pStyle w:val="ListParagraph"/>
-        <w:numPr>
-          <w:ilvl w:val="0"/>
-          <w:numId w:val="2"/>
-        </w:numPr>
-        <w:spacing w:after="60"/>
-      </w:pPr>
-      <w:r>
-        <w:rPr>
-          <w:rFonts w:ascii="Calibri" w:cs="Calibri" w:eastAsia="Calibri" w:hAnsi="Calibri"/>
-        </w:rPr>
-        <w:t xml:space="preserve">Erststück / Letztstückfreigabe in Zusammenarbeit mit dem PQB lt. Prüfbegleitkarte</w:t>
-      </w:r>
-    </w:p>
-    <w:p>
-      <w:pPr>
-        <w:pStyle w:val="ListParagraph"/>
-        <w:numPr>
-          <w:ilvl w:val="0"/>
-          <w:numId w:val="2"/>
-        </w:numPr>
-        <w:spacing w:after="60"/>
-      </w:pPr>
-      <w:r>
-        <w:rPr>
-          <w:rFonts w:ascii="Calibri" w:cs="Calibri" w:eastAsia="Calibri" w:hAnsi="Calibri"/>
-        </w:rPr>
-        <w:t xml:space="preserve">Erneute Freigabe nach geplanten / ungeplanten Produktionsunterbrechungen &gt;30 min lt. Prüfbegleitkarte</w:t>
+        <w:t xml:space="preserve">7.5.3.2 Teamleitung Spritzguss-Produktion (Schichtführer)</w:t>
+      </w:r>
+    </w:p>
+    <w:p>
+      <w:pPr>
+        <w:spacing w:after="100"/>
+      </w:pPr>
+      <w:r>
+        <w:rPr>
+          <w:rFonts w:ascii="Calibri" w:cs="Calibri" w:eastAsia="Calibri" w:hAnsi="Calibri"/>
+          <w:i/>
+          <w:iCs/>
+          <w:sz w:val="18"/>
+          <w:szCs w:val="18"/>
+        </w:rPr>
+        <w:t xml:space="preserve">Gehört zur Gruppe „Führungsrollen im Hauptprozess“ (End2End-Auftragsabwicklung, gemeinsam mit Teamleitung Lager, Montage, Endfertigung). Schichtführer und andere TeamleiterInnen unterscheiden sich grundsätzlich nicht; der relevanteste Unterschied ist die Schichtarbeit.</w:t>
+      </w:r>
+    </w:p>
+    <w:p>
+      <w:pPr>
+        <w:spacing w:after="80" w:before="220"/>
+      </w:pPr>
+      <w:r>
+        <w:rPr>
+          <w:rFonts w:ascii="Calibri" w:cs="Calibri" w:eastAsia="Calibri" w:hAnsi="Calibri"/>
+          <w:b/>
+          <w:bCs/>
+          <w:sz w:val="20"/>
+          <w:szCs w:val="20"/>
+          <w:u w:val="single"/>
+        </w:rPr>
+        <w:t xml:space="preserve">1. Maschinenüberwachung und Parametrierung</w:t>
+      </w:r>
+    </w:p>
+    <w:p>
+      <w:pPr>
+        <w:spacing w:after="40" w:before="40"/>
+      </w:pPr>
+      <w:r>
+        <w:rPr>
+          <w:rFonts w:ascii="Calibri" w:cs="Calibri" w:eastAsia="Calibri" w:hAnsi="Calibri"/>
+          <w:b/>
+          <w:bCs/>
+          <w:sz w:val="20"/>
+          <w:szCs w:val="20"/>
+        </w:rPr>
+        <w:t xml:space="preserve">Aufgabe:</w:t>
+      </w:r>
+    </w:p>
+    <w:p>
+      <w:pPr>
+        <w:pStyle w:val="ListParagraph"/>
+        <w:numPr>
+          <w:ilvl w:val="0"/>
+          <w:numId w:val="2"/>
+        </w:numPr>
+        <w:spacing w:after="60"/>
+      </w:pPr>
+      <w:r>
+        <w:rPr>
+          <w:rFonts w:ascii="Calibri" w:cs="Calibri" w:eastAsia="Calibri" w:hAnsi="Calibri"/>
+        </w:rPr>
+        <w:t xml:space="preserve">Überwachung der laufenden Produktionsmaschinen während der Schicht – inkl. der (teilweise automatisierten) Materialzuführung – auf Einhaltung der vorgegebenen Prozessparameter (Einstelldatenblatt)</w:t>
+      </w:r>
+    </w:p>
+    <w:p>
+      <w:pPr>
+        <w:pStyle w:val="ListParagraph"/>
+        <w:numPr>
+          <w:ilvl w:val="0"/>
+          <w:numId w:val="2"/>
+        </w:numPr>
+        <w:spacing w:after="60"/>
+      </w:pPr>
+      <w:r>
+        <w:rPr>
+          <w:rFonts w:ascii="Calibri" w:cs="Calibri" w:eastAsia="Calibri" w:hAnsi="Calibri"/>
+        </w:rPr>
+        <w:t xml:space="preserve">Auswahl der richtigen Einstelldaten und Übertragen der gültigen Parametersätze auf die Maschine (Umbau/Einstellung)</w:t>
+      </w:r>
+    </w:p>
+    <w:p>
+      <w:pPr>
+        <w:pStyle w:val="ListParagraph"/>
+        <w:numPr>
+          <w:ilvl w:val="0"/>
+          <w:numId w:val="2"/>
+        </w:numPr>
+        <w:spacing w:after="60"/>
+      </w:pPr>
+      <w:r>
+        <w:rPr>
+          <w:rFonts w:ascii="Calibri" w:cs="Calibri" w:eastAsia="Calibri" w:hAnsi="Calibri"/>
+        </w:rPr>
+        <w:t xml:space="preserve">Feinjustierung der Parameter innerhalb definierter Grenzen, auf Basis der laufenden Teilequalität, bis die geforderte Bauteilqualität erreicht ist. Grundlage: Rückstellmuster der letzten Produktion, im Prüfplan definierte Merkmale/Maße inkl. Toleranzen, bei besonders komplexen Fällen Erstmuster/Produktionsfreigabemuster aus dem Serienstart. PQB liefert dazu die Qualitätsrückmeldung zu den Teilen und kann fallweise auf Erfahrungsbasis beraten – die Entscheidung über Parameteranpassungen liegt jedoch nicht bei PQB</w:t>
+      </w:r>
+    </w:p>
+    <w:p>
+      <w:pPr>
+        <w:spacing w:after="40" w:before="40"/>
+      </w:pPr>
+      <w:r>
+        <w:rPr>
+          <w:rFonts w:ascii="Calibri" w:cs="Calibri" w:eastAsia="Calibri" w:hAnsi="Calibri"/>
+          <w:b/>
+          <w:bCs/>
+          <w:sz w:val="20"/>
+          <w:szCs w:val="20"/>
+        </w:rPr>
+        <w:t xml:space="preserve">Kompetenz:</w:t>
+      </w:r>
+    </w:p>
+    <w:p>
+      <w:pPr>
+        <w:pStyle w:val="ListParagraph"/>
+        <w:numPr>
+          <w:ilvl w:val="0"/>
+          <w:numId w:val="2"/>
+        </w:numPr>
+        <w:spacing w:after="60"/>
+      </w:pPr>
+      <w:r>
+        <w:rPr>
+          <w:rFonts w:ascii="Calibri" w:cs="Calibri" w:eastAsia="Calibri" w:hAnsi="Calibri"/>
+        </w:rPr>
+        <w:t xml:space="preserve">Eigenständige fachliche Entscheidung über Parameteranpassungen – beruht auf erlerntem Wissen und Erfahrung, da keine generelle/pauschale Lösung möglich ist (Vielzahl an Parametern und Wechselwirkungen, z. B. Materialchargen)</w:t>
+      </w:r>
+    </w:p>
+    <w:p>
+      <w:pPr>
+        <w:pStyle w:val="ListParagraph"/>
+        <w:numPr>
+          <w:ilvl w:val="0"/>
+          <w:numId w:val="2"/>
+        </w:numPr>
+        <w:spacing w:after="60"/>
+      </w:pPr>
+      <w:r>
+        <w:rPr>
+          <w:rFonts w:ascii="Calibri" w:cs="Calibri" w:eastAsia="Calibri" w:hAnsi="Calibri"/>
+        </w:rPr>
+        <w:t xml:space="preserve">Bei technischen Störungen: Eskalation an Teamleitung Instandhaltung (Maschine, automatisierte Materialförderung) bzw. Teamleitung Werkzeugbau (Werkzeugprobleme) bzw. Automatisierung</w:t>
+      </w:r>
+    </w:p>
+    <w:p>
+      <w:pPr>
+        <w:spacing w:after="100"/>
+      </w:pPr>
+      <w:r>
+        <w:rPr>
+          <w:rFonts w:ascii="Calibri" w:cs="Calibri" w:eastAsia="Calibri" w:hAnsi="Calibri"/>
+          <w:i/>
+          <w:iCs/>
+          <w:sz w:val="18"/>
+          <w:szCs w:val="18"/>
+        </w:rPr>
+        <w:t xml:space="preserve">Hinweis: Die „Produktionsfreigabe“ ist derselbe Schritt wie die Erststückfreigabe – siehe Themenblock 7.</w:t>
+      </w:r>
+    </w:p>
+    <w:p>
+      <w:pPr>
+        <w:spacing w:after="80" w:before="220"/>
+      </w:pPr>
+      <w:r>
+        <w:rPr>
+          <w:rFonts w:ascii="Calibri" w:cs="Calibri" w:eastAsia="Calibri" w:hAnsi="Calibri"/>
+          <w:b/>
+          <w:bCs/>
+          <w:sz w:val="20"/>
+          <w:szCs w:val="20"/>
+          <w:u w:val="single"/>
+        </w:rPr>
+        <w:t xml:space="preserve">2. Schichtergebnis Qualität/Quantität</w:t>
+      </w:r>
+    </w:p>
+    <w:p>
+      <w:pPr>
+        <w:spacing w:after="80"/>
+      </w:pPr>
+      <w:r>
+        <w:rPr>
+          <w:rFonts w:ascii="Calibri" w:cs="Calibri" w:eastAsia="Calibri" w:hAnsi="Calibri"/>
+          <w:b/>
+          <w:bCs/>
+          <w:sz w:val="20"/>
+          <w:szCs w:val="20"/>
+        </w:rPr>
+        <w:t xml:space="preserve">Verantwortung: </w:t>
+      </w:r>
+      <w:r>
+        <w:rPr>
+          <w:rFonts w:ascii="Calibri" w:cs="Calibri" w:eastAsia="Calibri" w:hAnsi="Calibri"/>
+          <w:sz w:val="20"/>
+          <w:szCs w:val="20"/>
+        </w:rPr>
+        <w:t xml:space="preserve">Sicherstellung der geplanten Produktionsmenge und der geforderten Bauteilqualität während der Schicht. Bei Abweichungen von der Produktionsplanung (z. B. durch Störungen): Rückmeldung an Produktionsplanung/Produktionsleitung.</w:t>
+      </w:r>
+    </w:p>
+    <w:p>
+      <w:pPr>
+        <w:spacing w:after="80" w:before="220"/>
+      </w:pPr>
+      <w:r>
+        <w:rPr>
+          <w:rFonts w:ascii="Calibri" w:cs="Calibri" w:eastAsia="Calibri" w:hAnsi="Calibri"/>
+          <w:b/>
+          <w:bCs/>
+          <w:sz w:val="20"/>
+          <w:szCs w:val="20"/>
+          <w:u w:val="single"/>
+        </w:rPr>
+        <w:t xml:space="preserve">3. Fehlerbewertung, Sperren, Transport gesperrter Ware</w:t>
+      </w:r>
+    </w:p>
+    <w:p>
+      <w:pPr>
+        <w:spacing w:after="80"/>
+      </w:pPr>
+      <w:r>
+        <w:rPr>
+          <w:rFonts w:ascii="Calibri" w:cs="Calibri" w:eastAsia="Calibri" w:hAnsi="Calibri"/>
+          <w:b/>
+          <w:bCs/>
+          <w:sz w:val="20"/>
+          <w:szCs w:val="20"/>
+        </w:rPr>
+        <w:t xml:space="preserve">Aufgabe: </w:t>
+      </w:r>
+      <w:r>
+        <w:rPr>
+          <w:rFonts w:ascii="Calibri" w:cs="Calibri" w:eastAsia="Calibri" w:hAnsi="Calibri"/>
+          <w:sz w:val="20"/>
+          <w:szCs w:val="20"/>
+        </w:rPr>
+        <w:t xml:space="preserve">Bewertung gemeldeter Fehler (Fehlermeldungen der Werker) gemeinsam mit PQB auf Schicht-/Team-Ebene; Entscheidung über Sperrung fehlerhafter Produkte. Anweisung an Lager bzw. Produktionslogistiker zum Transport gesperrter Ware ins gesperrte Lager.</w:t>
+      </w:r>
+    </w:p>
+    <w:p>
+      <w:pPr>
+        <w:spacing w:after="80" w:before="220"/>
+      </w:pPr>
+      <w:r>
+        <w:rPr>
+          <w:rFonts w:ascii="Calibri" w:cs="Calibri" w:eastAsia="Calibri" w:hAnsi="Calibri"/>
+          <w:b/>
+          <w:bCs/>
+          <w:sz w:val="20"/>
+          <w:szCs w:val="20"/>
+          <w:u w:val="single"/>
+        </w:rPr>
+        <w:t xml:space="preserve">4. Personalverantwortung Schicht</w:t>
+      </w:r>
+    </w:p>
+    <w:p>
+      <w:pPr>
+        <w:spacing w:after="80"/>
+      </w:pPr>
+      <w:r>
+        <w:rPr>
+          <w:rFonts w:ascii="Calibri" w:cs="Calibri" w:eastAsia="Calibri" w:hAnsi="Calibri"/>
+          <w:b/>
+          <w:bCs/>
+          <w:sz w:val="20"/>
+          <w:szCs w:val="20"/>
+        </w:rPr>
+        <w:t xml:space="preserve">Verantwortung: </w:t>
+      </w:r>
+      <w:r>
+        <w:rPr>
+          <w:rFonts w:ascii="Calibri" w:cs="Calibri" w:eastAsia="Calibri" w:hAnsi="Calibri"/>
+          <w:sz w:val="20"/>
+          <w:szCs w:val="20"/>
+        </w:rPr>
+        <w:t xml:space="preserve">Personalverantwortung für die unterstellten Werker der Schicht, inkl. Sicherheit, Ordnung und Sauberkeit am Arbeitsplatz. Erstverantwortung für disziplinarische Maßnahmen bei den unterstellten Werkern (Produktionsleiter als Eskalationsstufe).</w:t>
+      </w:r>
+    </w:p>
+    <w:p>
+      <w:pPr>
+        <w:spacing w:after="80"/>
+      </w:pPr>
+      <w:r>
+        <w:rPr>
+          <w:rFonts w:ascii="Calibri" w:cs="Calibri" w:eastAsia="Calibri" w:hAnsi="Calibri"/>
+          <w:b/>
+          <w:bCs/>
+          <w:sz w:val="20"/>
+          <w:szCs w:val="20"/>
+        </w:rPr>
+        <w:t xml:space="preserve">Aufgabe: </w:t>
+      </w:r>
+      <w:r>
+        <w:rPr>
+          <w:rFonts w:ascii="Calibri" w:cs="Calibri" w:eastAsia="Calibri" w:hAnsi="Calibri"/>
+          <w:sz w:val="20"/>
+          <w:szCs w:val="20"/>
+        </w:rPr>
+        <w:t xml:space="preserve">Personalführung der Schicht (Einteilung, Feedback, Konfliktmanagement).</w:t>
+      </w:r>
+    </w:p>
+    <w:p>
+      <w:pPr>
+        <w:spacing w:after="80" w:before="220"/>
+      </w:pPr>
+      <w:r>
+        <w:rPr>
+          <w:rFonts w:ascii="Calibri" w:cs="Calibri" w:eastAsia="Calibri" w:hAnsi="Calibri"/>
+          <w:b/>
+          <w:bCs/>
+          <w:sz w:val="20"/>
+          <w:szCs w:val="20"/>
+          <w:u w:val="single"/>
+        </w:rPr>
+        <w:t xml:space="preserve">5. Produktions- und Qualitätsaufzeichnungen</w:t>
+      </w:r>
+    </w:p>
+    <w:p>
+      <w:pPr>
+        <w:spacing w:after="80"/>
+      </w:pPr>
+      <w:r>
+        <w:rPr>
+          <w:rFonts w:ascii="Calibri" w:cs="Calibri" w:eastAsia="Calibri" w:hAnsi="Calibri"/>
+          <w:b/>
+          <w:bCs/>
+          <w:sz w:val="20"/>
+          <w:szCs w:val="20"/>
+        </w:rPr>
+        <w:t xml:space="preserve">Aufgabe: </w:t>
+      </w:r>
+      <w:r>
+        <w:rPr>
+          <w:rFonts w:ascii="Calibri" w:cs="Calibri" w:eastAsia="Calibri" w:hAnsi="Calibri"/>
+          <w:sz w:val="20"/>
+          <w:szCs w:val="20"/>
+        </w:rPr>
+        <w:t xml:space="preserve">Durchführung/Erstellung der vereinbarten Produktions- und Qualitätsaufzeichnungen der Schicht (z. B. Schichtlogbuch, Prüfbegleitkarte).</w:t>
+      </w:r>
+    </w:p>
+    <w:p>
+      <w:pPr>
+        <w:spacing w:after="80" w:before="220"/>
+      </w:pPr>
+      <w:r>
+        <w:rPr>
+          <w:rFonts w:ascii="Calibri" w:cs="Calibri" w:eastAsia="Calibri" w:hAnsi="Calibri"/>
+          <w:b/>
+          <w:bCs/>
+          <w:sz w:val="20"/>
+          <w:szCs w:val="20"/>
+          <w:u w:val="single"/>
+        </w:rPr>
+        <w:t xml:space="preserve">6. Restmaterialentsorgung</w:t>
+      </w:r>
+    </w:p>
+    <w:p>
+      <w:pPr>
+        <w:spacing w:after="80"/>
+      </w:pPr>
+      <w:r>
+        <w:rPr>
+          <w:rFonts w:ascii="Calibri" w:cs="Calibri" w:eastAsia="Calibri" w:hAnsi="Calibri"/>
+          <w:b/>
+          <w:bCs/>
+          <w:sz w:val="20"/>
+          <w:szCs w:val="20"/>
+        </w:rPr>
+        <w:t xml:space="preserve">Aufgabe: </w:t>
+      </w:r>
+      <w:r>
+        <w:rPr>
+          <w:rFonts w:ascii="Calibri" w:cs="Calibri" w:eastAsia="Calibri" w:hAnsi="Calibri"/>
+          <w:sz w:val="20"/>
+          <w:szCs w:val="20"/>
+        </w:rPr>
+        <w:t xml:space="preserve">Ausgespritztes Material sortenrein in Restmüllgebinde bzw. vorgeschriebene Container entsorgen.</w:t>
+      </w:r>
+    </w:p>
+    <w:p>
+      <w:pPr>
+        <w:spacing w:after="80" w:before="220"/>
+      </w:pPr>
+      <w:r>
+        <w:rPr>
+          <w:rFonts w:ascii="Calibri" w:cs="Calibri" w:eastAsia="Calibri" w:hAnsi="Calibri"/>
+          <w:b/>
+          <w:bCs/>
+          <w:sz w:val="20"/>
+          <w:szCs w:val="20"/>
+          <w:u w:val="single"/>
+        </w:rPr>
+        <w:t xml:space="preserve">7. Freigabeprüfungen</w:t>
+      </w:r>
+    </w:p>
+    <w:p>
+      <w:pPr>
+        <w:spacing w:after="80"/>
+      </w:pPr>
+      <w:r>
+        <w:rPr>
+          <w:rFonts w:ascii="Calibri" w:cs="Calibri" w:eastAsia="Calibri" w:hAnsi="Calibri"/>
+          <w:b/>
+          <w:bCs/>
+          <w:sz w:val="20"/>
+          <w:szCs w:val="20"/>
+        </w:rPr>
+        <w:t xml:space="preserve">Aufgabe: </w:t>
+      </w:r>
+      <w:r>
+        <w:rPr>
+          <w:rFonts w:ascii="Calibri" w:cs="Calibri" w:eastAsia="Calibri" w:hAnsi="Calibri"/>
+          <w:sz w:val="20"/>
+          <w:szCs w:val="20"/>
+        </w:rPr>
+        <w:t xml:space="preserve">Erststück-/Letztstückfreigabe sowie erneute Freigabe nach geplanten/ungeplanten Produktionsunterbrechungen &gt;30 min, jeweils gemeinsam mit PQB lt. Prüfbegleitkarte. Dies ist derselbe Schritt wie die Produktionsfreigabe nach der Parametrierung (Themenblock 1) – kein separater, vorgelagerter Freigabeschritt.</w:t>
+      </w:r>
+    </w:p>
+    <w:p>
+      <w:pPr>
+        <w:spacing w:after="80" w:before="220"/>
+      </w:pPr>
+      <w:r>
+        <w:rPr>
+          <w:rFonts w:ascii="Calibri" w:cs="Calibri" w:eastAsia="Calibri" w:hAnsi="Calibri"/>
+          <w:b/>
+          <w:bCs/>
+          <w:sz w:val="20"/>
+          <w:szCs w:val="20"/>
+          <w:u w:val="single"/>
+        </w:rPr>
+        <w:t xml:space="preserve">8. Einfache Werkzeug-Wartungstätigkeiten</w:t>
+      </w:r>
+    </w:p>
+    <w:p>
+      <w:pPr>
+        <w:spacing w:after="80"/>
+      </w:pPr>
+      <w:r>
+        <w:rPr>
+          <w:rFonts w:ascii="Calibri" w:cs="Calibri" w:eastAsia="Calibri" w:hAnsi="Calibri"/>
+          <w:b/>
+          <w:bCs/>
+          <w:sz w:val="20"/>
+          <w:szCs w:val="20"/>
+        </w:rPr>
+        <w:t xml:space="preserve">Aufgabe: </w:t>
+      </w:r>
+      <w:r>
+        <w:rPr>
+          <w:rFonts w:ascii="Calibri" w:cs="Calibri" w:eastAsia="Calibri" w:hAnsi="Calibri"/>
+          <w:sz w:val="20"/>
+          <w:szCs w:val="20"/>
+        </w:rPr>
+        <w:t xml:space="preserve">Durchführung einfacher Werkzeug-Wartungstätigkeiten am eingebauten Werkzeug (z. B. Reinigung, Schmierung beim Rüstvorgang). Tiefergehende Wartung, Reparatur und Instandhaltung obliegt der Teamleitung Werkzeugbau.</w:t>
+      </w:r>
+    </w:p>
+    <w:p>
+      <w:pPr>
+        <w:spacing w:after="80" w:before="220"/>
+      </w:pPr>
+      <w:r>
+        <w:rPr>
+          <w:rFonts w:ascii="Calibri" w:cs="Calibri" w:eastAsia="Calibri" w:hAnsi="Calibri"/>
+          <w:b/>
+          <w:bCs/>
+          <w:sz w:val="20"/>
+          <w:szCs w:val="20"/>
+          <w:u w:val="single"/>
+        </w:rPr>
+        <w:t xml:space="preserve">9. Schichtübergabe</w:t>
+      </w:r>
+    </w:p>
+    <w:p>
+      <w:pPr>
+        <w:spacing w:after="80"/>
+      </w:pPr>
+      <w:r>
+        <w:rPr>
+          <w:rFonts w:ascii="Calibri" w:cs="Calibri" w:eastAsia="Calibri" w:hAnsi="Calibri"/>
+          <w:b/>
+          <w:bCs/>
+          <w:sz w:val="20"/>
+          <w:szCs w:val="20"/>
+        </w:rPr>
+        <w:t xml:space="preserve">Aufgabe: </w:t>
+      </w:r>
+      <w:r>
+        <w:rPr>
+          <w:rFonts w:ascii="Calibri" w:cs="Calibri" w:eastAsia="Calibri" w:hAnsi="Calibri"/>
+          <w:sz w:val="20"/>
+          <w:szCs w:val="20"/>
+        </w:rPr>
+        <w:t xml:space="preserve">Durchführung der Schichtübergabe an den nachfolgenden Schichtführer: Weitergabe des aktuellen Produktions- und Qualitätsstatus je Maschine, offener Vorkommnisse und laufender Maßnahmen, dokumentiert im Schichtlogbuch.</w:t>
+      </w:r>
+    </w:p>
+    <w:p>
+      <w:r>
+        <w:br w:type="page"/>
+      </w:r>
+    </w:p>
+    <w:p>
+      <w:pPr>
+        <w:spacing w:after="100"/>
+      </w:pPr>
+      <w:r>
+        <w:rPr>
+          <w:rFonts w:ascii="Calibri" w:cs="Calibri" w:eastAsia="Calibri" w:hAnsi="Calibri"/>
+          <w:i/>
+          <w:iCs/>
+          <w:sz w:val="18"/>
+          <w:szCs w:val="18"/>
+        </w:rPr>
+        <w:t xml:space="preserve">Die folgenden Rollen sind noch nicht im Detail überarbeitet – Inhalt entspricht noch Version k (unverändertes Rohgerüst) und dient nur als Platzhalter.</w:t>
       </w:r>
     </w:p>
     <w:p>
@@ -696,7 +2429,7 @@
           <w:sz w:val="22"/>
           <w:szCs w:val="22"/>
         </w:rPr>
-        <w:t xml:space="preserve">7.5.3.4 Aufgaben Fertigung Montage</w:t>
+        <w:t xml:space="preserve">7.5.3.4 Aufgaben Montage</w:t>
       </w:r>
     </w:p>
     <w:p>
@@ -1284,7 +3017,7 @@
           <w:sz w:val="22"/>
           <w:szCs w:val="22"/>
         </w:rPr>
-        <w:t xml:space="preserve">7.5.3.8 Aufgaben Arbeitsvorbereitung</w:t>
+        <w:t xml:space="preserve">7.5.3.8 Aufgaben Digitale Prozessentwicklung &amp; Lean Management (ex Arbeitsvorbereitung)</w:t>
       </w:r>
     </w:p>
     <w:p>
@@ -1570,7 +3303,7 @@
           <w:sz w:val="22"/>
           <w:szCs w:val="22"/>
         </w:rPr>
-        <w:t xml:space="preserve">7.5.3.10 Aufgaben Lager (Materialvorbereitung)</w:t>
+        <w:t xml:space="preserve">7.5.3.10 Aufgaben Teamleitung Lager (Materialvorbereitung)</w:t>
       </w:r>
     </w:p>
     <w:p>
@@ -2007,7 +3740,7 @@
         <w:rPr>
           <w:rFonts w:ascii="Calibri" w:cs="Calibri" w:eastAsia="Calibri" w:hAnsi="Calibri"/>
         </w:rPr>
-        <w:t xml:space="preserve">Störungen werden, wenn möglich, sogleich behoben. Vom QMB / PL wird dann geprüft, ob Korrekturmaßnahmen notwendig sind, um Wiederholungsfehler zu vermeiden. Laufende Qualitätskontrollen werden vom PQB nach geregelter Häufigkeit lt. Arbeits- und Prüfanweisung durchgeführt und protokolliert. Interne Reklamationen werden über den Reklamationsbericht dokumentiert; der interne Reklamationskoordinator führt die Maßnahmenverfolgung nach dem 8D-Verfahren durch. Eine geregelte Wartung u. Instandhaltung (siehe Wartungslisten) dient als vorbeugende Maßnahme zur Produktionssicherheit (6A-32-1). Der Teamleader ist für die Auslieferqualität, für die Auswertung der Produktionsvorkommnisse bzw. Schichtberichte (Todo-Liste, OneNote Prüfbegleitkarte) verantwortlich u. hat bei Bedarf Maßnahmen einzuleiten.</w:t>
+        <w:t xml:space="preserve">Störungen werden, wenn möglich, sogleich behoben. Vom QMB / PL wird dann geprüft, ob Korrekturmaßnahmen notwendig sind, um Wiederholungsfehler zu vermeiden. Laufende Qualitätskontrollen werden vom PQB nach geregelter Häufigkeit lt. Arbeits- und Prüfanweisung durchgeführt und protokolliert. Interne Reklamationen werden über den Reklamationsbericht dokumentiert; der interne Reklamationskoordinator führt die Maßnahmenverfolgung nach dem 8D-Verfahren durch. Eine geregelte Wartung u. Instandhaltung (siehe Wartungslisten) dient als vorbeugende Maßnahme zur Produktionssicherheit (6A-32-1). Der Teamleader ist für die Auslieferqualität, für die Auswertung der Produktionsvorkommnisse verantwortlich u. hat bei Bedarf Maßnahmen einzuleiten.</w:t>
       </w:r>
     </w:p>
     <w:p>
@@ -2218,6 +3951,15 @@
       <w:lvlJc w:val="left"/>
       <w:pPr>
         <w:ind w:left="720" w:hanging="360"/>
+      </w:pPr>
+    </w:lvl>
+    <w:lvl w:ilvl="1" w15:tentative="1">
+      <w:start w:val="1"/>
+      <w:numFmt w:val="bullet"/>
+      <w:lvlText w:val="◦"/>
+      <w:lvlJc w:val="left"/>
+      <w:pPr>
+        <w:ind w:left="1080" w:hanging="360"/>
       </w:pPr>
     </w:lvl>
   </w:abstractNum>

</xml_diff>

<commit_message>
Dokument-Entwurf um Montage/Endfertigung/Lager/Instandhaltung/Werkzeugbau erweitern
- build.js spiegelt jetzt vollständig den aktuellen Stand der notes/*.md:
  gemeinsame AKV-Basis Führungsrollen Hauptprozess (A-J) und
  Unterstützungsprozesse (A-B), Teamleitung Montage, Endfertigung, Lager,
  Instandhaltung, Werkzeugbau
- Schichtführer-Abschnitt auf bereichsspezifische Themenblöcke getrimmt
  (Rest über gemeinsame Basis)
- veraltete Version-k-Platzhalter für Montage/Lager im Rohgerüst-Abschnitt
  entfernt (Inhalt jetzt vollständig weiter oben)
- Duplikat-Zeile in FUEHRUNG_HAUPTPROZESS.md Themenblock C behoben
- Word-Dokument neu generiert

Co-Authored-By: Claude Sonnet 5 <noreply@anthropic.com>
Claude-Session: https://claude.ai/code/session_01KTGUGVaPm39C5Y3H1dpETj
</commit_message>
<xml_diff>
--- a/working/7V-5-1_Auftragsabwicklung_Produktion_ENTWURF.docx
+++ b/working/7V-5-1_Auftragsabwicklung_Produktion_ENTWURF.docx
@@ -139,7 +139,7 @@
           <w:sz w:val="18"/>
           <w:szCs w:val="18"/>
         </w:rPr>
-        <w:t xml:space="preserve">Struktur je Rolle: AKV-Prinzip (Aufgaben / Kompetenzen / Verantwortung), gegliedert nach Themenblöcken. Details und Diskussionsstand siehe notes/PRODUKTIONSLEITER.md bzw. notes/SCHICHTFUEHRER.md.</w:t>
+        <w:t xml:space="preserve">Struktur je Rolle: AKV-Prinzip (Aufgaben / Kompetenzen / Verantwortung), gegliedert nach Themenblöcken. Details und Diskussionsstand siehe notes/*.md.</w:t>
       </w:r>
     </w:p>
     <w:p>
@@ -919,7 +919,7 @@
           <w:sz w:val="20"/>
           <w:szCs w:val="20"/>
         </w:rPr>
-        <w:t xml:space="preserve">Verantwortung: Organisatorische Sicherstellung, dass Produktionsaufzeichnungen den Anforderungen aus ISO 9001 (§7.5.2/7.5.3) und IATF 16949 (§7.5.3.2.1) entsprechen:</w:t>
+        <w:t xml:space="preserve">Verantwortung: Organisatorische Sicherstellung, dass Produktionsaufzeichnungen den Anforderungen aus ISO 9001 (§7.5.2/7.5.3) entsprechen:</w:t>
       </w:r>
     </w:p>
     <w:p>
@@ -983,7 +983,7 @@
         <w:rPr>
           <w:rFonts w:ascii="Calibri" w:cs="Calibri" w:eastAsia="Calibri" w:hAnsi="Calibri"/>
         </w:rPr>
-        <w:t xml:space="preserve">Aufbewahrung – gemäß Record-Retention-Policy (IATF 16949 §7.5.3.2.1)</w:t>
+        <w:t xml:space="preserve">Aufbewahrung – gemäß Record-Retention-Policy</w:t>
       </w:r>
     </w:p>
     <w:p>
@@ -1064,7 +1064,7 @@
         <w:rPr>
           <w:rFonts w:ascii="Calibri" w:cs="Calibri" w:eastAsia="Calibri" w:hAnsi="Calibri"/>
         </w:rPr>
-        <w:t xml:space="preserve">QMB ist eine normativ geforderte Funktion (IATF 16949 §5.3.1/§5.3.2) und vertritt die Organisation nach außen in Qualitätsangelegenheiten – nicht nur gegenüber Kunden, sondern auch gegenüber Lieferanten und bei der Überwachung von Partnern im Produktionsnetzwerk (Lohnfertigung). QS deckt demgegenüber die internen Qualitätsbelange ab: Sperren, Beurteilung, Grenzmusterkataloge, Erststückfreigaben sowie interne Maßnahmen zur Verbesserung und Vermeidung von Reklamationen.</w:t>
+        <w:t xml:space="preserve">QMB ist eine normativ geforderte Funktion und vertritt die Organisation nach außen in Qualitätsangelegenheiten – nicht nur gegenüber Kunden, sondern auch gegenüber Lieferanten und bei der Überwachung von Partnern im Produktionsnetzwerk (Lohnfertigung). QS deckt demgegenüber die internen Qualitätsbelange ab: Sperren, Beurteilung, Grenzmusterkataloge, Erststückfreigaben sowie interne Maßnahmen zur Verbesserung und Vermeidung von Reklamationen.</w:t>
       </w:r>
     </w:p>
     <w:p>
@@ -1239,7 +1239,7 @@
         <w:rPr>
           <w:rFonts w:ascii="Calibri" w:cs="Calibri" w:eastAsia="Calibri" w:hAnsi="Calibri"/>
         </w:rPr>
-        <w:t xml:space="preserve">Bemusterung (Werkzeug, Automatisierung, Material, Spritzgussparameter) obliegt der Rolle Prozesstechnik und Bemusterung. Die Kundenfreigabe nach Vorstellung serienfallender Teile entspricht dem normativ geforderten Produktfreigabeprozess (IATF 16949 §8.3.4.4). Danach ist Prozess/Referenznummer/Werkzeug zur Vorserie frei (z. B. für Run@Rate) – das Herstellungsrisiko einer etwaigen Vorproduktion liegt bei der Produktion (vergleichbar der „Interim Approval“ im PPAP-Prozess).</w:t>
+        <w:t xml:space="preserve">Bemusterung (Werkzeug, Automatisierung, Material, Spritzgussparameter) obliegt der Rolle Prozesstechnik und Bemusterung. Die Kundenfreigabe nach Vorstellung serienfallender Teile entspricht dem normativ geforderten Produktfreigabeprozess. Danach ist Prozess/Referenznummer/Werkzeug zur Vorserie frei (z. B. für Run@Rate) – das Herstellungsrisiko einer etwaigen Vorproduktion liegt bei der Produktion (vergleichbar der „Interim Approval“ im PPAP-Prozess).</w:t>
       </w:r>
     </w:p>
     <w:p>
@@ -1277,7 +1277,7 @@
           <w:sz w:val="20"/>
           <w:szCs w:val="20"/>
         </w:rPr>
-        <w:t xml:space="preserve">Kompetenz: Eskalationsinstanz bei mehreren Varianten oder Risikofragen – multidisziplinäre Abstimmung (IATF 16949 §8.3.2.1) zwischen:</w:t>
+        <w:t xml:space="preserve">Kompetenz: Eskalationsinstanz bei mehreren Varianten oder Risikofragen – multidisziplinäre Abstimmung zwischen:</w:t>
       </w:r>
     </w:p>
     <w:p>
@@ -1782,17 +1782,16 @@
     </w:p>
     <w:p>
       <w:pPr>
-        <w:spacing w:after="100" w:before="200"/>
-      </w:pPr>
-      <w:r>
-        <w:rPr>
-          <w:rFonts w:ascii="Calibri" w:cs="Calibri" w:eastAsia="Calibri" w:hAnsi="Calibri"/>
-          <w:b/>
-          <w:bCs/>
-          <w:sz w:val="22"/>
-          <w:szCs w:val="22"/>
-        </w:rPr>
-        <w:t xml:space="preserve">7.5.3.2 Teamleitung Spritzguss-Produktion (Schichtführer)</w:t>
+        <w:pStyle w:val="Heading2"/>
+        <w:spacing w:after="120" w:before="240"/>
+      </w:pPr>
+      <w:r>
+        <w:rPr>
+          <w:rFonts w:ascii="Calibri" w:cs="Calibri" w:eastAsia="Calibri" w:hAnsi="Calibri"/>
+          <w:b/>
+          <w:bCs/>
+        </w:rPr>
+        <w:t xml:space="preserve">Gemeinsame AKV-Basis: Führungsrollen im Hauptprozess</w:t>
       </w:r>
     </w:p>
     <w:p>
@@ -1807,7 +1806,7 @@
           <w:sz w:val="18"/>
           <w:szCs w:val="18"/>
         </w:rPr>
-        <w:t xml:space="preserve">Gehört zur Gruppe „Führungsrollen im Hauptprozess“ (End2End-Auftragsabwicklung, gemeinsam mit Teamleitung Lager, Montage, Endfertigung). Schichtführer und andere TeamleiterInnen unterscheiden sich grundsätzlich nicht; der relevanteste Unterschied ist die Schichtarbeit.</w:t>
+        <w:t xml:space="preserve">Gilt für Teamleitung Spritzguss-Produktion (Schichtführer), Teamleitung Montage, Teamleitung Endfertigung, Teamleitung Lager (End2End-Auftragsabwicklung, Turtle-Diagramm-Logik: Input-Bereitstellung/Transformation/Output-Versand). Allgemeine Punkte werden hier einmal dokumentiert; die einzelnen Rollen unten enthalten nur noch ihre spezifischen Ergänzungen.</w:t>
       </w:r>
     </w:p>
     <w:p>
@@ -1823,7 +1822,7 @@
           <w:szCs w:val="20"/>
           <w:u w:val="single"/>
         </w:rPr>
-        <w:t xml:space="preserve">1. Maschinenüberwachung und Parametrierung</w:t>
+        <w:t xml:space="preserve">A. Prozessmittelüberwachung und Parametrierung</w:t>
       </w:r>
     </w:p>
     <w:p>
@@ -1854,39 +1853,23 @@
         <w:rPr>
           <w:rFonts w:ascii="Calibri" w:cs="Calibri" w:eastAsia="Calibri" w:hAnsi="Calibri"/>
         </w:rPr>
-        <w:t xml:space="preserve">Überwachung der laufenden Produktionsmaschinen während der Schicht – inkl. der (teilweise automatisierten) Materialzuführung – auf Einhaltung der vorgegebenen Prozessparameter (Einstelldatenblatt)</w:t>
-      </w:r>
-    </w:p>
-    <w:p>
-      <w:pPr>
-        <w:pStyle w:val="ListParagraph"/>
-        <w:numPr>
-          <w:ilvl w:val="0"/>
-          <w:numId w:val="2"/>
-        </w:numPr>
-        <w:spacing w:after="60"/>
-      </w:pPr>
-      <w:r>
-        <w:rPr>
-          <w:rFonts w:ascii="Calibri" w:cs="Calibri" w:eastAsia="Calibri" w:hAnsi="Calibri"/>
-        </w:rPr>
-        <w:t xml:space="preserve">Auswahl der richtigen Einstelldaten und Übertragen der gültigen Parametersätze auf die Maschine (Umbau/Einstellung)</w:t>
-      </w:r>
-    </w:p>
-    <w:p>
-      <w:pPr>
-        <w:pStyle w:val="ListParagraph"/>
-        <w:numPr>
-          <w:ilvl w:val="0"/>
-          <w:numId w:val="2"/>
-        </w:numPr>
-        <w:spacing w:after="60"/>
-      </w:pPr>
-      <w:r>
-        <w:rPr>
-          <w:rFonts w:ascii="Calibri" w:cs="Calibri" w:eastAsia="Calibri" w:hAnsi="Calibri"/>
-        </w:rPr>
-        <w:t xml:space="preserve">Feinjustierung der Parameter innerhalb definierter Grenzen, auf Basis der laufenden Teilequalität, bis die geforderte Bauteilqualität erreicht ist. Grundlage: Rückstellmuster der letzten Produktion, im Prüfplan definierte Merkmale/Maße inkl. Toleranzen, bei besonders komplexen Fällen Erstmuster/Produktionsfreigabemuster aus dem Serienstart. PQB liefert dazu die Qualitätsrückmeldung zu den Teilen und kann fallweise auf Erfahrungsbasis beraten – die Entscheidung über Parameteranpassungen liegt jedoch nicht bei PQB</w:t>
+        <w:t xml:space="preserve">Überwachung der im jeweiligen Prozessschritt eingesetzten Maschinen, Anlagen, Werkzeuge und Vorrichtungen auf ordnungsgemäßen Zustand und korrekte Einstellung/Parametrierung – z. B. Spritzgussmaschinen (Teamleitung Spritzguss-Produktion), Montageautomaten/Vorrichtungen (Teamleitung Montage), Bearbeitungs-/Klebeanlagen (Teamleitung Endfertigung), Kommissionier-/Wiege-/Fördertechnik (Teamleitung Lager)</w:t>
+      </w:r>
+    </w:p>
+    <w:p>
+      <w:pPr>
+        <w:pStyle w:val="ListParagraph"/>
+        <w:numPr>
+          <w:ilvl w:val="0"/>
+          <w:numId w:val="2"/>
+        </w:numPr>
+        <w:spacing w:after="60"/>
+      </w:pPr>
+      <w:r>
+        <w:rPr>
+          <w:rFonts w:ascii="Calibri" w:cs="Calibri" w:eastAsia="Calibri" w:hAnsi="Calibri"/>
+        </w:rPr>
+        <w:t xml:space="preserve">Feinjustierung innerhalb definierter Grenzen auf Basis der Ergebnisqualität, soweit für den Bereich zutreffend</w:t>
       </w:r>
     </w:p>
     <w:p>
@@ -1917,23 +1900,470 @@
         <w:rPr>
           <w:rFonts w:ascii="Calibri" w:cs="Calibri" w:eastAsia="Calibri" w:hAnsi="Calibri"/>
         </w:rPr>
-        <w:t xml:space="preserve">Eigenständige fachliche Entscheidung über Parameteranpassungen – beruht auf erlerntem Wissen und Erfahrung, da keine generelle/pauschale Lösung möglich ist (Vielzahl an Parametern und Wechselwirkungen, z. B. Materialchargen)</w:t>
-      </w:r>
-    </w:p>
-    <w:p>
-      <w:pPr>
-        <w:pStyle w:val="ListParagraph"/>
-        <w:numPr>
-          <w:ilvl w:val="0"/>
-          <w:numId w:val="2"/>
-        </w:numPr>
-        <w:spacing w:after="60"/>
-      </w:pPr>
-      <w:r>
-        <w:rPr>
-          <w:rFonts w:ascii="Calibri" w:cs="Calibri" w:eastAsia="Calibri" w:hAnsi="Calibri"/>
-        </w:rPr>
-        <w:t xml:space="preserve">Bei technischen Störungen: Eskalation an Teamleitung Instandhaltung (Maschine, automatisierte Materialförderung) bzw. Teamleitung Werkzeugbau (Werkzeugprobleme) bzw. Automatisierung</w:t>
+        <w:t xml:space="preserve">Eigenständige fachliche Entscheidung im Rahmen der bereichseigenen Prozessmittel</w:t>
+      </w:r>
+    </w:p>
+    <w:p>
+      <w:pPr>
+        <w:pStyle w:val="ListParagraph"/>
+        <w:numPr>
+          <w:ilvl w:val="0"/>
+          <w:numId w:val="2"/>
+        </w:numPr>
+        <w:spacing w:after="60"/>
+      </w:pPr>
+      <w:r>
+        <w:rPr>
+          <w:rFonts w:ascii="Calibri" w:cs="Calibri" w:eastAsia="Calibri" w:hAnsi="Calibri"/>
+        </w:rPr>
+        <w:t xml:space="preserve">Bei technischen Störungen: Eskalation an die zuständige Fachrolle (Teamleitung Instandhaltung für Maschinen/Anlagen, Teamleitung Werkzeugbau für Werkzeuge, Automatisierung für automatisierte Systeme) – konkret durch Eintrag in die jeweilige Aufgabenliste von Instandhaltung bzw. Werkzeugbau</w:t>
+      </w:r>
+    </w:p>
+    <w:p>
+      <w:pPr>
+        <w:spacing w:after="80" w:before="220"/>
+      </w:pPr>
+      <w:r>
+        <w:rPr>
+          <w:rFonts w:ascii="Calibri" w:cs="Calibri" w:eastAsia="Calibri" w:hAnsi="Calibri"/>
+          <w:b/>
+          <w:bCs/>
+          <w:sz w:val="20"/>
+          <w:szCs w:val="20"/>
+          <w:u w:val="single"/>
+        </w:rPr>
+        <w:t xml:space="preserve">B. Ergebnisverantwortung Qualität/Quantität</w:t>
+      </w:r>
+    </w:p>
+    <w:p>
+      <w:pPr>
+        <w:spacing w:after="80"/>
+      </w:pPr>
+      <w:r>
+        <w:rPr>
+          <w:rFonts w:ascii="Calibri" w:cs="Calibri" w:eastAsia="Calibri" w:hAnsi="Calibri"/>
+          <w:b/>
+          <w:bCs/>
+          <w:sz w:val="20"/>
+          <w:szCs w:val="20"/>
+        </w:rPr>
+        <w:t xml:space="preserve">Verantwortung: </w:t>
+      </w:r>
+      <w:r>
+        <w:rPr>
+          <w:rFonts w:ascii="Calibri" w:cs="Calibri" w:eastAsia="Calibri" w:hAnsi="Calibri"/>
+          <w:sz w:val="20"/>
+          <w:szCs w:val="20"/>
+        </w:rPr>
+        <w:t xml:space="preserve">Sicherstellung der geplanten Produktionsmenge und der geforderten Qualität im jeweiligen Verantwortungsbereich. Bei Abweichungen von der Produktionsplanung (z. B. durch Störungen): Rückmeldung an Produktionsplanung/Produktionsleitung.</w:t>
+      </w:r>
+    </w:p>
+    <w:p>
+      <w:pPr>
+        <w:spacing w:after="80" w:before="220"/>
+      </w:pPr>
+      <w:r>
+        <w:rPr>
+          <w:rFonts w:ascii="Calibri" w:cs="Calibri" w:eastAsia="Calibri" w:hAnsi="Calibri"/>
+          <w:b/>
+          <w:bCs/>
+          <w:sz w:val="20"/>
+          <w:szCs w:val="20"/>
+          <w:u w:val="single"/>
+        </w:rPr>
+        <w:t xml:space="preserve">C. Fehlerbewertung, Sperren, Transport gesperrter Ware</w:t>
+      </w:r>
+    </w:p>
+    <w:p>
+      <w:pPr>
+        <w:spacing w:after="80"/>
+      </w:pPr>
+      <w:r>
+        <w:rPr>
+          <w:rFonts w:ascii="Calibri" w:cs="Calibri" w:eastAsia="Calibri" w:hAnsi="Calibri"/>
+          <w:b/>
+          <w:bCs/>
+          <w:sz w:val="20"/>
+          <w:szCs w:val="20"/>
+        </w:rPr>
+        <w:t xml:space="preserve">Aufgabe: </w:t>
+      </w:r>
+      <w:r>
+        <w:rPr>
+          <w:rFonts w:ascii="Calibri" w:cs="Calibri" w:eastAsia="Calibri" w:hAnsi="Calibri"/>
+          <w:sz w:val="20"/>
+          <w:szCs w:val="20"/>
+        </w:rPr>
+        <w:t xml:space="preserve">Bewertung gemeldeter Fehler gemeinsam mit PQB auf Schicht-/Team-Ebene; Entscheidung über Sperrung fehlerhafter Produkte. Anweisung an Lager bzw. Produktionslogistiker zum Transport gesperrter Ware ins gesperrte Lager. Zusätzlich: Rückmeldung fehlerhafter Kaufteile an PQB/Wareneingangskontrolle – da die Wareneingangsprüfung überwiegend stichprobenartig erfolgt, werden Fehler bei Kaufteilen häufig erst bei der Weiterverarbeitung festgestellt (bei Teamleitung Montage aufgrund des hohen Kaufteilanteils verstärkt relevant).</w:t>
+      </w:r>
+    </w:p>
+    <w:p>
+      <w:pPr>
+        <w:spacing w:after="80" w:before="220"/>
+      </w:pPr>
+      <w:r>
+        <w:rPr>
+          <w:rFonts w:ascii="Calibri" w:cs="Calibri" w:eastAsia="Calibri" w:hAnsi="Calibri"/>
+          <w:b/>
+          <w:bCs/>
+          <w:sz w:val="20"/>
+          <w:szCs w:val="20"/>
+          <w:u w:val="single"/>
+        </w:rPr>
+        <w:t xml:space="preserve">D. Personalverantwortung</w:t>
+      </w:r>
+    </w:p>
+    <w:p>
+      <w:pPr>
+        <w:spacing w:after="80"/>
+      </w:pPr>
+      <w:r>
+        <w:rPr>
+          <w:rFonts w:ascii="Calibri" w:cs="Calibri" w:eastAsia="Calibri" w:hAnsi="Calibri"/>
+          <w:b/>
+          <w:bCs/>
+          <w:sz w:val="20"/>
+          <w:szCs w:val="20"/>
+        </w:rPr>
+        <w:t xml:space="preserve">Verantwortung: </w:t>
+      </w:r>
+      <w:r>
+        <w:rPr>
+          <w:rFonts w:ascii="Calibri" w:cs="Calibri" w:eastAsia="Calibri" w:hAnsi="Calibri"/>
+          <w:sz w:val="20"/>
+          <w:szCs w:val="20"/>
+        </w:rPr>
+        <w:t xml:space="preserve">Personalverantwortung für die unterstellten Mitarbeiter des Bereichs, inkl. Sicherheit, Ordnung und Sauberkeit am Arbeitsplatz. Erstverantwortung für disziplinarische Maßnahmen (Produktionsleiter als Eskalationsstufe).</w:t>
+      </w:r>
+    </w:p>
+    <w:p>
+      <w:pPr>
+        <w:spacing w:after="80"/>
+      </w:pPr>
+      <w:r>
+        <w:rPr>
+          <w:rFonts w:ascii="Calibri" w:cs="Calibri" w:eastAsia="Calibri" w:hAnsi="Calibri"/>
+          <w:b/>
+          <w:bCs/>
+          <w:sz w:val="20"/>
+          <w:szCs w:val="20"/>
+        </w:rPr>
+        <w:t xml:space="preserve">Aufgabe: </w:t>
+      </w:r>
+      <w:r>
+        <w:rPr>
+          <w:rFonts w:ascii="Calibri" w:cs="Calibri" w:eastAsia="Calibri" w:hAnsi="Calibri"/>
+          <w:sz w:val="20"/>
+          <w:szCs w:val="20"/>
+        </w:rPr>
+        <w:t xml:space="preserve">Personalführung des Bereichs (Einteilung, Feedback, Konfliktmanagement).</w:t>
+      </w:r>
+    </w:p>
+    <w:p>
+      <w:pPr>
+        <w:spacing w:after="80" w:before="220"/>
+      </w:pPr>
+      <w:r>
+        <w:rPr>
+          <w:rFonts w:ascii="Calibri" w:cs="Calibri" w:eastAsia="Calibri" w:hAnsi="Calibri"/>
+          <w:b/>
+          <w:bCs/>
+          <w:sz w:val="20"/>
+          <w:szCs w:val="20"/>
+          <w:u w:val="single"/>
+        </w:rPr>
+        <w:t xml:space="preserve">E. Produktions- und Qualitätsaufzeichnungen</w:t>
+      </w:r>
+    </w:p>
+    <w:p>
+      <w:pPr>
+        <w:spacing w:after="80"/>
+      </w:pPr>
+      <w:r>
+        <w:rPr>
+          <w:rFonts w:ascii="Calibri" w:cs="Calibri" w:eastAsia="Calibri" w:hAnsi="Calibri"/>
+          <w:b/>
+          <w:bCs/>
+          <w:sz w:val="20"/>
+          <w:szCs w:val="20"/>
+        </w:rPr>
+        <w:t xml:space="preserve">Aufgabe: </w:t>
+      </w:r>
+      <w:r>
+        <w:rPr>
+          <w:rFonts w:ascii="Calibri" w:cs="Calibri" w:eastAsia="Calibri" w:hAnsi="Calibri"/>
+          <w:sz w:val="20"/>
+          <w:szCs w:val="20"/>
+        </w:rPr>
+        <w:t xml:space="preserve">Durchführung/Erstellung der vereinbarten Produktions- und Qualitätsaufzeichnungen des Bereichs (z. B. Prüfbegleitkarte).</w:t>
+      </w:r>
+    </w:p>
+    <w:p>
+      <w:pPr>
+        <w:spacing w:after="80" w:before="220"/>
+      </w:pPr>
+      <w:r>
+        <w:rPr>
+          <w:rFonts w:ascii="Calibri" w:cs="Calibri" w:eastAsia="Calibri" w:hAnsi="Calibri"/>
+          <w:b/>
+          <w:bCs/>
+          <w:sz w:val="20"/>
+          <w:szCs w:val="20"/>
+          <w:u w:val="single"/>
+        </w:rPr>
+        <w:t xml:space="preserve">F. Reststoff-/Abfallentsorgung</w:t>
+      </w:r>
+    </w:p>
+    <w:p>
+      <w:pPr>
+        <w:spacing w:after="80"/>
+      </w:pPr>
+      <w:r>
+        <w:rPr>
+          <w:rFonts w:ascii="Calibri" w:cs="Calibri" w:eastAsia="Calibri" w:hAnsi="Calibri"/>
+          <w:b/>
+          <w:bCs/>
+          <w:sz w:val="20"/>
+          <w:szCs w:val="20"/>
+        </w:rPr>
+        <w:t xml:space="preserve">Aufgabe: </w:t>
+      </w:r>
+      <w:r>
+        <w:rPr>
+          <w:rFonts w:ascii="Calibri" w:cs="Calibri" w:eastAsia="Calibri" w:hAnsi="Calibri"/>
+          <w:sz w:val="20"/>
+          <w:szCs w:val="20"/>
+        </w:rPr>
+        <w:t xml:space="preserve">Sortenreine Entsorgung der im jeweiligen Prozessschritt anfallenden Reststoffe/Abfälle in die vorgeschriebenen Behälter/Container – z. B. ausgespritztes Material (Teamleitung Spritzguss-Produktion), Verpackungsreste/Stanzabfälle (Teamleitung Montage), Schleifstaub/Klebstoffreste (Teamleitung Endfertigung).</w:t>
+      </w:r>
+    </w:p>
+    <w:p>
+      <w:pPr>
+        <w:spacing w:after="80" w:before="220"/>
+      </w:pPr>
+      <w:r>
+        <w:rPr>
+          <w:rFonts w:ascii="Calibri" w:cs="Calibri" w:eastAsia="Calibri" w:hAnsi="Calibri"/>
+          <w:b/>
+          <w:bCs/>
+          <w:sz w:val="20"/>
+          <w:szCs w:val="20"/>
+          <w:u w:val="single"/>
+        </w:rPr>
+        <w:t xml:space="preserve">G. Einfache Wartungstätigkeiten</w:t>
+      </w:r>
+    </w:p>
+    <w:p>
+      <w:pPr>
+        <w:spacing w:after="80"/>
+      </w:pPr>
+      <w:r>
+        <w:rPr>
+          <w:rFonts w:ascii="Calibri" w:cs="Calibri" w:eastAsia="Calibri" w:hAnsi="Calibri"/>
+          <w:b/>
+          <w:bCs/>
+          <w:sz w:val="20"/>
+          <w:szCs w:val="20"/>
+        </w:rPr>
+        <w:t xml:space="preserve">Aufgabe: </w:t>
+      </w:r>
+      <w:r>
+        <w:rPr>
+          <w:rFonts w:ascii="Calibri" w:cs="Calibri" w:eastAsia="Calibri" w:hAnsi="Calibri"/>
+          <w:sz w:val="20"/>
+          <w:szCs w:val="20"/>
+        </w:rPr>
+        <w:t xml:space="preserve">Durchführung einfacher Wartungstätigkeiten an den bereichseigenen Betriebs-/Hilfsmitteln (z. B. Reinigung, Schmierung). Tiefergehende Wartung/Reparatur/Instandhaltung obliegt Teamleitung Instandhaltung bzw. Teamleitung Werkzeugbau.</w:t>
+      </w:r>
+    </w:p>
+    <w:p>
+      <w:pPr>
+        <w:spacing w:after="80" w:before="220"/>
+      </w:pPr>
+      <w:r>
+        <w:rPr>
+          <w:rFonts w:ascii="Calibri" w:cs="Calibri" w:eastAsia="Calibri" w:hAnsi="Calibri"/>
+          <w:b/>
+          <w:bCs/>
+          <w:sz w:val="20"/>
+          <w:szCs w:val="20"/>
+          <w:u w:val="single"/>
+        </w:rPr>
+        <w:t xml:space="preserve">H. Freigabeprüfungen</w:t>
+      </w:r>
+    </w:p>
+    <w:p>
+      <w:pPr>
+        <w:spacing w:after="80"/>
+      </w:pPr>
+      <w:r>
+        <w:rPr>
+          <w:rFonts w:ascii="Calibri" w:cs="Calibri" w:eastAsia="Calibri" w:hAnsi="Calibri"/>
+          <w:b/>
+          <w:bCs/>
+          <w:sz w:val="20"/>
+          <w:szCs w:val="20"/>
+        </w:rPr>
+        <w:t xml:space="preserve">Aufgabe: </w:t>
+      </w:r>
+      <w:r>
+        <w:rPr>
+          <w:rFonts w:ascii="Calibri" w:cs="Calibri" w:eastAsia="Calibri" w:hAnsi="Calibri"/>
+          <w:sz w:val="20"/>
+          <w:szCs w:val="20"/>
+        </w:rPr>
+        <w:t xml:space="preserve">Erststück-/Letztstückfreigabe sowie erneute Freigabe nach geplanten/ungeplanten Produktionsunterbrechungen &gt;30 min, jeweils gemeinsam mit PQB lt. Prüfbegleitkarte.</w:t>
+      </w:r>
+    </w:p>
+    <w:p>
+      <w:pPr>
+        <w:spacing w:after="80" w:before="220"/>
+      </w:pPr>
+      <w:r>
+        <w:rPr>
+          <w:rFonts w:ascii="Calibri" w:cs="Calibri" w:eastAsia="Calibri" w:hAnsi="Calibri"/>
+          <w:b/>
+          <w:bCs/>
+          <w:sz w:val="20"/>
+          <w:szCs w:val="20"/>
+          <w:u w:val="single"/>
+        </w:rPr>
+        <w:t xml:space="preserve">I. Poka-Yoke-Verifizierung („Dummy-Prüfung“)</w:t>
+      </w:r>
+    </w:p>
+    <w:p>
+      <w:pPr>
+        <w:spacing w:after="120"/>
+      </w:pPr>
+      <w:r>
+        <w:rPr>
+          <w:rFonts w:ascii="Calibri" w:cs="Calibri" w:eastAsia="Calibri" w:hAnsi="Calibri"/>
+        </w:rPr>
+        <w:t xml:space="preserve">Gilt für Bereiche mit integrierten (In-Line-)Prüfanlagen.</w:t>
+      </w:r>
+    </w:p>
+    <w:p>
+      <w:pPr>
+        <w:spacing w:after="80"/>
+      </w:pPr>
+      <w:r>
+        <w:rPr>
+          <w:rFonts w:ascii="Calibri" w:cs="Calibri" w:eastAsia="Calibri" w:hAnsi="Calibri"/>
+          <w:b/>
+          <w:bCs/>
+          <w:sz w:val="20"/>
+          <w:szCs w:val="20"/>
+        </w:rPr>
+        <w:t xml:space="preserve">Aufgabe: </w:t>
+      </w:r>
+      <w:r>
+        <w:rPr>
+          <w:rFonts w:ascii="Calibri" w:cs="Calibri" w:eastAsia="Calibri" w:hAnsi="Calibri"/>
+          <w:sz w:val="20"/>
+          <w:szCs w:val="20"/>
+        </w:rPr>
+        <w:t xml:space="preserve">Regelmäßige Durchführung der vorgeschriebenen Funktionsprüfung dieser Prüfanlagen mittels Referenz-/Prüfteilen (Gut-/Schlechtteile), um sicherzustellen, dass fehlerhafte Teile zuverlässig erkannt werden. Prüffrequenz gemäß Lenkungsplan (Control Plan).</w:t>
+      </w:r>
+    </w:p>
+    <w:p>
+      <w:pPr>
+        <w:spacing w:after="80" w:before="220"/>
+      </w:pPr>
+      <w:r>
+        <w:rPr>
+          <w:rFonts w:ascii="Calibri" w:cs="Calibri" w:eastAsia="Calibri" w:hAnsi="Calibri"/>
+          <w:b/>
+          <w:bCs/>
+          <w:sz w:val="20"/>
+          <w:szCs w:val="20"/>
+          <w:u w:val="single"/>
+        </w:rPr>
+        <w:t xml:space="preserve">J. Kundenreklamationen – Sofortmaßnahmen</w:t>
+      </w:r>
+    </w:p>
+    <w:p>
+      <w:pPr>
+        <w:spacing w:after="40" w:before="40"/>
+      </w:pPr>
+      <w:r>
+        <w:rPr>
+          <w:rFonts w:ascii="Calibri" w:cs="Calibri" w:eastAsia="Calibri" w:hAnsi="Calibri"/>
+          <w:b/>
+          <w:bCs/>
+          <w:sz w:val="20"/>
+          <w:szCs w:val="20"/>
+        </w:rPr>
+        <w:t xml:space="preserve">Aufgabe:</w:t>
+      </w:r>
+    </w:p>
+    <w:p>
+      <w:pPr>
+        <w:pStyle w:val="ListParagraph"/>
+        <w:numPr>
+          <w:ilvl w:val="0"/>
+          <w:numId w:val="2"/>
+        </w:numPr>
+        <w:spacing w:after="60"/>
+      </w:pPr>
+      <w:r>
+        <w:rPr>
+          <w:rFonts w:ascii="Calibri" w:cs="Calibri" w:eastAsia="Calibri" w:hAnsi="Calibri"/>
+        </w:rPr>
+        <w:t xml:space="preserve">Umsetzung von Sofortmaßnahmen bei Kundenreklamationen: 100%-Kontrolle der betroffenen Teile/Bestände, Sensibilisierung und Unterweisung der Mitarbeiter, Mithilfe bei der Eingrenzung des Fehlerzeitraums bzw. des ersten Auftretens</w:t>
+      </w:r>
+    </w:p>
+    <w:p>
+      <w:pPr>
+        <w:pStyle w:val="ListParagraph"/>
+        <w:numPr>
+          <w:ilvl w:val="0"/>
+          <w:numId w:val="2"/>
+        </w:numPr>
+        <w:spacing w:after="60"/>
+      </w:pPr>
+      <w:r>
+        <w:rPr>
+          <w:rFonts w:ascii="Calibri" w:cs="Calibri" w:eastAsia="Calibri" w:hAnsi="Calibri"/>
+        </w:rPr>
+        <w:t xml:space="preserve">Sicherstellung der Einhaltung geänderter Arbeitsanweisungen, die im Zuge der Reklamation angepasst wurden (Unterweisung durch Teamleitung oder QS)</w:t>
+      </w:r>
+    </w:p>
+    <w:p>
+      <w:pPr>
+        <w:spacing w:after="80"/>
+      </w:pPr>
+      <w:r>
+        <w:rPr>
+          <w:rFonts w:ascii="Calibri" w:cs="Calibri" w:eastAsia="Calibri" w:hAnsi="Calibri"/>
+          <w:b/>
+          <w:bCs/>
+          <w:sz w:val="20"/>
+          <w:szCs w:val="20"/>
+        </w:rPr>
+        <w:t xml:space="preserve">Kompetenz: </w:t>
+      </w:r>
+      <w:r>
+        <w:rPr>
+          <w:rFonts w:ascii="Calibri" w:cs="Calibri" w:eastAsia="Calibri" w:hAnsi="Calibri"/>
+          <w:sz w:val="20"/>
+          <w:szCs w:val="20"/>
+        </w:rPr>
+        <w:t xml:space="preserve">Gemeinsame Definition (mit QS/QMB) von Vermeidungs- und Abstellmaßnahmen sowie Sicherstellung von deren Einhaltung.</w:t>
+      </w:r>
+    </w:p>
+    <w:p>
+      <w:pPr>
+        <w:spacing w:after="100" w:before="200"/>
+      </w:pPr>
+      <w:r>
+        <w:rPr>
+          <w:rFonts w:ascii="Calibri" w:cs="Calibri" w:eastAsia="Calibri" w:hAnsi="Calibri"/>
+          <w:b/>
+          <w:bCs/>
+          <w:sz w:val="22"/>
+          <w:szCs w:val="22"/>
+        </w:rPr>
+        <w:t xml:space="preserve">7.5.3.2 Teamleitung Spritzguss-Produktion (Schichtführer)</w:t>
       </w:r>
     </w:p>
     <w:p>
@@ -1948,7 +2378,7 @@
           <w:sz w:val="18"/>
           <w:szCs w:val="18"/>
         </w:rPr>
-        <w:t xml:space="preserve">Hinweis: Die „Produktionsfreigabe“ ist derselbe Schritt wie die Erststückfreigabe – siehe Themenblock 7.</w:t>
+        <w:t xml:space="preserve">Führungsrolle im Hauptprozess (siehe oben). Schichtführer und andere TeamleiterInnen unterscheiden sich grundsätzlich nicht; der relevanteste Unterschied ist die Schichtarbeit. Nachfolgend nur die Spritzguss-spezifischen Ausprägungen sowie die schichtspezifische Besonderheit Schichtübergabe.</w:t>
       </w:r>
     </w:p>
     <w:p>
@@ -1964,331 +2394,117 @@
           <w:szCs w:val="20"/>
           <w:u w:val="single"/>
         </w:rPr>
-        <w:t xml:space="preserve">2. Schichtergebnis Qualität/Quantität</w:t>
-      </w:r>
-    </w:p>
-    <w:p>
-      <w:pPr>
-        <w:spacing w:after="80"/>
-      </w:pPr>
-      <w:r>
-        <w:rPr>
-          <w:rFonts w:ascii="Calibri" w:cs="Calibri" w:eastAsia="Calibri" w:hAnsi="Calibri"/>
-          <w:b/>
-          <w:bCs/>
-          <w:sz w:val="20"/>
-          <w:szCs w:val="20"/>
-        </w:rPr>
-        <w:t xml:space="preserve">Verantwortung: </w:t>
-      </w:r>
-      <w:r>
-        <w:rPr>
-          <w:rFonts w:ascii="Calibri" w:cs="Calibri" w:eastAsia="Calibri" w:hAnsi="Calibri"/>
-          <w:sz w:val="20"/>
-          <w:szCs w:val="20"/>
-        </w:rPr>
-        <w:t xml:space="preserve">Sicherstellung der geplanten Produktionsmenge und der geforderten Bauteilqualität während der Schicht. Bei Abweichungen von der Produktionsplanung (z. B. durch Störungen): Rückmeldung an Produktionsplanung/Produktionsleitung.</w:t>
-      </w:r>
-    </w:p>
-    <w:p>
-      <w:pPr>
-        <w:spacing w:after="80" w:before="220"/>
-      </w:pPr>
-      <w:r>
-        <w:rPr>
-          <w:rFonts w:ascii="Calibri" w:cs="Calibri" w:eastAsia="Calibri" w:hAnsi="Calibri"/>
-          <w:b/>
-          <w:bCs/>
-          <w:sz w:val="20"/>
-          <w:szCs w:val="20"/>
-          <w:u w:val="single"/>
-        </w:rPr>
-        <w:t xml:space="preserve">3. Fehlerbewertung, Sperren, Transport gesperrter Ware</w:t>
-      </w:r>
-    </w:p>
-    <w:p>
-      <w:pPr>
-        <w:spacing w:after="80"/>
-      </w:pPr>
-      <w:r>
-        <w:rPr>
-          <w:rFonts w:ascii="Calibri" w:cs="Calibri" w:eastAsia="Calibri" w:hAnsi="Calibri"/>
-          <w:b/>
-          <w:bCs/>
-          <w:sz w:val="20"/>
-          <w:szCs w:val="20"/>
-        </w:rPr>
-        <w:t xml:space="preserve">Aufgabe: </w:t>
-      </w:r>
-      <w:r>
-        <w:rPr>
-          <w:rFonts w:ascii="Calibri" w:cs="Calibri" w:eastAsia="Calibri" w:hAnsi="Calibri"/>
-          <w:sz w:val="20"/>
-          <w:szCs w:val="20"/>
-        </w:rPr>
-        <w:t xml:space="preserve">Bewertung gemeldeter Fehler (Fehlermeldungen der Werker) gemeinsam mit PQB auf Schicht-/Team-Ebene; Entscheidung über Sperrung fehlerhafter Produkte. Anweisung an Lager bzw. Produktionslogistiker zum Transport gesperrter Ware ins gesperrte Lager.</w:t>
-      </w:r>
-    </w:p>
-    <w:p>
-      <w:pPr>
-        <w:spacing w:after="80" w:before="220"/>
-      </w:pPr>
-      <w:r>
-        <w:rPr>
-          <w:rFonts w:ascii="Calibri" w:cs="Calibri" w:eastAsia="Calibri" w:hAnsi="Calibri"/>
-          <w:b/>
-          <w:bCs/>
-          <w:sz w:val="20"/>
-          <w:szCs w:val="20"/>
-          <w:u w:val="single"/>
-        </w:rPr>
-        <w:t xml:space="preserve">4. Personalverantwortung Schicht</w:t>
-      </w:r>
-    </w:p>
-    <w:p>
-      <w:pPr>
-        <w:spacing w:after="80"/>
-      </w:pPr>
-      <w:r>
-        <w:rPr>
-          <w:rFonts w:ascii="Calibri" w:cs="Calibri" w:eastAsia="Calibri" w:hAnsi="Calibri"/>
-          <w:b/>
-          <w:bCs/>
-          <w:sz w:val="20"/>
-          <w:szCs w:val="20"/>
-        </w:rPr>
-        <w:t xml:space="preserve">Verantwortung: </w:t>
-      </w:r>
-      <w:r>
-        <w:rPr>
-          <w:rFonts w:ascii="Calibri" w:cs="Calibri" w:eastAsia="Calibri" w:hAnsi="Calibri"/>
-          <w:sz w:val="20"/>
-          <w:szCs w:val="20"/>
-        </w:rPr>
-        <w:t xml:space="preserve">Personalverantwortung für die unterstellten Werker der Schicht, inkl. Sicherheit, Ordnung und Sauberkeit am Arbeitsplatz. Erstverantwortung für disziplinarische Maßnahmen bei den unterstellten Werkern (Produktionsleiter als Eskalationsstufe).</w:t>
-      </w:r>
-    </w:p>
-    <w:p>
-      <w:pPr>
-        <w:spacing w:after="80"/>
-      </w:pPr>
-      <w:r>
-        <w:rPr>
-          <w:rFonts w:ascii="Calibri" w:cs="Calibri" w:eastAsia="Calibri" w:hAnsi="Calibri"/>
-          <w:b/>
-          <w:bCs/>
-          <w:sz w:val="20"/>
-          <w:szCs w:val="20"/>
-        </w:rPr>
-        <w:t xml:space="preserve">Aufgabe: </w:t>
-      </w:r>
-      <w:r>
-        <w:rPr>
-          <w:rFonts w:ascii="Calibri" w:cs="Calibri" w:eastAsia="Calibri" w:hAnsi="Calibri"/>
-          <w:sz w:val="20"/>
-          <w:szCs w:val="20"/>
-        </w:rPr>
-        <w:t xml:space="preserve">Personalführung der Schicht (Einteilung, Feedback, Konfliktmanagement).</w:t>
-      </w:r>
-    </w:p>
-    <w:p>
-      <w:pPr>
-        <w:spacing w:after="80" w:before="220"/>
-      </w:pPr>
-      <w:r>
-        <w:rPr>
-          <w:rFonts w:ascii="Calibri" w:cs="Calibri" w:eastAsia="Calibri" w:hAnsi="Calibri"/>
-          <w:b/>
-          <w:bCs/>
-          <w:sz w:val="20"/>
-          <w:szCs w:val="20"/>
-          <w:u w:val="single"/>
-        </w:rPr>
-        <w:t xml:space="preserve">5. Produktions- und Qualitätsaufzeichnungen</w:t>
-      </w:r>
-    </w:p>
-    <w:p>
-      <w:pPr>
-        <w:spacing w:after="80"/>
-      </w:pPr>
-      <w:r>
-        <w:rPr>
-          <w:rFonts w:ascii="Calibri" w:cs="Calibri" w:eastAsia="Calibri" w:hAnsi="Calibri"/>
-          <w:b/>
-          <w:bCs/>
-          <w:sz w:val="20"/>
-          <w:szCs w:val="20"/>
-        </w:rPr>
-        <w:t xml:space="preserve">Aufgabe: </w:t>
-      </w:r>
-      <w:r>
-        <w:rPr>
-          <w:rFonts w:ascii="Calibri" w:cs="Calibri" w:eastAsia="Calibri" w:hAnsi="Calibri"/>
-          <w:sz w:val="20"/>
-          <w:szCs w:val="20"/>
-        </w:rPr>
-        <w:t xml:space="preserve">Durchführung/Erstellung der vereinbarten Produktions- und Qualitätsaufzeichnungen der Schicht (z. B. Schichtlogbuch, Prüfbegleitkarte).</w:t>
-      </w:r>
-    </w:p>
-    <w:p>
-      <w:pPr>
-        <w:spacing w:after="80" w:before="220"/>
-      </w:pPr>
-      <w:r>
-        <w:rPr>
-          <w:rFonts w:ascii="Calibri" w:cs="Calibri" w:eastAsia="Calibri" w:hAnsi="Calibri"/>
-          <w:b/>
-          <w:bCs/>
-          <w:sz w:val="20"/>
-          <w:szCs w:val="20"/>
-          <w:u w:val="single"/>
-        </w:rPr>
-        <w:t xml:space="preserve">6. Restmaterialentsorgung</w:t>
-      </w:r>
-    </w:p>
-    <w:p>
-      <w:pPr>
-        <w:spacing w:after="80"/>
-      </w:pPr>
-      <w:r>
-        <w:rPr>
-          <w:rFonts w:ascii="Calibri" w:cs="Calibri" w:eastAsia="Calibri" w:hAnsi="Calibri"/>
-          <w:b/>
-          <w:bCs/>
-          <w:sz w:val="20"/>
-          <w:szCs w:val="20"/>
-        </w:rPr>
-        <w:t xml:space="preserve">Aufgabe: </w:t>
-      </w:r>
-      <w:r>
-        <w:rPr>
-          <w:rFonts w:ascii="Calibri" w:cs="Calibri" w:eastAsia="Calibri" w:hAnsi="Calibri"/>
-          <w:sz w:val="20"/>
-          <w:szCs w:val="20"/>
-        </w:rPr>
-        <w:t xml:space="preserve">Ausgespritztes Material sortenrein in Restmüllgebinde bzw. vorgeschriebene Container entsorgen.</w:t>
-      </w:r>
-    </w:p>
-    <w:p>
-      <w:pPr>
-        <w:spacing w:after="80" w:before="220"/>
-      </w:pPr>
-      <w:r>
-        <w:rPr>
-          <w:rFonts w:ascii="Calibri" w:cs="Calibri" w:eastAsia="Calibri" w:hAnsi="Calibri"/>
-          <w:b/>
-          <w:bCs/>
-          <w:sz w:val="20"/>
-          <w:szCs w:val="20"/>
-          <w:u w:val="single"/>
-        </w:rPr>
-        <w:t xml:space="preserve">7. Freigabeprüfungen</w:t>
-      </w:r>
-    </w:p>
-    <w:p>
-      <w:pPr>
-        <w:spacing w:after="80"/>
-      </w:pPr>
-      <w:r>
-        <w:rPr>
-          <w:rFonts w:ascii="Calibri" w:cs="Calibri" w:eastAsia="Calibri" w:hAnsi="Calibri"/>
-          <w:b/>
-          <w:bCs/>
-          <w:sz w:val="20"/>
-          <w:szCs w:val="20"/>
-        </w:rPr>
-        <w:t xml:space="preserve">Aufgabe: </w:t>
-      </w:r>
-      <w:r>
-        <w:rPr>
-          <w:rFonts w:ascii="Calibri" w:cs="Calibri" w:eastAsia="Calibri" w:hAnsi="Calibri"/>
-          <w:sz w:val="20"/>
-          <w:szCs w:val="20"/>
-        </w:rPr>
-        <w:t xml:space="preserve">Erststück-/Letztstückfreigabe sowie erneute Freigabe nach geplanten/ungeplanten Produktionsunterbrechungen &gt;30 min, jeweils gemeinsam mit PQB lt. Prüfbegleitkarte. Dies ist derselbe Schritt wie die Produktionsfreigabe nach der Parametrierung (Themenblock 1) – kein separater, vorgelagerter Freigabeschritt.</w:t>
-      </w:r>
-    </w:p>
-    <w:p>
-      <w:pPr>
-        <w:spacing w:after="80" w:before="220"/>
-      </w:pPr>
-      <w:r>
-        <w:rPr>
-          <w:rFonts w:ascii="Calibri" w:cs="Calibri" w:eastAsia="Calibri" w:hAnsi="Calibri"/>
-          <w:b/>
-          <w:bCs/>
-          <w:sz w:val="20"/>
-          <w:szCs w:val="20"/>
-          <w:u w:val="single"/>
-        </w:rPr>
-        <w:t xml:space="preserve">8. Einfache Werkzeug-Wartungstätigkeiten</w:t>
-      </w:r>
-    </w:p>
-    <w:p>
-      <w:pPr>
-        <w:spacing w:after="80"/>
-      </w:pPr>
-      <w:r>
-        <w:rPr>
-          <w:rFonts w:ascii="Calibri" w:cs="Calibri" w:eastAsia="Calibri" w:hAnsi="Calibri"/>
-          <w:b/>
-          <w:bCs/>
-          <w:sz w:val="20"/>
-          <w:szCs w:val="20"/>
-        </w:rPr>
-        <w:t xml:space="preserve">Aufgabe: </w:t>
-      </w:r>
-      <w:r>
-        <w:rPr>
-          <w:rFonts w:ascii="Calibri" w:cs="Calibri" w:eastAsia="Calibri" w:hAnsi="Calibri"/>
-          <w:sz w:val="20"/>
-          <w:szCs w:val="20"/>
-        </w:rPr>
-        <w:t xml:space="preserve">Durchführung einfacher Werkzeug-Wartungstätigkeiten am eingebauten Werkzeug (z. B. Reinigung, Schmierung beim Rüstvorgang). Tiefergehende Wartung, Reparatur und Instandhaltung obliegt der Teamleitung Werkzeugbau.</w:t>
-      </w:r>
-    </w:p>
-    <w:p>
-      <w:pPr>
-        <w:spacing w:after="80" w:before="220"/>
-      </w:pPr>
-      <w:r>
-        <w:rPr>
-          <w:rFonts w:ascii="Calibri" w:cs="Calibri" w:eastAsia="Calibri" w:hAnsi="Calibri"/>
-          <w:b/>
-          <w:bCs/>
-          <w:sz w:val="20"/>
-          <w:szCs w:val="20"/>
-          <w:u w:val="single"/>
-        </w:rPr>
-        <w:t xml:space="preserve">9. Schichtübergabe</w:t>
-      </w:r>
-    </w:p>
-    <w:p>
-      <w:pPr>
-        <w:spacing w:after="80"/>
-      </w:pPr>
-      <w:r>
-        <w:rPr>
-          <w:rFonts w:ascii="Calibri" w:cs="Calibri" w:eastAsia="Calibri" w:hAnsi="Calibri"/>
-          <w:b/>
-          <w:bCs/>
-          <w:sz w:val="20"/>
-          <w:szCs w:val="20"/>
-        </w:rPr>
-        <w:t xml:space="preserve">Aufgabe: </w:t>
-      </w:r>
-      <w:r>
-        <w:rPr>
-          <w:rFonts w:ascii="Calibri" w:cs="Calibri" w:eastAsia="Calibri" w:hAnsi="Calibri"/>
-          <w:sz w:val="20"/>
-          <w:szCs w:val="20"/>
-        </w:rPr>
-        <w:t xml:space="preserve">Durchführung der Schichtübergabe an den nachfolgenden Schichtführer: Weitergabe des aktuellen Produktions- und Qualitätsstatus je Maschine, offener Vorkommnisse und laufender Maßnahmen, dokumentiert im Schichtlogbuch.</w:t>
-      </w:r>
-    </w:p>
-    <w:p>
-      <w:r>
-        <w:br w:type="page"/>
+        <w:t xml:space="preserve">1. Maschinenüberwachung und Parametrierung – Spritzguss-spezifisch</w:t>
+      </w:r>
+    </w:p>
+    <w:p>
+      <w:pPr>
+        <w:spacing w:after="40" w:before="40"/>
+      </w:pPr>
+      <w:r>
+        <w:rPr>
+          <w:rFonts w:ascii="Calibri" w:cs="Calibri" w:eastAsia="Calibri" w:hAnsi="Calibri"/>
+          <w:b/>
+          <w:bCs/>
+          <w:sz w:val="20"/>
+          <w:szCs w:val="20"/>
+        </w:rPr>
+        <w:t xml:space="preserve">Aufgabe:</w:t>
+      </w:r>
+    </w:p>
+    <w:p>
+      <w:pPr>
+        <w:pStyle w:val="ListParagraph"/>
+        <w:numPr>
+          <w:ilvl w:val="0"/>
+          <w:numId w:val="2"/>
+        </w:numPr>
+        <w:spacing w:after="60"/>
+      </w:pPr>
+      <w:r>
+        <w:rPr>
+          <w:rFonts w:ascii="Calibri" w:cs="Calibri" w:eastAsia="Calibri" w:hAnsi="Calibri"/>
+        </w:rPr>
+        <w:t xml:space="preserve">Überwachung der laufenden Produktionsmaschinen während der Schicht – inkl. der (teilweise automatisierten) Materialzuführung – auf Einhaltung der vorgegebenen Prozessparameter (Einstelldatenblatt)</w:t>
+      </w:r>
+    </w:p>
+    <w:p>
+      <w:pPr>
+        <w:pStyle w:val="ListParagraph"/>
+        <w:numPr>
+          <w:ilvl w:val="0"/>
+          <w:numId w:val="2"/>
+        </w:numPr>
+        <w:spacing w:after="60"/>
+      </w:pPr>
+      <w:r>
+        <w:rPr>
+          <w:rFonts w:ascii="Calibri" w:cs="Calibri" w:eastAsia="Calibri" w:hAnsi="Calibri"/>
+        </w:rPr>
+        <w:t xml:space="preserve">Auswahl der richtigen Einstelldaten und Übertragen der gültigen Parametersätze auf die Maschine (Umbau/Einstellung)</w:t>
+      </w:r>
+    </w:p>
+    <w:p>
+      <w:pPr>
+        <w:pStyle w:val="ListParagraph"/>
+        <w:numPr>
+          <w:ilvl w:val="0"/>
+          <w:numId w:val="2"/>
+        </w:numPr>
+        <w:spacing w:after="60"/>
+      </w:pPr>
+      <w:r>
+        <w:rPr>
+          <w:rFonts w:ascii="Calibri" w:cs="Calibri" w:eastAsia="Calibri" w:hAnsi="Calibri"/>
+        </w:rPr>
+        <w:t xml:space="preserve">Feinjustierung der Parameter innerhalb definierter Grenzen, auf Basis der laufenden Teilequalität, bis die geforderte Bauteilqualität erreicht ist. Grundlage: Rückstellmuster der letzten Produktion, im Prüfplan definierte Merkmale/Maße inkl. Toleranzen, bei besonders komplexen Fällen Erstmuster/Produktionsfreigabemuster aus dem Serienstart. PQB liefert dazu die Qualitätsrückmeldung zu den Teilen und kann fallweise auf Erfahrungsbasis beraten – die Entscheidung über Parameteranpassungen liegt jedoch nicht bei PQB</w:t>
+      </w:r>
+    </w:p>
+    <w:p>
+      <w:pPr>
+        <w:spacing w:after="40" w:before="40"/>
+      </w:pPr>
+      <w:r>
+        <w:rPr>
+          <w:rFonts w:ascii="Calibri" w:cs="Calibri" w:eastAsia="Calibri" w:hAnsi="Calibri"/>
+          <w:b/>
+          <w:bCs/>
+          <w:sz w:val="20"/>
+          <w:szCs w:val="20"/>
+        </w:rPr>
+        <w:t xml:space="preserve">Kompetenz:</w:t>
+      </w:r>
+    </w:p>
+    <w:p>
+      <w:pPr>
+        <w:pStyle w:val="ListParagraph"/>
+        <w:numPr>
+          <w:ilvl w:val="0"/>
+          <w:numId w:val="2"/>
+        </w:numPr>
+        <w:spacing w:after="60"/>
+      </w:pPr>
+      <w:r>
+        <w:rPr>
+          <w:rFonts w:ascii="Calibri" w:cs="Calibri" w:eastAsia="Calibri" w:hAnsi="Calibri"/>
+        </w:rPr>
+        <w:t xml:space="preserve">Eigenständige fachliche Entscheidung über Parameteranpassungen – beruht auf erlerntem Wissen und Erfahrung, da keine generelle/pauschale Lösung möglich ist (Vielzahl an Parametern und Wechselwirkungen, z. B. Materialchargen)</w:t>
+      </w:r>
+    </w:p>
+    <w:p>
+      <w:pPr>
+        <w:pStyle w:val="ListParagraph"/>
+        <w:numPr>
+          <w:ilvl w:val="0"/>
+          <w:numId w:val="2"/>
+        </w:numPr>
+        <w:spacing w:after="60"/>
+      </w:pPr>
+      <w:r>
+        <w:rPr>
+          <w:rFonts w:ascii="Calibri" w:cs="Calibri" w:eastAsia="Calibri" w:hAnsi="Calibri"/>
+        </w:rPr>
+        <w:t xml:space="preserve">Bei technischen Störungen: Eskalation an Teamleitung Instandhaltung (Maschine, automatisierte Materialförderung) bzw. Teamleitung Werkzeugbau (Werkzeugprobleme) bzw. Automatisierung</w:t>
       </w:r>
     </w:p>
     <w:p>
@@ -2303,7 +2519,124 @@
           <w:sz w:val="18"/>
           <w:szCs w:val="18"/>
         </w:rPr>
-        <w:t xml:space="preserve">Die folgenden Rollen sind noch nicht im Detail überarbeitet – Inhalt entspricht noch Version k (unverändertes Rohgerüst) und dient nur als Platzhalter.</w:t>
+        <w:t xml:space="preserve">Hinweis: Die „Produktionsfreigabe“ ist derselbe Schritt wie die Erststückfreigabe (siehe Themenblock H oben).</w:t>
+      </w:r>
+    </w:p>
+    <w:p>
+      <w:pPr>
+        <w:spacing w:after="80" w:before="220"/>
+      </w:pPr>
+      <w:r>
+        <w:rPr>
+          <w:rFonts w:ascii="Calibri" w:cs="Calibri" w:eastAsia="Calibri" w:hAnsi="Calibri"/>
+          <w:b/>
+          <w:bCs/>
+          <w:sz w:val="20"/>
+          <w:szCs w:val="20"/>
+          <w:u w:val="single"/>
+        </w:rPr>
+        <w:t xml:space="preserve">6. Restmaterialentsorgung – Spritzguss-spezifisch</w:t>
+      </w:r>
+    </w:p>
+    <w:p>
+      <w:pPr>
+        <w:spacing w:after="80"/>
+      </w:pPr>
+      <w:r>
+        <w:rPr>
+          <w:rFonts w:ascii="Calibri" w:cs="Calibri" w:eastAsia="Calibri" w:hAnsi="Calibri"/>
+          <w:b/>
+          <w:bCs/>
+          <w:sz w:val="20"/>
+          <w:szCs w:val="20"/>
+        </w:rPr>
+        <w:t xml:space="preserve">Aufgabe: </w:t>
+      </w:r>
+      <w:r>
+        <w:rPr>
+          <w:rFonts w:ascii="Calibri" w:cs="Calibri" w:eastAsia="Calibri" w:hAnsi="Calibri"/>
+          <w:sz w:val="20"/>
+          <w:szCs w:val="20"/>
+        </w:rPr>
+        <w:t xml:space="preserve">Ausgespritztes Material sortenrein in Restmüllgebinde bzw. vorgeschriebene Container entsorgen.</w:t>
+      </w:r>
+    </w:p>
+    <w:p>
+      <w:pPr>
+        <w:spacing w:after="80" w:before="220"/>
+      </w:pPr>
+      <w:r>
+        <w:rPr>
+          <w:rFonts w:ascii="Calibri" w:cs="Calibri" w:eastAsia="Calibri" w:hAnsi="Calibri"/>
+          <w:b/>
+          <w:bCs/>
+          <w:sz w:val="20"/>
+          <w:szCs w:val="20"/>
+          <w:u w:val="single"/>
+        </w:rPr>
+        <w:t xml:space="preserve">8. Einfache Werkzeug-Wartungstätigkeiten – Spritzguss-spezifisch</w:t>
+      </w:r>
+    </w:p>
+    <w:p>
+      <w:pPr>
+        <w:spacing w:after="80"/>
+      </w:pPr>
+      <w:r>
+        <w:rPr>
+          <w:rFonts w:ascii="Calibri" w:cs="Calibri" w:eastAsia="Calibri" w:hAnsi="Calibri"/>
+          <w:b/>
+          <w:bCs/>
+          <w:sz w:val="20"/>
+          <w:szCs w:val="20"/>
+        </w:rPr>
+        <w:t xml:space="preserve">Aufgabe: </w:t>
+      </w:r>
+      <w:r>
+        <w:rPr>
+          <w:rFonts w:ascii="Calibri" w:cs="Calibri" w:eastAsia="Calibri" w:hAnsi="Calibri"/>
+          <w:sz w:val="20"/>
+          <w:szCs w:val="20"/>
+        </w:rPr>
+        <w:t xml:space="preserve">Durchführung einfacher Werkzeug-Wartungstätigkeiten am eingebauten Werkzeug (z. B. Reinigung, Schmierung beim Rüstvorgang). Tiefergehende Wartung, Reparatur und Instandhaltung obliegt der Teamleitung Werkzeugbau.</w:t>
+      </w:r>
+    </w:p>
+    <w:p>
+      <w:pPr>
+        <w:spacing w:after="80" w:before="220"/>
+      </w:pPr>
+      <w:r>
+        <w:rPr>
+          <w:rFonts w:ascii="Calibri" w:cs="Calibri" w:eastAsia="Calibri" w:hAnsi="Calibri"/>
+          <w:b/>
+          <w:bCs/>
+          <w:sz w:val="20"/>
+          <w:szCs w:val="20"/>
+          <w:u w:val="single"/>
+        </w:rPr>
+        <w:t xml:space="preserve">9. Schichtübergabe</w:t>
+      </w:r>
+    </w:p>
+    <w:p>
+      <w:pPr>
+        <w:spacing w:after="80"/>
+      </w:pPr>
+      <w:r>
+        <w:rPr>
+          <w:rFonts w:ascii="Calibri" w:cs="Calibri" w:eastAsia="Calibri" w:hAnsi="Calibri"/>
+          <w:b/>
+          <w:bCs/>
+          <w:sz w:val="20"/>
+          <w:szCs w:val="20"/>
+        </w:rPr>
+        <w:t xml:space="preserve">Aufgabe: </w:t>
+      </w:r>
+      <w:r>
+        <w:rPr>
+          <w:rFonts w:ascii="Calibri" w:cs="Calibri" w:eastAsia="Calibri" w:hAnsi="Calibri"/>
+          <w:sz w:val="20"/>
+          <w:szCs w:val="20"/>
+        </w:rPr>
+        <w:t xml:space="preserve">Durchführung der Schichtübergabe an den nachfolgenden Schichtführer: Weitergabe des aktuellen Produktions- und Qualitätsstatus je Maschine, offener Vorkommnisse und laufender Maßnahmen, dokumentiert im Schichtlogbuch (einziges Dokumentationsmittel für die Schichtübergabe).</w:t>
       </w:r>
     </w:p>
     <w:p>
@@ -2318,103 +2651,215 @@
           <w:sz w:val="22"/>
           <w:szCs w:val="22"/>
         </w:rPr>
-        <w:t xml:space="preserve">7.5.3.3 Aufgaben des Maschinenpersonals (Werker)</w:t>
-      </w:r>
-    </w:p>
-    <w:p>
-      <w:pPr>
-        <w:pStyle w:val="ListParagraph"/>
-        <w:numPr>
-          <w:ilvl w:val="0"/>
-          <w:numId w:val="2"/>
-        </w:numPr>
-        <w:spacing w:after="60"/>
-      </w:pPr>
-      <w:r>
-        <w:rPr>
-          <w:rFonts w:ascii="Calibri" w:cs="Calibri" w:eastAsia="Calibri" w:hAnsi="Calibri"/>
-        </w:rPr>
-        <w:t xml:space="preserve">Eigenverantwortliches Beurteilen der produzierten Teile lt. AAW</w:t>
-      </w:r>
-    </w:p>
-    <w:p>
-      <w:pPr>
-        <w:pStyle w:val="ListParagraph"/>
-        <w:numPr>
-          <w:ilvl w:val="0"/>
-          <w:numId w:val="2"/>
-        </w:numPr>
-        <w:spacing w:after="60"/>
-      </w:pPr>
-      <w:r>
-        <w:rPr>
-          <w:rFonts w:ascii="Calibri" w:cs="Calibri" w:eastAsia="Calibri" w:hAnsi="Calibri"/>
-        </w:rPr>
-        <w:t xml:space="preserve">Fehlermeldung bei niO Teilen an SF/PQB</w:t>
-      </w:r>
-    </w:p>
-    <w:p>
-      <w:pPr>
-        <w:pStyle w:val="ListParagraph"/>
-        <w:numPr>
-          <w:ilvl w:val="0"/>
-          <w:numId w:val="2"/>
-        </w:numPr>
-        <w:spacing w:after="60"/>
-      </w:pPr>
-      <w:r>
-        <w:rPr>
-          <w:rFonts w:ascii="Calibri" w:cs="Calibri" w:eastAsia="Calibri" w:hAnsi="Calibri"/>
-        </w:rPr>
-        <w:t xml:space="preserve">Beachten von zus. Q-Hinweisen z.B.: temp. AAW</w:t>
-      </w:r>
-    </w:p>
-    <w:p>
-      <w:pPr>
-        <w:pStyle w:val="ListParagraph"/>
-        <w:numPr>
-          <w:ilvl w:val="0"/>
-          <w:numId w:val="2"/>
-        </w:numPr>
-        <w:spacing w:after="60"/>
-      </w:pPr>
-      <w:r>
-        <w:rPr>
-          <w:rFonts w:ascii="Calibri" w:cs="Calibri" w:eastAsia="Calibri" w:hAnsi="Calibri"/>
-        </w:rPr>
-        <w:t xml:space="preserve">Teile entgraten oder montieren (lt. Anweisung)</w:t>
-      </w:r>
-    </w:p>
-    <w:p>
-      <w:pPr>
-        <w:pStyle w:val="ListParagraph"/>
-        <w:numPr>
-          <w:ilvl w:val="0"/>
-          <w:numId w:val="2"/>
-        </w:numPr>
-        <w:spacing w:after="60"/>
-      </w:pPr>
-      <w:r>
-        <w:rPr>
-          <w:rFonts w:ascii="Calibri" w:cs="Calibri" w:eastAsia="Calibri" w:hAnsi="Calibri"/>
-        </w:rPr>
-        <w:t xml:space="preserve">Teile verpacken, etikettieren lt. Verpackungsvorschrift</w:t>
-      </w:r>
-    </w:p>
-    <w:p>
-      <w:pPr>
-        <w:pStyle w:val="ListParagraph"/>
-        <w:numPr>
-          <w:ilvl w:val="0"/>
-          <w:numId w:val="2"/>
-        </w:numPr>
-        <w:spacing w:after="60"/>
-      </w:pPr>
-      <w:r>
-        <w:rPr>
-          <w:rFonts w:ascii="Calibri" w:cs="Calibri" w:eastAsia="Calibri" w:hAnsi="Calibri"/>
-        </w:rPr>
-        <w:t xml:space="preserve">Mitwirkung Erststück / Letztstückfreigabe</w:t>
+        <w:t xml:space="preserve">7.5.3.4 Teamleitung Montage</w:t>
+      </w:r>
+    </w:p>
+    <w:p>
+      <w:pPr>
+        <w:spacing w:after="100"/>
+      </w:pPr>
+      <w:r>
+        <w:rPr>
+          <w:rFonts w:ascii="Calibri" w:cs="Calibri" w:eastAsia="Calibri" w:hAnsi="Calibri"/>
+          <w:i/>
+          <w:iCs/>
+          <w:sz w:val="18"/>
+          <w:szCs w:val="18"/>
+        </w:rPr>
+        <w:t xml:space="preserve">Führungsrolle im Hauptprozess (siehe oben). Besonderheit gegenüber Teamleitung Spritzguss-Produktion: Die Teamleitung Montage arbeitet operativ mit (kein reines Führungs-/Überwachungsprofil).</w:t>
+      </w:r>
+    </w:p>
+    <w:p>
+      <w:pPr>
+        <w:spacing w:after="80" w:before="220"/>
+      </w:pPr>
+      <w:r>
+        <w:rPr>
+          <w:rFonts w:ascii="Calibri" w:cs="Calibri" w:eastAsia="Calibri" w:hAnsi="Calibri"/>
+          <w:b/>
+          <w:bCs/>
+          <w:sz w:val="20"/>
+          <w:szCs w:val="20"/>
+          <w:u w:val="single"/>
+        </w:rPr>
+        <w:t xml:space="preserve">1. Ausführung der Montagetätigkeiten</w:t>
+      </w:r>
+    </w:p>
+    <w:p>
+      <w:pPr>
+        <w:spacing w:after="80"/>
+      </w:pPr>
+      <w:r>
+        <w:rPr>
+          <w:rFonts w:ascii="Calibri" w:cs="Calibri" w:eastAsia="Calibri" w:hAnsi="Calibri"/>
+          <w:b/>
+          <w:bCs/>
+          <w:sz w:val="20"/>
+          <w:szCs w:val="20"/>
+        </w:rPr>
+        <w:t xml:space="preserve">Aufgabe: </w:t>
+      </w:r>
+      <w:r>
+        <w:rPr>
+          <w:rFonts w:ascii="Calibri" w:cs="Calibri" w:eastAsia="Calibri" w:hAnsi="Calibri"/>
+          <w:sz w:val="20"/>
+          <w:szCs w:val="20"/>
+        </w:rPr>
+        <w:t xml:space="preserve">Durchführung der Montagetätigkeiten – sowohl an manuellen Montagetischen als auch an Montageautomaten (integrierter Bestandteil der Montage, ebenfalls durch Montagepersonal betreut) – gemäß Produktions- bzw. Auftragsplanung. Bei Montageautomaten zusätzlich: Betrieb, Überprüfung des störungsfreien Betriebs, kleinere Wartungsarbeiten und Störungsmeldung an Instandhaltung.</w:t>
+      </w:r>
+    </w:p>
+    <w:p>
+      <w:pPr>
+        <w:spacing w:after="100"/>
+      </w:pPr>
+      <w:r>
+        <w:rPr>
+          <w:rFonts w:ascii="Calibri" w:cs="Calibri" w:eastAsia="Calibri" w:hAnsi="Calibri"/>
+          <w:i/>
+          <w:iCs/>
+          <w:sz w:val="18"/>
+          <w:szCs w:val="18"/>
+        </w:rPr>
+        <w:t xml:space="preserve">Abgrenzung zu Teamleitung Spritzguss-Produktion: Dort überwacht/parametriert die Teamleitung die Maschinen, die Werker führen die Handarbeiten aus. Bei Montage arbeitet die Teamleitung selbst aktiv operativ mit.</w:t>
+      </w:r>
+    </w:p>
+    <w:p>
+      <w:pPr>
+        <w:spacing w:after="80" w:before="220"/>
+      </w:pPr>
+      <w:r>
+        <w:rPr>
+          <w:rFonts w:ascii="Calibri" w:cs="Calibri" w:eastAsia="Calibri" w:hAnsi="Calibri"/>
+          <w:b/>
+          <w:bCs/>
+          <w:sz w:val="20"/>
+          <w:szCs w:val="20"/>
+          <w:u w:val="single"/>
+        </w:rPr>
+        <w:t xml:space="preserve">2. Qualitätskontrolle</w:t>
+      </w:r>
+    </w:p>
+    <w:p>
+      <w:pPr>
+        <w:spacing w:after="80"/>
+      </w:pPr>
+      <w:r>
+        <w:rPr>
+          <w:rFonts w:ascii="Calibri" w:cs="Calibri" w:eastAsia="Calibri" w:hAnsi="Calibri"/>
+          <w:b/>
+          <w:bCs/>
+          <w:sz w:val="20"/>
+          <w:szCs w:val="20"/>
+        </w:rPr>
+        <w:t xml:space="preserve">Aufgabe: </w:t>
+      </w:r>
+      <w:r>
+        <w:rPr>
+          <w:rFonts w:ascii="Calibri" w:cs="Calibri" w:eastAsia="Calibri" w:hAnsi="Calibri"/>
+          <w:sz w:val="20"/>
+          <w:szCs w:val="20"/>
+        </w:rPr>
+        <w:t xml:space="preserve">Qualitätskontrolle der montierten Produkte gemäß Arbeitsanweisung.</w:t>
+      </w:r>
+    </w:p>
+    <w:p>
+      <w:pPr>
+        <w:spacing w:after="80" w:before="220"/>
+      </w:pPr>
+      <w:r>
+        <w:rPr>
+          <w:rFonts w:ascii="Calibri" w:cs="Calibri" w:eastAsia="Calibri" w:hAnsi="Calibri"/>
+          <w:b/>
+          <w:bCs/>
+          <w:sz w:val="20"/>
+          <w:szCs w:val="20"/>
+          <w:u w:val="single"/>
+        </w:rPr>
+        <w:t xml:space="preserve">3. Materialbereitstellung am Arbeitsplatz</w:t>
+      </w:r>
+    </w:p>
+    <w:p>
+      <w:pPr>
+        <w:spacing w:after="120"/>
+      </w:pPr>
+      <w:r>
+        <w:rPr>
+          <w:rFonts w:ascii="Calibri" w:cs="Calibri" w:eastAsia="Calibri" w:hAnsi="Calibri"/>
+        </w:rPr>
+        <w:t xml:space="preserve">Die Montage verfügt über zwei bereichsnahe Lagerbereiche – ein Lager für Halbfertigfabrikate und ein vergleichsweise großes Kaufteilelager. Einlagerung, Organisation, Lagerstand und Kennzeichnung dieser Lagerbereiche erfolgen durch die Produktionslogistik, nicht durch die Montage.</w:t>
+      </w:r>
+    </w:p>
+    <w:p>
+      <w:pPr>
+        <w:spacing w:after="80"/>
+      </w:pPr>
+      <w:r>
+        <w:rPr>
+          <w:rFonts w:ascii="Calibri" w:cs="Calibri" w:eastAsia="Calibri" w:hAnsi="Calibri"/>
+          <w:b/>
+          <w:bCs/>
+          <w:sz w:val="20"/>
+          <w:szCs w:val="20"/>
+        </w:rPr>
+        <w:t xml:space="preserve">Aufgabe: </w:t>
+      </w:r>
+      <w:r>
+        <w:rPr>
+          <w:rFonts w:ascii="Calibri" w:cs="Calibri" w:eastAsia="Calibri" w:hAnsi="Calibri"/>
+          <w:sz w:val="20"/>
+          <w:szCs w:val="20"/>
+        </w:rPr>
+        <w:t xml:space="preserve">Entnahme der benötigten Materialien (Kaufteile, Halbfertigfabrikate) aus den bereichsnahen Regalen/Blocklagern zu den Montagetischen, für den aktuellen und die nachfolgenden Aufträge – durch Montage-Mitarbeiter und die Teamleitung Montage selbst.</w:t>
+      </w:r>
+    </w:p>
+    <w:p>
+      <w:pPr>
+        <w:spacing w:after="80" w:before="220"/>
+      </w:pPr>
+      <w:r>
+        <w:rPr>
+          <w:rFonts w:ascii="Calibri" w:cs="Calibri" w:eastAsia="Calibri" w:hAnsi="Calibri"/>
+          <w:b/>
+          <w:bCs/>
+          <w:sz w:val="20"/>
+          <w:szCs w:val="20"/>
+          <w:u w:val="single"/>
+        </w:rPr>
+        <w:t xml:space="preserve">4. Verpackung in Ausliefergebinde</w:t>
+      </w:r>
+    </w:p>
+    <w:p>
+      <w:pPr>
+        <w:spacing w:after="120"/>
+      </w:pPr>
+      <w:r>
+        <w:rPr>
+          <w:rFonts w:ascii="Calibri" w:cs="Calibri" w:eastAsia="Calibri" w:hAnsi="Calibri"/>
+        </w:rPr>
+        <w:t xml:space="preserve">Da sowohl an den Montagetischen als auch an den Montageautomaten größtenteils fertige, versandfähige Teile produziert werden, die direkt ins Versandlager und anschließend zum Kunden gehen, fällt bei einem Großteil der Montage-Teile die Verpackung an.</w:t>
+      </w:r>
+    </w:p>
+    <w:p>
+      <w:pPr>
+        <w:spacing w:after="80"/>
+      </w:pPr>
+      <w:r>
+        <w:rPr>
+          <w:rFonts w:ascii="Calibri" w:cs="Calibri" w:eastAsia="Calibri" w:hAnsi="Calibri"/>
+          <w:b/>
+          <w:bCs/>
+          <w:sz w:val="20"/>
+          <w:szCs w:val="20"/>
+        </w:rPr>
+        <w:t xml:space="preserve">Aufgabe: </w:t>
+      </w:r>
+      <w:r>
+        <w:rPr>
+          <w:rFonts w:ascii="Calibri" w:cs="Calibri" w:eastAsia="Calibri" w:hAnsi="Calibri"/>
+          <w:sz w:val="20"/>
+          <w:szCs w:val="20"/>
+        </w:rPr>
+        <w:t xml:space="preserve">Verpackung der fertigen Teile (aus Montagetischen und Montageautomaten) in die vorgesehenen Ausliefergebinde.</w:t>
       </w:r>
     </w:p>
     <w:p>
@@ -2429,119 +2874,111 @@
           <w:sz w:val="22"/>
           <w:szCs w:val="22"/>
         </w:rPr>
-        <w:t xml:space="preserve">7.5.3.4 Aufgaben Montage</w:t>
-      </w:r>
-    </w:p>
-    <w:p>
-      <w:pPr>
-        <w:pStyle w:val="ListParagraph"/>
-        <w:numPr>
-          <w:ilvl w:val="0"/>
-          <w:numId w:val="2"/>
-        </w:numPr>
-        <w:spacing w:after="60"/>
-      </w:pPr>
-      <w:r>
-        <w:rPr>
-          <w:rFonts w:ascii="Calibri" w:cs="Calibri" w:eastAsia="Calibri" w:hAnsi="Calibri"/>
-        </w:rPr>
-        <w:t xml:space="preserve">Durchführen der Fertigungsarbeiten an Produkten der Produktionsmaschinen lt. Produktions- bzw. Auftragsplanung</w:t>
-      </w:r>
-    </w:p>
-    <w:p>
-      <w:pPr>
-        <w:pStyle w:val="ListParagraph"/>
-        <w:numPr>
-          <w:ilvl w:val="0"/>
-          <w:numId w:val="2"/>
-        </w:numPr>
-        <w:spacing w:after="60"/>
-      </w:pPr>
-      <w:r>
-        <w:rPr>
-          <w:rFonts w:ascii="Calibri" w:cs="Calibri" w:eastAsia="Calibri" w:hAnsi="Calibri"/>
-        </w:rPr>
-        <w:t xml:space="preserve">Qualitätskontrolle der bearbeiteten Produkte lt. Arbeitsanweisung</w:t>
-      </w:r>
-    </w:p>
-    <w:p>
-      <w:pPr>
-        <w:pStyle w:val="ListParagraph"/>
-        <w:numPr>
-          <w:ilvl w:val="0"/>
-          <w:numId w:val="2"/>
-        </w:numPr>
-        <w:spacing w:after="60"/>
-      </w:pPr>
-      <w:r>
-        <w:rPr>
-          <w:rFonts w:ascii="Calibri" w:cs="Calibri" w:eastAsia="Calibri" w:hAnsi="Calibri"/>
-        </w:rPr>
-        <w:t xml:space="preserve">Organisation der Lagerbereiche, Lagerstand u. Kennzeichnung</w:t>
-      </w:r>
-    </w:p>
-    <w:p>
-      <w:pPr>
-        <w:pStyle w:val="ListParagraph"/>
-        <w:numPr>
-          <w:ilvl w:val="0"/>
-          <w:numId w:val="2"/>
-        </w:numPr>
-        <w:spacing w:after="60"/>
-      </w:pPr>
-      <w:r>
-        <w:rPr>
-          <w:rFonts w:ascii="Calibri" w:cs="Calibri" w:eastAsia="Calibri" w:hAnsi="Calibri"/>
-        </w:rPr>
-        <w:t xml:space="preserve">Verpackung der Produkte von Montageautomaten</w:t>
-      </w:r>
-    </w:p>
-    <w:p>
-      <w:pPr>
-        <w:pStyle w:val="ListParagraph"/>
-        <w:numPr>
-          <w:ilvl w:val="0"/>
-          <w:numId w:val="2"/>
-        </w:numPr>
-        <w:spacing w:after="60"/>
-      </w:pPr>
-      <w:r>
-        <w:rPr>
-          <w:rFonts w:ascii="Calibri" w:cs="Calibri" w:eastAsia="Calibri" w:hAnsi="Calibri"/>
-        </w:rPr>
-        <w:t xml:space="preserve">Meldung an PQB / WE-Kontrolle bei festgestellten NIO Teilen / Lieferungen von Unterlieferanten</w:t>
-      </w:r>
-    </w:p>
-    <w:p>
-      <w:pPr>
-        <w:pStyle w:val="ListParagraph"/>
-        <w:numPr>
-          <w:ilvl w:val="0"/>
-          <w:numId w:val="2"/>
-        </w:numPr>
-        <w:spacing w:after="60"/>
-      </w:pPr>
-      <w:r>
-        <w:rPr>
-          <w:rFonts w:ascii="Calibri" w:cs="Calibri" w:eastAsia="Calibri" w:hAnsi="Calibri"/>
-        </w:rPr>
-        <w:t xml:space="preserve">Sperren von fehlerhaften Produkten</w:t>
-      </w:r>
-    </w:p>
-    <w:p>
-      <w:pPr>
-        <w:pStyle w:val="ListParagraph"/>
-        <w:numPr>
-          <w:ilvl w:val="0"/>
-          <w:numId w:val="2"/>
-        </w:numPr>
-        <w:spacing w:after="60"/>
-      </w:pPr>
-      <w:r>
-        <w:rPr>
-          <w:rFonts w:ascii="Calibri" w:cs="Calibri" w:eastAsia="Calibri" w:hAnsi="Calibri"/>
-        </w:rPr>
-        <w:t xml:space="preserve">Erststück / Letztstückfreigabe</w:t>
+        <w:t xml:space="preserve">7.5.3.12 Teamleitung Endfertigung</w:t>
+      </w:r>
+    </w:p>
+    <w:p>
+      <w:pPr>
+        <w:spacing w:after="100"/>
+      </w:pPr>
+      <w:r>
+        <w:rPr>
+          <w:rFonts w:ascii="Calibri" w:cs="Calibri" w:eastAsia="Calibri" w:hAnsi="Calibri"/>
+          <w:i/>
+          <w:iCs/>
+          <w:sz w:val="18"/>
+          <w:szCs w:val="18"/>
+        </w:rPr>
+        <w:t xml:space="preserve">Führungsrolle im Hauptprozess (siehe oben); neuer Bereich, in Version k nicht enthalten. Teamleitung Endfertigung = Teamleitung Produktionskoordination in Personalunion, daher keine regelmäßige operative Mitarbeit wie bei Teamleitung Montage.</w:t>
+      </w:r>
+    </w:p>
+    <w:p>
+      <w:pPr>
+        <w:spacing w:after="80" w:before="220"/>
+      </w:pPr>
+      <w:r>
+        <w:rPr>
+          <w:rFonts w:ascii="Calibri" w:cs="Calibri" w:eastAsia="Calibri" w:hAnsi="Calibri"/>
+          <w:b/>
+          <w:bCs/>
+          <w:sz w:val="20"/>
+          <w:szCs w:val="20"/>
+          <w:u w:val="single"/>
+        </w:rPr>
+        <w:t xml:space="preserve">1. Aufgabenbereich Fertigungsschritte</w:t>
+      </w:r>
+    </w:p>
+    <w:p>
+      <w:pPr>
+        <w:spacing w:after="120"/>
+      </w:pPr>
+      <w:r>
+        <w:rPr>
+          <w:rFonts w:ascii="Calibri" w:cs="Calibri" w:eastAsia="Calibri" w:hAnsi="Calibri"/>
+        </w:rPr>
+        <w:t xml:space="preserve">Endfertigung übernimmt Fertigungsschritte, die nicht bereits im Spritzguss integriert sind – insbesondere nachträgliches Entgraten/Schleifen von Spritzgussteilen, Stanzen sowie Kleben von Zusatzteilen (unlösbares Fügen). Abgrenzung zu Montage: Montage komplettiert/fügt lösbar (z. B. Verschrauben), Endfertigung führt Fertigungsschritte aus bzw. fügt unlösbar. Der Aufgabenumfang ist dynamisch, da Fertigungsschritte nach Möglichkeit vorgelagert in den Spritzguss integriert werden.</w:t>
+      </w:r>
+    </w:p>
+    <w:p>
+      <w:pPr>
+        <w:spacing w:after="80"/>
+      </w:pPr>
+      <w:r>
+        <w:rPr>
+          <w:rFonts w:ascii="Calibri" w:cs="Calibri" w:eastAsia="Calibri" w:hAnsi="Calibri"/>
+          <w:b/>
+          <w:bCs/>
+          <w:sz w:val="20"/>
+          <w:szCs w:val="20"/>
+        </w:rPr>
+        <w:t xml:space="preserve">Aufgabe: </w:t>
+      </w:r>
+      <w:r>
+        <w:rPr>
+          <w:rFonts w:ascii="Calibri" w:cs="Calibri" w:eastAsia="Calibri" w:hAnsi="Calibri"/>
+          <w:sz w:val="20"/>
+          <w:szCs w:val="20"/>
+        </w:rPr>
+        <w:t xml:space="preserve">Im Unterschied zu Teamleitung Montage arbeitet die Teamleitung Endfertigung nicht regelmäßig operativ mit – sie übernimmt zusätzlich die Funktion Produktionskoordination (Personalunion). Operative Mitarbeit erfolgt nur ausnahmsweise bei Bedarfsspitzen, im Sinne ihrer Verantwortung für die Liefertreue.</w:t>
+      </w:r>
+    </w:p>
+    <w:p>
+      <w:pPr>
+        <w:spacing w:after="80" w:before="220"/>
+      </w:pPr>
+      <w:r>
+        <w:rPr>
+          <w:rFonts w:ascii="Calibri" w:cs="Calibri" w:eastAsia="Calibri" w:hAnsi="Calibri"/>
+          <w:b/>
+          <w:bCs/>
+          <w:sz w:val="20"/>
+          <w:szCs w:val="20"/>
+          <w:u w:val="single"/>
+        </w:rPr>
+        <w:t xml:space="preserve">2. Überwachung Produktionsparameter und Vormaterialien/Betriebsstoffe</w:t>
+      </w:r>
+    </w:p>
+    <w:p>
+      <w:pPr>
+        <w:spacing w:after="80"/>
+      </w:pPr>
+      <w:r>
+        <w:rPr>
+          <w:rFonts w:ascii="Calibri" w:cs="Calibri" w:eastAsia="Calibri" w:hAnsi="Calibri"/>
+          <w:b/>
+          <w:bCs/>
+          <w:sz w:val="20"/>
+          <w:szCs w:val="20"/>
+        </w:rPr>
+        <w:t xml:space="preserve">Aufgabe: </w:t>
+      </w:r>
+      <w:r>
+        <w:rPr>
+          <w:rFonts w:ascii="Calibri" w:cs="Calibri" w:eastAsia="Calibri" w:hAnsi="Calibri"/>
+          <w:sz w:val="20"/>
+          <w:szCs w:val="20"/>
+        </w:rPr>
+        <w:t xml:space="preserve">Überwachung und Einhaltung der Produktionsparameter sowie der ausschließlichen Verwendung geeigneter Vormaterialien/Betriebsstoffe – insbesondere Sicherstellung der Haltbarkeit/Gültigkeit des verwendeten Klebstoffs (kein Einsatz abgelaufener Klebstoffchargen).</w:t>
       </w:r>
     </w:p>
     <w:p>
@@ -2556,87 +2993,436 @@
           <w:sz w:val="22"/>
           <w:szCs w:val="22"/>
         </w:rPr>
-        <w:t xml:space="preserve">7.5.3.5 Aufgaben Boxenbauer</w:t>
-      </w:r>
-    </w:p>
-    <w:p>
-      <w:pPr>
-        <w:pStyle w:val="ListParagraph"/>
-        <w:numPr>
-          <w:ilvl w:val="0"/>
-          <w:numId w:val="2"/>
-        </w:numPr>
-        <w:spacing w:after="60"/>
-      </w:pPr>
-      <w:r>
-        <w:rPr>
-          <w:rFonts w:ascii="Calibri" w:cs="Calibri" w:eastAsia="Calibri" w:hAnsi="Calibri"/>
-        </w:rPr>
-        <w:t xml:space="preserve">Buchungen und Abtransport der Gebinde / Teile</w:t>
-      </w:r>
-    </w:p>
-    <w:p>
-      <w:pPr>
-        <w:pStyle w:val="ListParagraph"/>
-        <w:numPr>
-          <w:ilvl w:val="0"/>
-          <w:numId w:val="2"/>
-        </w:numPr>
-        <w:spacing w:after="60"/>
-      </w:pPr>
-      <w:r>
-        <w:rPr>
-          <w:rFonts w:ascii="Calibri" w:cs="Calibri" w:eastAsia="Calibri" w:hAnsi="Calibri"/>
-        </w:rPr>
-        <w:t xml:space="preserve">Unterstützende Mitarbeit im Produktionsbereich</w:t>
-      </w:r>
-    </w:p>
-    <w:p>
-      <w:pPr>
-        <w:pStyle w:val="ListParagraph"/>
-        <w:numPr>
-          <w:ilvl w:val="0"/>
-          <w:numId w:val="2"/>
-        </w:numPr>
-        <w:spacing w:after="60"/>
-      </w:pPr>
-      <w:r>
-        <w:rPr>
-          <w:rFonts w:ascii="Calibri" w:cs="Calibri" w:eastAsia="Calibri" w:hAnsi="Calibri"/>
-        </w:rPr>
-        <w:t xml:space="preserve">Qualitätsfreigabe der Leergebinde u. Verpackungsmaterial unter Berücksichtigung der Qualitätsvorschriften</w:t>
-      </w:r>
-    </w:p>
-    <w:p>
-      <w:pPr>
-        <w:pStyle w:val="ListParagraph"/>
-        <w:numPr>
-          <w:ilvl w:val="0"/>
-          <w:numId w:val="2"/>
-        </w:numPr>
-        <w:spacing w:after="60"/>
-      </w:pPr>
-      <w:r>
-        <w:rPr>
-          <w:rFonts w:ascii="Calibri" w:cs="Calibri" w:eastAsia="Calibri" w:hAnsi="Calibri"/>
-        </w:rPr>
-        <w:t xml:space="preserve">Übergabe der Restgebinde an das Lager (Artikelrest)</w:t>
-      </w:r>
-    </w:p>
-    <w:p>
-      <w:pPr>
-        <w:pStyle w:val="ListParagraph"/>
-        <w:numPr>
-          <w:ilvl w:val="0"/>
-          <w:numId w:val="2"/>
-        </w:numPr>
-        <w:spacing w:after="60"/>
-      </w:pPr>
-      <w:r>
-        <w:rPr>
-          <w:rFonts w:ascii="Calibri" w:cs="Calibri" w:eastAsia="Calibri" w:hAnsi="Calibri"/>
-        </w:rPr>
-        <w:t xml:space="preserve">Material Rückbuchungen durchführen</w:t>
+        <w:t xml:space="preserve">7.5.3.10 Teamleitung Lager</w:t>
+      </w:r>
+    </w:p>
+    <w:p>
+      <w:pPr>
+        <w:spacing w:after="100"/>
+      </w:pPr>
+      <w:r>
+        <w:rPr>
+          <w:rFonts w:ascii="Calibri" w:cs="Calibri" w:eastAsia="Calibri" w:hAnsi="Calibri"/>
+          <w:i/>
+          <w:iCs/>
+          <w:sz w:val="18"/>
+          <w:szCs w:val="18"/>
+        </w:rPr>
+        <w:t xml:space="preserve">Führungsrolle im Hauptprozess (siehe oben). Hinweis zum Umfang: Der Produktionsleiter ist nicht für die Lagerprozesse allgemein zuständig – hier wird nur der Teil beschrieben, der im Auftragsabwicklungsprozess der Produktion relevant ist.</w:t>
+      </w:r>
+    </w:p>
+    <w:p>
+      <w:pPr>
+        <w:spacing w:after="80" w:before="220"/>
+      </w:pPr>
+      <w:r>
+        <w:rPr>
+          <w:rFonts w:ascii="Calibri" w:cs="Calibri" w:eastAsia="Calibri" w:hAnsi="Calibri"/>
+          <w:b/>
+          <w:bCs/>
+          <w:sz w:val="20"/>
+          <w:szCs w:val="20"/>
+          <w:u w:val="single"/>
+        </w:rPr>
+        <w:t xml:space="preserve">1. Warenannahme und -ausgang</w:t>
+      </w:r>
+    </w:p>
+    <w:p>
+      <w:pPr>
+        <w:spacing w:after="80"/>
+      </w:pPr>
+      <w:r>
+        <w:rPr>
+          <w:rFonts w:ascii="Calibri" w:cs="Calibri" w:eastAsia="Calibri" w:hAnsi="Calibri"/>
+          <w:b/>
+          <w:bCs/>
+          <w:sz w:val="20"/>
+          <w:szCs w:val="20"/>
+        </w:rPr>
+        <w:t xml:space="preserve">Aufgabe: </w:t>
+      </w:r>
+      <w:r>
+        <w:rPr>
+          <w:rFonts w:ascii="Calibri" w:cs="Calibri" w:eastAsia="Calibri" w:hAnsi="Calibri"/>
+          <w:sz w:val="20"/>
+          <w:szCs w:val="20"/>
+        </w:rPr>
+        <w:t xml:space="preserve">Be- und Entladen von LKWs (Wareneingang/-ausgang); Kommissionierung und Versand der Aufträge.</w:t>
+      </w:r>
+    </w:p>
+    <w:p>
+      <w:pPr>
+        <w:spacing w:after="80" w:before="220"/>
+      </w:pPr>
+      <w:r>
+        <w:rPr>
+          <w:rFonts w:ascii="Calibri" w:cs="Calibri" w:eastAsia="Calibri" w:hAnsi="Calibri"/>
+          <w:b/>
+          <w:bCs/>
+          <w:sz w:val="20"/>
+          <w:szCs w:val="20"/>
+          <w:u w:val="single"/>
+        </w:rPr>
+        <w:t xml:space="preserve">2. Lagerorganisation</w:t>
+      </w:r>
+    </w:p>
+    <w:p>
+      <w:pPr>
+        <w:spacing w:after="80"/>
+      </w:pPr>
+      <w:r>
+        <w:rPr>
+          <w:rFonts w:ascii="Calibri" w:cs="Calibri" w:eastAsia="Calibri" w:hAnsi="Calibri"/>
+          <w:b/>
+          <w:bCs/>
+          <w:sz w:val="20"/>
+          <w:szCs w:val="20"/>
+        </w:rPr>
+        <w:t xml:space="preserve">Aufgabe: </w:t>
+      </w:r>
+      <w:r>
+        <w:rPr>
+          <w:rFonts w:ascii="Calibri" w:cs="Calibri" w:eastAsia="Calibri" w:hAnsi="Calibri"/>
+          <w:sz w:val="20"/>
+          <w:szCs w:val="20"/>
+        </w:rPr>
+        <w:t xml:space="preserve">Organisation der (zentralen) Lagerbereiche, Lagerstand und Kennzeichnung; Einlagerung der von den Produktionsbereichen (Spritzguss, Montage, Endfertigung) produzierten Ware.</w:t>
+      </w:r>
+    </w:p>
+    <w:p>
+      <w:pPr>
+        <w:spacing w:after="80" w:before="220"/>
+      </w:pPr>
+      <w:r>
+        <w:rPr>
+          <w:rFonts w:ascii="Calibri" w:cs="Calibri" w:eastAsia="Calibri" w:hAnsi="Calibri"/>
+          <w:b/>
+          <w:bCs/>
+          <w:sz w:val="20"/>
+          <w:szCs w:val="20"/>
+          <w:u w:val="single"/>
+        </w:rPr>
+        <w:t xml:space="preserve">3. Materialvorbereitung Spritzguss</w:t>
+      </w:r>
+    </w:p>
+    <w:p>
+      <w:pPr>
+        <w:spacing w:after="80"/>
+      </w:pPr>
+      <w:r>
+        <w:rPr>
+          <w:rFonts w:ascii="Calibri" w:cs="Calibri" w:eastAsia="Calibri" w:hAnsi="Calibri"/>
+          <w:b/>
+          <w:bCs/>
+          <w:sz w:val="20"/>
+          <w:szCs w:val="20"/>
+        </w:rPr>
+        <w:t xml:space="preserve">Aufgabe: </w:t>
+      </w:r>
+      <w:r>
+        <w:rPr>
+          <w:rFonts w:ascii="Calibri" w:cs="Calibri" w:eastAsia="Calibri" w:hAnsi="Calibri"/>
+          <w:sz w:val="20"/>
+          <w:szCs w:val="20"/>
+        </w:rPr>
+        <w:t xml:space="preserve">Vortrocknung und Bereitstellung der Rohstoffe (Granulat) sowie Verwaltung und Vorbereitung der Einlegeteile für den Spritzguss.</w:t>
+      </w:r>
+    </w:p>
+    <w:p>
+      <w:pPr>
+        <w:spacing w:after="80" w:before="220"/>
+      </w:pPr>
+      <w:r>
+        <w:rPr>
+          <w:rFonts w:ascii="Calibri" w:cs="Calibri" w:eastAsia="Calibri" w:hAnsi="Calibri"/>
+          <w:b/>
+          <w:bCs/>
+          <w:sz w:val="20"/>
+          <w:szCs w:val="20"/>
+          <w:u w:val="single"/>
+        </w:rPr>
+        <w:t xml:space="preserve">4. Administrative Tätigkeiten</w:t>
+      </w:r>
+    </w:p>
+    <w:p>
+      <w:pPr>
+        <w:spacing w:after="80"/>
+      </w:pPr>
+      <w:r>
+        <w:rPr>
+          <w:rFonts w:ascii="Calibri" w:cs="Calibri" w:eastAsia="Calibri" w:hAnsi="Calibri"/>
+          <w:b/>
+          <w:bCs/>
+          <w:sz w:val="20"/>
+          <w:szCs w:val="20"/>
+        </w:rPr>
+        <w:t xml:space="preserve">Aufgabe: </w:t>
+      </w:r>
+      <w:r>
+        <w:rPr>
+          <w:rFonts w:ascii="Calibri" w:cs="Calibri" w:eastAsia="Calibri" w:hAnsi="Calibri"/>
+          <w:sz w:val="20"/>
+          <w:szCs w:val="20"/>
+        </w:rPr>
+        <w:t xml:space="preserve">Buchungen im ERP-System (FOSS); Bestellanforderungen an den Einkauf; Bedarfsmeldung bei der Abfallentsorgung.</w:t>
+      </w:r>
+    </w:p>
+    <w:p>
+      <w:pPr>
+        <w:spacing w:after="80" w:before="220"/>
+      </w:pPr>
+      <w:r>
+        <w:rPr>
+          <w:rFonts w:ascii="Calibri" w:cs="Calibri" w:eastAsia="Calibri" w:hAnsi="Calibri"/>
+          <w:b/>
+          <w:bCs/>
+          <w:sz w:val="20"/>
+          <w:szCs w:val="20"/>
+          <w:u w:val="single"/>
+        </w:rPr>
+        <w:t xml:space="preserve">5. Transport gesperrter Ware</w:t>
+      </w:r>
+    </w:p>
+    <w:p>
+      <w:pPr>
+        <w:spacing w:after="80"/>
+      </w:pPr>
+      <w:r>
+        <w:rPr>
+          <w:rFonts w:ascii="Calibri" w:cs="Calibri" w:eastAsia="Calibri" w:hAnsi="Calibri"/>
+          <w:b/>
+          <w:bCs/>
+          <w:sz w:val="20"/>
+          <w:szCs w:val="20"/>
+        </w:rPr>
+        <w:t xml:space="preserve">Aufgabe: </w:t>
+      </w:r>
+      <w:r>
+        <w:rPr>
+          <w:rFonts w:ascii="Calibri" w:cs="Calibri" w:eastAsia="Calibri" w:hAnsi="Calibri"/>
+          <w:sz w:val="20"/>
+          <w:szCs w:val="20"/>
+        </w:rPr>
+        <w:t xml:space="preserve">Durchführung des Transports gesperrter Ware ins Gesperrt-Lager, auf Anweisung der jeweiligen Teamleitung/Schichtführung.</w:t>
+      </w:r>
+    </w:p>
+    <w:p>
+      <w:pPr>
+        <w:spacing w:after="80" w:before="220"/>
+      </w:pPr>
+      <w:r>
+        <w:rPr>
+          <w:rFonts w:ascii="Calibri" w:cs="Calibri" w:eastAsia="Calibri" w:hAnsi="Calibri"/>
+          <w:b/>
+          <w:bCs/>
+          <w:sz w:val="20"/>
+          <w:szCs w:val="20"/>
+          <w:u w:val="single"/>
+        </w:rPr>
+        <w:t xml:space="preserve">6. Gebinde-Versorgung</w:t>
+      </w:r>
+    </w:p>
+    <w:p>
+      <w:pPr>
+        <w:spacing w:after="80"/>
+      </w:pPr>
+      <w:r>
+        <w:rPr>
+          <w:rFonts w:ascii="Calibri" w:cs="Calibri" w:eastAsia="Calibri" w:hAnsi="Calibri"/>
+          <w:b/>
+          <w:bCs/>
+          <w:sz w:val="20"/>
+          <w:szCs w:val="20"/>
+        </w:rPr>
+        <w:t xml:space="preserve">Aufgabe: </w:t>
+      </w:r>
+      <w:r>
+        <w:rPr>
+          <w:rFonts w:ascii="Calibri" w:cs="Calibri" w:eastAsia="Calibri" w:hAnsi="Calibri"/>
+          <w:sz w:val="20"/>
+          <w:szCs w:val="20"/>
+        </w:rPr>
+        <w:t xml:space="preserve">Versorgung der Produktion mit Gebinden – bevorzugt möglichst direkt mit Ausliefergebinden, zur Vermeidung von Umpackaufwänden. Falls Auslieferbehälter nicht rechtzeitig zur Verfügung standen: Umpacken der Ware von internen Gebinden in Auslieferungsgebinde.</w:t>
+      </w:r>
+    </w:p>
+    <w:p>
+      <w:pPr>
+        <w:spacing w:after="80" w:before="220"/>
+      </w:pPr>
+      <w:r>
+        <w:rPr>
+          <w:rFonts w:ascii="Calibri" w:cs="Calibri" w:eastAsia="Calibri" w:hAnsi="Calibri"/>
+          <w:b/>
+          <w:bCs/>
+          <w:sz w:val="20"/>
+          <w:szCs w:val="20"/>
+          <w:u w:val="single"/>
+        </w:rPr>
+        <w:t xml:space="preserve">7. Kundenspezifische Komplettierungen (Ausnahmefall)</w:t>
+      </w:r>
+    </w:p>
+    <w:p>
+      <w:pPr>
+        <w:spacing w:after="120"/>
+      </w:pPr>
+      <w:r>
+        <w:rPr>
+          <w:rFonts w:ascii="Calibri" w:cs="Calibri" w:eastAsia="Calibri" w:hAnsi="Calibri"/>
+        </w:rPr>
+        <w:t xml:space="preserve">Um unnötigen Aufwand in der Produktion durch Varianten zu vermeiden (kundenspezifische Variantenbildung möglichst spät im Prozess), werden manche kleinere, kundenspezifische Komplettierungsschritte erst im Lager statt in der Montage durchgeführt.</w:t>
+      </w:r>
+    </w:p>
+    <w:p>
+      <w:pPr>
+        <w:spacing w:after="80"/>
+      </w:pPr>
+      <w:r>
+        <w:rPr>
+          <w:rFonts w:ascii="Calibri" w:cs="Calibri" w:eastAsia="Calibri" w:hAnsi="Calibri"/>
+          <w:b/>
+          <w:bCs/>
+          <w:sz w:val="20"/>
+          <w:szCs w:val="20"/>
+        </w:rPr>
+        <w:t xml:space="preserve">Aufgabe: </w:t>
+      </w:r>
+      <w:r>
+        <w:rPr>
+          <w:rFonts w:ascii="Calibri" w:cs="Calibri" w:eastAsia="Calibri" w:hAnsi="Calibri"/>
+          <w:sz w:val="20"/>
+          <w:szCs w:val="20"/>
+        </w:rPr>
+        <w:t xml:space="preserve">Selten Durchführung kleinerer, kundenspezifischer Komplettierungsschritte im Lager gemäß Arbeitsanweisung – eigentlich Montagetätigkeiten, die hier ausnahmsweise vor Versand erledigt werden.</w:t>
+      </w:r>
+    </w:p>
+    <w:p>
+      <w:pPr>
+        <w:pStyle w:val="Heading2"/>
+        <w:spacing w:after="120" w:before="240"/>
+      </w:pPr>
+      <w:r>
+        <w:rPr>
+          <w:rFonts w:ascii="Calibri" w:cs="Calibri" w:eastAsia="Calibri" w:hAnsi="Calibri"/>
+          <w:b/>
+          <w:bCs/>
+        </w:rPr>
+        <w:t xml:space="preserve">Gemeinsame AKV-Basis: Führungsrollen in Unterstützungsprozessen</w:t>
+      </w:r>
+    </w:p>
+    <w:p>
+      <w:pPr>
+        <w:spacing w:after="100"/>
+      </w:pPr>
+      <w:r>
+        <w:rPr>
+          <w:rFonts w:ascii="Calibri" w:cs="Calibri" w:eastAsia="Calibri" w:hAnsi="Calibri"/>
+          <w:i/>
+          <w:iCs/>
+          <w:sz w:val="18"/>
+          <w:szCs w:val="18"/>
+        </w:rPr>
+        <w:t xml:space="preserve">Gilt für Teamleitung Instandhaltung und Teamleitung Werkzeugbau – Fach-/Führungsrollen, die Ressourcen/Betriebsmittel bereitstellen bzw. betriebsbereit halten, aber nicht Teil des Material-/Auftragsflusses selbst sind (im Unterschied zu den Rollen oben).</w:t>
+      </w:r>
+    </w:p>
+    <w:p>
+      <w:pPr>
+        <w:spacing w:after="80" w:before="220"/>
+      </w:pPr>
+      <w:r>
+        <w:rPr>
+          <w:rFonts w:ascii="Calibri" w:cs="Calibri" w:eastAsia="Calibri" w:hAnsi="Calibri"/>
+          <w:b/>
+          <w:bCs/>
+          <w:sz w:val="20"/>
+          <w:szCs w:val="20"/>
+          <w:u w:val="single"/>
+        </w:rPr>
+        <w:t xml:space="preserve">A. Personalverantwortung</w:t>
+      </w:r>
+    </w:p>
+    <w:p>
+      <w:pPr>
+        <w:spacing w:after="80"/>
+      </w:pPr>
+      <w:r>
+        <w:rPr>
+          <w:rFonts w:ascii="Calibri" w:cs="Calibri" w:eastAsia="Calibri" w:hAnsi="Calibri"/>
+          <w:b/>
+          <w:bCs/>
+          <w:sz w:val="20"/>
+          <w:szCs w:val="20"/>
+        </w:rPr>
+        <w:t xml:space="preserve">Verantwortung: </w:t>
+      </w:r>
+      <w:r>
+        <w:rPr>
+          <w:rFonts w:ascii="Calibri" w:cs="Calibri" w:eastAsia="Calibri" w:hAnsi="Calibri"/>
+          <w:sz w:val="20"/>
+          <w:szCs w:val="20"/>
+        </w:rPr>
+        <w:t xml:space="preserve">Personalverantwortung für die unterstellten Mitarbeiter des Bereichs, inkl. Sicherheit, Ordnung und Sauberkeit am Arbeitsplatz. Erstverantwortung für disziplinarische Maßnahmen (Produktionsleiter als Eskalationsstufe).</w:t>
+      </w:r>
+    </w:p>
+    <w:p>
+      <w:pPr>
+        <w:spacing w:after="80"/>
+      </w:pPr>
+      <w:r>
+        <w:rPr>
+          <w:rFonts w:ascii="Calibri" w:cs="Calibri" w:eastAsia="Calibri" w:hAnsi="Calibri"/>
+          <w:b/>
+          <w:bCs/>
+          <w:sz w:val="20"/>
+          <w:szCs w:val="20"/>
+        </w:rPr>
+        <w:t xml:space="preserve">Aufgabe: </w:t>
+      </w:r>
+      <w:r>
+        <w:rPr>
+          <w:rFonts w:ascii="Calibri" w:cs="Calibri" w:eastAsia="Calibri" w:hAnsi="Calibri"/>
+          <w:sz w:val="20"/>
+          <w:szCs w:val="20"/>
+        </w:rPr>
+        <w:t xml:space="preserve">Personalführung des Bereichs (Einteilung, Feedback, Konfliktmanagement).</w:t>
+      </w:r>
+    </w:p>
+    <w:p>
+      <w:pPr>
+        <w:spacing w:after="80" w:before="220"/>
+      </w:pPr>
+      <w:r>
+        <w:rPr>
+          <w:rFonts w:ascii="Calibri" w:cs="Calibri" w:eastAsia="Calibri" w:hAnsi="Calibri"/>
+          <w:b/>
+          <w:bCs/>
+          <w:sz w:val="20"/>
+          <w:szCs w:val="20"/>
+          <w:u w:val="single"/>
+        </w:rPr>
+        <w:t xml:space="preserve">B. Aufgabenliste als zentraler Eingangskanal</w:t>
+      </w:r>
+    </w:p>
+    <w:p>
+      <w:pPr>
+        <w:spacing w:after="80"/>
+      </w:pPr>
+      <w:r>
+        <w:rPr>
+          <w:rFonts w:ascii="Calibri" w:cs="Calibri" w:eastAsia="Calibri" w:hAnsi="Calibri"/>
+          <w:b/>
+          <w:bCs/>
+          <w:sz w:val="20"/>
+          <w:szCs w:val="20"/>
+        </w:rPr>
+        <w:t xml:space="preserve">Aufgabe: </w:t>
+      </w:r>
+      <w:r>
+        <w:rPr>
+          <w:rFonts w:ascii="Calibri" w:cs="Calibri" w:eastAsia="Calibri" w:hAnsi="Calibri"/>
+          <w:sz w:val="20"/>
+          <w:szCs w:val="20"/>
+        </w:rPr>
+        <w:t xml:space="preserve">Abarbeitung/Priorisierung der Aufgabenliste, in die verschiedene Stakeholder (andere Teamleitungen, Produktionsleitung) Störungen/Anliegen eintragen.</w:t>
       </w:r>
     </w:p>
     <w:p>
@@ -2651,167 +3437,286 @@
           <w:sz w:val="22"/>
           <w:szCs w:val="22"/>
         </w:rPr>
-        <w:t xml:space="preserve">7.5.3.6 Aufgaben Produktionslogistiker</w:t>
-      </w:r>
-    </w:p>
-    <w:p>
-      <w:pPr>
-        <w:pStyle w:val="ListParagraph"/>
-        <w:numPr>
-          <w:ilvl w:val="0"/>
-          <w:numId w:val="2"/>
-        </w:numPr>
-        <w:spacing w:after="60"/>
-      </w:pPr>
-      <w:r>
-        <w:rPr>
-          <w:rFonts w:ascii="Calibri" w:cs="Calibri" w:eastAsia="Calibri" w:hAnsi="Calibri"/>
-        </w:rPr>
-        <w:t xml:space="preserve">Verwaltung, Sicherstellung der Versorgung mit Zukaufteilen, Kartonagen und internen Leergebinden</w:t>
-      </w:r>
-    </w:p>
-    <w:p>
-      <w:pPr>
-        <w:pStyle w:val="ListParagraph"/>
-        <w:numPr>
-          <w:ilvl w:val="0"/>
-          <w:numId w:val="2"/>
-        </w:numPr>
-        <w:spacing w:after="60"/>
-      </w:pPr>
-      <w:r>
-        <w:rPr>
-          <w:rFonts w:ascii="Calibri" w:cs="Calibri" w:eastAsia="Calibri" w:hAnsi="Calibri"/>
-        </w:rPr>
-        <w:t xml:space="preserve">Durchführen von Reinigungsarbeiten wie Blecheinleger, Buchsen, Schrauben, Gebinde, …</w:t>
-      </w:r>
-    </w:p>
-    <w:p>
-      <w:pPr>
-        <w:pStyle w:val="ListParagraph"/>
-        <w:numPr>
-          <w:ilvl w:val="0"/>
-          <w:numId w:val="2"/>
-        </w:numPr>
-        <w:spacing w:after="60"/>
-      </w:pPr>
-      <w:r>
-        <w:rPr>
-          <w:rFonts w:ascii="Calibri" w:cs="Calibri" w:eastAsia="Calibri" w:hAnsi="Calibri"/>
-        </w:rPr>
-        <w:t xml:space="preserve">Zu- und Abtransport von HF und FT-Teile (Gebinde) aus der Montage</w:t>
-      </w:r>
-    </w:p>
-    <w:p>
-      <w:pPr>
-        <w:pStyle w:val="ListParagraph"/>
-        <w:numPr>
-          <w:ilvl w:val="0"/>
-          <w:numId w:val="2"/>
-        </w:numPr>
-        <w:spacing w:after="60"/>
-      </w:pPr>
-      <w:r>
-        <w:rPr>
-          <w:rFonts w:ascii="Calibri" w:cs="Calibri" w:eastAsia="Calibri" w:hAnsi="Calibri"/>
-        </w:rPr>
-        <w:t xml:space="preserve">Übergabe der Versandeinheiten an das Lager auf definierten Platz</w:t>
-      </w:r>
-    </w:p>
-    <w:p>
-      <w:pPr>
-        <w:pStyle w:val="ListParagraph"/>
-        <w:numPr>
-          <w:ilvl w:val="0"/>
-          <w:numId w:val="2"/>
-        </w:numPr>
-        <w:spacing w:after="60"/>
-      </w:pPr>
-      <w:r>
-        <w:rPr>
-          <w:rFonts w:ascii="Calibri" w:cs="Calibri" w:eastAsia="Calibri" w:hAnsi="Calibri"/>
-        </w:rPr>
-        <w:t xml:space="preserve">Bereitstellung von Leergebinde u. Verpackungsmaterial in der Montage</w:t>
-      </w:r>
-    </w:p>
-    <w:p>
-      <w:pPr>
-        <w:pStyle w:val="ListParagraph"/>
-        <w:numPr>
-          <w:ilvl w:val="0"/>
-          <w:numId w:val="2"/>
-        </w:numPr>
-        <w:spacing w:after="60"/>
-      </w:pPr>
-      <w:r>
-        <w:rPr>
-          <w:rFonts w:ascii="Calibri" w:cs="Calibri" w:eastAsia="Calibri" w:hAnsi="Calibri"/>
-        </w:rPr>
-        <w:t xml:space="preserve">Buchungen prüfen und durchführen von Korrekturen</w:t>
-      </w:r>
-    </w:p>
-    <w:p>
-      <w:pPr>
-        <w:pStyle w:val="ListParagraph"/>
-        <w:numPr>
-          <w:ilvl w:val="0"/>
-          <w:numId w:val="2"/>
-        </w:numPr>
-        <w:spacing w:after="60"/>
-      </w:pPr>
-      <w:r>
-        <w:rPr>
-          <w:rFonts w:ascii="Calibri" w:cs="Calibri" w:eastAsia="Calibri" w:hAnsi="Calibri"/>
-        </w:rPr>
-        <w:t xml:space="preserve">Korrektur und Rückmeldung von falschen Gewichtsangaben</w:t>
-      </w:r>
-    </w:p>
-    <w:p>
-      <w:pPr>
-        <w:pStyle w:val="ListParagraph"/>
-        <w:numPr>
-          <w:ilvl w:val="0"/>
-          <w:numId w:val="2"/>
-        </w:numPr>
-        <w:spacing w:after="60"/>
-      </w:pPr>
-      <w:r>
-        <w:rPr>
-          <w:rFonts w:ascii="Calibri" w:cs="Calibri" w:eastAsia="Calibri" w:hAnsi="Calibri"/>
-        </w:rPr>
-        <w:t xml:space="preserve">Kommunikation mit Lagerverantwortlichen bei Abweichungen durchführen</w:t>
-      </w:r>
-    </w:p>
-    <w:p>
-      <w:pPr>
-        <w:pStyle w:val="ListParagraph"/>
-        <w:numPr>
-          <w:ilvl w:val="0"/>
-          <w:numId w:val="2"/>
-        </w:numPr>
-        <w:spacing w:after="60"/>
-      </w:pPr>
-      <w:r>
-        <w:rPr>
-          <w:rFonts w:ascii="Calibri" w:cs="Calibri" w:eastAsia="Calibri" w:hAnsi="Calibri"/>
-        </w:rPr>
-        <w:t xml:space="preserve">Abschließen von Produktionsaufträgen im System</w:t>
-      </w:r>
-    </w:p>
-    <w:p>
-      <w:pPr>
-        <w:pStyle w:val="ListParagraph"/>
-        <w:numPr>
-          <w:ilvl w:val="0"/>
-          <w:numId w:val="2"/>
-        </w:numPr>
-        <w:spacing w:after="60"/>
-      </w:pPr>
-      <w:r>
-        <w:rPr>
-          <w:rFonts w:ascii="Calibri" w:cs="Calibri" w:eastAsia="Calibri" w:hAnsi="Calibri"/>
-        </w:rPr>
-        <w:t xml:space="preserve">Abwiegen und Entsorgen / Zuführen von Ausschüssen (Recyclingmaterial), Papier, Kartonagen in allen Bereichen</w:t>
+        <w:t xml:space="preserve">7.5.3.13 Teamleitung Instandhaltung</w:t>
+      </w:r>
+    </w:p>
+    <w:p>
+      <w:pPr>
+        <w:spacing w:after="100"/>
+      </w:pPr>
+      <w:r>
+        <w:rPr>
+          <w:rFonts w:ascii="Calibri" w:cs="Calibri" w:eastAsia="Calibri" w:hAnsi="Calibri"/>
+          <w:i/>
+          <w:iCs/>
+          <w:sz w:val="18"/>
+          <w:szCs w:val="18"/>
+        </w:rPr>
+        <w:t xml:space="preserve">Fach-/Führungsrolle in Unterstützungsprozessen (siehe oben); neue Rolle, in Version k nicht enthalten. Zuständig für Maschinen, Anlagen und Infrastruktur inkl. Betriebsmittel, Fertigungshilfsmittel, Roboter und automatisierte Anlagen. Berichtet im Regelbetrieb direkt an den Produktionsleiter.</w:t>
+      </w:r>
+    </w:p>
+    <w:p>
+      <w:pPr>
+        <w:spacing w:after="80" w:before="220"/>
+      </w:pPr>
+      <w:r>
+        <w:rPr>
+          <w:rFonts w:ascii="Calibri" w:cs="Calibri" w:eastAsia="Calibri" w:hAnsi="Calibri"/>
+          <w:b/>
+          <w:bCs/>
+          <w:sz w:val="20"/>
+          <w:szCs w:val="20"/>
+          <w:u w:val="single"/>
+        </w:rPr>
+        <w:t xml:space="preserve">1. Instandhaltungssystem</w:t>
+      </w:r>
+    </w:p>
+    <w:p>
+      <w:pPr>
+        <w:spacing w:after="80"/>
+      </w:pPr>
+      <w:r>
+        <w:rPr>
+          <w:rFonts w:ascii="Calibri" w:cs="Calibri" w:eastAsia="Calibri" w:hAnsi="Calibri"/>
+          <w:b/>
+          <w:bCs/>
+          <w:sz w:val="20"/>
+          <w:szCs w:val="20"/>
+        </w:rPr>
+        <w:t xml:space="preserve">Verantwortung: </w:t>
+      </w:r>
+      <w:r>
+        <w:rPr>
+          <w:rFonts w:ascii="Calibri" w:cs="Calibri" w:eastAsia="Calibri" w:hAnsi="Calibri"/>
+          <w:sz w:val="20"/>
+          <w:szCs w:val="20"/>
+        </w:rPr>
+        <w:t xml:space="preserve">Betrieb eines dokumentierten, geplanten Instandhaltungssystems für die prozessrelevanten Anlagen; Einhaltung sicherheitstechnischer und gesetzlicher Bestimmungen.</w:t>
+      </w:r>
+    </w:p>
+    <w:p>
+      <w:pPr>
+        <w:spacing w:after="40" w:before="40"/>
+      </w:pPr>
+      <w:r>
+        <w:rPr>
+          <w:rFonts w:ascii="Calibri" w:cs="Calibri" w:eastAsia="Calibri" w:hAnsi="Calibri"/>
+          <w:b/>
+          <w:bCs/>
+          <w:sz w:val="20"/>
+          <w:szCs w:val="20"/>
+        </w:rPr>
+        <w:t xml:space="preserve">Aufgabe:</w:t>
+      </w:r>
+    </w:p>
+    <w:p>
+      <w:pPr>
+        <w:pStyle w:val="ListParagraph"/>
+        <w:numPr>
+          <w:ilvl w:val="0"/>
+          <w:numId w:val="2"/>
+        </w:numPr>
+        <w:spacing w:after="60"/>
+      </w:pPr>
+      <w:r>
+        <w:rPr>
+          <w:rFonts w:ascii="Calibri" w:cs="Calibri" w:eastAsia="Calibri" w:hAnsi="Calibri"/>
+        </w:rPr>
+        <w:t xml:space="preserve">Durchführung von Reparaturen an Anlagen, Maschinen, Infrastruktur und Betriebsmitteln (reaktive Instandsetzung)</w:t>
+      </w:r>
+    </w:p>
+    <w:p>
+      <w:pPr>
+        <w:pStyle w:val="ListParagraph"/>
+        <w:numPr>
+          <w:ilvl w:val="0"/>
+          <w:numId w:val="2"/>
+        </w:numPr>
+        <w:spacing w:after="60"/>
+      </w:pPr>
+      <w:r>
+        <w:rPr>
+          <w:rFonts w:ascii="Calibri" w:cs="Calibri" w:eastAsia="Calibri" w:hAnsi="Calibri"/>
+        </w:rPr>
+        <w:t xml:space="preserve">Planung, Anfertigung und Installation neuer/geänderter Betriebsmittel (z. B. Vorrichtungen, Anbaugeräte, Temperiergeräte)</w:t>
+      </w:r>
+    </w:p>
+    <w:p>
+      <w:pPr>
+        <w:pStyle w:val="ListParagraph"/>
+        <w:numPr>
+          <w:ilvl w:val="0"/>
+          <w:numId w:val="2"/>
+        </w:numPr>
+        <w:spacing w:after="60"/>
+      </w:pPr>
+      <w:r>
+        <w:rPr>
+          <w:rFonts w:ascii="Calibri" w:cs="Calibri" w:eastAsia="Calibri" w:hAnsi="Calibri"/>
+        </w:rPr>
+        <w:t xml:space="preserve">Optimierung bestehender Anlagen</w:t>
+      </w:r>
+    </w:p>
+    <w:p>
+      <w:pPr>
+        <w:pStyle w:val="ListParagraph"/>
+        <w:numPr>
+          <w:ilvl w:val="0"/>
+          <w:numId w:val="2"/>
+        </w:numPr>
+        <w:spacing w:after="60"/>
+      </w:pPr>
+      <w:r>
+        <w:rPr>
+          <w:rFonts w:ascii="Calibri" w:cs="Calibri" w:eastAsia="Calibri" w:hAnsi="Calibri"/>
+        </w:rPr>
+        <w:t xml:space="preserve">Mitwirkung an KVP/5S/Kaizen</w:t>
+      </w:r>
+    </w:p>
+    <w:p>
+      <w:pPr>
+        <w:pStyle w:val="ListParagraph"/>
+        <w:numPr>
+          <w:ilvl w:val="0"/>
+          <w:numId w:val="2"/>
+        </w:numPr>
+        <w:spacing w:after="60"/>
+      </w:pPr>
+      <w:r>
+        <w:rPr>
+          <w:rFonts w:ascii="Calibri" w:cs="Calibri" w:eastAsia="Calibri" w:hAnsi="Calibri"/>
+        </w:rPr>
+        <w:t xml:space="preserve">Vorausschauende und ggf. vorbeugende Instandhaltung nach Wartungsplan</w:t>
+      </w:r>
+    </w:p>
+    <w:p>
+      <w:pPr>
+        <w:pStyle w:val="ListParagraph"/>
+        <w:numPr>
+          <w:ilvl w:val="0"/>
+          <w:numId w:val="2"/>
+        </w:numPr>
+        <w:spacing w:after="60"/>
+      </w:pPr>
+      <w:r>
+        <w:rPr>
+          <w:rFonts w:ascii="Calibri" w:cs="Calibri" w:eastAsia="Calibri" w:hAnsi="Calibri"/>
+        </w:rPr>
+        <w:t xml:space="preserve">Verwaltung von Ersatzteilen für Schlüsselanlagen, inkl. ordnungsgemäßer Lagerung (Verpackung, Konservierung)</w:t>
+      </w:r>
+    </w:p>
+    <w:p>
+      <w:pPr>
+        <w:pStyle w:val="ListParagraph"/>
+        <w:numPr>
+          <w:ilvl w:val="0"/>
+          <w:numId w:val="2"/>
+        </w:numPr>
+        <w:spacing w:after="60"/>
+      </w:pPr>
+      <w:r>
+        <w:rPr>
+          <w:rFonts w:ascii="Calibri" w:cs="Calibri" w:eastAsia="Calibri" w:hAnsi="Calibri"/>
+        </w:rPr>
+        <w:t xml:space="preserve">Jährliche Überprüfung des Wartungsplans</w:t>
+      </w:r>
+    </w:p>
+    <w:p>
+      <w:pPr>
+        <w:pStyle w:val="ListParagraph"/>
+        <w:numPr>
+          <w:ilvl w:val="0"/>
+          <w:numId w:val="2"/>
+        </w:numPr>
+        <w:spacing w:after="60"/>
+      </w:pPr>
+      <w:r>
+        <w:rPr>
+          <w:rFonts w:ascii="Calibri" w:cs="Calibri" w:eastAsia="Calibri" w:hAnsi="Calibri"/>
+        </w:rPr>
+        <w:t xml:space="preserve">Anlage und Pflege der Objektstammdaten (FOSS) für alle relevanten Anlagen, Betriebsmittel, Vorrichtungen etc.</w:t>
+      </w:r>
+    </w:p>
+    <w:p>
+      <w:pPr>
+        <w:pStyle w:val="ListParagraph"/>
+        <w:numPr>
+          <w:ilvl w:val="0"/>
+          <w:numId w:val="2"/>
+        </w:numPr>
+        <w:spacing w:after="60"/>
+      </w:pPr>
+      <w:r>
+        <w:rPr>
+          <w:rFonts w:ascii="Calibri" w:cs="Calibri" w:eastAsia="Calibri" w:hAnsi="Calibri"/>
+        </w:rPr>
+        <w:t xml:space="preserve">Beauftragung und Beaufsichtigung relevanter Prüfstellen für gesetzlich vorgeschriebene Prüfungen (z. B. Leitern, Hebezeuge, Anschlagmittel)</w:t>
+      </w:r>
+    </w:p>
+    <w:p>
+      <w:pPr>
+        <w:pStyle w:val="ListParagraph"/>
+        <w:numPr>
+          <w:ilvl w:val="0"/>
+          <w:numId w:val="2"/>
+        </w:numPr>
+        <w:spacing w:after="60"/>
+      </w:pPr>
+      <w:r>
+        <w:rPr>
+          <w:rFonts w:ascii="Calibri" w:cs="Calibri" w:eastAsia="Calibri" w:hAnsi="Calibri"/>
+        </w:rPr>
+        <w:t xml:space="preserve">Abarbeitung der Aufgabenliste (Störungsmeldungen)</w:t>
+      </w:r>
+    </w:p>
+    <w:p>
+      <w:pPr>
+        <w:spacing w:after="80"/>
+      </w:pPr>
+      <w:r>
+        <w:rPr>
+          <w:rFonts w:ascii="Calibri" w:cs="Calibri" w:eastAsia="Calibri" w:hAnsi="Calibri"/>
+          <w:b/>
+          <w:bCs/>
+          <w:sz w:val="20"/>
+          <w:szCs w:val="20"/>
+        </w:rPr>
+        <w:t xml:space="preserve">Kompetenz: </w:t>
+      </w:r>
+      <w:r>
+        <w:rPr>
+          <w:rFonts w:ascii="Calibri" w:cs="Calibri" w:eastAsia="Calibri" w:hAnsi="Calibri"/>
+          <w:sz w:val="20"/>
+          <w:szCs w:val="20"/>
+        </w:rPr>
+        <w:t xml:space="preserve">Festlegung von Instandhaltungszielen/-kennzahlen (z. B. OEE, MTBF, MTTR); bei Gefahr im Verzug Anlagen abstellen (Not-Halt-Kompetenz), mit Informationspflicht an die vorgesetzte Stelle. Meldepflicht bei Anlagenstörungen/Unfällen an die vorgesetzte Stelle.</w:t>
+      </w:r>
+    </w:p>
+    <w:p>
+      <w:pPr>
+        <w:spacing w:after="80" w:before="220"/>
+      </w:pPr>
+      <w:r>
+        <w:rPr>
+          <w:rFonts w:ascii="Calibri" w:cs="Calibri" w:eastAsia="Calibri" w:hAnsi="Calibri"/>
+          <w:b/>
+          <w:bCs/>
+          <w:sz w:val="20"/>
+          <w:szCs w:val="20"/>
+          <w:u w:val="single"/>
+        </w:rPr>
+        <w:t xml:space="preserve">2. Abgrenzung zu Hersteller und Automatisierung</w:t>
+      </w:r>
+    </w:p>
+    <w:p>
+      <w:pPr>
+        <w:spacing w:after="120"/>
+      </w:pPr>
+      <w:r>
+        <w:rPr>
+          <w:rFonts w:ascii="Calibri" w:cs="Calibri" w:eastAsia="Calibri" w:hAnsi="Calibri"/>
+        </w:rPr>
+        <w:t xml:space="preserve">Instandhaltung deckt Wartung/Reparatur im Rahmen der eigenen Kapazitäten und Fachkenntnisse ab. Bei Reparaturen, die spezielles Herstellerwissen/-ersatzteile erfordern, erfolgt eine Beauftragung/Koordination mit dem jeweiligen Anlagenhersteller. Bei automatisierten Anlagen: mechanische/elektrische Instandhaltung liegt bei Instandhaltung, Programmierung/Konfiguration und tiefergehende automatisierungstechnische Themen liegen bei der Rolle Automatisierung.</w:t>
       </w:r>
     </w:p>
     <w:p>
@@ -2826,183 +3731,290 @@
           <w:sz w:val="22"/>
           <w:szCs w:val="22"/>
         </w:rPr>
-        <w:t xml:space="preserve">7.5.3.7 Aufgaben Produktionsplanung</w:t>
-      </w:r>
-    </w:p>
-    <w:p>
-      <w:pPr>
-        <w:pStyle w:val="ListParagraph"/>
-        <w:numPr>
-          <w:ilvl w:val="0"/>
-          <w:numId w:val="2"/>
-        </w:numPr>
-        <w:spacing w:after="60"/>
-      </w:pPr>
-      <w:r>
-        <w:rPr>
-          <w:rFonts w:ascii="Calibri" w:cs="Calibri" w:eastAsia="Calibri" w:hAnsi="Calibri"/>
-        </w:rPr>
-        <w:t xml:space="preserve">Produktionsfeinplanung</w:t>
-      </w:r>
-    </w:p>
-    <w:p>
-      <w:pPr>
-        <w:pStyle w:val="ListParagraph"/>
-        <w:numPr>
-          <w:ilvl w:val="0"/>
-          <w:numId w:val="2"/>
-        </w:numPr>
-        <w:spacing w:after="60"/>
-      </w:pPr>
-      <w:r>
-        <w:rPr>
-          <w:rFonts w:ascii="Calibri" w:cs="Calibri" w:eastAsia="Calibri" w:hAnsi="Calibri"/>
-        </w:rPr>
-        <w:t xml:space="preserve">Zusammenarbeit mit und Unterstützung der Arbeitsvorbereitung (Mithilfe der Personaleinsatzplanung/Einsteuerung der Reparaturen und Wartungen von den Werkzeugen)</w:t>
-      </w:r>
-    </w:p>
-    <w:p>
-      <w:pPr>
-        <w:pStyle w:val="ListParagraph"/>
-        <w:numPr>
-          <w:ilvl w:val="0"/>
-          <w:numId w:val="2"/>
-        </w:numPr>
-        <w:spacing w:after="60"/>
-      </w:pPr>
-      <w:r>
-        <w:rPr>
-          <w:rFonts w:ascii="Calibri" w:cs="Calibri" w:eastAsia="Calibri" w:hAnsi="Calibri"/>
-        </w:rPr>
-        <w:t xml:space="preserve">Aktive Mitarbeit bei der Optimierung von Prozessen und Maßnahmen zur Qualitäts- oder Wirtschaftlichkeitsverbesserung</w:t>
-      </w:r>
-    </w:p>
-    <w:p>
-      <w:pPr>
-        <w:pStyle w:val="ListParagraph"/>
-        <w:numPr>
-          <w:ilvl w:val="0"/>
-          <w:numId w:val="2"/>
-        </w:numPr>
-        <w:spacing w:after="60"/>
-      </w:pPr>
-      <w:r>
-        <w:rPr>
-          <w:rFonts w:ascii="Calibri" w:cs="Calibri" w:eastAsia="Calibri" w:hAnsi="Calibri"/>
-        </w:rPr>
-        <w:t xml:space="preserve">Mitarbeit bei logistischen und produktionswirtschaftlichen Projekten</w:t>
-      </w:r>
-    </w:p>
-    <w:p>
-      <w:pPr>
-        <w:pStyle w:val="ListParagraph"/>
-        <w:numPr>
-          <w:ilvl w:val="0"/>
-          <w:numId w:val="2"/>
-        </w:numPr>
-        <w:spacing w:after="60"/>
-      </w:pPr>
-      <w:r>
-        <w:rPr>
-          <w:rFonts w:ascii="Calibri" w:cs="Calibri" w:eastAsia="Calibri" w:hAnsi="Calibri"/>
-        </w:rPr>
-        <w:t xml:space="preserve">Projektmanagement im Produktionsbereich</w:t>
-      </w:r>
-    </w:p>
-    <w:p>
-      <w:pPr>
-        <w:pStyle w:val="ListParagraph"/>
-        <w:numPr>
-          <w:ilvl w:val="0"/>
-          <w:numId w:val="2"/>
-        </w:numPr>
-        <w:spacing w:after="60"/>
-      </w:pPr>
-      <w:r>
-        <w:rPr>
-          <w:rFonts w:ascii="Calibri" w:cs="Calibri" w:eastAsia="Calibri" w:hAnsi="Calibri"/>
-        </w:rPr>
-        <w:t xml:space="preserve">Administrative Tätigkeiten im Produktionsbereich (z.B.: Vorbereitung der Produktionsaufträge, Erstellung unterschiedlicher Listen/Tabellen, usw.)</w:t>
-      </w:r>
-    </w:p>
-    <w:p>
-      <w:pPr>
-        <w:pStyle w:val="ListParagraph"/>
-        <w:numPr>
-          <w:ilvl w:val="0"/>
-          <w:numId w:val="2"/>
-        </w:numPr>
-        <w:spacing w:after="60"/>
-      </w:pPr>
-      <w:r>
-        <w:rPr>
-          <w:rFonts w:ascii="Calibri" w:cs="Calibri" w:eastAsia="Calibri" w:hAnsi="Calibri"/>
-        </w:rPr>
-        <w:t xml:space="preserve">Umsetzung der Vorgaben (Kundenbedarfe) laut Kapazitätsübersicht-Liste</w:t>
-      </w:r>
-    </w:p>
-    <w:p>
-      <w:pPr>
-        <w:pStyle w:val="ListParagraph"/>
-        <w:numPr>
-          <w:ilvl w:val="0"/>
-          <w:numId w:val="2"/>
-        </w:numPr>
-        <w:spacing w:after="60"/>
-      </w:pPr>
-      <w:r>
-        <w:rPr>
-          <w:rFonts w:ascii="Calibri" w:cs="Calibri" w:eastAsia="Calibri" w:hAnsi="Calibri"/>
-        </w:rPr>
-        <w:t xml:space="preserve">Erstellung der Produktionsaufträge im ERP-System (FOSS)</w:t>
-      </w:r>
-    </w:p>
-    <w:p>
-      <w:pPr>
-        <w:pStyle w:val="ListParagraph"/>
-        <w:numPr>
-          <w:ilvl w:val="0"/>
-          <w:numId w:val="2"/>
-        </w:numPr>
-        <w:spacing w:after="60"/>
-      </w:pPr>
-      <w:r>
-        <w:rPr>
-          <w:rFonts w:ascii="Calibri" w:cs="Calibri" w:eastAsia="Calibri" w:hAnsi="Calibri"/>
-        </w:rPr>
-        <w:t xml:space="preserve">Einplanung der Produktionsaufträge im MES-System (authentig)</w:t>
-      </w:r>
-    </w:p>
-    <w:p>
-      <w:pPr>
-        <w:pStyle w:val="ListParagraph"/>
-        <w:numPr>
-          <w:ilvl w:val="0"/>
-          <w:numId w:val="2"/>
-        </w:numPr>
-        <w:spacing w:after="60"/>
-      </w:pPr>
-      <w:r>
-        <w:rPr>
-          <w:rFonts w:ascii="Calibri" w:cs="Calibri" w:eastAsia="Calibri" w:hAnsi="Calibri"/>
-        </w:rPr>
-        <w:t xml:space="preserve">Dokumentation im DocuWare anlegen</w:t>
-      </w:r>
-    </w:p>
-    <w:p>
-      <w:pPr>
-        <w:pStyle w:val="ListParagraph"/>
-        <w:numPr>
-          <w:ilvl w:val="0"/>
-          <w:numId w:val="2"/>
-        </w:numPr>
-        <w:spacing w:after="60"/>
-      </w:pPr>
-      <w:r>
-        <w:rPr>
-          <w:rFonts w:ascii="Calibri" w:cs="Calibri" w:eastAsia="Calibri" w:hAnsi="Calibri"/>
-        </w:rPr>
-        <w:t xml:space="preserve">Berichtswesen</w:t>
+        <w:t xml:space="preserve">7.5.3.14 Teamleitung Werkzeugbau</w:t>
+      </w:r>
+    </w:p>
+    <w:p>
+      <w:pPr>
+        <w:spacing w:after="100"/>
+      </w:pPr>
+      <w:r>
+        <w:rPr>
+          <w:rFonts w:ascii="Calibri" w:cs="Calibri" w:eastAsia="Calibri" w:hAnsi="Calibri"/>
+          <w:i/>
+          <w:iCs/>
+          <w:sz w:val="18"/>
+          <w:szCs w:val="18"/>
+        </w:rPr>
+        <w:t xml:space="preserve">Fach-/Führungsrolle in Unterstützungsprozessen (siehe oben); neue Rolle, in Version k nicht enthalten. Zuständig für Werkzeugbau sowie Werkzeugwartung, -reparatur und -instandhaltung. Berichtet im Regelbetrieb direkt an den Produktionsleiter. Zusätzlich Lehrlingsausbildner für Werkzeugbautechniker.</w:t>
+      </w:r>
+    </w:p>
+    <w:p>
+      <w:pPr>
+        <w:spacing w:after="80" w:before="220"/>
+      </w:pPr>
+      <w:r>
+        <w:rPr>
+          <w:rFonts w:ascii="Calibri" w:cs="Calibri" w:eastAsia="Calibri" w:hAnsi="Calibri"/>
+          <w:b/>
+          <w:bCs/>
+          <w:sz w:val="20"/>
+          <w:szCs w:val="20"/>
+          <w:u w:val="single"/>
+        </w:rPr>
+        <w:t xml:space="preserve">1. Werkzeug-/Betriebsmittelmanagement</w:t>
+      </w:r>
+    </w:p>
+    <w:p>
+      <w:pPr>
+        <w:spacing w:after="80"/>
+      </w:pPr>
+      <w:r>
+        <w:rPr>
+          <w:rFonts w:ascii="Calibri" w:cs="Calibri" w:eastAsia="Calibri" w:hAnsi="Calibri"/>
+          <w:b/>
+          <w:bCs/>
+          <w:sz w:val="20"/>
+          <w:szCs w:val="20"/>
+        </w:rPr>
+        <w:t xml:space="preserve">Verantwortung: </w:t>
+      </w:r>
+      <w:r>
+        <w:rPr>
+          <w:rFonts w:ascii="Calibri" w:cs="Calibri" w:eastAsia="Calibri" w:hAnsi="Calibri"/>
+          <w:sz w:val="20"/>
+          <w:szCs w:val="20"/>
+        </w:rPr>
+        <w:t xml:space="preserve">Werkzeugbau sowie Wartung/Reparatur/Instandhaltung der Werkzeuge (inkl. Kundenwerkzeuge).</w:t>
+      </w:r>
+    </w:p>
+    <w:p>
+      <w:pPr>
+        <w:spacing w:after="40" w:before="40"/>
+      </w:pPr>
+      <w:r>
+        <w:rPr>
+          <w:rFonts w:ascii="Calibri" w:cs="Calibri" w:eastAsia="Calibri" w:hAnsi="Calibri"/>
+          <w:b/>
+          <w:bCs/>
+          <w:sz w:val="20"/>
+          <w:szCs w:val="20"/>
+        </w:rPr>
+        <w:t xml:space="preserve">Aufgabe:</w:t>
+      </w:r>
+    </w:p>
+    <w:p>
+      <w:pPr>
+        <w:pStyle w:val="ListParagraph"/>
+        <w:numPr>
+          <w:ilvl w:val="0"/>
+          <w:numId w:val="2"/>
+        </w:numPr>
+        <w:spacing w:after="60"/>
+      </w:pPr>
+      <w:r>
+        <w:rPr>
+          <w:rFonts w:ascii="Calibri" w:cs="Calibri" w:eastAsia="Calibri" w:hAnsi="Calibri"/>
+        </w:rPr>
+        <w:t xml:space="preserve">Werkzeugkennzeichnung (Kennnummer, Status, Eigentümer, Standort) – Kundenwerkzeuge dauerhaft/sichtbar gekennzeichnet</w:t>
+      </w:r>
+    </w:p>
+    <w:p>
+      <w:pPr>
+        <w:pStyle w:val="ListParagraph"/>
+        <w:numPr>
+          <w:ilvl w:val="0"/>
+          <w:numId w:val="2"/>
+        </w:numPr>
+        <w:spacing w:after="60"/>
+      </w:pPr>
+      <w:r>
+        <w:rPr>
+          <w:rFonts w:ascii="Calibri" w:cs="Calibri" w:eastAsia="Calibri" w:hAnsi="Calibri"/>
+        </w:rPr>
+        <w:t xml:space="preserve">Lagerung und Schutz der Werkzeuge vor Beschädigung/Verschleiß</w:t>
+      </w:r>
+    </w:p>
+    <w:p>
+      <w:pPr>
+        <w:pStyle w:val="ListParagraph"/>
+        <w:numPr>
+          <w:ilvl w:val="0"/>
+          <w:numId w:val="2"/>
+        </w:numPr>
+        <w:spacing w:after="60"/>
+      </w:pPr>
+      <w:r>
+        <w:rPr>
+          <w:rFonts w:ascii="Calibri" w:cs="Calibri" w:eastAsia="Calibri" w:hAnsi="Calibri"/>
+        </w:rPr>
+        <w:t xml:space="preserve">Rüst-/Werkzeugwechselprozesse</w:t>
+      </w:r>
+    </w:p>
+    <w:p>
+      <w:pPr>
+        <w:pStyle w:val="ListParagraph"/>
+        <w:numPr>
+          <w:ilvl w:val="0"/>
+          <w:numId w:val="2"/>
+        </w:numPr>
+        <w:spacing w:after="60"/>
+      </w:pPr>
+      <w:r>
+        <w:rPr>
+          <w:rFonts w:ascii="Calibri" w:cs="Calibri" w:eastAsia="Calibri" w:hAnsi="Calibri"/>
+        </w:rPr>
+        <w:t xml:space="preserve">Verschleißteil-Programm</w:t>
+      </w:r>
+    </w:p>
+    <w:p>
+      <w:pPr>
+        <w:pStyle w:val="ListParagraph"/>
+        <w:numPr>
+          <w:ilvl w:val="0"/>
+          <w:numId w:val="2"/>
+        </w:numPr>
+        <w:spacing w:after="60"/>
+      </w:pPr>
+      <w:r>
+        <w:rPr>
+          <w:rFonts w:ascii="Calibri" w:cs="Calibri" w:eastAsia="Calibri" w:hAnsi="Calibri"/>
+        </w:rPr>
+        <w:t xml:space="preserve">Dokumentation von Werkzeugänderungen/-modifikationen inkl. Änderungsstand</w:t>
+      </w:r>
+    </w:p>
+    <w:p>
+      <w:pPr>
+        <w:pStyle w:val="ListParagraph"/>
+        <w:numPr>
+          <w:ilvl w:val="0"/>
+          <w:numId w:val="2"/>
+        </w:numPr>
+        <w:spacing w:after="60"/>
+      </w:pPr>
+      <w:r>
+        <w:rPr>
+          <w:rFonts w:ascii="Calibri" w:cs="Calibri" w:eastAsia="Calibri" w:hAnsi="Calibri"/>
+        </w:rPr>
+        <w:t xml:space="preserve">Bedarfserhebung und Bestellabwicklung von Roh-, Hilfs- und Betriebsstoffen/-mitteln für den Werkzeugbau</w:t>
+      </w:r>
+    </w:p>
+    <w:p>
+      <w:pPr>
+        <w:pStyle w:val="ListParagraph"/>
+        <w:numPr>
+          <w:ilvl w:val="0"/>
+          <w:numId w:val="2"/>
+        </w:numPr>
+        <w:spacing w:after="60"/>
+      </w:pPr>
+      <w:r>
+        <w:rPr>
+          <w:rFonts w:ascii="Calibri" w:cs="Calibri" w:eastAsia="Calibri" w:hAnsi="Calibri"/>
+        </w:rPr>
+        <w:t xml:space="preserve">Gestaltung der Arbeitsplätze und Arbeitsvorbereitung im Werkzeugbau</w:t>
+      </w:r>
+    </w:p>
+    <w:p>
+      <w:pPr>
+        <w:pStyle w:val="ListParagraph"/>
+        <w:numPr>
+          <w:ilvl w:val="0"/>
+          <w:numId w:val="2"/>
+        </w:numPr>
+        <w:spacing w:after="60"/>
+      </w:pPr>
+      <w:r>
+        <w:rPr>
+          <w:rFonts w:ascii="Calibri" w:cs="Calibri" w:eastAsia="Calibri" w:hAnsi="Calibri"/>
+        </w:rPr>
+        <w:t xml:space="preserve">Fehlermeldung bei Produktionsstörungen durch Werkzeuge an den Produktionsleiter</w:t>
+      </w:r>
+    </w:p>
+    <w:p>
+      <w:pPr>
+        <w:pStyle w:val="ListParagraph"/>
+        <w:numPr>
+          <w:ilvl w:val="0"/>
+          <w:numId w:val="2"/>
+        </w:numPr>
+        <w:spacing w:after="60"/>
+      </w:pPr>
+      <w:r>
+        <w:rPr>
+          <w:rFonts w:ascii="Calibri" w:cs="Calibri" w:eastAsia="Calibri" w:hAnsi="Calibri"/>
+        </w:rPr>
+        <w:t xml:space="preserve">Abarbeitung der Aufgabenliste</w:t>
+      </w:r>
+    </w:p>
+    <w:p>
+      <w:pPr>
+        <w:spacing w:after="80"/>
+      </w:pPr>
+      <w:r>
+        <w:rPr>
+          <w:rFonts w:ascii="Calibri" w:cs="Calibri" w:eastAsia="Calibri" w:hAnsi="Calibri"/>
+          <w:b/>
+          <w:bCs/>
+          <w:sz w:val="20"/>
+          <w:szCs w:val="20"/>
+        </w:rPr>
+        <w:t xml:space="preserve">Kompetenz: </w:t>
+      </w:r>
+      <w:r>
+        <w:rPr>
+          <w:rFonts w:ascii="Calibri" w:cs="Calibri" w:eastAsia="Calibri" w:hAnsi="Calibri"/>
+          <w:sz w:val="20"/>
+          <w:szCs w:val="20"/>
+        </w:rPr>
+        <w:t xml:space="preserve">Entscheidung über Werkzeugstatus (Produktion/Reparatur/Aussonderung); Sperren von Werkzeugen/Vorrichtungen und Einleitung von Korrekturmaßnahmen; Produktionsstopp bei Gefahr oder Formbeschädigung (Not-Halt-Kompetenz).</w:t>
+      </w:r>
+    </w:p>
+    <w:p>
+      <w:pPr>
+        <w:spacing w:after="80" w:before="220"/>
+      </w:pPr>
+      <w:r>
+        <w:rPr>
+          <w:rFonts w:ascii="Calibri" w:cs="Calibri" w:eastAsia="Calibri" w:hAnsi="Calibri"/>
+          <w:b/>
+          <w:bCs/>
+          <w:sz w:val="20"/>
+          <w:szCs w:val="20"/>
+          <w:u w:val="single"/>
+        </w:rPr>
+        <w:t xml:space="preserve">2. Abgrenzung zu Prozesstechnik und Bemusterung/Produkt-Projekttechnik</w:t>
+      </w:r>
+    </w:p>
+    <w:p>
+      <w:pPr>
+        <w:spacing w:after="120"/>
+      </w:pPr>
+      <w:r>
+        <w:rPr>
+          <w:rFonts w:ascii="Calibri" w:cs="Calibri" w:eastAsia="Calibri" w:hAnsi="Calibri"/>
+        </w:rPr>
+        <w:t xml:space="preserve">Werkzeugbau ist zuständig für Bau, Wartung, Reparatur und Instandhaltung der Werkzeuge auf Basis der bestehenden, freigegebenen technischen Spezifikation. Technische Änderungen am Werkzeug (Designänderungen, die Form/Funktion betreffen und ggf. eine erneute Kundenfreigabe erfordern) liegen nicht in der Entscheidungskompetenz des Werkzeugbaus, sondern werden über Prozesstechnik und Bemusterung bzw. die Produkt-/Projekttechnik entschieden.</w:t>
+      </w:r>
+    </w:p>
+    <w:p>
+      <w:r>
+        <w:br w:type="page"/>
+      </w:r>
+    </w:p>
+    <w:p>
+      <w:pPr>
+        <w:spacing w:after="100"/>
+      </w:pPr>
+      <w:r>
+        <w:rPr>
+          <w:rFonts w:ascii="Calibri" w:cs="Calibri" w:eastAsia="Calibri" w:hAnsi="Calibri"/>
+          <w:i/>
+          <w:iCs/>
+          <w:sz w:val="18"/>
+          <w:szCs w:val="18"/>
+        </w:rPr>
+        <w:t xml:space="preserve">Die folgenden Rollen sind noch nicht im Detail überarbeitet – Inhalt entspricht noch Version k (unverändertes Rohgerüst) und dient nur als Platzhalter.</w:t>
       </w:r>
     </w:p>
     <w:p>
@@ -3017,119 +4029,103 @@
           <w:sz w:val="22"/>
           <w:szCs w:val="22"/>
         </w:rPr>
-        <w:t xml:space="preserve">7.5.3.8 Aufgaben Digitale Prozessentwicklung &amp; Lean Management (ex Arbeitsvorbereitung)</w:t>
-      </w:r>
-    </w:p>
-    <w:p>
-      <w:pPr>
-        <w:pStyle w:val="ListParagraph"/>
-        <w:numPr>
-          <w:ilvl w:val="0"/>
-          <w:numId w:val="2"/>
-        </w:numPr>
-        <w:spacing w:after="60"/>
-      </w:pPr>
-      <w:r>
-        <w:rPr>
-          <w:rFonts w:ascii="Calibri" w:cs="Calibri" w:eastAsia="Calibri" w:hAnsi="Calibri"/>
-        </w:rPr>
-        <w:t xml:space="preserve">Stammdatenpflege</w:t>
-      </w:r>
-    </w:p>
-    <w:p>
-      <w:pPr>
-        <w:pStyle w:val="ListParagraph"/>
-        <w:numPr>
-          <w:ilvl w:val="0"/>
-          <w:numId w:val="2"/>
-        </w:numPr>
-        <w:spacing w:after="60"/>
-      </w:pPr>
-      <w:r>
-        <w:rPr>
-          <w:rFonts w:ascii="Calibri" w:cs="Calibri" w:eastAsia="Calibri" w:hAnsi="Calibri"/>
-        </w:rPr>
-        <w:t xml:space="preserve">Arbeitsaufträge rechtzeitig unter Berücksichtigung der Projektpläne erstellen</w:t>
-      </w:r>
-    </w:p>
-    <w:p>
-      <w:pPr>
-        <w:pStyle w:val="ListParagraph"/>
-        <w:numPr>
-          <w:ilvl w:val="0"/>
-          <w:numId w:val="2"/>
-        </w:numPr>
-        <w:spacing w:after="60"/>
-      </w:pPr>
-      <w:r>
-        <w:rPr>
-          <w:rFonts w:ascii="Calibri" w:cs="Calibri" w:eastAsia="Calibri" w:hAnsi="Calibri"/>
-        </w:rPr>
-        <w:t xml:space="preserve">Prozessdaten- und Werkzeugoptimierung</w:t>
-      </w:r>
-    </w:p>
-    <w:p>
-      <w:pPr>
-        <w:pStyle w:val="ListParagraph"/>
-        <w:numPr>
-          <w:ilvl w:val="0"/>
-          <w:numId w:val="2"/>
-        </w:numPr>
-        <w:spacing w:after="60"/>
-      </w:pPr>
-      <w:r>
-        <w:rPr>
-          <w:rFonts w:ascii="Calibri" w:cs="Calibri" w:eastAsia="Calibri" w:hAnsi="Calibri"/>
-        </w:rPr>
-        <w:t xml:space="preserve">Informationspflicht an die vorgesetzte Stelle bei drohenden Kapazitätsengpässen oder anderen Einflüssen, welche die Bedarfserfüllung gefährden</w:t>
-      </w:r>
-    </w:p>
-    <w:p>
-      <w:pPr>
-        <w:pStyle w:val="ListParagraph"/>
-        <w:numPr>
-          <w:ilvl w:val="0"/>
-          <w:numId w:val="2"/>
-        </w:numPr>
-        <w:spacing w:after="60"/>
-      </w:pPr>
-      <w:r>
-        <w:rPr>
-          <w:rFonts w:ascii="Calibri" w:cs="Calibri" w:eastAsia="Calibri" w:hAnsi="Calibri"/>
-        </w:rPr>
-        <w:t xml:space="preserve">Machbarkeitsprüfungen bzgl. rechtzeitiger Bereitstellung von Werkzeugen und Vorrichtungen</w:t>
-      </w:r>
-    </w:p>
-    <w:p>
-      <w:pPr>
-        <w:pStyle w:val="ListParagraph"/>
-        <w:numPr>
-          <w:ilvl w:val="0"/>
-          <w:numId w:val="2"/>
-        </w:numPr>
-        <w:spacing w:after="60"/>
-      </w:pPr>
-      <w:r>
-        <w:rPr>
-          <w:rFonts w:ascii="Calibri" w:cs="Calibri" w:eastAsia="Calibri" w:hAnsi="Calibri"/>
-        </w:rPr>
-        <w:t xml:space="preserve">Mitarbeit bei logistischen und produktionswirtschaftlichen Projekten</w:t>
-      </w:r>
-    </w:p>
-    <w:p>
-      <w:pPr>
-        <w:pStyle w:val="ListParagraph"/>
-        <w:numPr>
-          <w:ilvl w:val="0"/>
-          <w:numId w:val="2"/>
-        </w:numPr>
-        <w:spacing w:after="60"/>
-      </w:pPr>
-      <w:r>
-        <w:rPr>
-          <w:rFonts w:ascii="Calibri" w:cs="Calibri" w:eastAsia="Calibri" w:hAnsi="Calibri"/>
-        </w:rPr>
-        <w:t xml:space="preserve">Vergabe u. Verwaltung von Lagerplätzen für WZG, Vorrichtungen, Mess-/Hilfsmittel</w:t>
+        <w:t xml:space="preserve">7.5.3.3 Aufgaben des Maschinenpersonals (Werker)</w:t>
+      </w:r>
+    </w:p>
+    <w:p>
+      <w:pPr>
+        <w:pStyle w:val="ListParagraph"/>
+        <w:numPr>
+          <w:ilvl w:val="0"/>
+          <w:numId w:val="2"/>
+        </w:numPr>
+        <w:spacing w:after="60"/>
+      </w:pPr>
+      <w:r>
+        <w:rPr>
+          <w:rFonts w:ascii="Calibri" w:cs="Calibri" w:eastAsia="Calibri" w:hAnsi="Calibri"/>
+        </w:rPr>
+        <w:t xml:space="preserve">Eigenverantwortliches Beurteilen der produzierten Teile lt. AAW</w:t>
+      </w:r>
+    </w:p>
+    <w:p>
+      <w:pPr>
+        <w:pStyle w:val="ListParagraph"/>
+        <w:numPr>
+          <w:ilvl w:val="0"/>
+          <w:numId w:val="2"/>
+        </w:numPr>
+        <w:spacing w:after="60"/>
+      </w:pPr>
+      <w:r>
+        <w:rPr>
+          <w:rFonts w:ascii="Calibri" w:cs="Calibri" w:eastAsia="Calibri" w:hAnsi="Calibri"/>
+        </w:rPr>
+        <w:t xml:space="preserve">Fehlermeldung bei niO Teilen an SF/PQB</w:t>
+      </w:r>
+    </w:p>
+    <w:p>
+      <w:pPr>
+        <w:pStyle w:val="ListParagraph"/>
+        <w:numPr>
+          <w:ilvl w:val="0"/>
+          <w:numId w:val="2"/>
+        </w:numPr>
+        <w:spacing w:after="60"/>
+      </w:pPr>
+      <w:r>
+        <w:rPr>
+          <w:rFonts w:ascii="Calibri" w:cs="Calibri" w:eastAsia="Calibri" w:hAnsi="Calibri"/>
+        </w:rPr>
+        <w:t xml:space="preserve">Beachten von zus. Q-Hinweisen z.B.: temp. AAW</w:t>
+      </w:r>
+    </w:p>
+    <w:p>
+      <w:pPr>
+        <w:pStyle w:val="ListParagraph"/>
+        <w:numPr>
+          <w:ilvl w:val="0"/>
+          <w:numId w:val="2"/>
+        </w:numPr>
+        <w:spacing w:after="60"/>
+      </w:pPr>
+      <w:r>
+        <w:rPr>
+          <w:rFonts w:ascii="Calibri" w:cs="Calibri" w:eastAsia="Calibri" w:hAnsi="Calibri"/>
+        </w:rPr>
+        <w:t xml:space="preserve">Teile entgraten oder montieren (lt. Anweisung)</w:t>
+      </w:r>
+    </w:p>
+    <w:p>
+      <w:pPr>
+        <w:pStyle w:val="ListParagraph"/>
+        <w:numPr>
+          <w:ilvl w:val="0"/>
+          <w:numId w:val="2"/>
+        </w:numPr>
+        <w:spacing w:after="60"/>
+      </w:pPr>
+      <w:r>
+        <w:rPr>
+          <w:rFonts w:ascii="Calibri" w:cs="Calibri" w:eastAsia="Calibri" w:hAnsi="Calibri"/>
+        </w:rPr>
+        <w:t xml:space="preserve">Teile verpacken, etikettieren lt. Verpackungsvorschrift</w:t>
+      </w:r>
+    </w:p>
+    <w:p>
+      <w:pPr>
+        <w:pStyle w:val="ListParagraph"/>
+        <w:numPr>
+          <w:ilvl w:val="0"/>
+          <w:numId w:val="2"/>
+        </w:numPr>
+        <w:spacing w:after="60"/>
+      </w:pPr>
+      <w:r>
+        <w:rPr>
+          <w:rFonts w:ascii="Calibri" w:cs="Calibri" w:eastAsia="Calibri" w:hAnsi="Calibri"/>
+        </w:rPr>
+        <w:t xml:space="preserve">Mitwirkung Erststück / Letztstückfreigabe</w:t>
       </w:r>
     </w:p>
     <w:p>
@@ -3144,151 +4140,87 @@
           <w:sz w:val="22"/>
           <w:szCs w:val="22"/>
         </w:rPr>
-        <w:t xml:space="preserve">7.5.3.9 Aufgaben Qualitätsprüfer/in (PQB)</w:t>
-      </w:r>
-    </w:p>
-    <w:p>
-      <w:pPr>
-        <w:pStyle w:val="ListParagraph"/>
-        <w:numPr>
-          <w:ilvl w:val="0"/>
-          <w:numId w:val="2"/>
-        </w:numPr>
-        <w:spacing w:after="60"/>
-      </w:pPr>
-      <w:r>
-        <w:rPr>
-          <w:rFonts w:ascii="Calibri" w:cs="Calibri" w:eastAsia="Calibri" w:hAnsi="Calibri"/>
-        </w:rPr>
-        <w:t xml:space="preserve">Durchführung von fertigungsbegleitenden Qualitätsprüfungen</w:t>
-      </w:r>
-    </w:p>
-    <w:p>
-      <w:pPr>
-        <w:pStyle w:val="ListParagraph"/>
-        <w:numPr>
-          <w:ilvl w:val="0"/>
-          <w:numId w:val="2"/>
-        </w:numPr>
-        <w:spacing w:after="60"/>
-      </w:pPr>
-      <w:r>
-        <w:rPr>
-          <w:rFonts w:ascii="Calibri" w:cs="Calibri" w:eastAsia="Calibri" w:hAnsi="Calibri"/>
-        </w:rPr>
-        <w:t xml:space="preserve">Dokumentieren der Prüf- und Messergebnisse in Q Studio</w:t>
-      </w:r>
-    </w:p>
-    <w:p>
-      <w:pPr>
-        <w:pStyle w:val="ListParagraph"/>
-        <w:numPr>
-          <w:ilvl w:val="0"/>
-          <w:numId w:val="2"/>
-        </w:numPr>
-        <w:spacing w:after="60"/>
-      </w:pPr>
-      <w:r>
-        <w:rPr>
-          <w:rFonts w:ascii="Calibri" w:cs="Calibri" w:eastAsia="Calibri" w:hAnsi="Calibri"/>
-        </w:rPr>
-        <w:t xml:space="preserve">Erfassen von festgestellten Fehlern</w:t>
-      </w:r>
-    </w:p>
-    <w:p>
-      <w:pPr>
-        <w:pStyle w:val="ListParagraph"/>
-        <w:numPr>
-          <w:ilvl w:val="0"/>
-          <w:numId w:val="2"/>
-        </w:numPr>
-        <w:spacing w:after="60"/>
-      </w:pPr>
-      <w:r>
-        <w:rPr>
-          <w:rFonts w:ascii="Calibri" w:cs="Calibri" w:eastAsia="Calibri" w:hAnsi="Calibri"/>
-        </w:rPr>
-        <w:t xml:space="preserve">Mitarbeit bei der Reklamationsbearbeitung</w:t>
-      </w:r>
-    </w:p>
-    <w:p>
-      <w:pPr>
-        <w:pStyle w:val="ListParagraph"/>
-        <w:numPr>
-          <w:ilvl w:val="0"/>
-          <w:numId w:val="2"/>
-        </w:numPr>
-        <w:spacing w:after="60"/>
-      </w:pPr>
-      <w:r>
-        <w:rPr>
-          <w:rFonts w:ascii="Calibri" w:cs="Calibri" w:eastAsia="Calibri" w:hAnsi="Calibri"/>
-        </w:rPr>
-        <w:t xml:space="preserve">Durchführung von Qualitätsschulungen</w:t>
-      </w:r>
-    </w:p>
-    <w:p>
-      <w:pPr>
-        <w:pStyle w:val="ListParagraph"/>
-        <w:numPr>
-          <w:ilvl w:val="0"/>
-          <w:numId w:val="2"/>
-        </w:numPr>
-        <w:spacing w:after="60"/>
-      </w:pPr>
-      <w:r>
-        <w:rPr>
-          <w:rFonts w:ascii="Calibri" w:cs="Calibri" w:eastAsia="Calibri" w:hAnsi="Calibri"/>
-        </w:rPr>
-        <w:t xml:space="preserve">Sperren von fehlerhaften Teilen</w:t>
-      </w:r>
-    </w:p>
-    <w:p>
-      <w:pPr>
-        <w:pStyle w:val="ListParagraph"/>
-        <w:numPr>
-          <w:ilvl w:val="0"/>
-          <w:numId w:val="2"/>
-        </w:numPr>
-        <w:spacing w:after="60"/>
-      </w:pPr>
-      <w:r>
-        <w:rPr>
-          <w:rFonts w:ascii="Calibri" w:cs="Calibri" w:eastAsia="Calibri" w:hAnsi="Calibri"/>
-        </w:rPr>
-        <w:t xml:space="preserve">Maßnahmenverfolgung bei Prozessänderungen</w:t>
-      </w:r>
-    </w:p>
-    <w:p>
-      <w:pPr>
-        <w:pStyle w:val="ListParagraph"/>
-        <w:numPr>
-          <w:ilvl w:val="0"/>
-          <w:numId w:val="2"/>
-        </w:numPr>
-        <w:spacing w:after="60"/>
-      </w:pPr>
-      <w:r>
-        <w:rPr>
-          <w:rFonts w:ascii="Calibri" w:cs="Calibri" w:eastAsia="Calibri" w:hAnsi="Calibri"/>
-        </w:rPr>
-        <w:t xml:space="preserve">Erststück / Letztstückfreigabe</w:t>
-      </w:r>
-    </w:p>
-    <w:p>
-      <w:pPr>
-        <w:pStyle w:val="ListParagraph"/>
-        <w:numPr>
-          <w:ilvl w:val="0"/>
-          <w:numId w:val="2"/>
-        </w:numPr>
-        <w:spacing w:after="60"/>
-      </w:pPr>
-      <w:r>
-        <w:rPr>
-          <w:rFonts w:ascii="Calibri" w:cs="Calibri" w:eastAsia="Calibri" w:hAnsi="Calibri"/>
-        </w:rPr>
-        <w:t xml:space="preserve">Erneute Freigabe nach Produktionsunterbrechung</w:t>
+        <w:t xml:space="preserve">7.5.3.5 Aufgaben Boxenbauer</w:t>
+      </w:r>
+    </w:p>
+    <w:p>
+      <w:pPr>
+        <w:pStyle w:val="ListParagraph"/>
+        <w:numPr>
+          <w:ilvl w:val="0"/>
+          <w:numId w:val="2"/>
+        </w:numPr>
+        <w:spacing w:after="60"/>
+      </w:pPr>
+      <w:r>
+        <w:rPr>
+          <w:rFonts w:ascii="Calibri" w:cs="Calibri" w:eastAsia="Calibri" w:hAnsi="Calibri"/>
+        </w:rPr>
+        <w:t xml:space="preserve">Buchungen und Abtransport der Gebinde / Teile</w:t>
+      </w:r>
+    </w:p>
+    <w:p>
+      <w:pPr>
+        <w:pStyle w:val="ListParagraph"/>
+        <w:numPr>
+          <w:ilvl w:val="0"/>
+          <w:numId w:val="2"/>
+        </w:numPr>
+        <w:spacing w:after="60"/>
+      </w:pPr>
+      <w:r>
+        <w:rPr>
+          <w:rFonts w:ascii="Calibri" w:cs="Calibri" w:eastAsia="Calibri" w:hAnsi="Calibri"/>
+        </w:rPr>
+        <w:t xml:space="preserve">Unterstützende Mitarbeit im Produktionsbereich</w:t>
+      </w:r>
+    </w:p>
+    <w:p>
+      <w:pPr>
+        <w:pStyle w:val="ListParagraph"/>
+        <w:numPr>
+          <w:ilvl w:val="0"/>
+          <w:numId w:val="2"/>
+        </w:numPr>
+        <w:spacing w:after="60"/>
+      </w:pPr>
+      <w:r>
+        <w:rPr>
+          <w:rFonts w:ascii="Calibri" w:cs="Calibri" w:eastAsia="Calibri" w:hAnsi="Calibri"/>
+        </w:rPr>
+        <w:t xml:space="preserve">Qualitätsfreigabe der Leergebinde u. Verpackungsmaterial unter Berücksichtigung der Qualitätsvorschriften</w:t>
+      </w:r>
+    </w:p>
+    <w:p>
+      <w:pPr>
+        <w:pStyle w:val="ListParagraph"/>
+        <w:numPr>
+          <w:ilvl w:val="0"/>
+          <w:numId w:val="2"/>
+        </w:numPr>
+        <w:spacing w:after="60"/>
+      </w:pPr>
+      <w:r>
+        <w:rPr>
+          <w:rFonts w:ascii="Calibri" w:cs="Calibri" w:eastAsia="Calibri" w:hAnsi="Calibri"/>
+        </w:rPr>
+        <w:t xml:space="preserve">Übergabe der Restgebinde an das Lager (Artikelrest)</w:t>
+      </w:r>
+    </w:p>
+    <w:p>
+      <w:pPr>
+        <w:pStyle w:val="ListParagraph"/>
+        <w:numPr>
+          <w:ilvl w:val="0"/>
+          <w:numId w:val="2"/>
+        </w:numPr>
+        <w:spacing w:after="60"/>
+      </w:pPr>
+      <w:r>
+        <w:rPr>
+          <w:rFonts w:ascii="Calibri" w:cs="Calibri" w:eastAsia="Calibri" w:hAnsi="Calibri"/>
+        </w:rPr>
+        <w:t xml:space="preserve">Material Rückbuchungen durchführen</w:t>
       </w:r>
     </w:p>
     <w:p>
@@ -3303,183 +4235,644 @@
           <w:sz w:val="22"/>
           <w:szCs w:val="22"/>
         </w:rPr>
-        <w:t xml:space="preserve">7.5.3.10 Aufgaben Teamleitung Lager (Materialvorbereitung)</w:t>
-      </w:r>
-    </w:p>
-    <w:p>
-      <w:pPr>
-        <w:pStyle w:val="ListParagraph"/>
-        <w:numPr>
-          <w:ilvl w:val="0"/>
-          <w:numId w:val="2"/>
-        </w:numPr>
-        <w:spacing w:after="60"/>
-      </w:pPr>
-      <w:r>
-        <w:rPr>
-          <w:rFonts w:ascii="Calibri" w:cs="Calibri" w:eastAsia="Calibri" w:hAnsi="Calibri"/>
-        </w:rPr>
-        <w:t xml:space="preserve">Be- und Entladen von LKWs</w:t>
-      </w:r>
-    </w:p>
-    <w:p>
-      <w:pPr>
-        <w:pStyle w:val="ListParagraph"/>
-        <w:numPr>
-          <w:ilvl w:val="0"/>
-          <w:numId w:val="2"/>
-        </w:numPr>
-        <w:spacing w:after="60"/>
-      </w:pPr>
-      <w:r>
-        <w:rPr>
-          <w:rFonts w:ascii="Calibri" w:cs="Calibri" w:eastAsia="Calibri" w:hAnsi="Calibri"/>
-        </w:rPr>
-        <w:t xml:space="preserve">Organisation der Lagerbereiche, Lagerstand u. Kennzeichnung</w:t>
-      </w:r>
-    </w:p>
-    <w:p>
-      <w:pPr>
-        <w:pStyle w:val="ListParagraph"/>
-        <w:numPr>
-          <w:ilvl w:val="0"/>
-          <w:numId w:val="2"/>
-        </w:numPr>
-        <w:spacing w:after="60"/>
-      </w:pPr>
-      <w:r>
-        <w:rPr>
-          <w:rFonts w:ascii="Calibri" w:cs="Calibri" w:eastAsia="Calibri" w:hAnsi="Calibri"/>
-        </w:rPr>
-        <w:t xml:space="preserve">Buchungen in FOSS ausführen</w:t>
-      </w:r>
-    </w:p>
-    <w:p>
-      <w:pPr>
-        <w:pStyle w:val="ListParagraph"/>
-        <w:numPr>
-          <w:ilvl w:val="0"/>
-          <w:numId w:val="2"/>
-        </w:numPr>
-        <w:spacing w:after="60"/>
-      </w:pPr>
-      <w:r>
-        <w:rPr>
-          <w:rFonts w:ascii="Calibri" w:cs="Calibri" w:eastAsia="Calibri" w:hAnsi="Calibri"/>
-        </w:rPr>
-        <w:t xml:space="preserve">Sperren fehlerhafter Ware</w:t>
-      </w:r>
-    </w:p>
-    <w:p>
-      <w:pPr>
-        <w:pStyle w:val="ListParagraph"/>
-        <w:numPr>
-          <w:ilvl w:val="0"/>
-          <w:numId w:val="2"/>
-        </w:numPr>
-        <w:spacing w:after="60"/>
-      </w:pPr>
-      <w:r>
-        <w:rPr>
-          <w:rFonts w:ascii="Calibri" w:cs="Calibri" w:eastAsia="Calibri" w:hAnsi="Calibri"/>
-        </w:rPr>
-        <w:t xml:space="preserve">Vortrocknung u. Bereitstellung der Rohstoffe</w:t>
-      </w:r>
-    </w:p>
-    <w:p>
-      <w:pPr>
-        <w:pStyle w:val="ListParagraph"/>
-        <w:numPr>
-          <w:ilvl w:val="0"/>
-          <w:numId w:val="2"/>
-        </w:numPr>
-        <w:spacing w:after="60"/>
-      </w:pPr>
-      <w:r>
-        <w:rPr>
-          <w:rFonts w:ascii="Calibri" w:cs="Calibri" w:eastAsia="Calibri" w:hAnsi="Calibri"/>
-        </w:rPr>
-        <w:t xml:space="preserve">Verwaltung u. Vorbereitung der Einlegeteile</w:t>
-      </w:r>
-    </w:p>
-    <w:p>
-      <w:pPr>
-        <w:pStyle w:val="ListParagraph"/>
-        <w:numPr>
-          <w:ilvl w:val="0"/>
-          <w:numId w:val="2"/>
-        </w:numPr>
-        <w:spacing w:after="60"/>
-      </w:pPr>
-      <w:r>
-        <w:rPr>
-          <w:rFonts w:ascii="Calibri" w:cs="Calibri" w:eastAsia="Calibri" w:hAnsi="Calibri"/>
-        </w:rPr>
-        <w:t xml:space="preserve">Einlagerung produzierter Ware</w:t>
-      </w:r>
-    </w:p>
-    <w:p>
-      <w:pPr>
-        <w:pStyle w:val="ListParagraph"/>
-        <w:numPr>
-          <w:ilvl w:val="0"/>
-          <w:numId w:val="2"/>
-        </w:numPr>
-        <w:spacing w:after="60"/>
-      </w:pPr>
-      <w:r>
-        <w:rPr>
-          <w:rFonts w:ascii="Calibri" w:cs="Calibri" w:eastAsia="Calibri" w:hAnsi="Calibri"/>
-        </w:rPr>
-        <w:t xml:space="preserve">Transport gesperrter Ware ins Gesperrt-Lager</w:t>
-      </w:r>
-    </w:p>
-    <w:p>
-      <w:pPr>
-        <w:pStyle w:val="ListParagraph"/>
-        <w:numPr>
-          <w:ilvl w:val="0"/>
-          <w:numId w:val="2"/>
-        </w:numPr>
-        <w:spacing w:after="60"/>
-      </w:pPr>
-      <w:r>
-        <w:rPr>
-          <w:rFonts w:ascii="Calibri" w:cs="Calibri" w:eastAsia="Calibri" w:hAnsi="Calibri"/>
-        </w:rPr>
-        <w:t xml:space="preserve">Kommissionierung und Versand</w:t>
-      </w:r>
-    </w:p>
-    <w:p>
-      <w:pPr>
-        <w:pStyle w:val="ListParagraph"/>
-        <w:numPr>
-          <w:ilvl w:val="0"/>
-          <w:numId w:val="2"/>
-        </w:numPr>
-        <w:spacing w:after="60"/>
-      </w:pPr>
-      <w:r>
-        <w:rPr>
-          <w:rFonts w:ascii="Calibri" w:cs="Calibri" w:eastAsia="Calibri" w:hAnsi="Calibri"/>
-        </w:rPr>
-        <w:t xml:space="preserve">Bestellanforderungen an Einkauf</w:t>
-      </w:r>
-    </w:p>
-    <w:p>
-      <w:pPr>
-        <w:pStyle w:val="ListParagraph"/>
-        <w:numPr>
-          <w:ilvl w:val="0"/>
-          <w:numId w:val="2"/>
-        </w:numPr>
-        <w:spacing w:after="60"/>
-      </w:pPr>
-      <w:r>
-        <w:rPr>
-          <w:rFonts w:ascii="Calibri" w:cs="Calibri" w:eastAsia="Calibri" w:hAnsi="Calibri"/>
-        </w:rPr>
-        <w:t xml:space="preserve">Bedarfsmeldung bei Abfallentsorgung</w:t>
+        <w:t xml:space="preserve">7.5.3.6 Aufgaben Produktionslogistiker</w:t>
+      </w:r>
+    </w:p>
+    <w:p>
+      <w:pPr>
+        <w:pStyle w:val="ListParagraph"/>
+        <w:numPr>
+          <w:ilvl w:val="0"/>
+          <w:numId w:val="2"/>
+        </w:numPr>
+        <w:spacing w:after="60"/>
+      </w:pPr>
+      <w:r>
+        <w:rPr>
+          <w:rFonts w:ascii="Calibri" w:cs="Calibri" w:eastAsia="Calibri" w:hAnsi="Calibri"/>
+        </w:rPr>
+        <w:t xml:space="preserve">Verwaltung, Sicherstellung der Versorgung mit Zukaufteilen, Kartonagen und internen Leergebinden</w:t>
+      </w:r>
+    </w:p>
+    <w:p>
+      <w:pPr>
+        <w:pStyle w:val="ListParagraph"/>
+        <w:numPr>
+          <w:ilvl w:val="0"/>
+          <w:numId w:val="2"/>
+        </w:numPr>
+        <w:spacing w:after="60"/>
+      </w:pPr>
+      <w:r>
+        <w:rPr>
+          <w:rFonts w:ascii="Calibri" w:cs="Calibri" w:eastAsia="Calibri" w:hAnsi="Calibri"/>
+        </w:rPr>
+        <w:t xml:space="preserve">Durchführen von Reinigungsarbeiten wie Blecheinleger, Buchsen, Schrauben, Gebinde, …</w:t>
+      </w:r>
+    </w:p>
+    <w:p>
+      <w:pPr>
+        <w:pStyle w:val="ListParagraph"/>
+        <w:numPr>
+          <w:ilvl w:val="0"/>
+          <w:numId w:val="2"/>
+        </w:numPr>
+        <w:spacing w:after="60"/>
+      </w:pPr>
+      <w:r>
+        <w:rPr>
+          <w:rFonts w:ascii="Calibri" w:cs="Calibri" w:eastAsia="Calibri" w:hAnsi="Calibri"/>
+        </w:rPr>
+        <w:t xml:space="preserve">Zu- und Abtransport von HF und FT-Teile (Gebinde) aus der Montage</w:t>
+      </w:r>
+    </w:p>
+    <w:p>
+      <w:pPr>
+        <w:pStyle w:val="ListParagraph"/>
+        <w:numPr>
+          <w:ilvl w:val="0"/>
+          <w:numId w:val="2"/>
+        </w:numPr>
+        <w:spacing w:after="60"/>
+      </w:pPr>
+      <w:r>
+        <w:rPr>
+          <w:rFonts w:ascii="Calibri" w:cs="Calibri" w:eastAsia="Calibri" w:hAnsi="Calibri"/>
+        </w:rPr>
+        <w:t xml:space="preserve">Übergabe der Versandeinheiten an das Lager auf definierten Platz</w:t>
+      </w:r>
+    </w:p>
+    <w:p>
+      <w:pPr>
+        <w:pStyle w:val="ListParagraph"/>
+        <w:numPr>
+          <w:ilvl w:val="0"/>
+          <w:numId w:val="2"/>
+        </w:numPr>
+        <w:spacing w:after="60"/>
+      </w:pPr>
+      <w:r>
+        <w:rPr>
+          <w:rFonts w:ascii="Calibri" w:cs="Calibri" w:eastAsia="Calibri" w:hAnsi="Calibri"/>
+        </w:rPr>
+        <w:t xml:space="preserve">Bereitstellung von Leergebinde u. Verpackungsmaterial in der Montage</w:t>
+      </w:r>
+    </w:p>
+    <w:p>
+      <w:pPr>
+        <w:pStyle w:val="ListParagraph"/>
+        <w:numPr>
+          <w:ilvl w:val="0"/>
+          <w:numId w:val="2"/>
+        </w:numPr>
+        <w:spacing w:after="60"/>
+      </w:pPr>
+      <w:r>
+        <w:rPr>
+          <w:rFonts w:ascii="Calibri" w:cs="Calibri" w:eastAsia="Calibri" w:hAnsi="Calibri"/>
+        </w:rPr>
+        <w:t xml:space="preserve">Buchungen prüfen und durchführen von Korrekturen</w:t>
+      </w:r>
+    </w:p>
+    <w:p>
+      <w:pPr>
+        <w:pStyle w:val="ListParagraph"/>
+        <w:numPr>
+          <w:ilvl w:val="0"/>
+          <w:numId w:val="2"/>
+        </w:numPr>
+        <w:spacing w:after="60"/>
+      </w:pPr>
+      <w:r>
+        <w:rPr>
+          <w:rFonts w:ascii="Calibri" w:cs="Calibri" w:eastAsia="Calibri" w:hAnsi="Calibri"/>
+        </w:rPr>
+        <w:t xml:space="preserve">Korrektur und Rückmeldung von falschen Gewichtsangaben</w:t>
+      </w:r>
+    </w:p>
+    <w:p>
+      <w:pPr>
+        <w:pStyle w:val="ListParagraph"/>
+        <w:numPr>
+          <w:ilvl w:val="0"/>
+          <w:numId w:val="2"/>
+        </w:numPr>
+        <w:spacing w:after="60"/>
+      </w:pPr>
+      <w:r>
+        <w:rPr>
+          <w:rFonts w:ascii="Calibri" w:cs="Calibri" w:eastAsia="Calibri" w:hAnsi="Calibri"/>
+        </w:rPr>
+        <w:t xml:space="preserve">Kommunikation mit Lagerverantwortlichen bei Abweichungen durchführen</w:t>
+      </w:r>
+    </w:p>
+    <w:p>
+      <w:pPr>
+        <w:pStyle w:val="ListParagraph"/>
+        <w:numPr>
+          <w:ilvl w:val="0"/>
+          <w:numId w:val="2"/>
+        </w:numPr>
+        <w:spacing w:after="60"/>
+      </w:pPr>
+      <w:r>
+        <w:rPr>
+          <w:rFonts w:ascii="Calibri" w:cs="Calibri" w:eastAsia="Calibri" w:hAnsi="Calibri"/>
+        </w:rPr>
+        <w:t xml:space="preserve">Abschließen von Produktionsaufträgen im System</w:t>
+      </w:r>
+    </w:p>
+    <w:p>
+      <w:pPr>
+        <w:pStyle w:val="ListParagraph"/>
+        <w:numPr>
+          <w:ilvl w:val="0"/>
+          <w:numId w:val="2"/>
+        </w:numPr>
+        <w:spacing w:after="60"/>
+      </w:pPr>
+      <w:r>
+        <w:rPr>
+          <w:rFonts w:ascii="Calibri" w:cs="Calibri" w:eastAsia="Calibri" w:hAnsi="Calibri"/>
+        </w:rPr>
+        <w:t xml:space="preserve">Abwiegen und Entsorgen / Zuführen von Ausschüssen (Recyclingmaterial), Papier, Kartonagen in allen Bereichen</w:t>
+      </w:r>
+    </w:p>
+    <w:p>
+      <w:pPr>
+        <w:spacing w:after="100" w:before="200"/>
+      </w:pPr>
+      <w:r>
+        <w:rPr>
+          <w:rFonts w:ascii="Calibri" w:cs="Calibri" w:eastAsia="Calibri" w:hAnsi="Calibri"/>
+          <w:b/>
+          <w:bCs/>
+          <w:sz w:val="22"/>
+          <w:szCs w:val="22"/>
+        </w:rPr>
+        <w:t xml:space="preserve">7.5.3.7 Aufgaben Produktionsplanung</w:t>
+      </w:r>
+    </w:p>
+    <w:p>
+      <w:pPr>
+        <w:pStyle w:val="ListParagraph"/>
+        <w:numPr>
+          <w:ilvl w:val="0"/>
+          <w:numId w:val="2"/>
+        </w:numPr>
+        <w:spacing w:after="60"/>
+      </w:pPr>
+      <w:r>
+        <w:rPr>
+          <w:rFonts w:ascii="Calibri" w:cs="Calibri" w:eastAsia="Calibri" w:hAnsi="Calibri"/>
+        </w:rPr>
+        <w:t xml:space="preserve">Produktionsfeinplanung</w:t>
+      </w:r>
+    </w:p>
+    <w:p>
+      <w:pPr>
+        <w:pStyle w:val="ListParagraph"/>
+        <w:numPr>
+          <w:ilvl w:val="0"/>
+          <w:numId w:val="2"/>
+        </w:numPr>
+        <w:spacing w:after="60"/>
+      </w:pPr>
+      <w:r>
+        <w:rPr>
+          <w:rFonts w:ascii="Calibri" w:cs="Calibri" w:eastAsia="Calibri" w:hAnsi="Calibri"/>
+        </w:rPr>
+        <w:t xml:space="preserve">Zusammenarbeit mit und Unterstützung der Arbeitsvorbereitung (Mithilfe der Personaleinsatzplanung/Einsteuerung der Reparaturen und Wartungen von den Werkzeugen)</w:t>
+      </w:r>
+    </w:p>
+    <w:p>
+      <w:pPr>
+        <w:pStyle w:val="ListParagraph"/>
+        <w:numPr>
+          <w:ilvl w:val="0"/>
+          <w:numId w:val="2"/>
+        </w:numPr>
+        <w:spacing w:after="60"/>
+      </w:pPr>
+      <w:r>
+        <w:rPr>
+          <w:rFonts w:ascii="Calibri" w:cs="Calibri" w:eastAsia="Calibri" w:hAnsi="Calibri"/>
+        </w:rPr>
+        <w:t xml:space="preserve">Aktive Mitarbeit bei der Optimierung von Prozessen und Maßnahmen zur Qualitäts- oder Wirtschaftlichkeitsverbesserung</w:t>
+      </w:r>
+    </w:p>
+    <w:p>
+      <w:pPr>
+        <w:pStyle w:val="ListParagraph"/>
+        <w:numPr>
+          <w:ilvl w:val="0"/>
+          <w:numId w:val="2"/>
+        </w:numPr>
+        <w:spacing w:after="60"/>
+      </w:pPr>
+      <w:r>
+        <w:rPr>
+          <w:rFonts w:ascii="Calibri" w:cs="Calibri" w:eastAsia="Calibri" w:hAnsi="Calibri"/>
+        </w:rPr>
+        <w:t xml:space="preserve">Mitarbeit bei logistischen und produktionswirtschaftlichen Projekten</w:t>
+      </w:r>
+    </w:p>
+    <w:p>
+      <w:pPr>
+        <w:pStyle w:val="ListParagraph"/>
+        <w:numPr>
+          <w:ilvl w:val="0"/>
+          <w:numId w:val="2"/>
+        </w:numPr>
+        <w:spacing w:after="60"/>
+      </w:pPr>
+      <w:r>
+        <w:rPr>
+          <w:rFonts w:ascii="Calibri" w:cs="Calibri" w:eastAsia="Calibri" w:hAnsi="Calibri"/>
+        </w:rPr>
+        <w:t xml:space="preserve">Projektmanagement im Produktionsbereich</w:t>
+      </w:r>
+    </w:p>
+    <w:p>
+      <w:pPr>
+        <w:pStyle w:val="ListParagraph"/>
+        <w:numPr>
+          <w:ilvl w:val="0"/>
+          <w:numId w:val="2"/>
+        </w:numPr>
+        <w:spacing w:after="60"/>
+      </w:pPr>
+      <w:r>
+        <w:rPr>
+          <w:rFonts w:ascii="Calibri" w:cs="Calibri" w:eastAsia="Calibri" w:hAnsi="Calibri"/>
+        </w:rPr>
+        <w:t xml:space="preserve">Administrative Tätigkeiten im Produktionsbereich (z.B.: Vorbereitung der Produktionsaufträge, Erstellung unterschiedlicher Listen/Tabellen, usw.)</w:t>
+      </w:r>
+    </w:p>
+    <w:p>
+      <w:pPr>
+        <w:pStyle w:val="ListParagraph"/>
+        <w:numPr>
+          <w:ilvl w:val="0"/>
+          <w:numId w:val="2"/>
+        </w:numPr>
+        <w:spacing w:after="60"/>
+      </w:pPr>
+      <w:r>
+        <w:rPr>
+          <w:rFonts w:ascii="Calibri" w:cs="Calibri" w:eastAsia="Calibri" w:hAnsi="Calibri"/>
+        </w:rPr>
+        <w:t xml:space="preserve">Umsetzung der Vorgaben (Kundenbedarfe) laut Kapazitätsübersicht-Liste</w:t>
+      </w:r>
+    </w:p>
+    <w:p>
+      <w:pPr>
+        <w:pStyle w:val="ListParagraph"/>
+        <w:numPr>
+          <w:ilvl w:val="0"/>
+          <w:numId w:val="2"/>
+        </w:numPr>
+        <w:spacing w:after="60"/>
+      </w:pPr>
+      <w:r>
+        <w:rPr>
+          <w:rFonts w:ascii="Calibri" w:cs="Calibri" w:eastAsia="Calibri" w:hAnsi="Calibri"/>
+        </w:rPr>
+        <w:t xml:space="preserve">Erstellung der Produktionsaufträge im ERP-System (FOSS)</w:t>
+      </w:r>
+    </w:p>
+    <w:p>
+      <w:pPr>
+        <w:pStyle w:val="ListParagraph"/>
+        <w:numPr>
+          <w:ilvl w:val="0"/>
+          <w:numId w:val="2"/>
+        </w:numPr>
+        <w:spacing w:after="60"/>
+      </w:pPr>
+      <w:r>
+        <w:rPr>
+          <w:rFonts w:ascii="Calibri" w:cs="Calibri" w:eastAsia="Calibri" w:hAnsi="Calibri"/>
+        </w:rPr>
+        <w:t xml:space="preserve">Einplanung der Produktionsaufträge im MES-System (authentig)</w:t>
+      </w:r>
+    </w:p>
+    <w:p>
+      <w:pPr>
+        <w:pStyle w:val="ListParagraph"/>
+        <w:numPr>
+          <w:ilvl w:val="0"/>
+          <w:numId w:val="2"/>
+        </w:numPr>
+        <w:spacing w:after="60"/>
+      </w:pPr>
+      <w:r>
+        <w:rPr>
+          <w:rFonts w:ascii="Calibri" w:cs="Calibri" w:eastAsia="Calibri" w:hAnsi="Calibri"/>
+        </w:rPr>
+        <w:t xml:space="preserve">Dokumentation im DocuWare anlegen</w:t>
+      </w:r>
+    </w:p>
+    <w:p>
+      <w:pPr>
+        <w:pStyle w:val="ListParagraph"/>
+        <w:numPr>
+          <w:ilvl w:val="0"/>
+          <w:numId w:val="2"/>
+        </w:numPr>
+        <w:spacing w:after="60"/>
+      </w:pPr>
+      <w:r>
+        <w:rPr>
+          <w:rFonts w:ascii="Calibri" w:cs="Calibri" w:eastAsia="Calibri" w:hAnsi="Calibri"/>
+        </w:rPr>
+        <w:t xml:space="preserve">Berichtswesen</w:t>
+      </w:r>
+    </w:p>
+    <w:p>
+      <w:pPr>
+        <w:spacing w:after="100" w:before="200"/>
+      </w:pPr>
+      <w:r>
+        <w:rPr>
+          <w:rFonts w:ascii="Calibri" w:cs="Calibri" w:eastAsia="Calibri" w:hAnsi="Calibri"/>
+          <w:b/>
+          <w:bCs/>
+          <w:sz w:val="22"/>
+          <w:szCs w:val="22"/>
+        </w:rPr>
+        <w:t xml:space="preserve">7.5.3.8 Aufgaben Digitale Prozessentwicklung &amp; Lean Management (ex Arbeitsvorbereitung)</w:t>
+      </w:r>
+    </w:p>
+    <w:p>
+      <w:pPr>
+        <w:pStyle w:val="ListParagraph"/>
+        <w:numPr>
+          <w:ilvl w:val="0"/>
+          <w:numId w:val="2"/>
+        </w:numPr>
+        <w:spacing w:after="60"/>
+      </w:pPr>
+      <w:r>
+        <w:rPr>
+          <w:rFonts w:ascii="Calibri" w:cs="Calibri" w:eastAsia="Calibri" w:hAnsi="Calibri"/>
+        </w:rPr>
+        <w:t xml:space="preserve">Stammdatenpflege</w:t>
+      </w:r>
+    </w:p>
+    <w:p>
+      <w:pPr>
+        <w:pStyle w:val="ListParagraph"/>
+        <w:numPr>
+          <w:ilvl w:val="0"/>
+          <w:numId w:val="2"/>
+        </w:numPr>
+        <w:spacing w:after="60"/>
+      </w:pPr>
+      <w:r>
+        <w:rPr>
+          <w:rFonts w:ascii="Calibri" w:cs="Calibri" w:eastAsia="Calibri" w:hAnsi="Calibri"/>
+        </w:rPr>
+        <w:t xml:space="preserve">Arbeitsaufträge rechtzeitig unter Berücksichtigung der Projektpläne erstellen</w:t>
+      </w:r>
+    </w:p>
+    <w:p>
+      <w:pPr>
+        <w:pStyle w:val="ListParagraph"/>
+        <w:numPr>
+          <w:ilvl w:val="0"/>
+          <w:numId w:val="2"/>
+        </w:numPr>
+        <w:spacing w:after="60"/>
+      </w:pPr>
+      <w:r>
+        <w:rPr>
+          <w:rFonts w:ascii="Calibri" w:cs="Calibri" w:eastAsia="Calibri" w:hAnsi="Calibri"/>
+        </w:rPr>
+        <w:t xml:space="preserve">Prozessdaten- und Werkzeugoptimierung</w:t>
+      </w:r>
+    </w:p>
+    <w:p>
+      <w:pPr>
+        <w:pStyle w:val="ListParagraph"/>
+        <w:numPr>
+          <w:ilvl w:val="0"/>
+          <w:numId w:val="2"/>
+        </w:numPr>
+        <w:spacing w:after="60"/>
+      </w:pPr>
+      <w:r>
+        <w:rPr>
+          <w:rFonts w:ascii="Calibri" w:cs="Calibri" w:eastAsia="Calibri" w:hAnsi="Calibri"/>
+        </w:rPr>
+        <w:t xml:space="preserve">Informationspflicht an die vorgesetzte Stelle bei drohenden Kapazitätsengpässen oder anderen Einflüssen, welche die Bedarfserfüllung gefährden</w:t>
+      </w:r>
+    </w:p>
+    <w:p>
+      <w:pPr>
+        <w:pStyle w:val="ListParagraph"/>
+        <w:numPr>
+          <w:ilvl w:val="0"/>
+          <w:numId w:val="2"/>
+        </w:numPr>
+        <w:spacing w:after="60"/>
+      </w:pPr>
+      <w:r>
+        <w:rPr>
+          <w:rFonts w:ascii="Calibri" w:cs="Calibri" w:eastAsia="Calibri" w:hAnsi="Calibri"/>
+        </w:rPr>
+        <w:t xml:space="preserve">Machbarkeitsprüfungen bzgl. rechtzeitiger Bereitstellung von Werkzeugen und Vorrichtungen</w:t>
+      </w:r>
+    </w:p>
+    <w:p>
+      <w:pPr>
+        <w:pStyle w:val="ListParagraph"/>
+        <w:numPr>
+          <w:ilvl w:val="0"/>
+          <w:numId w:val="2"/>
+        </w:numPr>
+        <w:spacing w:after="60"/>
+      </w:pPr>
+      <w:r>
+        <w:rPr>
+          <w:rFonts w:ascii="Calibri" w:cs="Calibri" w:eastAsia="Calibri" w:hAnsi="Calibri"/>
+        </w:rPr>
+        <w:t xml:space="preserve">Mitarbeit bei logistischen und produktionswirtschaftlichen Projekten</w:t>
+      </w:r>
+    </w:p>
+    <w:p>
+      <w:pPr>
+        <w:pStyle w:val="ListParagraph"/>
+        <w:numPr>
+          <w:ilvl w:val="0"/>
+          <w:numId w:val="2"/>
+        </w:numPr>
+        <w:spacing w:after="60"/>
+      </w:pPr>
+      <w:r>
+        <w:rPr>
+          <w:rFonts w:ascii="Calibri" w:cs="Calibri" w:eastAsia="Calibri" w:hAnsi="Calibri"/>
+        </w:rPr>
+        <w:t xml:space="preserve">Vergabe u. Verwaltung von Lagerplätzen für WZG, Vorrichtungen, Mess-/Hilfsmittel</w:t>
+      </w:r>
+    </w:p>
+    <w:p>
+      <w:pPr>
+        <w:spacing w:after="100" w:before="200"/>
+      </w:pPr>
+      <w:r>
+        <w:rPr>
+          <w:rFonts w:ascii="Calibri" w:cs="Calibri" w:eastAsia="Calibri" w:hAnsi="Calibri"/>
+          <w:b/>
+          <w:bCs/>
+          <w:sz w:val="22"/>
+          <w:szCs w:val="22"/>
+        </w:rPr>
+        <w:t xml:space="preserve">7.5.3.9 Aufgaben Qualitätsprüfer/in (PQB)</w:t>
+      </w:r>
+    </w:p>
+    <w:p>
+      <w:pPr>
+        <w:pStyle w:val="ListParagraph"/>
+        <w:numPr>
+          <w:ilvl w:val="0"/>
+          <w:numId w:val="2"/>
+        </w:numPr>
+        <w:spacing w:after="60"/>
+      </w:pPr>
+      <w:r>
+        <w:rPr>
+          <w:rFonts w:ascii="Calibri" w:cs="Calibri" w:eastAsia="Calibri" w:hAnsi="Calibri"/>
+        </w:rPr>
+        <w:t xml:space="preserve">Durchführung von fertigungsbegleitenden Qualitätsprüfungen</w:t>
+      </w:r>
+    </w:p>
+    <w:p>
+      <w:pPr>
+        <w:pStyle w:val="ListParagraph"/>
+        <w:numPr>
+          <w:ilvl w:val="0"/>
+          <w:numId w:val="2"/>
+        </w:numPr>
+        <w:spacing w:after="60"/>
+      </w:pPr>
+      <w:r>
+        <w:rPr>
+          <w:rFonts w:ascii="Calibri" w:cs="Calibri" w:eastAsia="Calibri" w:hAnsi="Calibri"/>
+        </w:rPr>
+        <w:t xml:space="preserve">Dokumentieren der Prüf- und Messergebnisse in Q Studio</w:t>
+      </w:r>
+    </w:p>
+    <w:p>
+      <w:pPr>
+        <w:pStyle w:val="ListParagraph"/>
+        <w:numPr>
+          <w:ilvl w:val="0"/>
+          <w:numId w:val="2"/>
+        </w:numPr>
+        <w:spacing w:after="60"/>
+      </w:pPr>
+      <w:r>
+        <w:rPr>
+          <w:rFonts w:ascii="Calibri" w:cs="Calibri" w:eastAsia="Calibri" w:hAnsi="Calibri"/>
+        </w:rPr>
+        <w:t xml:space="preserve">Erfassen von festgestellten Fehlern</w:t>
+      </w:r>
+    </w:p>
+    <w:p>
+      <w:pPr>
+        <w:pStyle w:val="ListParagraph"/>
+        <w:numPr>
+          <w:ilvl w:val="0"/>
+          <w:numId w:val="2"/>
+        </w:numPr>
+        <w:spacing w:after="60"/>
+      </w:pPr>
+      <w:r>
+        <w:rPr>
+          <w:rFonts w:ascii="Calibri" w:cs="Calibri" w:eastAsia="Calibri" w:hAnsi="Calibri"/>
+        </w:rPr>
+        <w:t xml:space="preserve">Mitarbeit bei der Reklamationsbearbeitung</w:t>
+      </w:r>
+    </w:p>
+    <w:p>
+      <w:pPr>
+        <w:pStyle w:val="ListParagraph"/>
+        <w:numPr>
+          <w:ilvl w:val="0"/>
+          <w:numId w:val="2"/>
+        </w:numPr>
+        <w:spacing w:after="60"/>
+      </w:pPr>
+      <w:r>
+        <w:rPr>
+          <w:rFonts w:ascii="Calibri" w:cs="Calibri" w:eastAsia="Calibri" w:hAnsi="Calibri"/>
+        </w:rPr>
+        <w:t xml:space="preserve">Durchführung von Qualitätsschulungen</w:t>
+      </w:r>
+    </w:p>
+    <w:p>
+      <w:pPr>
+        <w:pStyle w:val="ListParagraph"/>
+        <w:numPr>
+          <w:ilvl w:val="0"/>
+          <w:numId w:val="2"/>
+        </w:numPr>
+        <w:spacing w:after="60"/>
+      </w:pPr>
+      <w:r>
+        <w:rPr>
+          <w:rFonts w:ascii="Calibri" w:cs="Calibri" w:eastAsia="Calibri" w:hAnsi="Calibri"/>
+        </w:rPr>
+        <w:t xml:space="preserve">Sperren von fehlerhaften Teilen</w:t>
+      </w:r>
+    </w:p>
+    <w:p>
+      <w:pPr>
+        <w:pStyle w:val="ListParagraph"/>
+        <w:numPr>
+          <w:ilvl w:val="0"/>
+          <w:numId w:val="2"/>
+        </w:numPr>
+        <w:spacing w:after="60"/>
+      </w:pPr>
+      <w:r>
+        <w:rPr>
+          <w:rFonts w:ascii="Calibri" w:cs="Calibri" w:eastAsia="Calibri" w:hAnsi="Calibri"/>
+        </w:rPr>
+        <w:t xml:space="preserve">Maßnahmenverfolgung bei Prozessänderungen</w:t>
+      </w:r>
+    </w:p>
+    <w:p>
+      <w:pPr>
+        <w:pStyle w:val="ListParagraph"/>
+        <w:numPr>
+          <w:ilvl w:val="0"/>
+          <w:numId w:val="2"/>
+        </w:numPr>
+        <w:spacing w:after="60"/>
+      </w:pPr>
+      <w:r>
+        <w:rPr>
+          <w:rFonts w:ascii="Calibri" w:cs="Calibri" w:eastAsia="Calibri" w:hAnsi="Calibri"/>
+        </w:rPr>
+        <w:t xml:space="preserve">Erststück / Letztstückfreigabe</w:t>
+      </w:r>
+    </w:p>
+    <w:p>
+      <w:pPr>
+        <w:pStyle w:val="ListParagraph"/>
+        <w:numPr>
+          <w:ilvl w:val="0"/>
+          <w:numId w:val="2"/>
+        </w:numPr>
+        <w:spacing w:after="60"/>
+      </w:pPr>
+      <w:r>
+        <w:rPr>
+          <w:rFonts w:ascii="Calibri" w:cs="Calibri" w:eastAsia="Calibri" w:hAnsi="Calibri"/>
+        </w:rPr>
+        <w:t xml:space="preserve">Erneute Freigabe nach Produktionsunterbrechung</w:t>
       </w:r>
     </w:p>
     <w:p>

</xml_diff>

<commit_message>
Gruppenüberschrift "Teamleitungsfunktionen" vor die Teamleiter-Abschnitte einfügen
Kennzeichnet auf gleicher Gliederungsebene wie "Produktionsleiter", dass
die nachfolgenden Abschnitte (Gemeinsame AKV-Basis Hauptprozess/
Unterstützungsprozesse und die einzelnen Teamleitungsrollen) inhaltlich
zur Gruppe der Teamleitungsfunktionen gehören.

Co-Authored-By: Claude Sonnet 5 <noreply@anthropic.com>
Claude-Session: https://claude.ai/code/session_01KTGUGVaPm39C5Y3H1dpETj
</commit_message>
<xml_diff>
--- a/working/7V-5-1_Auftragsabwicklung_Produktion_ENTWURF.docx
+++ b/working/7V-5-1_Auftragsabwicklung_Produktion_ENTWURF.docx
@@ -1778,6 +1778,36 @@
           <w:rFonts w:ascii="Calibri" w:cs="Calibri" w:eastAsia="Calibri" w:hAnsi="Calibri"/>
         </w:rPr>
         <w:t xml:space="preserve">Bei längerer Abwesenheit (Richtwert 4–6 Wochen): erweiterte Befugnisse – auch weitreichende Entscheidungen gehen auf die Vertretung über</w:t>
+      </w:r>
+    </w:p>
+    <w:p>
+      <w:pPr>
+        <w:spacing w:after="100" w:before="200"/>
+      </w:pPr>
+      <w:r>
+        <w:rPr>
+          <w:rFonts w:ascii="Calibri" w:cs="Calibri" w:eastAsia="Calibri" w:hAnsi="Calibri"/>
+          <w:b/>
+          <w:bCs/>
+          <w:sz w:val="22"/>
+          <w:szCs w:val="22"/>
+        </w:rPr>
+        <w:t xml:space="preserve">Teamleitungsfunktionen (Führungsrollen im Hauptprozess und in Unterstützungsprozessen)</w:t>
+      </w:r>
+    </w:p>
+    <w:p>
+      <w:pPr>
+        <w:spacing w:after="100"/>
+      </w:pPr>
+      <w:r>
+        <w:rPr>
+          <w:rFonts w:ascii="Calibri" w:cs="Calibri" w:eastAsia="Calibri" w:hAnsi="Calibri"/>
+          <w:i/>
+          <w:iCs/>
+          <w:sz w:val="18"/>
+          <w:szCs w:val="18"/>
+        </w:rPr>
+        <w:t xml:space="preserve">Umfasst: Teamleitung Spritzguss-Produktion (Schichtführer), Montage, Endfertigung, Lager, Instandhaltung, Werkzeugbau.</w:t>
       </w:r>
     </w:p>
     <w:p>

</xml_diff>

<commit_message>
Internen Meta-Hinweis aus 7.5.3-Abschnitt entfernt
Hinweis auf notes/*.md (internes Arbeitsdokument) gehört nicht in ein
QM-Dokument.

Co-Authored-By: Claude Sonnet 5 <noreply@anthropic.com>
Claude-Session: https://claude.ai/code/session_01KTGUGVaPm39C5Y3H1dpETj
</commit_message>
<xml_diff>
--- a/working/7V-5-1_Auftragsabwicklung_Produktion_ENTWURF.docx
+++ b/working/7V-5-1_Auftragsabwicklung_Produktion_ENTWURF.docx
@@ -171,21 +171,6 @@
           <w:bCs/>
         </w:rPr>
         <w:t xml:space="preserve">7.5.3 Verantwortung und Befugnisse</w:t>
-      </w:r>
-    </w:p>
-    <w:p>
-      <w:pPr>
-        <w:spacing w:after="100"/>
-      </w:pPr>
-      <w:r>
-        <w:rPr>
-          <w:rFonts w:ascii="Calibri" w:cs="Calibri" w:eastAsia="Calibri" w:hAnsi="Calibri"/>
-          <w:i/>
-          <w:iCs/>
-          <w:sz w:val="18"/>
-          <w:szCs w:val="18"/>
-        </w:rPr>
-        <w:t xml:space="preserve">Struktur je Rolle: AKV-Prinzip (Aufgaben / Kompetenzen / Verantwortung), gegliedert nach Themenblöcken. Details und Diskussionsstand siehe notes/*.md.</w:t>
       </w:r>
     </w:p>
     <w:p>

</xml_diff>

<commit_message>
Teamleitung Lager: organisatorische Zuordnung korrigiert, Produktionslogistiker ergänzt
Teamleitung Lager ist dem Abteilungsleiter SCM/Logistik unterstellt,
nicht dem Produktionsleiter (abweichend von den übrigen Teamleitungen
im Hauptprozess). Entsprechend angepasst: Themenblock D
(Personalverantwortung, Ausnahme ergänzt), Lager-Rollenintro,
Teamleiter-Begriffsdefinition (BEGRIFFE.md, BEGRIFFE_ABKUERZUNGEN.md,
OFFENE_ROLLEN.md). Dabei auch die bereits veraltete QMB-Korrespondenz-
Angabe in BEGRIFFE.md konsistent mit der vorherigen Korrektur (QMB
keine Schicht-/Team-Ebene-Funktion) nachgezogen.

Produktionslogistiker Themenblock 2: neue Aufgabe ergänzt (Mitwirkung
bei Stammdatenpflege/-prüfung im ERP-System, z. B. Teilegewicht,
Stückliste).

Co-Authored-By: Claude Sonnet 5 <noreply@anthropic.com>
Claude-Session: https://claude.ai/code/session_01KTGUGVaPm39C5Y3H1dpETj
</commit_message>
<xml_diff>
--- a/working/7V-5-1_Auftragsabwicklung_Produktion_ENTWURF.docx
+++ b/working/7V-5-1_Auftragsabwicklung_Produktion_ENTWURF.docx
@@ -2075,7 +2075,7 @@
           <w:sz w:val="20"/>
           <w:szCs w:val="20"/>
         </w:rPr>
-        <w:t xml:space="preserve">Personalverantwortung für die unterstellten Mitarbeiter des Bereichs, inkl. Sicherheit, Ordnung und Sauberkeit am Arbeitsplatz. Erstverantwortung für disziplinarische Maßnahmen (Produktionsleiter als Eskalationsstufe).</w:t>
+        <w:t xml:space="preserve">Personalverantwortung für die unterstellten Mitarbeiter des Bereichs, inkl. Sicherheit, Ordnung und Sauberkeit am Arbeitsplatz. Erstverantwortung für disziplinarische Maßnahmen (Produktionsleiter als Eskalationsstufe). Ausnahme Teamleitung Lager: disziplinarische Eskalationsstufe ist dort der Abteilungsleiter SCM/Logistik, nicht der Produktionsleiter (siehe 7.5.3.7).</w:t>
       </w:r>
     </w:p>
     <w:p>
@@ -3431,7 +3431,7 @@
           <w:sz w:val="18"/>
           <w:szCs w:val="18"/>
         </w:rPr>
-        <w:t xml:space="preserve">Führungsrolle im Hauptprozess (siehe oben). Hinweis zum Umfang: Der Produktionsleiter ist nicht für die Lagerprozesse allgemein zuständig – hier wird nur der Teil beschrieben, der im Auftragsabwicklungsprozess der Produktion relevant ist.</w:t>
+        <w:t xml:space="preserve">Führungsrolle im Hauptprozess (siehe oben). Organisatorisch ist die Teamleitung Lager dem Abteilungsleiter SCM/Logistik unterstellt, nicht dem Produktionsleiter – abweichend von den übrigen Rollen dieser Gruppe (siehe Themenblock D). Der Produktionsleiter ist nur für die Schnittstelle Lager↔Produktion im Rahmen dieses Dokuments zuständig, nicht für die Lagerprozesse oder die Personalführung allgemein.</w:t>
       </w:r>
     </w:p>
     <w:p>
@@ -4389,6 +4389,22 @@
     </w:p>
     <w:p>
       <w:pPr>
+        <w:pStyle w:val="ListParagraph"/>
+        <w:numPr>
+          <w:ilvl w:val="0"/>
+          <w:numId w:val="2"/>
+        </w:numPr>
+        <w:spacing w:after="60"/>
+      </w:pPr>
+      <w:r>
+        <w:rPr>
+          <w:rFonts w:ascii="Calibri" w:cs="Calibri" w:eastAsia="Calibri" w:hAnsi="Calibri"/>
+        </w:rPr>
+        <w:t xml:space="preserve">Mitwirkung bei der Pflege/Überprüfung von Stammdaten im ERP-System (z. B. Teilegewicht, Stückliste)</w:t>
+      </w:r>
+    </w:p>
+    <w:p>
+      <w:pPr>
         <w:spacing w:after="80" w:before="220"/>
       </w:pPr>
       <w:r>
@@ -8717,7 +8733,7 @@
         <w:rPr>
           <w:rFonts w:ascii="Calibri" w:cs="Calibri" w:eastAsia="Calibri" w:hAnsi="Calibri"/>
         </w:rPr>
-        <w:t xml:space="preserve">Teamleiter – Sammelbegriff für die dem Produktionsleiter unterstellten Führungskräfte</w:t>
+        <w:t xml:space="preserve">Teamleiter – Sammelbegriff für die den jeweiligen Abteilungsleitungen unterstellten Führungskräfte im Produktionsumfeld dieses Dokuments; mit Ausnahme der Teamleitung Lager (Abteilungsleiter SCM/Logistik) dem Produktionsleiter unterstellt</w:t>
       </w:r>
     </w:p>
     <w:sectPr>

</xml_diff>

<commit_message>
Produktname Authentig groß geschrieben
Co-Authored-By: Claude Sonnet 5 <noreply@anthropic.com>
Claude-Session: https://claude.ai/code/session_01KTGUGVaPm39C5Y3H1dpETj
</commit_message>
<xml_diff>
--- a/working/7V-5-1_Auftragsabwicklung_Produktion_ENTWURF.docx
+++ b/working/7V-5-1_Auftragsabwicklung_Produktion_ENTWURF.docx
@@ -4745,7 +4745,7 @@
         <w:rPr>
           <w:rFonts w:ascii="Calibri" w:cs="Calibri" w:eastAsia="Calibri" w:hAnsi="Calibri"/>
         </w:rPr>
-        <w:t xml:space="preserve">Einplanung der Produktionsaufträge im MES-System (authentig)</w:t>
+        <w:t xml:space="preserve">Einplanung der Produktionsaufträge im MES-System (Authentig)</w:t>
       </w:r>
     </w:p>
     <w:p>
@@ -8525,7 +8525,7 @@
         <w:rPr>
           <w:rFonts w:ascii="Calibri" w:cs="Calibri" w:eastAsia="Calibri" w:hAnsi="Calibri"/>
         </w:rPr>
-        <w:t xml:space="preserve">MES (authentig) – Manufacturing Execution System</w:t>
+        <w:t xml:space="preserve">MES (Authentig) – Manufacturing Execution System</w:t>
       </w:r>
     </w:p>
     <w:p>

</xml_diff>

<commit_message>
Instandhaltung: überfüllten Ersatzteilhaltung-Punkt gegliedert
In Unterpunkte aufgeteilt statt als einzelner Fließtext-Bullet.

Co-Authored-By: Claude Sonnet 5 <noreply@anthropic.com>
Claude-Session: https://claude.ai/code/session_01KTGUGVaPm39C5Y3H1dpETj
</commit_message>
<xml_diff>
--- a/working/7V-5-1_Auftragsabwicklung_Produktion_ENTWURF.docx
+++ b/working/7V-5-1_Auftragsabwicklung_Produktion_ENTWURF.docx
@@ -6232,7 +6232,71 @@
         <w:rPr>
           <w:rFonts w:ascii="Calibri" w:cs="Calibri" w:eastAsia="Calibri" w:hAnsi="Calibri"/>
         </w:rPr>
-        <w:t xml:space="preserve">Ersatzteilhaltung: Kleinmateriallager für elektrische, pneumatische, elektronische und hydraulische Standardkomponenten (inkl. Kabel, Stecker u. Ä.); größere Komponenten (z. B. Hydraulikpumpen, Förderschnecken) an verschiedenen Lagerorten (u. a. Werkzeuglager). Kritische, wertige Ersatzteile werden im ERP-System (FOSS) bestandsgeführt, Verbrauchsmaterialien nicht separat. Da die meisten Ersatzteile von den Maschinenherstellern kurzfristig (binnen weniger Tage, bei Bedarf express) zur Verfügung gestellt werden, erfolgt die Beschaffung überwiegend anlassbezogen statt über große eigene Lagerbestände</w:t>
+        <w:t xml:space="preserve">Ersatzteilhaltung:</w:t>
+      </w:r>
+    </w:p>
+    <w:p>
+      <w:pPr>
+        <w:pStyle w:val="ListParagraph"/>
+        <w:numPr>
+          <w:ilvl w:val="1"/>
+          <w:numId w:val="2"/>
+        </w:numPr>
+        <w:spacing w:after="60"/>
+      </w:pPr>
+      <w:r>
+        <w:rPr>
+          <w:rFonts w:ascii="Calibri" w:cs="Calibri" w:eastAsia="Calibri" w:hAnsi="Calibri"/>
+        </w:rPr>
+        <w:t xml:space="preserve">Kleinmateriallager für elektrische, pneumatische, elektronische und hydraulische Standardkomponenten (inkl. Kabel, Stecker u. Ä.)</w:t>
+      </w:r>
+    </w:p>
+    <w:p>
+      <w:pPr>
+        <w:pStyle w:val="ListParagraph"/>
+        <w:numPr>
+          <w:ilvl w:val="1"/>
+          <w:numId w:val="2"/>
+        </w:numPr>
+        <w:spacing w:after="60"/>
+      </w:pPr>
+      <w:r>
+        <w:rPr>
+          <w:rFonts w:ascii="Calibri" w:cs="Calibri" w:eastAsia="Calibri" w:hAnsi="Calibri"/>
+        </w:rPr>
+        <w:t xml:space="preserve">Größere Komponenten (z. B. Hydraulikpumpen, Förderschnecken) an verschiedenen Lagerorten (u. a. Werkzeuglager)</w:t>
+      </w:r>
+    </w:p>
+    <w:p>
+      <w:pPr>
+        <w:pStyle w:val="ListParagraph"/>
+        <w:numPr>
+          <w:ilvl w:val="1"/>
+          <w:numId w:val="2"/>
+        </w:numPr>
+        <w:spacing w:after="60"/>
+      </w:pPr>
+      <w:r>
+        <w:rPr>
+          <w:rFonts w:ascii="Calibri" w:cs="Calibri" w:eastAsia="Calibri" w:hAnsi="Calibri"/>
+        </w:rPr>
+        <w:t xml:space="preserve">Kritische, wertige Ersatzteile werden im ERP-System (FOSS) bestandsgeführt, Verbrauchsmaterialien nicht separat</w:t>
+      </w:r>
+    </w:p>
+    <w:p>
+      <w:pPr>
+        <w:pStyle w:val="ListParagraph"/>
+        <w:numPr>
+          <w:ilvl w:val="1"/>
+          <w:numId w:val="2"/>
+        </w:numPr>
+        <w:spacing w:after="60"/>
+      </w:pPr>
+      <w:r>
+        <w:rPr>
+          <w:rFonts w:ascii="Calibri" w:cs="Calibri" w:eastAsia="Calibri" w:hAnsi="Calibri"/>
+        </w:rPr>
+        <w:t xml:space="preserve">Da die meisten Ersatzteile von den Maschinenherstellern kurzfristig (binnen weniger Tage, bei Bedarf express) zur Verfügung gestellt werden, erfolgt die Beschaffung überwiegend anlassbezogen statt über große eigene Lagerbestände</w:t>
       </w:r>
     </w:p>
     <w:p>

</xml_diff>

<commit_message>
Werkzeugbau: fehlerhaften Rüst-/Werkzeugwechselprozesse-Punkt entfernt
Rüst-/Werkzeugwechsel liegt bei Einsteller/Rüster (siehe
EINSTELLER_RUESTER.md, 7.5.4.4), nicht beim Werkzeugbau. Überbleibsel
aus der Zeit vor Entdeckung dieser Rolle.

Co-Authored-By: Claude Sonnet 5 <noreply@anthropic.com>
Claude-Session: https://claude.ai/code/session_01KTGUGVaPm39C5Y3H1dpETj
</commit_message>
<xml_diff>
--- a/working/7V-5-1_Auftragsabwicklung_Produktion_ENTWURF.docx
+++ b/working/7V-5-1_Auftragsabwicklung_Produktion_ENTWURF.docx
@@ -6580,22 +6580,6 @@
           <w:rFonts w:ascii="Calibri" w:cs="Calibri" w:eastAsia="Calibri" w:hAnsi="Calibri"/>
         </w:rPr>
         <w:t xml:space="preserve">Lagerung und Schutz der Werkzeuge vor Beschädigung/Verschleiß</w:t>
-      </w:r>
-    </w:p>
-    <w:p>
-      <w:pPr>
-        <w:pStyle w:val="ListParagraph"/>
-        <w:numPr>
-          <w:ilvl w:val="0"/>
-          <w:numId w:val="2"/>
-        </w:numPr>
-        <w:spacing w:after="60"/>
-      </w:pPr>
-      <w:r>
-        <w:rPr>
-          <w:rFonts w:ascii="Calibri" w:cs="Calibri" w:eastAsia="Calibri" w:hAnsi="Calibri"/>
-        </w:rPr>
-        <w:t xml:space="preserve">Rüst-/Werkzeugwechselprozesse</w:t>
       </w:r>
     </w:p>
     <w:p>

</xml_diff>

<commit_message>
Werkzeugbau: überfüllten Verschleißteile-Management-Punkt gegliedert
Analog zur Instandhaltung-Gliederung: in Hauptpunkt und Unterpunkte
aufgeteilt statt als einzelner Fließtext-Bullet.

Co-Authored-By: Claude Sonnet 5 <noreply@anthropic.com>
Claude-Session: https://claude.ai/code/session_01KTGUGVaPm39C5Y3H1dpETj
</commit_message>
<xml_diff>
--- a/working/7V-5-1_Auftragsabwicklung_Produktion_ENTWURF.docx
+++ b/working/7V-5-1_Auftragsabwicklung_Produktion_ENTWURF.docx
@@ -6595,7 +6595,39 @@
         <w:rPr>
           <w:rFonts w:ascii="Calibri" w:cs="Calibri" w:eastAsia="Calibri" w:hAnsi="Calibri"/>
         </w:rPr>
-        <w:t xml:space="preserve">Verschleißteile-Management: systematischer Umgang mit Verschleißteilen am Werkzeug (Erkennung, Austausch, Dokumentation). Eine Wartungsstrategie mit hinterlegten Soll-Schusszahlen, erfassten Ist-Schusszahlen und Erreichungsgrad löst die Wartung aus. Werkzeuge werden während Wartung/Reparatur über den LCST (LifeCycle Status) bzw. den Betriebsmittelstatus für die Produktion gesperrt und nach Abschluss wieder für die Planung und Steuerung freigegeben</w:t>
+        <w:t xml:space="preserve">Verschleißteile-Management: systematischer Umgang mit Verschleißteilen am Werkzeug (Erkennung, Austausch, Dokumentation)</w:t>
+      </w:r>
+    </w:p>
+    <w:p>
+      <w:pPr>
+        <w:pStyle w:val="ListParagraph"/>
+        <w:numPr>
+          <w:ilvl w:val="1"/>
+          <w:numId w:val="2"/>
+        </w:numPr>
+        <w:spacing w:after="60"/>
+      </w:pPr>
+      <w:r>
+        <w:rPr>
+          <w:rFonts w:ascii="Calibri" w:cs="Calibri" w:eastAsia="Calibri" w:hAnsi="Calibri"/>
+        </w:rPr>
+        <w:t xml:space="preserve">Eine Wartungsstrategie mit hinterlegten Soll-Schusszahlen, erfassten Ist-Schusszahlen und Erreichungsgrad löst die Wartung aus</w:t>
+      </w:r>
+    </w:p>
+    <w:p>
+      <w:pPr>
+        <w:pStyle w:val="ListParagraph"/>
+        <w:numPr>
+          <w:ilvl w:val="1"/>
+          <w:numId w:val="2"/>
+        </w:numPr>
+        <w:spacing w:after="60"/>
+      </w:pPr>
+      <w:r>
+        <w:rPr>
+          <w:rFonts w:ascii="Calibri" w:cs="Calibri" w:eastAsia="Calibri" w:hAnsi="Calibri"/>
+        </w:rPr>
+        <w:t xml:space="preserve">Werkzeuge werden während Wartung/Reparatur über den LCST (LifeCycle Status) bzw. den Betriebsmittelstatus für die Produktion gesperrt und nach Abschluss wieder für die Planung und Steuerung freigegeben</w:t>
       </w:r>
     </w:p>
     <w:p>

</xml_diff>

<commit_message>
Werkzeugbau: Dokumentation von Werkzeugänderungen falsch zugeordnet entfernt
Technische Werkzeugänderungen inkl. deren Dokumentation/Änderungsstand
liegen bei Prozesstechnik und Bemusterung bzw. Produkt-/Projekttechnik,
nicht beim Werkzeugbau (konsistent mit Themenblock 3).

Co-Authored-By: Claude Sonnet 5 <noreply@anthropic.com>
Claude-Session: https://claude.ai/code/session_01KTGUGVaPm39C5Y3H1dpETj
</commit_message>
<xml_diff>
--- a/working/7V-5-1_Auftragsabwicklung_Produktion_ENTWURF.docx
+++ b/working/7V-5-1_Auftragsabwicklung_Produktion_ENTWURF.docx
@@ -6628,22 +6628,6 @@
           <w:rFonts w:ascii="Calibri" w:cs="Calibri" w:eastAsia="Calibri" w:hAnsi="Calibri"/>
         </w:rPr>
         <w:t xml:space="preserve">Werkzeuge werden während Wartung/Reparatur über den LCST (LifeCycle Status) bzw. den Betriebsmittelstatus für die Produktion gesperrt und nach Abschluss wieder für die Planung und Steuerung freigegeben</w:t>
-      </w:r>
-    </w:p>
-    <w:p>
-      <w:pPr>
-        <w:pStyle w:val="ListParagraph"/>
-        <w:numPr>
-          <w:ilvl w:val="0"/>
-          <w:numId w:val="2"/>
-        </w:numPr>
-        <w:spacing w:after="60"/>
-      </w:pPr>
-      <w:r>
-        <w:rPr>
-          <w:rFonts w:ascii="Calibri" w:cs="Calibri" w:eastAsia="Calibri" w:hAnsi="Calibri"/>
-        </w:rPr>
-        <w:t xml:space="preserve">Dokumentation von Werkzeugänderungen/-modifikationen inkl. Änderungsstand</w:t>
       </w:r>
     </w:p>
     <w:p>

</xml_diff>

<commit_message>
Fließtext/Aufzählungen auf Blocksatz umgestellt
Betrifft alle Textbausteine (p, bullet, akv, akvLabel, note).
Überschriften bleiben unverändert (linksbündig).

Co-Authored-By: Claude Sonnet 5 <noreply@anthropic.com>
Claude-Session: https://claude.ai/code/session_01KTGUGVaPm39C5Y3H1dpETj
</commit_message>
<xml_diff>
--- a/working/7V-5-1_Auftragsabwicklung_Produktion_ENTWURF.docx
+++ b/working/7V-5-1_Auftragsabwicklung_Produktion_ENTWURF.docx
@@ -61,6 +61,7 @@
     <w:p>
       <w:pPr>
         <w:spacing w:after="120"/>
+        <w:jc w:val="both"/>
       </w:pPr>
       <w:r>
         <w:rPr>
@@ -86,6 +87,7 @@
     <w:p>
       <w:pPr>
         <w:spacing w:after="120"/>
+        <w:jc w:val="both"/>
       </w:pPr>
       <w:r>
         <w:rPr>
@@ -97,6 +99,7 @@
     <w:p>
       <w:pPr>
         <w:spacing w:after="80"/>
+        <w:jc w:val="both"/>
       </w:pPr>
       <w:r>
         <w:rPr>
@@ -120,6 +123,7 @@
     <w:p>
       <w:pPr>
         <w:spacing w:after="80"/>
+        <w:jc w:val="both"/>
       </w:pPr>
       <w:r>
         <w:rPr>
@@ -188,6 +192,7 @@
     <w:p>
       <w:pPr>
         <w:spacing w:after="40" w:before="40"/>
+        <w:jc w:val="both"/>
       </w:pPr>
       <w:r>
         <w:rPr>
@@ -208,6 +213,7 @@
           <w:numId w:val="2"/>
         </w:numPr>
         <w:spacing w:after="60"/>
+        <w:jc w:val="both"/>
       </w:pPr>
       <w:r>
         <w:rPr>
@@ -224,6 +230,7 @@
           <w:numId w:val="2"/>
         </w:numPr>
         <w:spacing w:after="60"/>
+        <w:jc w:val="both"/>
       </w:pPr>
       <w:r>
         <w:rPr>
@@ -240,6 +247,7 @@
           <w:numId w:val="2"/>
         </w:numPr>
         <w:spacing w:after="60"/>
+        <w:jc w:val="both"/>
       </w:pPr>
       <w:r>
         <w:rPr>
@@ -256,6 +264,7 @@
           <w:numId w:val="2"/>
         </w:numPr>
         <w:spacing w:after="60"/>
+        <w:jc w:val="both"/>
       </w:pPr>
       <w:r>
         <w:rPr>
@@ -267,6 +276,7 @@
     <w:p>
       <w:pPr>
         <w:spacing w:after="40" w:before="40"/>
+        <w:jc w:val="both"/>
       </w:pPr>
       <w:r>
         <w:rPr>
@@ -287,6 +297,7 @@
           <w:numId w:val="2"/>
         </w:numPr>
         <w:spacing w:after="60"/>
+        <w:jc w:val="both"/>
       </w:pPr>
       <w:r>
         <w:rPr>
@@ -303,6 +314,7 @@
           <w:numId w:val="2"/>
         </w:numPr>
         <w:spacing w:after="60"/>
+        <w:jc w:val="both"/>
       </w:pPr>
       <w:r>
         <w:rPr>
@@ -330,6 +342,7 @@
     <w:p>
       <w:pPr>
         <w:spacing w:after="120"/>
+        <w:jc w:val="both"/>
       </w:pPr>
       <w:r>
         <w:rPr>
@@ -341,6 +354,7 @@
     <w:p>
       <w:pPr>
         <w:spacing w:after="40" w:before="40"/>
+        <w:jc w:val="both"/>
       </w:pPr>
       <w:r>
         <w:rPr>
@@ -361,6 +375,7 @@
           <w:numId w:val="2"/>
         </w:numPr>
         <w:spacing w:after="60"/>
+        <w:jc w:val="both"/>
       </w:pPr>
       <w:r>
         <w:rPr>
@@ -377,6 +392,7 @@
           <w:numId w:val="2"/>
         </w:numPr>
         <w:spacing w:after="60"/>
+        <w:jc w:val="both"/>
       </w:pPr>
       <w:r>
         <w:rPr>
@@ -393,6 +409,7 @@
           <w:numId w:val="2"/>
         </w:numPr>
         <w:spacing w:after="60"/>
+        <w:jc w:val="both"/>
       </w:pPr>
       <w:r>
         <w:rPr>
@@ -404,6 +421,7 @@
     <w:p>
       <w:pPr>
         <w:spacing w:after="80"/>
+        <w:jc w:val="both"/>
       </w:pPr>
       <w:r>
         <w:rPr>
@@ -427,6 +445,7 @@
     <w:p>
       <w:pPr>
         <w:spacing w:after="80"/>
+        <w:jc w:val="both"/>
       </w:pPr>
       <w:r>
         <w:rPr>
@@ -466,6 +485,7 @@
     <w:p>
       <w:pPr>
         <w:spacing w:after="80"/>
+        <w:jc w:val="both"/>
       </w:pPr>
       <w:r>
         <w:rPr>
@@ -489,6 +509,7 @@
     <w:p>
       <w:pPr>
         <w:spacing w:after="80"/>
+        <w:jc w:val="both"/>
       </w:pPr>
       <w:r>
         <w:rPr>
@@ -528,6 +549,7 @@
     <w:p>
       <w:pPr>
         <w:spacing w:after="120"/>
+        <w:jc w:val="both"/>
       </w:pPr>
       <w:r>
         <w:rPr>
@@ -539,6 +561,7 @@
     <w:p>
       <w:pPr>
         <w:spacing w:after="40" w:before="40"/>
+        <w:jc w:val="both"/>
       </w:pPr>
       <w:r>
         <w:rPr>
@@ -559,6 +582,7 @@
           <w:numId w:val="2"/>
         </w:numPr>
         <w:spacing w:after="60"/>
+        <w:jc w:val="both"/>
       </w:pPr>
       <w:r>
         <w:rPr>
@@ -575,6 +599,7 @@
           <w:numId w:val="2"/>
         </w:numPr>
         <w:spacing w:after="60"/>
+        <w:jc w:val="both"/>
       </w:pPr>
       <w:r>
         <w:rPr>
@@ -591,6 +616,7 @@
           <w:numId w:val="2"/>
         </w:numPr>
         <w:spacing w:after="60"/>
+        <w:jc w:val="both"/>
       </w:pPr>
       <w:r>
         <w:rPr>
@@ -602,6 +628,7 @@
     <w:p>
       <w:pPr>
         <w:spacing w:after="40" w:before="40"/>
+        <w:jc w:val="both"/>
       </w:pPr>
       <w:r>
         <w:rPr>
@@ -622,6 +649,7 @@
           <w:numId w:val="2"/>
         </w:numPr>
         <w:spacing w:after="60"/>
+        <w:jc w:val="both"/>
       </w:pPr>
       <w:r>
         <w:rPr>
@@ -638,6 +666,7 @@
           <w:numId w:val="2"/>
         </w:numPr>
         <w:spacing w:after="60"/>
+        <w:jc w:val="both"/>
       </w:pPr>
       <w:r>
         <w:rPr>
@@ -654,6 +683,7 @@
           <w:numId w:val="2"/>
         </w:numPr>
         <w:spacing w:after="60"/>
+        <w:jc w:val="both"/>
       </w:pPr>
       <w:r>
         <w:rPr>
@@ -670,6 +700,7 @@
           <w:numId w:val="2"/>
         </w:numPr>
         <w:spacing w:after="60"/>
+        <w:jc w:val="both"/>
       </w:pPr>
       <w:r>
         <w:rPr>
@@ -686,6 +717,7 @@
           <w:numId w:val="2"/>
         </w:numPr>
         <w:spacing w:after="60"/>
+        <w:jc w:val="both"/>
       </w:pPr>
       <w:r>
         <w:rPr>
@@ -702,6 +734,7 @@
           <w:numId w:val="2"/>
         </w:numPr>
         <w:spacing w:after="60"/>
+        <w:jc w:val="both"/>
       </w:pPr>
       <w:r>
         <w:rPr>
@@ -713,6 +746,7 @@
     <w:p>
       <w:pPr>
         <w:spacing w:after="40" w:before="40"/>
+        <w:jc w:val="both"/>
       </w:pPr>
       <w:r>
         <w:rPr>
@@ -733,6 +767,7 @@
           <w:numId w:val="2"/>
         </w:numPr>
         <w:spacing w:after="60"/>
+        <w:jc w:val="both"/>
       </w:pPr>
       <w:r>
         <w:rPr>
@@ -749,6 +784,7 @@
           <w:numId w:val="2"/>
         </w:numPr>
         <w:spacing w:after="60"/>
+        <w:jc w:val="both"/>
       </w:pPr>
       <w:r>
         <w:rPr>
@@ -776,6 +812,7 @@
     <w:p>
       <w:pPr>
         <w:spacing w:after="120"/>
+        <w:jc w:val="both"/>
       </w:pPr>
       <w:r>
         <w:rPr>
@@ -787,6 +824,7 @@
     <w:p>
       <w:pPr>
         <w:spacing w:after="80"/>
+        <w:jc w:val="both"/>
       </w:pPr>
       <w:r>
         <w:rPr>
@@ -810,6 +848,7 @@
     <w:p>
       <w:pPr>
         <w:spacing w:after="80"/>
+        <w:jc w:val="both"/>
       </w:pPr>
       <w:r>
         <w:rPr>
@@ -849,6 +888,7 @@
     <w:p>
       <w:pPr>
         <w:spacing w:after="120"/>
+        <w:jc w:val="both"/>
       </w:pPr>
       <w:r>
         <w:rPr>
@@ -860,6 +900,7 @@
     <w:p>
       <w:pPr>
         <w:spacing w:after="80"/>
+        <w:jc w:val="both"/>
       </w:pPr>
       <w:r>
         <w:rPr>
@@ -883,6 +924,7 @@
     <w:p>
       <w:pPr>
         <w:spacing w:after="80"/>
+        <w:jc w:val="both"/>
       </w:pPr>
       <w:r>
         <w:rPr>
@@ -922,6 +964,7 @@
     <w:p>
       <w:pPr>
         <w:spacing w:after="40" w:before="40"/>
+        <w:jc w:val="both"/>
       </w:pPr>
       <w:r>
         <w:rPr>
@@ -942,6 +985,7 @@
           <w:numId w:val="2"/>
         </w:numPr>
         <w:spacing w:after="60"/>
+        <w:jc w:val="both"/>
       </w:pPr>
       <w:r>
         <w:rPr>
@@ -958,6 +1002,7 @@
           <w:numId w:val="2"/>
         </w:numPr>
         <w:spacing w:after="60"/>
+        <w:jc w:val="both"/>
       </w:pPr>
       <w:r>
         <w:rPr>
@@ -974,6 +1019,7 @@
           <w:numId w:val="2"/>
         </w:numPr>
         <w:spacing w:after="60"/>
+        <w:jc w:val="both"/>
       </w:pPr>
       <w:r>
         <w:rPr>
@@ -990,6 +1036,7 @@
           <w:numId w:val="2"/>
         </w:numPr>
         <w:spacing w:after="60"/>
+        <w:jc w:val="both"/>
       </w:pPr>
       <w:r>
         <w:rPr>
@@ -1006,6 +1053,7 @@
           <w:numId w:val="2"/>
         </w:numPr>
         <w:spacing w:after="60"/>
+        <w:jc w:val="both"/>
       </w:pPr>
       <w:r>
         <w:rPr>
@@ -1017,6 +1065,7 @@
     <w:p>
       <w:pPr>
         <w:spacing w:after="80"/>
+        <w:jc w:val="both"/>
       </w:pPr>
       <w:r>
         <w:rPr>
@@ -1040,6 +1089,7 @@
     <w:p>
       <w:pPr>
         <w:spacing w:after="100"/>
+        <w:jc w:val="both"/>
       </w:pPr>
       <w:r>
         <w:rPr>
@@ -1071,6 +1121,7 @@
     <w:p>
       <w:pPr>
         <w:spacing w:after="120"/>
+        <w:jc w:val="both"/>
       </w:pPr>
       <w:r>
         <w:rPr>
@@ -1082,6 +1133,7 @@
     <w:p>
       <w:pPr>
         <w:spacing w:after="80"/>
+        <w:jc w:val="both"/>
       </w:pPr>
       <w:r>
         <w:rPr>
@@ -1121,6 +1173,7 @@
     <w:p>
       <w:pPr>
         <w:spacing w:after="80"/>
+        <w:jc w:val="both"/>
       </w:pPr>
       <w:r>
         <w:rPr>
@@ -1160,6 +1213,7 @@
     <w:p>
       <w:pPr>
         <w:spacing w:after="80"/>
+        <w:jc w:val="both"/>
       </w:pPr>
       <w:r>
         <w:rPr>
@@ -1183,6 +1237,7 @@
     <w:p>
       <w:pPr>
         <w:spacing w:after="40" w:before="40"/>
+        <w:jc w:val="both"/>
       </w:pPr>
       <w:r>
         <w:rPr>
@@ -1203,6 +1258,7 @@
           <w:numId w:val="2"/>
         </w:numPr>
         <w:spacing w:after="60"/>
+        <w:jc w:val="both"/>
       </w:pPr>
       <w:r>
         <w:rPr>
@@ -1219,6 +1275,7 @@
           <w:numId w:val="2"/>
         </w:numPr>
         <w:spacing w:after="60"/>
+        <w:jc w:val="both"/>
       </w:pPr>
       <w:r>
         <w:rPr>
@@ -1246,6 +1303,7 @@
     <w:p>
       <w:pPr>
         <w:spacing w:after="120"/>
+        <w:jc w:val="both"/>
       </w:pPr>
       <w:r>
         <w:rPr>
@@ -1257,6 +1315,7 @@
     <w:p>
       <w:pPr>
         <w:spacing w:after="80"/>
+        <w:jc w:val="both"/>
       </w:pPr>
       <w:r>
         <w:rPr>
@@ -1280,6 +1339,7 @@
     <w:p>
       <w:pPr>
         <w:spacing w:after="40" w:before="40"/>
+        <w:jc w:val="both"/>
       </w:pPr>
       <w:r>
         <w:rPr>
@@ -1300,6 +1360,7 @@
           <w:numId w:val="2"/>
         </w:numPr>
         <w:spacing w:after="60"/>
+        <w:jc w:val="both"/>
       </w:pPr>
       <w:r>
         <w:rPr>
@@ -1316,6 +1377,7 @@
           <w:numId w:val="2"/>
         </w:numPr>
         <w:spacing w:after="60"/>
+        <w:jc w:val="both"/>
       </w:pPr>
       <w:r>
         <w:rPr>
@@ -1332,6 +1394,7 @@
           <w:numId w:val="2"/>
         </w:numPr>
         <w:spacing w:after="60"/>
+        <w:jc w:val="both"/>
       </w:pPr>
       <w:r>
         <w:rPr>
@@ -1348,6 +1411,7 @@
           <w:numId w:val="2"/>
         </w:numPr>
         <w:spacing w:after="60"/>
+        <w:jc w:val="both"/>
       </w:pPr>
       <w:r>
         <w:rPr>
@@ -1359,6 +1423,7 @@
     <w:p>
       <w:pPr>
         <w:spacing w:after="100"/>
+        <w:jc w:val="both"/>
       </w:pPr>
       <w:r>
         <w:rPr>
@@ -1390,6 +1455,7 @@
     <w:p>
       <w:pPr>
         <w:spacing w:after="120"/>
+        <w:jc w:val="both"/>
       </w:pPr>
       <w:r>
         <w:rPr>
@@ -1401,6 +1467,7 @@
     <w:p>
       <w:pPr>
         <w:spacing w:after="40" w:before="40"/>
+        <w:jc w:val="both"/>
       </w:pPr>
       <w:r>
         <w:rPr>
@@ -1421,6 +1488,7 @@
           <w:numId w:val="2"/>
         </w:numPr>
         <w:spacing w:after="60"/>
+        <w:jc w:val="both"/>
       </w:pPr>
       <w:r>
         <w:rPr>
@@ -1437,6 +1505,7 @@
           <w:numId w:val="2"/>
         </w:numPr>
         <w:spacing w:after="60"/>
+        <w:jc w:val="both"/>
       </w:pPr>
       <w:r>
         <w:rPr>
@@ -1448,6 +1517,7 @@
     <w:p>
       <w:pPr>
         <w:spacing w:after="80"/>
+        <w:jc w:val="both"/>
       </w:pPr>
       <w:r>
         <w:rPr>
@@ -1487,6 +1557,7 @@
     <w:p>
       <w:pPr>
         <w:spacing w:after="80"/>
+        <w:jc w:val="both"/>
       </w:pPr>
       <w:r>
         <w:rPr>
@@ -1510,6 +1581,7 @@
     <w:p>
       <w:pPr>
         <w:spacing w:after="80"/>
+        <w:jc w:val="both"/>
       </w:pPr>
       <w:r>
         <w:rPr>
@@ -1549,6 +1621,7 @@
     <w:p>
       <w:pPr>
         <w:spacing w:after="120"/>
+        <w:jc w:val="both"/>
       </w:pPr>
       <w:r>
         <w:rPr>
@@ -1560,6 +1633,7 @@
     <w:p>
       <w:pPr>
         <w:spacing w:after="40" w:before="40"/>
+        <w:jc w:val="both"/>
       </w:pPr>
       <w:r>
         <w:rPr>
@@ -1580,6 +1654,7 @@
           <w:numId w:val="2"/>
         </w:numPr>
         <w:spacing w:after="60"/>
+        <w:jc w:val="both"/>
       </w:pPr>
       <w:r>
         <w:rPr>
@@ -1596,6 +1671,7 @@
           <w:numId w:val="2"/>
         </w:numPr>
         <w:spacing w:after="60"/>
+        <w:jc w:val="both"/>
       </w:pPr>
       <w:r>
         <w:rPr>
@@ -1612,6 +1688,7 @@
           <w:numId w:val="2"/>
         </w:numPr>
         <w:spacing w:after="60"/>
+        <w:jc w:val="both"/>
       </w:pPr>
       <w:r>
         <w:rPr>
@@ -1623,6 +1700,7 @@
     <w:p>
       <w:pPr>
         <w:spacing w:after="80"/>
+        <w:jc w:val="both"/>
       </w:pPr>
       <w:r>
         <w:rPr>
@@ -1662,6 +1740,7 @@
     <w:p>
       <w:pPr>
         <w:spacing w:after="40" w:before="40"/>
+        <w:jc w:val="both"/>
       </w:pPr>
       <w:r>
         <w:rPr>
@@ -1682,6 +1761,7 @@
           <w:numId w:val="2"/>
         </w:numPr>
         <w:spacing w:after="60"/>
+        <w:jc w:val="both"/>
       </w:pPr>
       <w:r>
         <w:rPr>
@@ -1698,6 +1778,7 @@
           <w:numId w:val="2"/>
         </w:numPr>
         <w:spacing w:after="60"/>
+        <w:jc w:val="both"/>
       </w:pPr>
       <w:r>
         <w:rPr>
@@ -1714,6 +1795,7 @@
           <w:numId w:val="2"/>
         </w:numPr>
         <w:spacing w:after="60"/>
+        <w:jc w:val="both"/>
       </w:pPr>
       <w:r>
         <w:rPr>
@@ -1725,6 +1807,7 @@
     <w:p>
       <w:pPr>
         <w:spacing w:after="80"/>
+        <w:jc w:val="both"/>
       </w:pPr>
       <w:r>
         <w:rPr>
@@ -1748,6 +1831,7 @@
     <w:p>
       <w:pPr>
         <w:spacing w:after="40" w:before="40"/>
+        <w:jc w:val="both"/>
       </w:pPr>
       <w:r>
         <w:rPr>
@@ -1768,6 +1852,7 @@
           <w:numId w:val="2"/>
         </w:numPr>
         <w:spacing w:after="60"/>
+        <w:jc w:val="both"/>
       </w:pPr>
       <w:r>
         <w:rPr>
@@ -1784,6 +1869,7 @@
           <w:numId w:val="2"/>
         </w:numPr>
         <w:spacing w:after="60"/>
+        <w:jc w:val="both"/>
       </w:pPr>
       <w:r>
         <w:rPr>
@@ -1810,6 +1896,7 @@
     <w:p>
       <w:pPr>
         <w:spacing w:after="100"/>
+        <w:jc w:val="both"/>
       </w:pPr>
       <w:r>
         <w:rPr>
@@ -1839,6 +1926,7 @@
     <w:p>
       <w:pPr>
         <w:spacing w:after="100"/>
+        <w:jc w:val="both"/>
       </w:pPr>
       <w:r>
         <w:rPr>
@@ -1870,6 +1958,7 @@
     <w:p>
       <w:pPr>
         <w:spacing w:after="40" w:before="40"/>
+        <w:jc w:val="both"/>
       </w:pPr>
       <w:r>
         <w:rPr>
@@ -1890,6 +1979,7 @@
           <w:numId w:val="2"/>
         </w:numPr>
         <w:spacing w:after="60"/>
+        <w:jc w:val="both"/>
       </w:pPr>
       <w:r>
         <w:rPr>
@@ -1906,6 +1996,7 @@
           <w:numId w:val="2"/>
         </w:numPr>
         <w:spacing w:after="60"/>
+        <w:jc w:val="both"/>
       </w:pPr>
       <w:r>
         <w:rPr>
@@ -1917,6 +2008,7 @@
     <w:p>
       <w:pPr>
         <w:spacing w:after="40" w:before="40"/>
+        <w:jc w:val="both"/>
       </w:pPr>
       <w:r>
         <w:rPr>
@@ -1937,6 +2029,7 @@
           <w:numId w:val="2"/>
         </w:numPr>
         <w:spacing w:after="60"/>
+        <w:jc w:val="both"/>
       </w:pPr>
       <w:r>
         <w:rPr>
@@ -1953,6 +2046,7 @@
           <w:numId w:val="2"/>
         </w:numPr>
         <w:spacing w:after="60"/>
+        <w:jc w:val="both"/>
       </w:pPr>
       <w:r>
         <w:rPr>
@@ -1980,6 +2074,7 @@
     <w:p>
       <w:pPr>
         <w:spacing w:after="80"/>
+        <w:jc w:val="both"/>
       </w:pPr>
       <w:r>
         <w:rPr>
@@ -2019,6 +2114,7 @@
     <w:p>
       <w:pPr>
         <w:spacing w:after="80"/>
+        <w:jc w:val="both"/>
       </w:pPr>
       <w:r>
         <w:rPr>
@@ -2058,6 +2154,7 @@
     <w:p>
       <w:pPr>
         <w:spacing w:after="80"/>
+        <w:jc w:val="both"/>
       </w:pPr>
       <w:r>
         <w:rPr>
@@ -2081,6 +2178,7 @@
     <w:p>
       <w:pPr>
         <w:spacing w:after="80"/>
+        <w:jc w:val="both"/>
       </w:pPr>
       <w:r>
         <w:rPr>
@@ -2120,6 +2218,7 @@
     <w:p>
       <w:pPr>
         <w:spacing w:after="80"/>
+        <w:jc w:val="both"/>
       </w:pPr>
       <w:r>
         <w:rPr>
@@ -2159,6 +2258,7 @@
     <w:p>
       <w:pPr>
         <w:spacing w:after="80"/>
+        <w:jc w:val="both"/>
       </w:pPr>
       <w:r>
         <w:rPr>
@@ -2198,6 +2298,7 @@
     <w:p>
       <w:pPr>
         <w:spacing w:after="80"/>
+        <w:jc w:val="both"/>
       </w:pPr>
       <w:r>
         <w:rPr>
@@ -2237,6 +2338,7 @@
     <w:p>
       <w:pPr>
         <w:spacing w:after="80"/>
+        <w:jc w:val="both"/>
       </w:pPr>
       <w:r>
         <w:rPr>
@@ -2276,6 +2378,7 @@
     <w:p>
       <w:pPr>
         <w:spacing w:after="120"/>
+        <w:jc w:val="both"/>
       </w:pPr>
       <w:r>
         <w:rPr>
@@ -2287,6 +2390,7 @@
     <w:p>
       <w:pPr>
         <w:spacing w:after="80"/>
+        <w:jc w:val="both"/>
       </w:pPr>
       <w:r>
         <w:rPr>
@@ -2326,6 +2430,7 @@
     <w:p>
       <w:pPr>
         <w:spacing w:after="40" w:before="40"/>
+        <w:jc w:val="both"/>
       </w:pPr>
       <w:r>
         <w:rPr>
@@ -2346,6 +2451,7 @@
           <w:numId w:val="2"/>
         </w:numPr>
         <w:spacing w:after="60"/>
+        <w:jc w:val="both"/>
       </w:pPr>
       <w:r>
         <w:rPr>
@@ -2362,6 +2468,7 @@
           <w:numId w:val="2"/>
         </w:numPr>
         <w:spacing w:after="60"/>
+        <w:jc w:val="both"/>
       </w:pPr>
       <w:r>
         <w:rPr>
@@ -2373,6 +2480,7 @@
     <w:p>
       <w:pPr>
         <w:spacing w:after="80"/>
+        <w:jc w:val="both"/>
       </w:pPr>
       <w:r>
         <w:rPr>
@@ -2411,6 +2519,7 @@
     <w:p>
       <w:pPr>
         <w:spacing w:after="100"/>
+        <w:jc w:val="both"/>
       </w:pPr>
       <w:r>
         <w:rPr>
@@ -2442,6 +2551,7 @@
     <w:p>
       <w:pPr>
         <w:spacing w:after="40" w:before="40"/>
+        <w:jc w:val="both"/>
       </w:pPr>
       <w:r>
         <w:rPr>
@@ -2462,6 +2572,7 @@
           <w:numId w:val="2"/>
         </w:numPr>
         <w:spacing w:after="60"/>
+        <w:jc w:val="both"/>
       </w:pPr>
       <w:r>
         <w:rPr>
@@ -2478,6 +2589,7 @@
           <w:numId w:val="2"/>
         </w:numPr>
         <w:spacing w:after="60"/>
+        <w:jc w:val="both"/>
       </w:pPr>
       <w:r>
         <w:rPr>
@@ -2494,6 +2606,7 @@
           <w:numId w:val="2"/>
         </w:numPr>
         <w:spacing w:after="60"/>
+        <w:jc w:val="both"/>
       </w:pPr>
       <w:r>
         <w:rPr>
@@ -2505,6 +2618,7 @@
     <w:p>
       <w:pPr>
         <w:spacing w:after="40" w:before="40"/>
+        <w:jc w:val="both"/>
       </w:pPr>
       <w:r>
         <w:rPr>
@@ -2525,6 +2639,7 @@
           <w:numId w:val="2"/>
         </w:numPr>
         <w:spacing w:after="60"/>
+        <w:jc w:val="both"/>
       </w:pPr>
       <w:r>
         <w:rPr>
@@ -2541,6 +2656,7 @@
           <w:numId w:val="2"/>
         </w:numPr>
         <w:spacing w:after="60"/>
+        <w:jc w:val="both"/>
       </w:pPr>
       <w:r>
         <w:rPr>
@@ -2552,6 +2668,7 @@
     <w:p>
       <w:pPr>
         <w:spacing w:after="100"/>
+        <w:jc w:val="both"/>
       </w:pPr>
       <w:r>
         <w:rPr>
@@ -2583,6 +2700,7 @@
     <w:p>
       <w:pPr>
         <w:spacing w:after="80"/>
+        <w:jc w:val="both"/>
       </w:pPr>
       <w:r>
         <w:rPr>
@@ -2622,6 +2740,7 @@
     <w:p>
       <w:pPr>
         <w:spacing w:after="80"/>
+        <w:jc w:val="both"/>
       </w:pPr>
       <w:r>
         <w:rPr>
@@ -2661,6 +2780,7 @@
     <w:p>
       <w:pPr>
         <w:spacing w:after="80"/>
+        <w:jc w:val="both"/>
       </w:pPr>
       <w:r>
         <w:rPr>
@@ -2699,6 +2819,7 @@
     <w:p>
       <w:pPr>
         <w:spacing w:after="100"/>
+        <w:jc w:val="both"/>
       </w:pPr>
       <w:r>
         <w:rPr>
@@ -2730,6 +2851,7 @@
     <w:p>
       <w:pPr>
         <w:spacing w:after="40" w:before="40"/>
+        <w:jc w:val="both"/>
       </w:pPr>
       <w:r>
         <w:rPr>
@@ -2750,6 +2872,7 @@
           <w:numId w:val="2"/>
         </w:numPr>
         <w:spacing w:after="60"/>
+        <w:jc w:val="both"/>
       </w:pPr>
       <w:r>
         <w:rPr>
@@ -2766,6 +2889,7 @@
           <w:numId w:val="2"/>
         </w:numPr>
         <w:spacing w:after="60"/>
+        <w:jc w:val="both"/>
       </w:pPr>
       <w:r>
         <w:rPr>
@@ -2777,6 +2901,7 @@
     <w:p>
       <w:pPr>
         <w:spacing w:after="40" w:before="40"/>
+        <w:jc w:val="both"/>
       </w:pPr>
       <w:r>
         <w:rPr>
@@ -2797,6 +2922,7 @@
           <w:numId w:val="2"/>
         </w:numPr>
         <w:spacing w:after="60"/>
+        <w:jc w:val="both"/>
       </w:pPr>
       <w:r>
         <w:rPr>
@@ -2813,6 +2939,7 @@
           <w:numId w:val="2"/>
         </w:numPr>
         <w:spacing w:after="60"/>
+        <w:jc w:val="both"/>
       </w:pPr>
       <w:r>
         <w:rPr>
@@ -2840,6 +2967,7 @@
     <w:p>
       <w:pPr>
         <w:spacing w:after="40" w:before="40"/>
+        <w:jc w:val="both"/>
       </w:pPr>
       <w:r>
         <w:rPr>
@@ -2860,6 +2988,7 @@
           <w:numId w:val="2"/>
         </w:numPr>
         <w:spacing w:after="60"/>
+        <w:jc w:val="both"/>
       </w:pPr>
       <w:r>
         <w:rPr>
@@ -2876,6 +3005,7 @@
           <w:numId w:val="2"/>
         </w:numPr>
         <w:spacing w:after="60"/>
+        <w:jc w:val="both"/>
       </w:pPr>
       <w:r>
         <w:rPr>
@@ -2902,6 +3032,7 @@
     <w:p>
       <w:pPr>
         <w:spacing w:after="100"/>
+        <w:jc w:val="both"/>
       </w:pPr>
       <w:r>
         <w:rPr>
@@ -2933,6 +3064,7 @@
     <w:p>
       <w:pPr>
         <w:spacing w:after="80"/>
+        <w:jc w:val="both"/>
       </w:pPr>
       <w:r>
         <w:rPr>
@@ -2956,6 +3088,7 @@
     <w:p>
       <w:pPr>
         <w:spacing w:after="100"/>
+        <w:jc w:val="both"/>
       </w:pPr>
       <w:r>
         <w:rPr>
@@ -2987,6 +3120,7 @@
     <w:p>
       <w:pPr>
         <w:spacing w:after="80"/>
+        <w:jc w:val="both"/>
       </w:pPr>
       <w:r>
         <w:rPr>
@@ -3026,6 +3160,7 @@
     <w:p>
       <w:pPr>
         <w:spacing w:after="120"/>
+        <w:jc w:val="both"/>
       </w:pPr>
       <w:r>
         <w:rPr>
@@ -3037,6 +3172,7 @@
     <w:p>
       <w:pPr>
         <w:spacing w:after="80"/>
+        <w:jc w:val="both"/>
       </w:pPr>
       <w:r>
         <w:rPr>
@@ -3076,6 +3212,7 @@
     <w:p>
       <w:pPr>
         <w:spacing w:after="120"/>
+        <w:jc w:val="both"/>
       </w:pPr>
       <w:r>
         <w:rPr>
@@ -3087,6 +3224,7 @@
     <w:p>
       <w:pPr>
         <w:spacing w:after="80"/>
+        <w:jc w:val="both"/>
       </w:pPr>
       <w:r>
         <w:rPr>
@@ -3125,6 +3263,7 @@
     <w:p>
       <w:pPr>
         <w:spacing w:after="100"/>
+        <w:jc w:val="both"/>
       </w:pPr>
       <w:r>
         <w:rPr>
@@ -3156,6 +3295,7 @@
     <w:p>
       <w:pPr>
         <w:spacing w:after="120"/>
+        <w:jc w:val="both"/>
       </w:pPr>
       <w:r>
         <w:rPr>
@@ -3167,6 +3307,7 @@
     <w:p>
       <w:pPr>
         <w:spacing w:after="80"/>
+        <w:jc w:val="both"/>
       </w:pPr>
       <w:r>
         <w:rPr>
@@ -3206,6 +3347,7 @@
     <w:p>
       <w:pPr>
         <w:spacing w:after="80"/>
+        <w:jc w:val="both"/>
       </w:pPr>
       <w:r>
         <w:rPr>
@@ -3244,6 +3386,7 @@
     <w:p>
       <w:pPr>
         <w:spacing w:after="100"/>
+        <w:jc w:val="both"/>
       </w:pPr>
       <w:r>
         <w:rPr>
@@ -3275,6 +3418,7 @@
     <w:p>
       <w:pPr>
         <w:spacing w:after="120"/>
+        <w:jc w:val="both"/>
       </w:pPr>
       <w:r>
         <w:rPr>
@@ -3286,6 +3430,7 @@
     <w:p>
       <w:pPr>
         <w:spacing w:after="40" w:before="40"/>
+        <w:jc w:val="both"/>
       </w:pPr>
       <w:r>
         <w:rPr>
@@ -3306,6 +3451,7 @@
           <w:numId w:val="2"/>
         </w:numPr>
         <w:spacing w:after="60"/>
+        <w:jc w:val="both"/>
       </w:pPr>
       <w:r>
         <w:rPr>
@@ -3322,6 +3468,7 @@
           <w:numId w:val="2"/>
         </w:numPr>
         <w:spacing w:after="60"/>
+        <w:jc w:val="both"/>
       </w:pPr>
       <w:r>
         <w:rPr>
@@ -3338,6 +3485,7 @@
           <w:numId w:val="2"/>
         </w:numPr>
         <w:spacing w:after="60"/>
+        <w:jc w:val="both"/>
       </w:pPr>
       <w:r>
         <w:rPr>
@@ -3354,6 +3502,7 @@
           <w:numId w:val="2"/>
         </w:numPr>
         <w:spacing w:after="60"/>
+        <w:jc w:val="both"/>
       </w:pPr>
       <w:r>
         <w:rPr>
@@ -3365,6 +3514,7 @@
     <w:p>
       <w:pPr>
         <w:spacing w:after="100"/>
+        <w:jc w:val="both"/>
       </w:pPr>
       <w:r>
         <w:rPr>
@@ -3396,6 +3546,7 @@
     <w:p>
       <w:pPr>
         <w:spacing w:after="120"/>
+        <w:jc w:val="both"/>
       </w:pPr>
       <w:r>
         <w:rPr>
@@ -3422,6 +3573,7 @@
     <w:p>
       <w:pPr>
         <w:spacing w:after="100"/>
+        <w:jc w:val="both"/>
       </w:pPr>
       <w:r>
         <w:rPr>
@@ -3453,6 +3605,7 @@
     <w:p>
       <w:pPr>
         <w:spacing w:after="80"/>
+        <w:jc w:val="both"/>
       </w:pPr>
       <w:r>
         <w:rPr>
@@ -3492,6 +3645,7 @@
     <w:p>
       <w:pPr>
         <w:spacing w:after="80"/>
+        <w:jc w:val="both"/>
       </w:pPr>
       <w:r>
         <w:rPr>
@@ -3531,6 +3685,7 @@
     <w:p>
       <w:pPr>
         <w:spacing w:after="80"/>
+        <w:jc w:val="both"/>
       </w:pPr>
       <w:r>
         <w:rPr>
@@ -3570,6 +3725,7 @@
     <w:p>
       <w:pPr>
         <w:spacing w:after="80"/>
+        <w:jc w:val="both"/>
       </w:pPr>
       <w:r>
         <w:rPr>
@@ -3609,6 +3765,7 @@
     <w:p>
       <w:pPr>
         <w:spacing w:after="80"/>
+        <w:jc w:val="both"/>
       </w:pPr>
       <w:r>
         <w:rPr>
@@ -3648,6 +3805,7 @@
     <w:p>
       <w:pPr>
         <w:spacing w:after="80"/>
+        <w:jc w:val="both"/>
       </w:pPr>
       <w:r>
         <w:rPr>
@@ -3687,6 +3845,7 @@
     <w:p>
       <w:pPr>
         <w:spacing w:after="120"/>
+        <w:jc w:val="both"/>
       </w:pPr>
       <w:r>
         <w:rPr>
@@ -3698,6 +3857,7 @@
     <w:p>
       <w:pPr>
         <w:spacing w:after="80"/>
+        <w:jc w:val="both"/>
       </w:pPr>
       <w:r>
         <w:rPr>
@@ -3736,6 +3896,7 @@
     <w:p>
       <w:pPr>
         <w:spacing w:after="100"/>
+        <w:jc w:val="both"/>
       </w:pPr>
       <w:r>
         <w:rPr>
@@ -3767,6 +3928,7 @@
     <w:p>
       <w:pPr>
         <w:spacing w:after="40" w:before="40"/>
+        <w:jc w:val="both"/>
       </w:pPr>
       <w:r>
         <w:rPr>
@@ -3787,6 +3949,7 @@
           <w:numId w:val="2"/>
         </w:numPr>
         <w:spacing w:after="60"/>
+        <w:jc w:val="both"/>
       </w:pPr>
       <w:r>
         <w:rPr>
@@ -3803,6 +3966,7 @@
           <w:numId w:val="2"/>
         </w:numPr>
         <w:spacing w:after="60"/>
+        <w:jc w:val="both"/>
       </w:pPr>
       <w:r>
         <w:rPr>
@@ -3819,6 +3983,7 @@
           <w:numId w:val="2"/>
         </w:numPr>
         <w:spacing w:after="60"/>
+        <w:jc w:val="both"/>
       </w:pPr>
       <w:r>
         <w:rPr>
@@ -3835,6 +4000,7 @@
           <w:numId w:val="2"/>
         </w:numPr>
         <w:spacing w:after="60"/>
+        <w:jc w:val="both"/>
       </w:pPr>
       <w:r>
         <w:rPr>
@@ -3851,6 +4017,7 @@
           <w:numId w:val="2"/>
         </w:numPr>
         <w:spacing w:after="60"/>
+        <w:jc w:val="both"/>
       </w:pPr>
       <w:r>
         <w:rPr>
@@ -3867,6 +4034,7 @@
           <w:numId w:val="2"/>
         </w:numPr>
         <w:spacing w:after="60"/>
+        <w:jc w:val="both"/>
       </w:pPr>
       <w:r>
         <w:rPr>
@@ -3883,6 +4051,7 @@
           <w:numId w:val="2"/>
         </w:numPr>
         <w:spacing w:after="60"/>
+        <w:jc w:val="both"/>
       </w:pPr>
       <w:r>
         <w:rPr>
@@ -3899,6 +4068,7 @@
           <w:numId w:val="2"/>
         </w:numPr>
         <w:spacing w:after="60"/>
+        <w:jc w:val="both"/>
       </w:pPr>
       <w:r>
         <w:rPr>
@@ -3915,6 +4085,7 @@
           <w:numId w:val="2"/>
         </w:numPr>
         <w:spacing w:after="60"/>
+        <w:jc w:val="both"/>
       </w:pPr>
       <w:r>
         <w:rPr>
@@ -3926,6 +4097,7 @@
     <w:p>
       <w:pPr>
         <w:spacing w:after="40" w:before="40"/>
+        <w:jc w:val="both"/>
       </w:pPr>
       <w:r>
         <w:rPr>
@@ -3946,6 +4118,7 @@
           <w:numId w:val="2"/>
         </w:numPr>
         <w:spacing w:after="60"/>
+        <w:jc w:val="both"/>
       </w:pPr>
       <w:r>
         <w:rPr>
@@ -3962,6 +4135,7 @@
           <w:numId w:val="2"/>
         </w:numPr>
         <w:spacing w:after="60"/>
+        <w:jc w:val="both"/>
       </w:pPr>
       <w:r>
         <w:rPr>
@@ -4004,6 +4178,7 @@
     <w:p>
       <w:pPr>
         <w:spacing w:after="40" w:before="40"/>
+        <w:jc w:val="both"/>
       </w:pPr>
       <w:r>
         <w:rPr>
@@ -4024,6 +4199,7 @@
           <w:numId w:val="2"/>
         </w:numPr>
         <w:spacing w:after="60"/>
+        <w:jc w:val="both"/>
       </w:pPr>
       <w:r>
         <w:rPr>
@@ -4040,6 +4216,7 @@
           <w:numId w:val="2"/>
         </w:numPr>
         <w:spacing w:after="60"/>
+        <w:jc w:val="both"/>
       </w:pPr>
       <w:r>
         <w:rPr>
@@ -4056,6 +4233,7 @@
           <w:numId w:val="2"/>
         </w:numPr>
         <w:spacing w:after="60"/>
+        <w:jc w:val="both"/>
       </w:pPr>
       <w:r>
         <w:rPr>
@@ -4072,6 +4250,7 @@
           <w:numId w:val="2"/>
         </w:numPr>
         <w:spacing w:after="60"/>
+        <w:jc w:val="both"/>
       </w:pPr>
       <w:r>
         <w:rPr>
@@ -4088,6 +4267,7 @@
           <w:numId w:val="2"/>
         </w:numPr>
         <w:spacing w:after="60"/>
+        <w:jc w:val="both"/>
       </w:pPr>
       <w:r>
         <w:rPr>
@@ -4104,6 +4284,7 @@
           <w:numId w:val="2"/>
         </w:numPr>
         <w:spacing w:after="60"/>
+        <w:jc w:val="both"/>
       </w:pPr>
       <w:r>
         <w:rPr>
@@ -4131,6 +4312,7 @@
     <w:p>
       <w:pPr>
         <w:spacing w:after="80"/>
+        <w:jc w:val="both"/>
       </w:pPr>
       <w:r>
         <w:rPr>
@@ -4154,6 +4336,7 @@
     <w:p>
       <w:pPr>
         <w:spacing w:after="100"/>
+        <w:jc w:val="both"/>
       </w:pPr>
       <w:r>
         <w:rPr>
@@ -4200,6 +4383,7 @@
     <w:p>
       <w:pPr>
         <w:spacing w:after="40" w:before="40"/>
+        <w:jc w:val="both"/>
       </w:pPr>
       <w:r>
         <w:rPr>
@@ -4220,6 +4404,7 @@
           <w:numId w:val="2"/>
         </w:numPr>
         <w:spacing w:after="60"/>
+        <w:jc w:val="both"/>
       </w:pPr>
       <w:r>
         <w:rPr>
@@ -4236,6 +4421,7 @@
           <w:numId w:val="2"/>
         </w:numPr>
         <w:spacing w:after="60"/>
+        <w:jc w:val="both"/>
       </w:pPr>
       <w:r>
         <w:rPr>
@@ -4252,6 +4438,7 @@
           <w:numId w:val="2"/>
         </w:numPr>
         <w:spacing w:after="60"/>
+        <w:jc w:val="both"/>
       </w:pPr>
       <w:r>
         <w:rPr>
@@ -4268,6 +4455,7 @@
           <w:numId w:val="2"/>
         </w:numPr>
         <w:spacing w:after="60"/>
+        <w:jc w:val="both"/>
       </w:pPr>
       <w:r>
         <w:rPr>
@@ -4284,6 +4472,7 @@
           <w:numId w:val="2"/>
         </w:numPr>
         <w:spacing w:after="60"/>
+        <w:jc w:val="both"/>
       </w:pPr>
       <w:r>
         <w:rPr>
@@ -4311,6 +4500,7 @@
     <w:p>
       <w:pPr>
         <w:spacing w:after="40" w:before="40"/>
+        <w:jc w:val="both"/>
       </w:pPr>
       <w:r>
         <w:rPr>
@@ -4331,6 +4521,7 @@
           <w:numId w:val="2"/>
         </w:numPr>
         <w:spacing w:after="60"/>
+        <w:jc w:val="both"/>
       </w:pPr>
       <w:r>
         <w:rPr>
@@ -4347,6 +4538,7 @@
           <w:numId w:val="2"/>
         </w:numPr>
         <w:spacing w:after="60"/>
+        <w:jc w:val="both"/>
       </w:pPr>
       <w:r>
         <w:rPr>
@@ -4363,6 +4555,7 @@
           <w:numId w:val="2"/>
         </w:numPr>
         <w:spacing w:after="60"/>
+        <w:jc w:val="both"/>
       </w:pPr>
       <w:r>
         <w:rPr>
@@ -4379,6 +4572,7 @@
           <w:numId w:val="2"/>
         </w:numPr>
         <w:spacing w:after="60"/>
+        <w:jc w:val="both"/>
       </w:pPr>
       <w:r>
         <w:rPr>
@@ -4395,6 +4589,7 @@
           <w:numId w:val="2"/>
         </w:numPr>
         <w:spacing w:after="60"/>
+        <w:jc w:val="both"/>
       </w:pPr>
       <w:r>
         <w:rPr>
@@ -4422,6 +4617,7 @@
     <w:p>
       <w:pPr>
         <w:spacing w:after="80"/>
+        <w:jc w:val="both"/>
       </w:pPr>
       <w:r>
         <w:rPr>
@@ -4460,6 +4656,7 @@
     <w:p>
       <w:pPr>
         <w:spacing w:after="80"/>
+        <w:jc w:val="both"/>
       </w:pPr>
       <w:r>
         <w:rPr>
@@ -4499,6 +4696,7 @@
     <w:p>
       <w:pPr>
         <w:spacing w:after="40" w:before="40"/>
+        <w:jc w:val="both"/>
       </w:pPr>
       <w:r>
         <w:rPr>
@@ -4519,6 +4717,7 @@
           <w:numId w:val="2"/>
         </w:numPr>
         <w:spacing w:after="60"/>
+        <w:jc w:val="both"/>
       </w:pPr>
       <w:r>
         <w:rPr>
@@ -4535,6 +4734,7 @@
           <w:numId w:val="2"/>
         </w:numPr>
         <w:spacing w:after="60"/>
+        <w:jc w:val="both"/>
       </w:pPr>
       <w:r>
         <w:rPr>
@@ -4551,6 +4751,7 @@
           <w:numId w:val="2"/>
         </w:numPr>
         <w:spacing w:after="60"/>
+        <w:jc w:val="both"/>
       </w:pPr>
       <w:r>
         <w:rPr>
@@ -4567,6 +4768,7 @@
           <w:numId w:val="2"/>
         </w:numPr>
         <w:spacing w:after="60"/>
+        <w:jc w:val="both"/>
       </w:pPr>
       <w:r>
         <w:rPr>
@@ -4594,6 +4796,7 @@
     <w:p>
       <w:pPr>
         <w:spacing w:after="80"/>
+        <w:jc w:val="both"/>
       </w:pPr>
       <w:r>
         <w:rPr>
@@ -4633,6 +4836,7 @@
     <w:p>
       <w:pPr>
         <w:spacing w:after="80"/>
+        <w:jc w:val="both"/>
       </w:pPr>
       <w:r>
         <w:rPr>
@@ -4672,6 +4876,7 @@
     <w:p>
       <w:pPr>
         <w:spacing w:after="40" w:before="40"/>
+        <w:jc w:val="both"/>
       </w:pPr>
       <w:r>
         <w:rPr>
@@ -4692,6 +4897,7 @@
           <w:numId w:val="2"/>
         </w:numPr>
         <w:spacing w:after="60"/>
+        <w:jc w:val="both"/>
       </w:pPr>
       <w:r>
         <w:rPr>
@@ -4708,6 +4914,7 @@
           <w:numId w:val="2"/>
         </w:numPr>
         <w:spacing w:after="60"/>
+        <w:jc w:val="both"/>
       </w:pPr>
       <w:r>
         <w:rPr>
@@ -4724,6 +4931,7 @@
           <w:numId w:val="2"/>
         </w:numPr>
         <w:spacing w:after="60"/>
+        <w:jc w:val="both"/>
       </w:pPr>
       <w:r>
         <w:rPr>
@@ -4740,6 +4948,7 @@
           <w:numId w:val="2"/>
         </w:numPr>
         <w:spacing w:after="60"/>
+        <w:jc w:val="both"/>
       </w:pPr>
       <w:r>
         <w:rPr>
@@ -4756,6 +4965,7 @@
           <w:numId w:val="2"/>
         </w:numPr>
         <w:spacing w:after="60"/>
+        <w:jc w:val="both"/>
       </w:pPr>
       <w:r>
         <w:rPr>
@@ -4772,6 +4982,7 @@
           <w:numId w:val="2"/>
         </w:numPr>
         <w:spacing w:after="60"/>
+        <w:jc w:val="both"/>
       </w:pPr>
       <w:r>
         <w:rPr>
@@ -4798,6 +5009,7 @@
     <w:p>
       <w:pPr>
         <w:spacing w:after="100"/>
+        <w:jc w:val="both"/>
       </w:pPr>
       <w:r>
         <w:rPr>
@@ -4829,6 +5041,7 @@
     <w:p>
       <w:pPr>
         <w:spacing w:after="40" w:before="40"/>
+        <w:jc w:val="both"/>
       </w:pPr>
       <w:r>
         <w:rPr>
@@ -4849,6 +5062,7 @@
           <w:numId w:val="2"/>
         </w:numPr>
         <w:spacing w:after="60"/>
+        <w:jc w:val="both"/>
       </w:pPr>
       <w:r>
         <w:rPr>
@@ -4865,6 +5079,7 @@
           <w:numId w:val="2"/>
         </w:numPr>
         <w:spacing w:after="60"/>
+        <w:jc w:val="both"/>
       </w:pPr>
       <w:r>
         <w:rPr>
@@ -4881,6 +5096,7 @@
           <w:numId w:val="2"/>
         </w:numPr>
         <w:spacing w:after="60"/>
+        <w:jc w:val="both"/>
       </w:pPr>
       <w:r>
         <w:rPr>
@@ -4897,6 +5113,7 @@
           <w:numId w:val="2"/>
         </w:numPr>
         <w:spacing w:after="60"/>
+        <w:jc w:val="both"/>
       </w:pPr>
       <w:r>
         <w:rPr>
@@ -4924,6 +5141,7 @@
     <w:p>
       <w:pPr>
         <w:spacing w:after="40" w:before="40"/>
+        <w:jc w:val="both"/>
       </w:pPr>
       <w:r>
         <w:rPr>
@@ -4944,6 +5162,7 @@
           <w:numId w:val="2"/>
         </w:numPr>
         <w:spacing w:after="60"/>
+        <w:jc w:val="both"/>
       </w:pPr>
       <w:r>
         <w:rPr>
@@ -4960,6 +5179,7 @@
           <w:numId w:val="2"/>
         </w:numPr>
         <w:spacing w:after="60"/>
+        <w:jc w:val="both"/>
       </w:pPr>
       <w:r>
         <w:rPr>
@@ -4976,6 +5196,7 @@
           <w:numId w:val="2"/>
         </w:numPr>
         <w:spacing w:after="60"/>
+        <w:jc w:val="both"/>
       </w:pPr>
       <w:r>
         <w:rPr>
@@ -5003,6 +5224,7 @@
     <w:p>
       <w:pPr>
         <w:spacing w:after="80"/>
+        <w:jc w:val="both"/>
       </w:pPr>
       <w:r>
         <w:rPr>
@@ -5042,6 +5264,7 @@
     <w:p>
       <w:pPr>
         <w:spacing w:after="80"/>
+        <w:jc w:val="both"/>
       </w:pPr>
       <w:r>
         <w:rPr>
@@ -5081,6 +5304,7 @@
     <w:p>
       <w:pPr>
         <w:spacing w:after="40" w:before="40"/>
+        <w:jc w:val="both"/>
       </w:pPr>
       <w:r>
         <w:rPr>
@@ -5101,6 +5325,7 @@
           <w:numId w:val="2"/>
         </w:numPr>
         <w:spacing w:after="60"/>
+        <w:jc w:val="both"/>
       </w:pPr>
       <w:r>
         <w:rPr>
@@ -5117,6 +5342,7 @@
           <w:numId w:val="2"/>
         </w:numPr>
         <w:spacing w:after="60"/>
+        <w:jc w:val="both"/>
       </w:pPr>
       <w:r>
         <w:rPr>
@@ -5144,6 +5370,7 @@
     <w:p>
       <w:pPr>
         <w:spacing w:after="80"/>
+        <w:jc w:val="both"/>
       </w:pPr>
       <w:r>
         <w:rPr>
@@ -5182,6 +5409,7 @@
     <w:p>
       <w:pPr>
         <w:spacing w:after="100"/>
+        <w:jc w:val="both"/>
       </w:pPr>
       <w:r>
         <w:rPr>
@@ -5213,6 +5441,7 @@
     <w:p>
       <w:pPr>
         <w:spacing w:after="40" w:before="40"/>
+        <w:jc w:val="both"/>
       </w:pPr>
       <w:r>
         <w:rPr>
@@ -5233,6 +5462,7 @@
           <w:numId w:val="2"/>
         </w:numPr>
         <w:spacing w:after="60"/>
+        <w:jc w:val="both"/>
       </w:pPr>
       <w:r>
         <w:rPr>
@@ -5249,6 +5479,7 @@
           <w:numId w:val="2"/>
         </w:numPr>
         <w:spacing w:after="60"/>
+        <w:jc w:val="both"/>
       </w:pPr>
       <w:r>
         <w:rPr>
@@ -5265,6 +5496,7 @@
           <w:numId w:val="2"/>
         </w:numPr>
         <w:spacing w:after="60"/>
+        <w:jc w:val="both"/>
       </w:pPr>
       <w:r>
         <w:rPr>
@@ -5292,6 +5524,7 @@
     <w:p>
       <w:pPr>
         <w:spacing w:after="40" w:before="40"/>
+        <w:jc w:val="both"/>
       </w:pPr>
       <w:r>
         <w:rPr>
@@ -5312,6 +5545,7 @@
           <w:numId w:val="2"/>
         </w:numPr>
         <w:spacing w:after="60"/>
+        <w:jc w:val="both"/>
       </w:pPr>
       <w:r>
         <w:rPr>
@@ -5328,6 +5562,7 @@
           <w:numId w:val="2"/>
         </w:numPr>
         <w:spacing w:after="60"/>
+        <w:jc w:val="both"/>
       </w:pPr>
       <w:r>
         <w:rPr>
@@ -5355,6 +5590,7 @@
     <w:p>
       <w:pPr>
         <w:spacing w:after="80"/>
+        <w:jc w:val="both"/>
       </w:pPr>
       <w:r>
         <w:rPr>
@@ -5394,6 +5630,7 @@
     <w:p>
       <w:pPr>
         <w:spacing w:after="40" w:before="40"/>
+        <w:jc w:val="both"/>
       </w:pPr>
       <w:r>
         <w:rPr>
@@ -5414,6 +5651,7 @@
           <w:numId w:val="2"/>
         </w:numPr>
         <w:spacing w:after="60"/>
+        <w:jc w:val="both"/>
       </w:pPr>
       <w:r>
         <w:rPr>
@@ -5430,6 +5668,7 @@
           <w:numId w:val="2"/>
         </w:numPr>
         <w:spacing w:after="60"/>
+        <w:jc w:val="both"/>
       </w:pPr>
       <w:r>
         <w:rPr>
@@ -5441,6 +5680,7 @@
     <w:p>
       <w:pPr>
         <w:spacing w:after="80"/>
+        <w:jc w:val="both"/>
       </w:pPr>
       <w:r>
         <w:rPr>
@@ -5480,6 +5720,7 @@
     <w:p>
       <w:pPr>
         <w:spacing w:after="80"/>
+        <w:jc w:val="both"/>
       </w:pPr>
       <w:r>
         <w:rPr>
@@ -5518,6 +5759,7 @@
     <w:p>
       <w:pPr>
         <w:spacing w:after="100"/>
+        <w:jc w:val="both"/>
       </w:pPr>
       <w:r>
         <w:rPr>
@@ -5549,6 +5791,7 @@
     <w:p>
       <w:pPr>
         <w:spacing w:after="40" w:before="40"/>
+        <w:jc w:val="both"/>
       </w:pPr>
       <w:r>
         <w:rPr>
@@ -5569,6 +5812,7 @@
           <w:numId w:val="2"/>
         </w:numPr>
         <w:spacing w:after="60"/>
+        <w:jc w:val="both"/>
       </w:pPr>
       <w:r>
         <w:rPr>
@@ -5585,6 +5829,7 @@
           <w:numId w:val="2"/>
         </w:numPr>
         <w:spacing w:after="60"/>
+        <w:jc w:val="both"/>
       </w:pPr>
       <w:r>
         <w:rPr>
@@ -5601,6 +5846,7 @@
           <w:numId w:val="2"/>
         </w:numPr>
         <w:spacing w:after="60"/>
+        <w:jc w:val="both"/>
       </w:pPr>
       <w:r>
         <w:rPr>
@@ -5628,6 +5874,7 @@
     <w:p>
       <w:pPr>
         <w:spacing w:after="40" w:before="40"/>
+        <w:jc w:val="both"/>
       </w:pPr>
       <w:r>
         <w:rPr>
@@ -5648,6 +5895,7 @@
           <w:numId w:val="2"/>
         </w:numPr>
         <w:spacing w:after="60"/>
+        <w:jc w:val="both"/>
       </w:pPr>
       <w:r>
         <w:rPr>
@@ -5664,6 +5912,7 @@
           <w:numId w:val="2"/>
         </w:numPr>
         <w:spacing w:after="60"/>
+        <w:jc w:val="both"/>
       </w:pPr>
       <w:r>
         <w:rPr>
@@ -5691,6 +5940,7 @@
     <w:p>
       <w:pPr>
         <w:spacing w:after="40" w:before="40"/>
+        <w:jc w:val="both"/>
       </w:pPr>
       <w:r>
         <w:rPr>
@@ -5711,6 +5961,7 @@
           <w:numId w:val="2"/>
         </w:numPr>
         <w:spacing w:after="60"/>
+        <w:jc w:val="both"/>
       </w:pPr>
       <w:r>
         <w:rPr>
@@ -5727,6 +5978,7 @@
           <w:numId w:val="2"/>
         </w:numPr>
         <w:spacing w:after="60"/>
+        <w:jc w:val="both"/>
       </w:pPr>
       <w:r>
         <w:rPr>
@@ -5754,6 +6006,7 @@
     <w:p>
       <w:pPr>
         <w:spacing w:after="40" w:before="40"/>
+        <w:jc w:val="both"/>
       </w:pPr>
       <w:r>
         <w:rPr>
@@ -5774,6 +6027,7 @@
           <w:numId w:val="2"/>
         </w:numPr>
         <w:spacing w:after="60"/>
+        <w:jc w:val="both"/>
       </w:pPr>
       <w:r>
         <w:rPr>
@@ -5790,6 +6044,7 @@
           <w:numId w:val="2"/>
         </w:numPr>
         <w:spacing w:after="60"/>
+        <w:jc w:val="both"/>
       </w:pPr>
       <w:r>
         <w:rPr>
@@ -5806,6 +6061,7 @@
           <w:numId w:val="2"/>
         </w:numPr>
         <w:spacing w:after="60"/>
+        <w:jc w:val="both"/>
       </w:pPr>
       <w:r>
         <w:rPr>
@@ -5822,6 +6078,7 @@
           <w:numId w:val="2"/>
         </w:numPr>
         <w:spacing w:after="60"/>
+        <w:jc w:val="both"/>
       </w:pPr>
       <w:r>
         <w:rPr>
@@ -5838,6 +6095,7 @@
           <w:numId w:val="2"/>
         </w:numPr>
         <w:spacing w:after="60"/>
+        <w:jc w:val="both"/>
       </w:pPr>
       <w:r>
         <w:rPr>
@@ -5854,6 +6112,7 @@
           <w:numId w:val="2"/>
         </w:numPr>
         <w:spacing w:after="60"/>
+        <w:jc w:val="both"/>
       </w:pPr>
       <w:r>
         <w:rPr>
@@ -5881,6 +6140,7 @@
     <w:p>
       <w:pPr>
         <w:spacing w:after="40" w:before="40"/>
+        <w:jc w:val="both"/>
       </w:pPr>
       <w:r>
         <w:rPr>
@@ -5901,6 +6161,7 @@
           <w:numId w:val="2"/>
         </w:numPr>
         <w:spacing w:after="60"/>
+        <w:jc w:val="both"/>
       </w:pPr>
       <w:r>
         <w:rPr>
@@ -5917,6 +6178,7 @@
           <w:numId w:val="2"/>
         </w:numPr>
         <w:spacing w:after="60"/>
+        <w:jc w:val="both"/>
       </w:pPr>
       <w:r>
         <w:rPr>
@@ -5942,6 +6204,7 @@
     <w:p>
       <w:pPr>
         <w:spacing w:after="100"/>
+        <w:jc w:val="both"/>
       </w:pPr>
       <w:r>
         <w:rPr>
@@ -5973,6 +6236,7 @@
     <w:p>
       <w:pPr>
         <w:spacing w:after="80"/>
+        <w:jc w:val="both"/>
       </w:pPr>
       <w:r>
         <w:rPr>
@@ -5996,6 +6260,7 @@
     <w:p>
       <w:pPr>
         <w:spacing w:after="80"/>
+        <w:jc w:val="both"/>
       </w:pPr>
       <w:r>
         <w:rPr>
@@ -6035,6 +6300,7 @@
     <w:p>
       <w:pPr>
         <w:spacing w:after="80"/>
+        <w:jc w:val="both"/>
       </w:pPr>
       <w:r>
         <w:rPr>
@@ -6073,6 +6339,7 @@
     <w:p>
       <w:pPr>
         <w:spacing w:after="100"/>
+        <w:jc w:val="both"/>
       </w:pPr>
       <w:r>
         <w:rPr>
@@ -6104,6 +6371,7 @@
     <w:p>
       <w:pPr>
         <w:spacing w:after="80"/>
+        <w:jc w:val="both"/>
       </w:pPr>
       <w:r>
         <w:rPr>
@@ -6127,6 +6395,7 @@
     <w:p>
       <w:pPr>
         <w:spacing w:after="40" w:before="40"/>
+        <w:jc w:val="both"/>
       </w:pPr>
       <w:r>
         <w:rPr>
@@ -6147,6 +6416,7 @@
           <w:numId w:val="2"/>
         </w:numPr>
         <w:spacing w:after="60"/>
+        <w:jc w:val="both"/>
       </w:pPr>
       <w:r>
         <w:rPr>
@@ -6163,6 +6433,7 @@
           <w:numId w:val="2"/>
         </w:numPr>
         <w:spacing w:after="60"/>
+        <w:jc w:val="both"/>
       </w:pPr>
       <w:r>
         <w:rPr>
@@ -6179,6 +6450,7 @@
           <w:numId w:val="2"/>
         </w:numPr>
         <w:spacing w:after="60"/>
+        <w:jc w:val="both"/>
       </w:pPr>
       <w:r>
         <w:rPr>
@@ -6195,6 +6467,7 @@
           <w:numId w:val="2"/>
         </w:numPr>
         <w:spacing w:after="60"/>
+        <w:jc w:val="both"/>
       </w:pPr>
       <w:r>
         <w:rPr>
@@ -6211,6 +6484,7 @@
           <w:numId w:val="2"/>
         </w:numPr>
         <w:spacing w:after="60"/>
+        <w:jc w:val="both"/>
       </w:pPr>
       <w:r>
         <w:rPr>
@@ -6227,6 +6501,7 @@
           <w:numId w:val="2"/>
         </w:numPr>
         <w:spacing w:after="60"/>
+        <w:jc w:val="both"/>
       </w:pPr>
       <w:r>
         <w:rPr>
@@ -6243,6 +6518,7 @@
           <w:numId w:val="2"/>
         </w:numPr>
         <w:spacing w:after="60"/>
+        <w:jc w:val="both"/>
       </w:pPr>
       <w:r>
         <w:rPr>
@@ -6259,6 +6535,7 @@
           <w:numId w:val="2"/>
         </w:numPr>
         <w:spacing w:after="60"/>
+        <w:jc w:val="both"/>
       </w:pPr>
       <w:r>
         <w:rPr>
@@ -6275,6 +6552,7 @@
           <w:numId w:val="2"/>
         </w:numPr>
         <w:spacing w:after="60"/>
+        <w:jc w:val="both"/>
       </w:pPr>
       <w:r>
         <w:rPr>
@@ -6291,6 +6569,7 @@
           <w:numId w:val="2"/>
         </w:numPr>
         <w:spacing w:after="60"/>
+        <w:jc w:val="both"/>
       </w:pPr>
       <w:r>
         <w:rPr>
@@ -6307,6 +6586,7 @@
           <w:numId w:val="2"/>
         </w:numPr>
         <w:spacing w:after="60"/>
+        <w:jc w:val="both"/>
       </w:pPr>
       <w:r>
         <w:rPr>
@@ -6323,6 +6603,7 @@
           <w:numId w:val="2"/>
         </w:numPr>
         <w:spacing w:after="60"/>
+        <w:jc w:val="both"/>
       </w:pPr>
       <w:r>
         <w:rPr>
@@ -6339,6 +6620,7 @@
           <w:numId w:val="2"/>
         </w:numPr>
         <w:spacing w:after="60"/>
+        <w:jc w:val="both"/>
       </w:pPr>
       <w:r>
         <w:rPr>
@@ -6355,6 +6637,7 @@
           <w:numId w:val="2"/>
         </w:numPr>
         <w:spacing w:after="60"/>
+        <w:jc w:val="both"/>
       </w:pPr>
       <w:r>
         <w:rPr>
@@ -6371,6 +6654,7 @@
           <w:numId w:val="2"/>
         </w:numPr>
         <w:spacing w:after="60"/>
+        <w:jc w:val="both"/>
       </w:pPr>
       <w:r>
         <w:rPr>
@@ -6382,6 +6666,7 @@
     <w:p>
       <w:pPr>
         <w:spacing w:after="80"/>
+        <w:jc w:val="both"/>
       </w:pPr>
       <w:r>
         <w:rPr>
@@ -6421,6 +6706,7 @@
     <w:p>
       <w:pPr>
         <w:spacing w:after="120"/>
+        <w:jc w:val="both"/>
       </w:pPr>
       <w:r>
         <w:rPr>
@@ -6432,6 +6718,7 @@
     <w:p>
       <w:pPr>
         <w:spacing w:after="120"/>
+        <w:jc w:val="both"/>
       </w:pPr>
       <w:r>
         <w:rPr>
@@ -6443,6 +6730,7 @@
     <w:p>
       <w:pPr>
         <w:spacing w:after="120"/>
+        <w:jc w:val="both"/>
       </w:pPr>
       <w:r>
         <w:rPr>
@@ -6469,6 +6757,7 @@
     <w:p>
       <w:pPr>
         <w:spacing w:after="100"/>
+        <w:jc w:val="both"/>
       </w:pPr>
       <w:r>
         <w:rPr>
@@ -6484,6 +6773,7 @@
     <w:p>
       <w:pPr>
         <w:spacing w:after="100"/>
+        <w:jc w:val="both"/>
       </w:pPr>
       <w:r>
         <w:rPr>
@@ -6515,6 +6805,7 @@
     <w:p>
       <w:pPr>
         <w:spacing w:after="80"/>
+        <w:jc w:val="both"/>
       </w:pPr>
       <w:r>
         <w:rPr>
@@ -6538,6 +6829,7 @@
     <w:p>
       <w:pPr>
         <w:spacing w:after="40" w:before="40"/>
+        <w:jc w:val="both"/>
       </w:pPr>
       <w:r>
         <w:rPr>
@@ -6558,6 +6850,7 @@
           <w:numId w:val="2"/>
         </w:numPr>
         <w:spacing w:after="60"/>
+        <w:jc w:val="both"/>
       </w:pPr>
       <w:r>
         <w:rPr>
@@ -6574,6 +6867,7 @@
           <w:numId w:val="2"/>
         </w:numPr>
         <w:spacing w:after="60"/>
+        <w:jc w:val="both"/>
       </w:pPr>
       <w:r>
         <w:rPr>
@@ -6590,6 +6884,7 @@
           <w:numId w:val="2"/>
         </w:numPr>
         <w:spacing w:after="60"/>
+        <w:jc w:val="both"/>
       </w:pPr>
       <w:r>
         <w:rPr>
@@ -6606,6 +6901,7 @@
           <w:numId w:val="2"/>
         </w:numPr>
         <w:spacing w:after="60"/>
+        <w:jc w:val="both"/>
       </w:pPr>
       <w:r>
         <w:rPr>
@@ -6622,6 +6918,7 @@
           <w:numId w:val="2"/>
         </w:numPr>
         <w:spacing w:after="60"/>
+        <w:jc w:val="both"/>
       </w:pPr>
       <w:r>
         <w:rPr>
@@ -6638,6 +6935,7 @@
           <w:numId w:val="2"/>
         </w:numPr>
         <w:spacing w:after="60"/>
+        <w:jc w:val="both"/>
       </w:pPr>
       <w:r>
         <w:rPr>
@@ -6649,6 +6947,7 @@
     <w:p>
       <w:pPr>
         <w:spacing w:after="80"/>
+        <w:jc w:val="both"/>
       </w:pPr>
       <w:r>
         <w:rPr>
@@ -6688,6 +6987,7 @@
     <w:p>
       <w:pPr>
         <w:spacing w:after="40" w:before="40"/>
+        <w:jc w:val="both"/>
       </w:pPr>
       <w:r>
         <w:rPr>
@@ -6708,6 +7008,7 @@
           <w:numId w:val="2"/>
         </w:numPr>
         <w:spacing w:after="60"/>
+        <w:jc w:val="both"/>
       </w:pPr>
       <w:r>
         <w:rPr>
@@ -6724,6 +7025,7 @@
           <w:numId w:val="2"/>
         </w:numPr>
         <w:spacing w:after="60"/>
+        <w:jc w:val="both"/>
       </w:pPr>
       <w:r>
         <w:rPr>
@@ -6740,6 +7042,7 @@
           <w:numId w:val="2"/>
         </w:numPr>
         <w:spacing w:after="60"/>
+        <w:jc w:val="both"/>
       </w:pPr>
       <w:r>
         <w:rPr>
@@ -6767,6 +7070,7 @@
     <w:p>
       <w:pPr>
         <w:spacing w:after="120"/>
+        <w:jc w:val="both"/>
       </w:pPr>
       <w:r>
         <w:rPr>
@@ -6794,6 +7098,7 @@
     <w:p>
       <w:pPr>
         <w:spacing w:after="80"/>
+        <w:jc w:val="both"/>
       </w:pPr>
       <w:r>
         <w:rPr>
@@ -6817,6 +7122,7 @@
     <w:p>
       <w:pPr>
         <w:spacing w:after="40" w:before="40"/>
+        <w:jc w:val="both"/>
       </w:pPr>
       <w:r>
         <w:rPr>
@@ -6837,6 +7143,7 @@
           <w:numId w:val="2"/>
         </w:numPr>
         <w:spacing w:after="60"/>
+        <w:jc w:val="both"/>
       </w:pPr>
       <w:r>
         <w:rPr>
@@ -6853,6 +7160,7 @@
           <w:numId w:val="2"/>
         </w:numPr>
         <w:spacing w:after="60"/>
+        <w:jc w:val="both"/>
       </w:pPr>
       <w:r>
         <w:rPr>
@@ -6869,6 +7177,7 @@
           <w:numId w:val="2"/>
         </w:numPr>
         <w:spacing w:after="60"/>
+        <w:jc w:val="both"/>
       </w:pPr>
       <w:r>
         <w:rPr>
@@ -6885,6 +7194,7 @@
           <w:numId w:val="2"/>
         </w:numPr>
         <w:spacing w:after="60"/>
+        <w:jc w:val="both"/>
       </w:pPr>
       <w:r>
         <w:rPr>
@@ -6901,6 +7211,7 @@
           <w:numId w:val="2"/>
         </w:numPr>
         <w:spacing w:after="60"/>
+        <w:jc w:val="both"/>
       </w:pPr>
       <w:r>
         <w:rPr>
@@ -6917,6 +7228,7 @@
           <w:numId w:val="2"/>
         </w:numPr>
         <w:spacing w:after="60"/>
+        <w:jc w:val="both"/>
       </w:pPr>
       <w:r>
         <w:rPr>
@@ -6928,6 +7240,7 @@
     <w:p>
       <w:pPr>
         <w:spacing w:after="80"/>
+        <w:jc w:val="both"/>
       </w:pPr>
       <w:r>
         <w:rPr>
@@ -6966,6 +7279,7 @@
     <w:p>
       <w:pPr>
         <w:spacing w:after="100"/>
+        <w:jc w:val="both"/>
       </w:pPr>
       <w:r>
         <w:rPr>
@@ -6997,6 +7311,7 @@
     <w:p>
       <w:pPr>
         <w:spacing w:after="40" w:before="40"/>
+        <w:jc w:val="both"/>
       </w:pPr>
       <w:r>
         <w:rPr>
@@ -7017,6 +7332,7 @@
           <w:numId w:val="2"/>
         </w:numPr>
         <w:spacing w:after="60"/>
+        <w:jc w:val="both"/>
       </w:pPr>
       <w:r>
         <w:rPr>
@@ -7033,6 +7349,7 @@
           <w:numId w:val="2"/>
         </w:numPr>
         <w:spacing w:after="60"/>
+        <w:jc w:val="both"/>
       </w:pPr>
       <w:r>
         <w:rPr>
@@ -7060,6 +7377,7 @@
     <w:p>
       <w:pPr>
         <w:spacing w:after="40" w:before="40"/>
+        <w:jc w:val="both"/>
       </w:pPr>
       <w:r>
         <w:rPr>
@@ -7080,6 +7398,7 @@
           <w:numId w:val="2"/>
         </w:numPr>
         <w:spacing w:after="60"/>
+        <w:jc w:val="both"/>
       </w:pPr>
       <w:r>
         <w:rPr>
@@ -7096,6 +7415,7 @@
           <w:numId w:val="2"/>
         </w:numPr>
         <w:spacing w:after="60"/>
+        <w:jc w:val="both"/>
       </w:pPr>
       <w:r>
         <w:rPr>
@@ -7123,6 +7443,7 @@
     <w:p>
       <w:pPr>
         <w:spacing w:after="40" w:before="40"/>
+        <w:jc w:val="both"/>
       </w:pPr>
       <w:r>
         <w:rPr>
@@ -7143,6 +7464,7 @@
           <w:numId w:val="2"/>
         </w:numPr>
         <w:spacing w:after="60"/>
+        <w:jc w:val="both"/>
       </w:pPr>
       <w:r>
         <w:rPr>
@@ -7159,6 +7481,7 @@
           <w:numId w:val="2"/>
         </w:numPr>
         <w:spacing w:after="60"/>
+        <w:jc w:val="both"/>
       </w:pPr>
       <w:r>
         <w:rPr>
@@ -7175,6 +7498,7 @@
           <w:numId w:val="2"/>
         </w:numPr>
         <w:spacing w:after="60"/>
+        <w:jc w:val="both"/>
       </w:pPr>
       <w:r>
         <w:rPr>
@@ -7191,6 +7515,7 @@
           <w:numId w:val="2"/>
         </w:numPr>
         <w:spacing w:after="60"/>
+        <w:jc w:val="both"/>
       </w:pPr>
       <w:r>
         <w:rPr>
@@ -7207,6 +7532,7 @@
           <w:numId w:val="2"/>
         </w:numPr>
         <w:spacing w:after="60"/>
+        <w:jc w:val="both"/>
       </w:pPr>
       <w:r>
         <w:rPr>
@@ -7234,6 +7560,7 @@
     <w:p>
       <w:pPr>
         <w:spacing w:after="80"/>
+        <w:jc w:val="both"/>
       </w:pPr>
       <w:r>
         <w:rPr>
@@ -7257,6 +7584,7 @@
     <w:p>
       <w:pPr>
         <w:spacing w:after="40" w:before="40"/>
+        <w:jc w:val="both"/>
       </w:pPr>
       <w:r>
         <w:rPr>
@@ -7277,6 +7605,7 @@
           <w:numId w:val="2"/>
         </w:numPr>
         <w:spacing w:after="60"/>
+        <w:jc w:val="both"/>
       </w:pPr>
       <w:r>
         <w:rPr>
@@ -7293,6 +7622,7 @@
           <w:numId w:val="2"/>
         </w:numPr>
         <w:spacing w:after="60"/>
+        <w:jc w:val="both"/>
       </w:pPr>
       <w:r>
         <w:rPr>
@@ -7309,6 +7639,7 @@
           <w:numId w:val="2"/>
         </w:numPr>
         <w:spacing w:after="60"/>
+        <w:jc w:val="both"/>
       </w:pPr>
       <w:r>
         <w:rPr>
@@ -7335,6 +7666,7 @@
     <w:p>
       <w:pPr>
         <w:spacing w:after="100"/>
+        <w:jc w:val="both"/>
       </w:pPr>
       <w:r>
         <w:rPr>
@@ -7366,6 +7698,7 @@
     <w:p>
       <w:pPr>
         <w:spacing w:after="80"/>
+        <w:jc w:val="both"/>
       </w:pPr>
       <w:r>
         <w:rPr>
@@ -7389,6 +7722,7 @@
     <w:p>
       <w:pPr>
         <w:spacing w:after="40" w:before="40"/>
+        <w:jc w:val="both"/>
       </w:pPr>
       <w:r>
         <w:rPr>
@@ -7409,6 +7743,7 @@
           <w:numId w:val="2"/>
         </w:numPr>
         <w:spacing w:after="60"/>
+        <w:jc w:val="both"/>
       </w:pPr>
       <w:r>
         <w:rPr>
@@ -7425,6 +7760,7 @@
           <w:numId w:val="2"/>
         </w:numPr>
         <w:spacing w:after="60"/>
+        <w:jc w:val="both"/>
       </w:pPr>
       <w:r>
         <w:rPr>
@@ -7452,6 +7788,7 @@
     <w:p>
       <w:pPr>
         <w:spacing w:after="40" w:before="40"/>
+        <w:jc w:val="both"/>
       </w:pPr>
       <w:r>
         <w:rPr>
@@ -7472,6 +7809,7 @@
           <w:numId w:val="2"/>
         </w:numPr>
         <w:spacing w:after="60"/>
+        <w:jc w:val="both"/>
       </w:pPr>
       <w:r>
         <w:rPr>
@@ -7488,6 +7826,7 @@
           <w:numId w:val="2"/>
         </w:numPr>
         <w:spacing w:after="60"/>
+        <w:jc w:val="both"/>
       </w:pPr>
       <w:r>
         <w:rPr>
@@ -7504,6 +7843,7 @@
           <w:numId w:val="2"/>
         </w:numPr>
         <w:spacing w:after="60"/>
+        <w:jc w:val="both"/>
       </w:pPr>
       <w:r>
         <w:rPr>
@@ -7531,6 +7871,7 @@
     <w:p>
       <w:pPr>
         <w:spacing w:after="120"/>
+        <w:jc w:val="both"/>
       </w:pPr>
       <w:r>
         <w:rPr>
@@ -7542,6 +7883,7 @@
     <w:p>
       <w:pPr>
         <w:spacing w:after="120"/>
+        <w:jc w:val="both"/>
       </w:pPr>
       <w:r>
         <w:rPr>
@@ -7553,6 +7895,7 @@
     <w:p>
       <w:pPr>
         <w:spacing w:after="100"/>
+        <w:jc w:val="both"/>
       </w:pPr>
       <w:r>
         <w:rPr>
@@ -7584,6 +7927,7 @@
     <w:p>
       <w:pPr>
         <w:spacing w:after="80"/>
+        <w:jc w:val="both"/>
       </w:pPr>
       <w:r>
         <w:rPr>
@@ -7607,6 +7951,7 @@
     <w:p>
       <w:pPr>
         <w:spacing w:after="80"/>
+        <w:jc w:val="both"/>
       </w:pPr>
       <w:r>
         <w:rPr>
@@ -7645,6 +7990,7 @@
     <w:p>
       <w:pPr>
         <w:spacing w:after="100"/>
+        <w:jc w:val="both"/>
       </w:pPr>
       <w:r>
         <w:rPr>
@@ -7676,6 +8022,7 @@
     <w:p>
       <w:pPr>
         <w:spacing w:after="40" w:before="40"/>
+        <w:jc w:val="both"/>
       </w:pPr>
       <w:r>
         <w:rPr>
@@ -7696,6 +8043,7 @@
           <w:numId w:val="2"/>
         </w:numPr>
         <w:spacing w:after="60"/>
+        <w:jc w:val="both"/>
       </w:pPr>
       <w:r>
         <w:rPr>
@@ -7712,6 +8060,7 @@
           <w:numId w:val="2"/>
         </w:numPr>
         <w:spacing w:after="60"/>
+        <w:jc w:val="both"/>
       </w:pPr>
       <w:r>
         <w:rPr>
@@ -7728,6 +8077,7 @@
           <w:numId w:val="2"/>
         </w:numPr>
         <w:spacing w:after="60"/>
+        <w:jc w:val="both"/>
       </w:pPr>
       <w:r>
         <w:rPr>
@@ -7739,6 +8089,7 @@
     <w:p>
       <w:pPr>
         <w:spacing w:after="100"/>
+        <w:jc w:val="both"/>
       </w:pPr>
       <w:r>
         <w:rPr>
@@ -7770,6 +8121,7 @@
     <w:p>
       <w:pPr>
         <w:spacing w:after="40" w:before="40"/>
+        <w:jc w:val="both"/>
       </w:pPr>
       <w:r>
         <w:rPr>
@@ -7790,6 +8142,7 @@
           <w:numId w:val="2"/>
         </w:numPr>
         <w:spacing w:after="60"/>
+        <w:jc w:val="both"/>
       </w:pPr>
       <w:r>
         <w:rPr>
@@ -7806,6 +8159,7 @@
           <w:numId w:val="2"/>
         </w:numPr>
         <w:spacing w:after="60"/>
+        <w:jc w:val="both"/>
       </w:pPr>
       <w:r>
         <w:rPr>
@@ -7833,6 +8187,7 @@
     <w:p>
       <w:pPr>
         <w:spacing w:after="80"/>
+        <w:jc w:val="both"/>
       </w:pPr>
       <w:r>
         <w:rPr>
@@ -7872,6 +8227,7 @@
     <w:p>
       <w:pPr>
         <w:spacing w:after="40" w:before="40"/>
+        <w:jc w:val="both"/>
       </w:pPr>
       <w:r>
         <w:rPr>
@@ -7892,6 +8248,7 @@
           <w:numId w:val="2"/>
         </w:numPr>
         <w:spacing w:after="60"/>
+        <w:jc w:val="both"/>
       </w:pPr>
       <w:r>
         <w:rPr>
@@ -7908,6 +8265,7 @@
           <w:numId w:val="2"/>
         </w:numPr>
         <w:spacing w:after="60"/>
+        <w:jc w:val="both"/>
       </w:pPr>
       <w:r>
         <w:rPr>
@@ -7919,6 +8277,7 @@
     <w:p>
       <w:pPr>
         <w:spacing w:after="80"/>
+        <w:jc w:val="both"/>
       </w:pPr>
       <w:r>
         <w:rPr>
@@ -7958,6 +8317,7 @@
     <w:p>
       <w:pPr>
         <w:spacing w:after="40" w:before="40"/>
+        <w:jc w:val="both"/>
       </w:pPr>
       <w:r>
         <w:rPr>
@@ -7978,6 +8338,7 @@
           <w:numId w:val="2"/>
         </w:numPr>
         <w:spacing w:after="60"/>
+        <w:jc w:val="both"/>
       </w:pPr>
       <w:r>
         <w:rPr>
@@ -7994,6 +8355,7 @@
           <w:numId w:val="2"/>
         </w:numPr>
         <w:spacing w:after="60"/>
+        <w:jc w:val="both"/>
       </w:pPr>
       <w:r>
         <w:rPr>
@@ -8010,6 +8372,7 @@
           <w:numId w:val="2"/>
         </w:numPr>
         <w:spacing w:after="60"/>
+        <w:jc w:val="both"/>
       </w:pPr>
       <w:r>
         <w:rPr>
@@ -8021,6 +8384,7 @@
     <w:p>
       <w:pPr>
         <w:spacing w:after="100"/>
+        <w:jc w:val="both"/>
       </w:pPr>
       <w:r>
         <w:rPr>
@@ -8050,6 +8414,7 @@
     <w:p>
       <w:pPr>
         <w:spacing w:after="120"/>
+        <w:jc w:val="both"/>
       </w:pPr>
       <w:r>
         <w:rPr>
@@ -8066,6 +8431,7 @@
           <w:numId w:val="2"/>
         </w:numPr>
         <w:spacing w:after="60"/>
+        <w:jc w:val="both"/>
       </w:pPr>
       <w:r>
         <w:rPr>
@@ -8082,6 +8448,7 @@
           <w:numId w:val="2"/>
         </w:numPr>
         <w:spacing w:after="60"/>
+        <w:jc w:val="both"/>
       </w:pPr>
       <w:r>
         <w:rPr>
@@ -8107,6 +8474,7 @@
     <w:p>
       <w:pPr>
         <w:spacing w:after="120"/>
+        <w:jc w:val="both"/>
       </w:pPr>
       <w:r>
         <w:rPr>
@@ -8132,6 +8500,7 @@
     <w:p>
       <w:pPr>
         <w:spacing w:after="120"/>
+        <w:jc w:val="both"/>
       </w:pPr>
       <w:r>
         <w:rPr>
@@ -8157,6 +8526,7 @@
     <w:p>
       <w:pPr>
         <w:spacing w:after="120"/>
+        <w:jc w:val="both"/>
       </w:pPr>
       <w:r>
         <w:rPr>
@@ -8182,6 +8552,7 @@
     <w:p>
       <w:pPr>
         <w:spacing w:after="120"/>
+        <w:jc w:val="both"/>
       </w:pPr>
       <w:r>
         <w:rPr>
@@ -8207,6 +8578,7 @@
     <w:p>
       <w:pPr>
         <w:spacing w:after="120"/>
+        <w:jc w:val="both"/>
       </w:pPr>
       <w:r>
         <w:rPr>
@@ -8232,6 +8604,7 @@
     <w:p>
       <w:pPr>
         <w:spacing w:after="120"/>
+        <w:jc w:val="both"/>
       </w:pPr>
       <w:r>
         <w:rPr>
@@ -8257,6 +8630,7 @@
     <w:p>
       <w:pPr>
         <w:spacing w:after="120"/>
+        <w:jc w:val="both"/>
       </w:pPr>
       <w:r>
         <w:rPr>
@@ -8282,6 +8656,7 @@
     <w:p>
       <w:pPr>
         <w:spacing w:after="120"/>
+        <w:jc w:val="both"/>
       </w:pPr>
       <w:r>
         <w:rPr>
@@ -8298,6 +8673,7 @@
           <w:numId w:val="2"/>
         </w:numPr>
         <w:spacing w:after="60"/>
+        <w:jc w:val="both"/>
       </w:pPr>
       <w:r>
         <w:rPr>
@@ -8314,6 +8690,7 @@
           <w:numId w:val="2"/>
         </w:numPr>
         <w:spacing w:after="60"/>
+        <w:jc w:val="both"/>
       </w:pPr>
       <w:r>
         <w:rPr>
@@ -8330,6 +8707,7 @@
           <w:numId w:val="2"/>
         </w:numPr>
         <w:spacing w:after="60"/>
+        <w:jc w:val="both"/>
       </w:pPr>
       <w:r>
         <w:rPr>
@@ -8346,6 +8724,7 @@
           <w:numId w:val="2"/>
         </w:numPr>
         <w:spacing w:after="60"/>
+        <w:jc w:val="both"/>
       </w:pPr>
       <w:r>
         <w:rPr>
@@ -8362,6 +8741,7 @@
           <w:numId w:val="2"/>
         </w:numPr>
         <w:spacing w:after="60"/>
+        <w:jc w:val="both"/>
       </w:pPr>
       <w:r>
         <w:rPr>
@@ -8378,6 +8758,7 @@
           <w:numId w:val="2"/>
         </w:numPr>
         <w:spacing w:after="60"/>
+        <w:jc w:val="both"/>
       </w:pPr>
       <w:r>
         <w:rPr>
@@ -8394,6 +8775,7 @@
           <w:numId w:val="2"/>
         </w:numPr>
         <w:spacing w:after="60"/>
+        <w:jc w:val="both"/>
       </w:pPr>
       <w:r>
         <w:rPr>
@@ -8410,6 +8792,7 @@
           <w:numId w:val="2"/>
         </w:numPr>
         <w:spacing w:after="60"/>
+        <w:jc w:val="both"/>
       </w:pPr>
       <w:r>
         <w:rPr>
@@ -8440,6 +8823,7 @@
           <w:numId w:val="2"/>
         </w:numPr>
         <w:spacing w:after="60"/>
+        <w:jc w:val="both"/>
       </w:pPr>
       <w:r>
         <w:rPr>
@@ -8456,6 +8840,7 @@
           <w:numId w:val="2"/>
         </w:numPr>
         <w:spacing w:after="60"/>
+        <w:jc w:val="both"/>
       </w:pPr>
       <w:r>
         <w:rPr>
@@ -8472,6 +8857,7 @@
           <w:numId w:val="2"/>
         </w:numPr>
         <w:spacing w:after="60"/>
+        <w:jc w:val="both"/>
       </w:pPr>
       <w:r>
         <w:rPr>
@@ -8488,6 +8874,7 @@
           <w:numId w:val="2"/>
         </w:numPr>
         <w:spacing w:after="60"/>
+        <w:jc w:val="both"/>
       </w:pPr>
       <w:r>
         <w:rPr>
@@ -8504,6 +8891,7 @@
           <w:numId w:val="2"/>
         </w:numPr>
         <w:spacing w:after="60"/>
+        <w:jc w:val="both"/>
       </w:pPr>
       <w:r>
         <w:rPr>
@@ -8520,6 +8908,7 @@
           <w:numId w:val="2"/>
         </w:numPr>
         <w:spacing w:after="60"/>
+        <w:jc w:val="both"/>
       </w:pPr>
       <w:r>
         <w:rPr>
@@ -8536,6 +8925,7 @@
           <w:numId w:val="2"/>
         </w:numPr>
         <w:spacing w:after="60"/>
+        <w:jc w:val="both"/>
       </w:pPr>
       <w:r>
         <w:rPr>
@@ -8552,6 +8942,7 @@
           <w:numId w:val="2"/>
         </w:numPr>
         <w:spacing w:after="60"/>
+        <w:jc w:val="both"/>
       </w:pPr>
       <w:r>
         <w:rPr>
@@ -8568,6 +8959,7 @@
           <w:numId w:val="2"/>
         </w:numPr>
         <w:spacing w:after="60"/>
+        <w:jc w:val="both"/>
       </w:pPr>
       <w:r>
         <w:rPr>
@@ -8584,6 +8976,7 @@
           <w:numId w:val="2"/>
         </w:numPr>
         <w:spacing w:after="60"/>
+        <w:jc w:val="both"/>
       </w:pPr>
       <w:r>
         <w:rPr>
@@ -8600,6 +8993,7 @@
           <w:numId w:val="2"/>
         </w:numPr>
         <w:spacing w:after="60"/>
+        <w:jc w:val="both"/>
       </w:pPr>
       <w:r>
         <w:rPr>
@@ -8616,6 +9010,7 @@
           <w:numId w:val="2"/>
         </w:numPr>
         <w:spacing w:after="60"/>
+        <w:jc w:val="both"/>
       </w:pPr>
       <w:r>
         <w:rPr>
@@ -8632,6 +9027,7 @@
           <w:numId w:val="2"/>
         </w:numPr>
         <w:spacing w:after="60"/>
+        <w:jc w:val="both"/>
       </w:pPr>
       <w:r>
         <w:rPr>
@@ -8648,6 +9044,7 @@
           <w:numId w:val="2"/>
         </w:numPr>
         <w:spacing w:after="60"/>
+        <w:jc w:val="both"/>
       </w:pPr>
       <w:r>
         <w:rPr>
@@ -8664,6 +9061,7 @@
           <w:numId w:val="2"/>
         </w:numPr>
         <w:spacing w:after="60"/>
+        <w:jc w:val="both"/>
       </w:pPr>
       <w:r>
         <w:rPr>
@@ -8680,6 +9078,7 @@
           <w:numId w:val="2"/>
         </w:numPr>
         <w:spacing w:after="60"/>
+        <w:jc w:val="both"/>
       </w:pPr>
       <w:r>
         <w:rPr>
@@ -8696,6 +9095,7 @@
           <w:numId w:val="2"/>
         </w:numPr>
         <w:spacing w:after="60"/>
+        <w:jc w:val="both"/>
       </w:pPr>
       <w:r>
         <w:rPr>
@@ -8712,6 +9112,7 @@
           <w:numId w:val="2"/>
         </w:numPr>
         <w:spacing w:after="60"/>
+        <w:jc w:val="both"/>
       </w:pPr>
       <w:r>
         <w:rPr>
@@ -8728,6 +9129,7 @@
           <w:numId w:val="2"/>
         </w:numPr>
         <w:spacing w:after="60"/>
+        <w:jc w:val="both"/>
       </w:pPr>
       <w:r>
         <w:rPr>
@@ -8744,6 +9146,7 @@
           <w:numId w:val="2"/>
         </w:numPr>
         <w:spacing w:after="60"/>
+        <w:jc w:val="both"/>
       </w:pPr>
       <w:r>
         <w:rPr>
@@ -8760,6 +9163,7 @@
           <w:numId w:val="2"/>
         </w:numPr>
         <w:spacing w:after="60"/>
+        <w:jc w:val="both"/>
       </w:pPr>
       <w:r>
         <w:rPr>
@@ -8776,6 +9180,7 @@
           <w:numId w:val="2"/>
         </w:numPr>
         <w:spacing w:after="60"/>
+        <w:jc w:val="both"/>
       </w:pPr>
       <w:r>
         <w:rPr>
@@ -8792,6 +9197,7 @@
           <w:numId w:val="2"/>
         </w:numPr>
         <w:spacing w:after="60"/>
+        <w:jc w:val="both"/>
       </w:pPr>
       <w:r>
         <w:rPr>

</xml_diff>

<commit_message>
7.5.4 Einleitung und 7.5.4.1.1 Grobplanung erstmals vollständig reviewed
Einleitungssatz zu 7.5.4 war bislang unentdeckt unveränderter
Version-k-Rohtext: "Produktdatenblätter" (undefinierter Begriff) und
Flow-Chart-Verweis (keine entsprechende Anlage vorhanden) gestrichen.

7.5.4.1.1 Grobplanung: neue Rolle "Logistikplanung" eingeführt (eigene
Planungsfunktion innerhalb SCM/Logistik, prüft Kundenbestellungen auf
grundsätzliche terminliche Machbarkeit in Abstimmung mit dem VKI vor
FOSS-Übergabe); Prüfung durch Produktionsplanung und -steuerung um
Ressourcenabgleich präzisiert (Maschinen-/Personalkapazität,
Behälterverfügbarkeit, Materialverfügbarkeit). Begriff in
BEGRIFFE.md/BEGRIFFE_ABKUERZUNGEN.md ergänzt.

Co-Authored-By: Claude Sonnet 5 <noreply@anthropic.com>
Claude-Session: https://claude.ai/code/session_01KTGUGVaPm39C5Y3H1dpETj
</commit_message>
<xml_diff>
--- a/working/7V-5-1_Auftragsabwicklung_Produktion_ENTWURF.docx
+++ b/working/7V-5-1_Auftragsabwicklung_Produktion_ENTWURF.docx
@@ -8480,7 +8480,7 @@
         <w:rPr>
           <w:rFonts w:ascii="Calibri" w:cs="Calibri" w:eastAsia="Calibri" w:hAnsi="Calibri"/>
         </w:rPr>
-        <w:t xml:space="preserve">Zur Sicherheit der Produktionsabläufe wurden entsprechende Prüf- und Arbeitsanweisungen erstellt. In den Produktionsaufträgen und Produktdatenblättern sind alle Informationen zur Herstellung der Produkte enthalten. Der Ablauf ist im Flow Chart (siehe separate Grafik / Anhang) dargestellt.</w:t>
+        <w:t xml:space="preserve">Zur Sicherstellung korrekter Produktionsabläufe liegen entsprechende Arbeitsanweisungen und Prüfpläne vor. In den Produktionsaufträgen sind alle relevanten Steuerungsinformationen zur Herstellung der Produkte enthalten.</w:t>
       </w:r>
     </w:p>
     <w:p>
@@ -8506,7 +8506,7 @@
         <w:rPr>
           <w:rFonts w:ascii="Calibri" w:cs="Calibri" w:eastAsia="Calibri" w:hAnsi="Calibri"/>
         </w:rPr>
-        <w:t xml:space="preserve">Kundenbestellungen werden vom Verkaufsinnendienst (VKI) geprüft und ins FOSS übergeben. Die Produktionsplanung und -steuerung ermittelt anhand des KPLI-Moduls die aktuellen Bedarfe und lastet die Produktionsaufträge entsprechend Lagerstand und Bedarf ein.</w:t>
+        <w:t xml:space="preserve">Kundenbestellungen werden von der Logistikplanung in Abstimmung mit dem Verkaufsinnendienst (VKI) auf grundsätzliche terminliche Machbarkeit geprüft und anschließend an das FOSS-System übergeben. Die Produktionsplanung und -steuerung überprüft anhand des KPLI-Moduls die aktuellen Bedarfe gegen die Verfügbarkeit aller relevanten Ressourcen (Maschinenkapazität, Personalkapazität, Behälterverfügbarkeit, grundsätzliche Materialverfügbarkeit, …) und lastet die Produktionsaufträge entsprechend Lagerstand und Bedarf ein.</w:t>
       </w:r>
     </w:p>
     <w:p>
@@ -8966,6 +8966,23 @@
           <w:rFonts w:ascii="Calibri" w:cs="Calibri" w:eastAsia="Calibri" w:hAnsi="Calibri"/>
         </w:rPr>
         <w:t xml:space="preserve">LMS – Lernmanagementsystem</w:t>
+      </w:r>
+    </w:p>
+    <w:p>
+      <w:pPr>
+        <w:pStyle w:val="ListParagraph"/>
+        <w:numPr>
+          <w:ilvl w:val="0"/>
+          <w:numId w:val="2"/>
+        </w:numPr>
+        <w:spacing w:after="60"/>
+        <w:jc w:val="both"/>
+      </w:pPr>
+      <w:r>
+        <w:rPr>
+          <w:rFonts w:ascii="Calibri" w:cs="Calibri" w:eastAsia="Calibri" w:hAnsi="Calibri"/>
+        </w:rPr>
+        <w:t xml:space="preserve">Logistikplanung – Planungsfunktion innerhalb der Abteilung SCM/Logistik, getrennt von der Produktionsplanung und -steuerung</w:t>
       </w:r>
     </w:p>
     <w:p>

</xml_diff>

<commit_message>
Dokumentenlenkungs-Tabelle ergänzt (Status, Ersteller, Geprüft/Freigegeben)
Status "Entwurf" bleibt als formale Dokumentenlenkungs-Angabe (ISO 9001
§7.5.2) bis zur Freigabe bestehen - im Unterschied zum zuvor entfernten
internen Zwischenstand-Hinweis. Ersteller: Alexander Brühl. Prüfung
durch QS, Freigabe durch QMB.

Co-Authored-By: Claude Sonnet 5 <noreply@anthropic.com>
Claude-Session: https://claude.ai/code/session_01KTGUGVaPm39C5Y3H1dpETj
</commit_message>
<xml_diff>
--- a/working/7V-5-1_Auftragsabwicklung_Produktion_ENTWURF.docx
+++ b/working/7V-5-1_Auftragsabwicklung_Produktion_ENTWURF.docx
@@ -43,6 +43,245 @@
         </w:rPr>
         <w:t xml:space="preserve">Auftragsabwicklung in der Produktion</w:t>
       </w:r>
+    </w:p>
+    <w:tbl>
+      <w:tblPr>
+        <w:tblW w:type="pct" w:w="100%"/>
+        <w:tblBorders>
+          <w:top w:val="single" w:color="auto" w:sz="4"/>
+          <w:left w:val="single" w:color="auto" w:sz="4"/>
+          <w:bottom w:val="single" w:color="auto" w:sz="4"/>
+          <w:right w:val="single" w:color="auto" w:sz="4"/>
+          <w:insideH w:val="single" w:color="auto" w:sz="4"/>
+          <w:insideV w:val="single" w:color="auto" w:sz="4"/>
+        </w:tblBorders>
+      </w:tblPr>
+      <w:tblGrid>
+        <w:gridCol w:w="100"/>
+        <w:gridCol w:w="100"/>
+        <w:gridCol w:w="100"/>
+        <w:gridCol w:w="100"/>
+        <w:gridCol w:w="100"/>
+      </w:tblGrid>
+      <w:tr>
+        <w:tc>
+          <w:tcPr>
+            <w:tcMar>
+              <w:top w:type="dxa" w:w="60"/>
+              <w:left w:type="dxa" w:w="100"/>
+              <w:bottom w:type="dxa" w:w="60"/>
+              <w:right w:type="dxa" w:w="100"/>
+            </w:tcMar>
+          </w:tcPr>
+          <w:p>
+            <w:r>
+              <w:rPr>
+                <w:rFonts w:ascii="Calibri" w:cs="Calibri" w:eastAsia="Calibri" w:hAnsi="Calibri"/>
+                <w:b/>
+                <w:bCs/>
+                <w:sz w:val="18"/>
+                <w:szCs w:val="18"/>
+              </w:rPr>
+              <w:t xml:space="preserve">Status</w:t>
+            </w:r>
+          </w:p>
+        </w:tc>
+        <w:tc>
+          <w:tcPr>
+            <w:tcMar>
+              <w:top w:type="dxa" w:w="60"/>
+              <w:left w:type="dxa" w:w="100"/>
+              <w:bottom w:type="dxa" w:w="60"/>
+              <w:right w:type="dxa" w:w="100"/>
+            </w:tcMar>
+          </w:tcPr>
+          <w:p>
+            <w:r>
+              <w:rPr>
+                <w:rFonts w:ascii="Calibri" w:cs="Calibri" w:eastAsia="Calibri" w:hAnsi="Calibri"/>
+                <w:b/>
+                <w:bCs/>
+                <w:sz w:val="18"/>
+                <w:szCs w:val="18"/>
+              </w:rPr>
+              <w:t xml:space="preserve">Ersteller</w:t>
+            </w:r>
+          </w:p>
+        </w:tc>
+        <w:tc>
+          <w:tcPr>
+            <w:tcMar>
+              <w:top w:type="dxa" w:w="60"/>
+              <w:left w:type="dxa" w:w="100"/>
+              <w:bottom w:type="dxa" w:w="60"/>
+              <w:right w:type="dxa" w:w="100"/>
+            </w:tcMar>
+          </w:tcPr>
+          <w:p>
+            <w:r>
+              <w:rPr>
+                <w:rFonts w:ascii="Calibri" w:cs="Calibri" w:eastAsia="Calibri" w:hAnsi="Calibri"/>
+                <w:b/>
+                <w:bCs/>
+                <w:sz w:val="18"/>
+                <w:szCs w:val="18"/>
+              </w:rPr>
+              <w:t xml:space="preserve">Geprüft durch</w:t>
+            </w:r>
+          </w:p>
+        </w:tc>
+        <w:tc>
+          <w:tcPr>
+            <w:tcMar>
+              <w:top w:type="dxa" w:w="60"/>
+              <w:left w:type="dxa" w:w="100"/>
+              <w:bottom w:type="dxa" w:w="60"/>
+              <w:right w:type="dxa" w:w="100"/>
+            </w:tcMar>
+          </w:tcPr>
+          <w:p>
+            <w:r>
+              <w:rPr>
+                <w:rFonts w:ascii="Calibri" w:cs="Calibri" w:eastAsia="Calibri" w:hAnsi="Calibri"/>
+                <w:b/>
+                <w:bCs/>
+                <w:sz w:val="18"/>
+                <w:szCs w:val="18"/>
+              </w:rPr>
+              <w:t xml:space="preserve">Freigegeben durch</w:t>
+            </w:r>
+          </w:p>
+        </w:tc>
+        <w:tc>
+          <w:tcPr>
+            <w:tcMar>
+              <w:top w:type="dxa" w:w="60"/>
+              <w:left w:type="dxa" w:w="100"/>
+              <w:bottom w:type="dxa" w:w="60"/>
+              <w:right w:type="dxa" w:w="100"/>
+            </w:tcMar>
+          </w:tcPr>
+          <w:p>
+            <w:r>
+              <w:rPr>
+                <w:rFonts w:ascii="Calibri" w:cs="Calibri" w:eastAsia="Calibri" w:hAnsi="Calibri"/>
+                <w:b/>
+                <w:bCs/>
+                <w:sz w:val="18"/>
+                <w:szCs w:val="18"/>
+              </w:rPr>
+              <w:t xml:space="preserve">Datum Freigabe</w:t>
+            </w:r>
+          </w:p>
+        </w:tc>
+      </w:tr>
+      <w:tr>
+        <w:tc>
+          <w:tcPr>
+            <w:tcMar>
+              <w:top w:type="dxa" w:w="60"/>
+              <w:left w:type="dxa" w:w="100"/>
+              <w:bottom w:type="dxa" w:w="60"/>
+              <w:right w:type="dxa" w:w="100"/>
+            </w:tcMar>
+          </w:tcPr>
+          <w:p>
+            <w:r>
+              <w:rPr>
+                <w:rFonts w:ascii="Calibri" w:cs="Calibri" w:eastAsia="Calibri" w:hAnsi="Calibri"/>
+                <w:sz w:val="18"/>
+                <w:szCs w:val="18"/>
+              </w:rPr>
+              <w:t xml:space="preserve">Entwurf</w:t>
+            </w:r>
+          </w:p>
+        </w:tc>
+        <w:tc>
+          <w:tcPr>
+            <w:tcMar>
+              <w:top w:type="dxa" w:w="60"/>
+              <w:left w:type="dxa" w:w="100"/>
+              <w:bottom w:type="dxa" w:w="60"/>
+              <w:right w:type="dxa" w:w="100"/>
+            </w:tcMar>
+          </w:tcPr>
+          <w:p>
+            <w:r>
+              <w:rPr>
+                <w:rFonts w:ascii="Calibri" w:cs="Calibri" w:eastAsia="Calibri" w:hAnsi="Calibri"/>
+                <w:sz w:val="18"/>
+                <w:szCs w:val="18"/>
+              </w:rPr>
+              <w:t xml:space="preserve">Alexander Brühl</w:t>
+            </w:r>
+          </w:p>
+        </w:tc>
+        <w:tc>
+          <w:tcPr>
+            <w:tcMar>
+              <w:top w:type="dxa" w:w="60"/>
+              <w:left w:type="dxa" w:w="100"/>
+              <w:bottom w:type="dxa" w:w="60"/>
+              <w:right w:type="dxa" w:w="100"/>
+            </w:tcMar>
+          </w:tcPr>
+          <w:p>
+            <w:r>
+              <w:rPr>
+                <w:rFonts w:ascii="Calibri" w:cs="Calibri" w:eastAsia="Calibri" w:hAnsi="Calibri"/>
+                <w:sz w:val="18"/>
+                <w:szCs w:val="18"/>
+              </w:rPr>
+              <w:t xml:space="preserve">QS</w:t>
+            </w:r>
+          </w:p>
+        </w:tc>
+        <w:tc>
+          <w:tcPr>
+            <w:tcMar>
+              <w:top w:type="dxa" w:w="60"/>
+              <w:left w:type="dxa" w:w="100"/>
+              <w:bottom w:type="dxa" w:w="60"/>
+              <w:right w:type="dxa" w:w="100"/>
+            </w:tcMar>
+          </w:tcPr>
+          <w:p>
+            <w:r>
+              <w:rPr>
+                <w:rFonts w:ascii="Calibri" w:cs="Calibri" w:eastAsia="Calibri" w:hAnsi="Calibri"/>
+                <w:sz w:val="18"/>
+                <w:szCs w:val="18"/>
+              </w:rPr>
+              <w:t xml:space="preserve">QMB</w:t>
+            </w:r>
+          </w:p>
+        </w:tc>
+        <w:tc>
+          <w:tcPr>
+            <w:tcMar>
+              <w:top w:type="dxa" w:w="60"/>
+              <w:left w:type="dxa" w:w="100"/>
+              <w:bottom w:type="dxa" w:w="60"/>
+              <w:right w:type="dxa" w:w="100"/>
+            </w:tcMar>
+          </w:tcPr>
+          <w:p>
+            <w:r>
+              <w:rPr>
+                <w:rFonts w:ascii="Calibri" w:cs="Calibri" w:eastAsia="Calibri" w:hAnsi="Calibri"/>
+                <w:sz w:val="18"/>
+                <w:szCs w:val="18"/>
+              </w:rPr>
+              <w:t xml:space="preserve">–</w:t>
+            </w:r>
+          </w:p>
+        </w:tc>
+      </w:tr>
+    </w:tbl>
+    <w:p>
+      <w:pPr>
+        <w:spacing w:after="200"/>
+      </w:pPr>
     </w:p>
     <w:p>
       <w:pPr>

</xml_diff>

<commit_message>
Dokumentenlenkungs-Tabelle: feste Spaltenbreiten statt Prozentangabe
Robuster für einfachere docx-Vorschau-Renderer.

Co-Authored-By: Claude Sonnet 5 <noreply@anthropic.com>
Claude-Session: https://claude.ai/code/session_01KTGUGVaPm39C5Y3H1dpETj
</commit_message>
<xml_diff>
--- a/working/7V-5-1_Auftragsabwicklung_Produktion_ENTWURF.docx
+++ b/working/7V-5-1_Auftragsabwicklung_Produktion_ENTWURF.docx
@@ -46,7 +46,7 @@
     </w:p>
     <w:tbl>
       <w:tblPr>
-        <w:tblW w:type="pct" w:w="100%"/>
+        <w:tblW w:type="dxa" w:w="8400"/>
         <w:tblBorders>
           <w:top w:val="single" w:color="auto" w:sz="4"/>
           <w:left w:val="single" w:color="auto" w:sz="4"/>
@@ -55,17 +55,19 @@
           <w:insideH w:val="single" w:color="auto" w:sz="4"/>
           <w:insideV w:val="single" w:color="auto" w:sz="4"/>
         </w:tblBorders>
+        <w:tblLayout w:type="fixed"/>
       </w:tblPr>
       <w:tblGrid>
-        <w:gridCol w:w="100"/>
-        <w:gridCol w:w="100"/>
-        <w:gridCol w:w="100"/>
-        <w:gridCol w:w="100"/>
-        <w:gridCol w:w="100"/>
+        <w:gridCol w:w="1400"/>
+        <w:gridCol w:w="2200"/>
+        <w:gridCol w:w="1500"/>
+        <w:gridCol w:w="1700"/>
+        <w:gridCol w:w="1600"/>
       </w:tblGrid>
       <w:tr>
         <w:tc>
           <w:tcPr>
+            <w:tcW w:type="dxa" w:w="1400"/>
             <w:tcMar>
               <w:top w:type="dxa" w:w="60"/>
               <w:left w:type="dxa" w:w="100"/>
@@ -88,6 +90,7 @@
         </w:tc>
         <w:tc>
           <w:tcPr>
+            <w:tcW w:type="dxa" w:w="2200"/>
             <w:tcMar>
               <w:top w:type="dxa" w:w="60"/>
               <w:left w:type="dxa" w:w="100"/>
@@ -110,6 +113,7 @@
         </w:tc>
         <w:tc>
           <w:tcPr>
+            <w:tcW w:type="dxa" w:w="1500"/>
             <w:tcMar>
               <w:top w:type="dxa" w:w="60"/>
               <w:left w:type="dxa" w:w="100"/>
@@ -132,6 +136,7 @@
         </w:tc>
         <w:tc>
           <w:tcPr>
+            <w:tcW w:type="dxa" w:w="1700"/>
             <w:tcMar>
               <w:top w:type="dxa" w:w="60"/>
               <w:left w:type="dxa" w:w="100"/>
@@ -154,6 +159,7 @@
         </w:tc>
         <w:tc>
           <w:tcPr>
+            <w:tcW w:type="dxa" w:w="1600"/>
             <w:tcMar>
               <w:top w:type="dxa" w:w="60"/>
               <w:left w:type="dxa" w:w="100"/>
@@ -178,6 +184,7 @@
       <w:tr>
         <w:tc>
           <w:tcPr>
+            <w:tcW w:type="dxa" w:w="1400"/>
             <w:tcMar>
               <w:top w:type="dxa" w:w="60"/>
               <w:left w:type="dxa" w:w="100"/>
@@ -198,6 +205,7 @@
         </w:tc>
         <w:tc>
           <w:tcPr>
+            <w:tcW w:type="dxa" w:w="2200"/>
             <w:tcMar>
               <w:top w:type="dxa" w:w="60"/>
               <w:left w:type="dxa" w:w="100"/>
@@ -218,6 +226,7 @@
         </w:tc>
         <w:tc>
           <w:tcPr>
+            <w:tcW w:type="dxa" w:w="1500"/>
             <w:tcMar>
               <w:top w:type="dxa" w:w="60"/>
               <w:left w:type="dxa" w:w="100"/>
@@ -238,6 +247,7 @@
         </w:tc>
         <w:tc>
           <w:tcPr>
+            <w:tcW w:type="dxa" w:w="1700"/>
             <w:tcMar>
               <w:top w:type="dxa" w:w="60"/>
               <w:left w:type="dxa" w:w="100"/>
@@ -258,6 +268,7 @@
         </w:tc>
         <w:tc>
           <w:tcPr>
+            <w:tcW w:type="dxa" w:w="1600"/>
             <w:tcMar>
               <w:top w:type="dxa" w:w="60"/>
               <w:left w:type="dxa" w:w="100"/>

</xml_diff>

<commit_message>
QS-Rollenentwurf (7.5.3.9a) ins working-DOCX ergänzen
Neuer Abschnitt "QS – Qualitätssicherung Produktion" auf Basis der bereits
dokumentierten Eckpunkte in notes/OFFENE_ROLLEN.md, als vorläufiger Entwurf
(Nummerierung und Inhalt noch nicht im Detail mit Alexander abgestimmt)
zwischen PQB (7.5.3.9) und Lager (7.5.3.10) eingefügt.

Co-Authored-By: Claude Sonnet 5 <noreply@anthropic.com>
Claude-Session: https://claude.ai/code/session_01RGUMW1xe7QmP9yunCbCqHi
</commit_message>
<xml_diff>
--- a/working/7V-5-1_Auftragsabwicklung_Produktion_ENTWURF.docx
+++ b/working/7V-5-1_Auftragsabwicklung_Produktion_ENTWURF.docx
@@ -1897,6 +1897,216 @@
           <w:rFonts w:ascii="Calibri" w:cs="Calibri" w:eastAsia="Calibri" w:hAnsi="Calibri"/>
         </w:rPr>
         <w:t xml:space="preserve">Erneute Freigabe nach Produktionsunterbrechung</w:t>
+      </w:r>
+    </w:p>
+    <w:p>
+      <w:pPr>
+        <w:spacing w:after="60" w:before="200"/>
+      </w:pPr>
+      <w:r>
+        <w:rPr>
+          <w:rFonts w:ascii="Calibri" w:cs="Calibri" w:eastAsia="Calibri" w:hAnsi="Calibri"/>
+          <w:b/>
+          <w:bCs/>
+          <w:color w:val="8A6D00"/>
+          <w:sz w:val="22"/>
+          <w:szCs w:val="22"/>
+        </w:rPr>
+        <w:t xml:space="preserve">7.5.3.9a QS – Qualitätssicherung Produktion [NEU – Entwurf, Nummerierung vorläufig]</w:t>
+      </w:r>
+    </w:p>
+    <w:p>
+      <w:pPr>
+        <w:spacing w:after="100"/>
+      </w:pPr>
+      <w:r>
+        <w:rPr>
+          <w:rFonts w:ascii="Calibri" w:cs="Calibri" w:eastAsia="Calibri" w:hAnsi="Calibri"/>
+          <w:i/>
+          <w:iCs/>
+          <w:sz w:val="20"/>
+          <w:szCs w:val="20"/>
+        </w:rPr>
+        <w:t xml:space="preserve">Bewusst außerhalb der Produktionsabteilung angesiedelt (4-Augen-Prinzip zwischen Produktions- und Qualitätsseite). Entwurf auf Basis von notes/OFFENE_ROLLEN.md – noch nicht im Detail mit Alexander abgestimmt.</w:t>
+      </w:r>
+    </w:p>
+    <w:p>
+      <w:pPr>
+        <w:spacing w:after="60" w:before="160"/>
+      </w:pPr>
+      <w:r>
+        <w:rPr>
+          <w:rFonts w:ascii="Calibri" w:cs="Calibri" w:eastAsia="Calibri" w:hAnsi="Calibri"/>
+          <w:b/>
+          <w:bCs/>
+          <w:i/>
+          <w:iCs/>
+          <w:sz w:val="21"/>
+          <w:szCs w:val="21"/>
+        </w:rPr>
+        <w:t xml:space="preserve">Verantwortung</w:t>
+      </w:r>
+    </w:p>
+    <w:p>
+      <w:pPr>
+        <w:pStyle w:val="ListParagraph"/>
+        <w:numPr>
+          <w:ilvl w:val="0"/>
+          <w:numId w:val="2"/>
+        </w:numPr>
+        <w:spacing w:after="60"/>
+      </w:pPr>
+      <w:r>
+        <w:rPr>
+          <w:rFonts w:ascii="Calibri" w:cs="Calibri" w:eastAsia="Calibri" w:hAnsi="Calibri"/>
+        </w:rPr>
+        <w:t xml:space="preserve">Vertretung des Produktionsleiters im Bereich Qualität (1 von 3 Vertretungsbereichen: Organisation/Personal, Technik, Qualität)</w:t>
+      </w:r>
+    </w:p>
+    <w:p>
+      <w:pPr>
+        <w:pStyle w:val="ListParagraph"/>
+        <w:numPr>
+          <w:ilvl w:val="0"/>
+          <w:numId w:val="2"/>
+        </w:numPr>
+        <w:spacing w:after="60"/>
+      </w:pPr>
+      <w:r>
+        <w:rPr>
+          <w:rFonts w:ascii="Calibri" w:cs="Calibri" w:eastAsia="Calibri" w:hAnsi="Calibri"/>
+        </w:rPr>
+        <w:t xml:space="preserve">Organisatorisch übergeordnet gegenüber den PQB (Qualitätsprüfer/in, Rolle 7.5.3.9), welche schichtbezogen aufgeteilt sind</w:t>
+      </w:r>
+    </w:p>
+    <w:p>
+      <w:pPr>
+        <w:spacing w:after="60" w:before="160"/>
+      </w:pPr>
+      <w:r>
+        <w:rPr>
+          <w:rFonts w:ascii="Calibri" w:cs="Calibri" w:eastAsia="Calibri" w:hAnsi="Calibri"/>
+          <w:b/>
+          <w:bCs/>
+          <w:i/>
+          <w:iCs/>
+          <w:sz w:val="21"/>
+          <w:szCs w:val="21"/>
+        </w:rPr>
+        <w:t xml:space="preserve">Aufgaben</w:t>
+      </w:r>
+    </w:p>
+    <w:p>
+      <w:pPr>
+        <w:pStyle w:val="ListParagraph"/>
+        <w:numPr>
+          <w:ilvl w:val="0"/>
+          <w:numId w:val="2"/>
+        </w:numPr>
+        <w:spacing w:after="60"/>
+      </w:pPr>
+      <w:r>
+        <w:rPr>
+          <w:rFonts w:ascii="Calibri" w:cs="Calibri" w:eastAsia="Calibri" w:hAnsi="Calibri"/>
+        </w:rPr>
+        <w:t xml:space="preserve">Korrespondenzfunktion zur Produktionsleitung auf Gesamtebene (analog: QMB ↔ Schichtführer/Teamleiter auf Schicht-/Team-Ebene)</w:t>
+      </w:r>
+    </w:p>
+    <w:p>
+      <w:pPr>
+        <w:pStyle w:val="ListParagraph"/>
+        <w:numPr>
+          <w:ilvl w:val="0"/>
+          <w:numId w:val="2"/>
+        </w:numPr>
+        <w:spacing w:after="60"/>
+      </w:pPr>
+      <w:r>
+        <w:rPr>
+          <w:rFonts w:ascii="Calibri" w:cs="Calibri" w:eastAsia="Calibri" w:hAnsi="Calibri"/>
+        </w:rPr>
+        <w:t xml:space="preserve">Vertretung des Produktionsleiters in allen qualitätsrelevanten Fragen: fehlerhafte Teile im Haus, Reklamationen, Sperren, Nacharbeit, Maschinen abstellen/stoppen</w:t>
+      </w:r>
+    </w:p>
+    <w:p>
+      <w:pPr>
+        <w:pStyle w:val="ListParagraph"/>
+        <w:numPr>
+          <w:ilvl w:val="0"/>
+          <w:numId w:val="2"/>
+        </w:numPr>
+        <w:spacing w:after="60"/>
+      </w:pPr>
+      <w:r>
+        <w:rPr>
+          <w:rFonts w:ascii="Calibri" w:cs="Calibri" w:eastAsia="Calibri" w:hAnsi="Calibri"/>
+        </w:rPr>
+        <w:t xml:space="preserve">Feststellen von Korrekturmaßnahmenbedarf und Meldung an die Produktionsleitung</w:t>
+      </w:r>
+    </w:p>
+    <w:p>
+      <w:pPr>
+        <w:pStyle w:val="ListParagraph"/>
+        <w:numPr>
+          <w:ilvl w:val="0"/>
+          <w:numId w:val="2"/>
+        </w:numPr>
+        <w:spacing w:after="60"/>
+      </w:pPr>
+      <w:r>
+        <w:rPr>
+          <w:rFonts w:ascii="Calibri" w:cs="Calibri" w:eastAsia="Calibri" w:hAnsi="Calibri"/>
+        </w:rPr>
+        <w:t xml:space="preserve">Prüfung und Freigabe nach Wirksamkeitsnachweis (z.B.: Entsperren von Teilen/Prozessen), nachdem die Produktionsleitung die konkrete Maßnahme festgelegt hat</w:t>
+      </w:r>
+    </w:p>
+    <w:p>
+      <w:pPr>
+        <w:spacing w:after="60" w:before="160"/>
+      </w:pPr>
+      <w:r>
+        <w:rPr>
+          <w:rFonts w:ascii="Calibri" w:cs="Calibri" w:eastAsia="Calibri" w:hAnsi="Calibri"/>
+          <w:b/>
+          <w:bCs/>
+          <w:i/>
+          <w:iCs/>
+          <w:sz w:val="21"/>
+          <w:szCs w:val="21"/>
+        </w:rPr>
+        <w:t xml:space="preserve">Kompetenzen</w:t>
+      </w:r>
+    </w:p>
+    <w:p>
+      <w:pPr>
+        <w:pStyle w:val="ListParagraph"/>
+        <w:numPr>
+          <w:ilvl w:val="0"/>
+          <w:numId w:val="2"/>
+        </w:numPr>
+        <w:spacing w:after="60"/>
+      </w:pPr>
+      <w:r>
+        <w:rPr>
+          <w:rFonts w:ascii="Calibri" w:cs="Calibri" w:eastAsia="Calibri" w:hAnsi="Calibri"/>
+        </w:rPr>
+        <w:t xml:space="preserve">Entscheidungsbefugnis über Freigabe/Entsperren von Teilen und Prozessen nach Wirksamkeitsprüfung</w:t>
+      </w:r>
+    </w:p>
+    <w:p>
+      <w:pPr>
+        <w:pStyle w:val="ListParagraph"/>
+        <w:numPr>
+          <w:ilvl w:val="0"/>
+          <w:numId w:val="2"/>
+        </w:numPr>
+        <w:spacing w:after="60"/>
+      </w:pPr>
+      <w:r>
+        <w:rPr>
+          <w:rFonts w:ascii="Calibri" w:cs="Calibri" w:eastAsia="Calibri" w:hAnsi="Calibri"/>
+        </w:rPr>
+        <w:t xml:space="preserve">Koordinierende Befugnis gegenüber den PQB (schichtübergreifend)</w:t>
       </w:r>
     </w:p>
     <w:p>

</xml_diff>

<commit_message>
Stellenbeschreibungen als separate Dokumente anlegen
Stellenbeschreibungen/Rollenbeschreibungen sind eigenständige Dokumente,
nicht Teil der QM-Verfahrensanweisung 7V-5-1. Entsprechend:

- working/7V-5-1_*.docx auf Originalzustand (Version k) zurückgesetzt, inkl.
  der kurzen Rollenliste 7.5.3.1 Produktionsleiter (keine AKV-Details, kein
  QS-Abschnitt mehr dort).
- Neuer Ordner stellenbeschreibungen/ mit je einem .docx pro Rolle:
  - Stellenbeschreibung_Produktionsleiter_ENTWURF.docx (Themenblöcke 1-5,
    abgestimmt, siehe notes/PRODUKTIONSLEITER.md)
  - Stellenbeschreibung_QS_ENTWURF.docx (Entwurf auf Basis von
    notes/OFFENE_ROLLEN.md, noch nicht im Detail abgestimmt)
- Build-Skripte für beide Dokumente unter scripts/.
- Notes aktualisiert (Struktur-Entscheidung in PROJEKTSTATUS.md dokumentiert).

Co-Authored-By: Claude Sonnet 5 <noreply@anthropic.com>
Claude-Session: https://claude.ai/code/session_01RGUMW1xe7QmP9yunCbCqHi
</commit_message>
<xml_diff>
--- a/working/7V-5-1_Auftragsabwicklung_Produktion_ENTWURF.docx
+++ b/working/7V-5-1_Auftragsabwicklung_Produktion_ENTWURF.docx
@@ -139,24 +139,39 @@
           <w:sz w:val="22"/>
           <w:szCs w:val="22"/>
         </w:rPr>
-        <w:t xml:space="preserve">7.5.3.1 Produktionsleiter (Aufgaben, Kompetenzen, Verantwortung)</w:t>
-      </w:r>
-    </w:p>
-    <w:p>
-      <w:pPr>
-        <w:spacing w:after="60" w:before="220"/>
-      </w:pPr>
-      <w:r>
-        <w:rPr>
-          <w:rFonts w:ascii="Calibri" w:cs="Calibri" w:eastAsia="Calibri" w:hAnsi="Calibri"/>
-          <w:b/>
-          <w:bCs/>
-          <w:i/>
-          <w:iCs/>
-          <w:sz w:val="21"/>
-          <w:szCs w:val="21"/>
-        </w:rPr>
-        <w:t xml:space="preserve">Verantwortung</w:t>
+        <w:t xml:space="preserve">7.5.3.1 Aufgaben des Produktionsleiters</w:t>
+      </w:r>
+    </w:p>
+    <w:p>
+      <w:pPr>
+        <w:pStyle w:val="ListParagraph"/>
+        <w:numPr>
+          <w:ilvl w:val="0"/>
+          <w:numId w:val="2"/>
+        </w:numPr>
+        <w:spacing w:after="60"/>
+      </w:pPr>
+      <w:r>
+        <w:rPr>
+          <w:rFonts w:ascii="Calibri" w:cs="Calibri" w:eastAsia="Calibri" w:hAnsi="Calibri"/>
+        </w:rPr>
+        <w:t xml:space="preserve">Auftragsbesprechung mit LVK, Verwaltung der Produktionsplanung</w:t>
+      </w:r>
+    </w:p>
+    <w:p>
+      <w:pPr>
+        <w:pStyle w:val="ListParagraph"/>
+        <w:numPr>
+          <w:ilvl w:val="0"/>
+          <w:numId w:val="2"/>
+        </w:numPr>
+        <w:spacing w:after="60"/>
+      </w:pPr>
+      <w:r>
+        <w:rPr>
+          <w:rFonts w:ascii="Calibri" w:cs="Calibri" w:eastAsia="Calibri" w:hAnsi="Calibri"/>
+        </w:rPr>
+        <w:t xml:space="preserve">Produktionsbesprechung mit Abteilungsleitern</w:t>
       </w:r>
     </w:p>
     <w:p>
@@ -188,395 +203,39 @@
         <w:rPr>
           <w:rFonts w:ascii="Calibri" w:cs="Calibri" w:eastAsia="Calibri" w:hAnsi="Calibri"/>
         </w:rPr>
-        <w:t xml:space="preserve">Personalverantwortung für die Mitarbeiter der Produktion inkl. Werkzeugbau und Instandhaltung</w:t>
-      </w:r>
-    </w:p>
-    <w:p>
-      <w:pPr>
-        <w:pStyle w:val="ListParagraph"/>
-        <w:numPr>
-          <w:ilvl w:val="0"/>
-          <w:numId w:val="2"/>
-        </w:numPr>
-        <w:spacing w:after="60"/>
-      </w:pPr>
-      <w:r>
-        <w:rPr>
-          <w:rFonts w:ascii="Calibri" w:cs="Calibri" w:eastAsia="Calibri" w:hAnsi="Calibri"/>
-        </w:rPr>
-        <w:t xml:space="preserve">Einhaltung aller relevanten Gesetze, insbesondere des Arbeitszeitgesetzes und des ArbeitnehmerInnenschutzgesetzes (ASchG)</w:t>
-      </w:r>
-    </w:p>
-    <w:p>
-      <w:pPr>
-        <w:pStyle w:val="ListParagraph"/>
-        <w:numPr>
-          <w:ilvl w:val="0"/>
-          <w:numId w:val="2"/>
-        </w:numPr>
-        <w:spacing w:after="60"/>
-      </w:pPr>
-      <w:r>
-        <w:rPr>
-          <w:rFonts w:ascii="Calibri" w:cs="Calibri" w:eastAsia="Calibri" w:hAnsi="Calibri"/>
-        </w:rPr>
-        <w:t xml:space="preserve">Disziplinarische Verantwortung bei WerkerInnen und Sachbearbeitern als Eskalationsstufe (Erstverantwortung liegt bei den jeweiligen Teamleitern, sofern im Organigramm zugeordnet)</w:t>
-      </w:r>
-    </w:p>
-    <w:p>
-      <w:pPr>
-        <w:spacing w:after="60" w:before="220"/>
-      </w:pPr>
-      <w:r>
-        <w:rPr>
-          <w:rFonts w:ascii="Calibri" w:cs="Calibri" w:eastAsia="Calibri" w:hAnsi="Calibri"/>
-          <w:b/>
-          <w:bCs/>
-          <w:i/>
-          <w:iCs/>
-          <w:sz w:val="21"/>
-          <w:szCs w:val="21"/>
-        </w:rPr>
-        <w:t xml:space="preserve">Aufgaben</w:t>
-      </w:r>
-    </w:p>
-    <w:p>
-      <w:pPr>
-        <w:pStyle w:val="ListParagraph"/>
-        <w:numPr>
-          <w:ilvl w:val="0"/>
-          <w:numId w:val="2"/>
-        </w:numPr>
-        <w:spacing w:after="60"/>
-      </w:pPr>
-      <w:r>
-        <w:rPr>
-          <w:rFonts w:ascii="Calibri" w:cs="Calibri" w:eastAsia="Calibri" w:hAnsi="Calibri"/>
-        </w:rPr>
-        <w:t xml:space="preserve">Teilnahme an der Kapazitäts- und Planungsabstimmung Produktion/Logistik (aktuell: wöchentliches Meeting KPLI)</w:t>
-      </w:r>
-    </w:p>
-    <w:p>
-      <w:pPr>
-        <w:pStyle w:val="ListParagraph"/>
-        <w:numPr>
-          <w:ilvl w:val="0"/>
-          <w:numId w:val="2"/>
-        </w:numPr>
-        <w:spacing w:after="60"/>
-      </w:pPr>
-      <w:r>
-        <w:rPr>
-          <w:rFonts w:ascii="Calibri" w:cs="Calibri" w:eastAsia="Calibri" w:hAnsi="Calibri"/>
-        </w:rPr>
-        <w:t xml:space="preserve">Kontrolle/Prüfung der von der Rolle „Produktionsplanung“ erstellten Pläne</w:t>
-      </w:r>
-    </w:p>
-    <w:p>
-      <w:pPr>
-        <w:pStyle w:val="ListParagraph"/>
-        <w:numPr>
-          <w:ilvl w:val="0"/>
-          <w:numId w:val="2"/>
-        </w:numPr>
-        <w:spacing w:after="60"/>
-      </w:pPr>
-      <w:r>
-        <w:rPr>
-          <w:rFonts w:ascii="Calibri" w:cs="Calibri" w:eastAsia="Calibri" w:hAnsi="Calibri"/>
-        </w:rPr>
-        <w:t xml:space="preserve">Mitwirkung bei der Umsetzung kurzfristiger, ungeplanter Kapazitätsmaßnahmen (z.B.: Einsatz alternativer Anlagen, zusätzliche Schichten)</w:t>
-      </w:r>
-    </w:p>
-    <w:p>
-      <w:pPr>
-        <w:pStyle w:val="ListParagraph"/>
-        <w:numPr>
-          <w:ilvl w:val="0"/>
-          <w:numId w:val="2"/>
-        </w:numPr>
-        <w:spacing w:after="60"/>
-      </w:pPr>
-      <w:r>
-        <w:rPr>
-          <w:rFonts w:ascii="Calibri" w:cs="Calibri" w:eastAsia="Calibri" w:hAnsi="Calibri"/>
-        </w:rPr>
-        <w:t xml:space="preserve">Weiterentwicklung der Planungsmethodik und der eingesetzten Systeme</w:t>
-      </w:r>
-    </w:p>
-    <w:p>
-      <w:pPr>
-        <w:pStyle w:val="ListParagraph"/>
-        <w:numPr>
-          <w:ilvl w:val="0"/>
-          <w:numId w:val="2"/>
-        </w:numPr>
-        <w:spacing w:after="60"/>
-      </w:pPr>
-      <w:r>
-        <w:rPr>
-          <w:rFonts w:ascii="Calibri" w:cs="Calibri" w:eastAsia="Calibri" w:hAnsi="Calibri"/>
-        </w:rPr>
-        <w:t xml:space="preserve">Leitung der IKK (Interdisziplinäre Koordinationsrunde Kernprozesse) mit den Bereichen Produktion, Logistik, Produkt-/Projekttechnik, Business Development und Qualitätsmanagement: Top-Down Vorbereitung auf anstehende externe Themen (z.B.: Audits, neue Kundenprojekte/Werkzeuge, TISAX-Einführung); Bottom-Up Ableitung verallgemeinerter, systemischer Maßnahmen aus aktuellen operativen Problemen (Reklamationen, Werkzeug-/Ablaufschwierigkeiten, Ausschuss); Fokus auf den Kernprozess der Leistungserbringung inkl. vorgelagertem Vorserienprozess</w:t>
-      </w:r>
-    </w:p>
-    <w:p>
-      <w:pPr>
-        <w:pStyle w:val="ListParagraph"/>
-        <w:numPr>
-          <w:ilvl w:val="0"/>
-          <w:numId w:val="2"/>
-        </w:numPr>
-        <w:spacing w:after="60"/>
-      </w:pPr>
-      <w:r>
-        <w:rPr>
-          <w:rFonts w:ascii="Calibri" w:cs="Calibri" w:eastAsia="Calibri" w:hAnsi="Calibri"/>
-        </w:rPr>
-        <w:t xml:space="preserve">Sicherstellung des wirtschaftlichen Einsatzes von Personal und Ressourcen (laufende Steuerung/Überwachung im operativen Betrieb)</w:t>
-      </w:r>
-    </w:p>
-    <w:p>
-      <w:pPr>
-        <w:pStyle w:val="ListParagraph"/>
-        <w:numPr>
-          <w:ilvl w:val="0"/>
-          <w:numId w:val="2"/>
-        </w:numPr>
-        <w:spacing w:after="60"/>
-      </w:pPr>
-      <w:r>
-        <w:rPr>
-          <w:rFonts w:ascii="Calibri" w:cs="Calibri" w:eastAsia="Calibri" w:hAnsi="Calibri"/>
-        </w:rPr>
-        <w:t xml:space="preserve">Personalanforderung</w:t>
-      </w:r>
-    </w:p>
-    <w:p>
-      <w:pPr>
-        <w:pStyle w:val="ListParagraph"/>
-        <w:numPr>
-          <w:ilvl w:val="0"/>
-          <w:numId w:val="2"/>
-        </w:numPr>
-        <w:spacing w:after="60"/>
-      </w:pPr>
-      <w:r>
-        <w:rPr>
-          <w:rFonts w:ascii="Calibri" w:cs="Calibri" w:eastAsia="Calibri" w:hAnsi="Calibri"/>
-        </w:rPr>
-        <w:t xml:space="preserve">Führung von Mitarbeitergesprächen</w:t>
-      </w:r>
-    </w:p>
-    <w:p>
-      <w:pPr>
-        <w:pStyle w:val="ListParagraph"/>
-        <w:numPr>
-          <w:ilvl w:val="0"/>
-          <w:numId w:val="2"/>
-        </w:numPr>
-        <w:spacing w:after="60"/>
-      </w:pPr>
-      <w:r>
-        <w:rPr>
-          <w:rFonts w:ascii="Calibri" w:cs="Calibri" w:eastAsia="Calibri" w:hAnsi="Calibri"/>
-        </w:rPr>
-        <w:t xml:space="preserve">Bildungsbedarfsermittlung</w:t>
-      </w:r>
-    </w:p>
-    <w:p>
-      <w:pPr>
-        <w:pStyle w:val="ListParagraph"/>
-        <w:numPr>
-          <w:ilvl w:val="0"/>
-          <w:numId w:val="2"/>
-        </w:numPr>
-        <w:spacing w:after="60"/>
-      </w:pPr>
-      <w:r>
-        <w:rPr>
-          <w:rFonts w:ascii="Calibri" w:cs="Calibri" w:eastAsia="Calibri" w:hAnsi="Calibri"/>
-        </w:rPr>
-        <w:t xml:space="preserve">Sicherstellung der produktionsrelevanten Schulungen</w:t>
-      </w:r>
-    </w:p>
-    <w:p>
-      <w:pPr>
-        <w:pStyle w:val="ListParagraph"/>
-        <w:numPr>
-          <w:ilvl w:val="0"/>
-          <w:numId w:val="2"/>
-        </w:numPr>
-        <w:spacing w:after="60"/>
-      </w:pPr>
-      <w:r>
-        <w:rPr>
-          <w:rFonts w:ascii="Calibri" w:cs="Calibri" w:eastAsia="Calibri" w:hAnsi="Calibri"/>
-        </w:rPr>
-        <w:t xml:space="preserve">Mitwirkung an der Einführung geeigneter (flexibler) Arbeitszeitmodelle (gemeinsam mit HR)</w:t>
-      </w:r>
-    </w:p>
-    <w:p>
-      <w:pPr>
-        <w:pStyle w:val="ListParagraph"/>
-        <w:numPr>
-          <w:ilvl w:val="0"/>
-          <w:numId w:val="2"/>
-        </w:numPr>
-        <w:spacing w:after="60"/>
-      </w:pPr>
-      <w:r>
-        <w:rPr>
-          <w:rFonts w:ascii="Calibri" w:cs="Calibri" w:eastAsia="Calibri" w:hAnsi="Calibri"/>
-        </w:rPr>
-        <w:t xml:space="preserve">Sicherstellung der Urlaubsplanung</w:t>
-      </w:r>
-    </w:p>
-    <w:p>
-      <w:pPr>
-        <w:pStyle w:val="ListParagraph"/>
-        <w:numPr>
-          <w:ilvl w:val="0"/>
-          <w:numId w:val="2"/>
-        </w:numPr>
-        <w:spacing w:after="60"/>
-      </w:pPr>
-      <w:r>
-        <w:rPr>
-          <w:rFonts w:ascii="Calibri" w:cs="Calibri" w:eastAsia="Calibri" w:hAnsi="Calibri"/>
-        </w:rPr>
-        <w:t xml:space="preserve">Entscheidung über Art und Umsetzung von Korrekturmaßnahmen bei durch QS festgestelltem Handlungsbedarf (gesamtheitliche Ebene)</w:t>
-      </w:r>
-    </w:p>
-    <w:p>
-      <w:pPr>
-        <w:spacing w:after="60" w:before="220"/>
-      </w:pPr>
-      <w:r>
-        <w:rPr>
-          <w:rFonts w:ascii="Calibri" w:cs="Calibri" w:eastAsia="Calibri" w:hAnsi="Calibri"/>
-          <w:b/>
-          <w:bCs/>
-          <w:i/>
-          <w:iCs/>
-          <w:sz w:val="21"/>
-          <w:szCs w:val="21"/>
-        </w:rPr>
-        <w:t xml:space="preserve">Kompetenzen</w:t>
-      </w:r>
-    </w:p>
-    <w:p>
-      <w:pPr>
-        <w:pStyle w:val="ListParagraph"/>
-        <w:numPr>
-          <w:ilvl w:val="0"/>
-          <w:numId w:val="2"/>
-        </w:numPr>
-        <w:spacing w:after="60"/>
-      </w:pPr>
-      <w:r>
-        <w:rPr>
-          <w:rFonts w:ascii="Calibri" w:cs="Calibri" w:eastAsia="Calibri" w:hAnsi="Calibri"/>
-        </w:rPr>
-        <w:t xml:space="preserve">Freigabe-/Entscheidungsbefugnis über die Produktionsplanung (Kontrollfunktion gegenüber der Rolle Produktionsplanung)</w:t>
-      </w:r>
-    </w:p>
-    <w:p>
-      <w:pPr>
-        <w:pStyle w:val="ListParagraph"/>
-        <w:numPr>
-          <w:ilvl w:val="0"/>
-          <w:numId w:val="2"/>
-        </w:numPr>
-        <w:spacing w:after="60"/>
-      </w:pPr>
-      <w:r>
-        <w:rPr>
-          <w:rFonts w:ascii="Calibri" w:cs="Calibri" w:eastAsia="Calibri" w:hAnsi="Calibri"/>
-        </w:rPr>
-        <w:t xml:space="preserve">Entscheidungsbefugnis bei ungeplanten Kapazitätskonflikten (z.B.: Freigabe alternativer Anlagen, Anordnung zusätzlicher Schichten)</w:t>
-      </w:r>
-    </w:p>
-    <w:p>
-      <w:pPr>
-        <w:pStyle w:val="ListParagraph"/>
-        <w:numPr>
-          <w:ilvl w:val="0"/>
-          <w:numId w:val="2"/>
-        </w:numPr>
-        <w:spacing w:after="60"/>
-      </w:pPr>
-      <w:r>
-        <w:rPr>
-          <w:rFonts w:ascii="Calibri" w:cs="Calibri" w:eastAsia="Calibri" w:hAnsi="Calibri"/>
-        </w:rPr>
-        <w:t xml:space="preserve">Entscheidungsbefugnis über die aus der IKK abgeleiteten Maßnahmen</w:t>
-      </w:r>
-    </w:p>
-    <w:p>
-      <w:pPr>
-        <w:pStyle w:val="ListParagraph"/>
-        <w:numPr>
-          <w:ilvl w:val="0"/>
-          <w:numId w:val="2"/>
-        </w:numPr>
-        <w:spacing w:after="60"/>
-      </w:pPr>
-      <w:r>
-        <w:rPr>
-          <w:rFonts w:ascii="Calibri" w:cs="Calibri" w:eastAsia="Calibri" w:hAnsi="Calibri"/>
-        </w:rPr>
-        <w:t xml:space="preserve">Entscheidung über Einstellung/Kündigung</w:t>
-      </w:r>
-    </w:p>
-    <w:p>
-      <w:pPr>
-        <w:pStyle w:val="ListParagraph"/>
-        <w:numPr>
-          <w:ilvl w:val="0"/>
-          <w:numId w:val="2"/>
-        </w:numPr>
-        <w:spacing w:after="60"/>
-      </w:pPr>
-      <w:r>
-        <w:rPr>
-          <w:rFonts w:ascii="Calibri" w:cs="Calibri" w:eastAsia="Calibri" w:hAnsi="Calibri"/>
-        </w:rPr>
-        <w:t xml:space="preserve">Disziplinarische Maßnahmen bei WerkerInnen/Sachbearbeitern (als Eskalationsinstanz – Teamleiter sind primär zuständig, wo zugeordnet)</w:t>
-      </w:r>
-    </w:p>
-    <w:p>
-      <w:pPr>
-        <w:pStyle w:val="ListParagraph"/>
-        <w:numPr>
-          <w:ilvl w:val="0"/>
-          <w:numId w:val="2"/>
-        </w:numPr>
-        <w:spacing w:after="60"/>
-      </w:pPr>
-      <w:r>
-        <w:rPr>
-          <w:rFonts w:ascii="Calibri" w:cs="Calibri" w:eastAsia="Calibri" w:hAnsi="Calibri"/>
-        </w:rPr>
-        <w:t xml:space="preserve">Entscheidungsbefugnis über die konkrete Maßnahmenwahl bei Korrekturmaßnahmen</w:t>
-      </w:r>
-    </w:p>
-    <w:p>
-      <w:pPr>
-        <w:spacing w:after="60" w:before="220"/>
-      </w:pPr>
-      <w:r>
-        <w:rPr>
-          <w:rFonts w:ascii="Calibri" w:cs="Calibri" w:eastAsia="Calibri" w:hAnsi="Calibri"/>
-          <w:b/>
-          <w:bCs/>
-          <w:i/>
-          <w:iCs/>
-          <w:color w:val="8A6D00"/>
-          <w:sz w:val="21"/>
-          <w:szCs w:val="21"/>
-        </w:rPr>
-        <w:t xml:space="preserve">Noch offen – Diskussion ausständig (Version k, unverändert)</w:t>
+        <w:t xml:space="preserve">Personalplanung</w:t>
+      </w:r>
+    </w:p>
+    <w:p>
+      <w:pPr>
+        <w:pStyle w:val="ListParagraph"/>
+        <w:numPr>
+          <w:ilvl w:val="0"/>
+          <w:numId w:val="2"/>
+        </w:numPr>
+        <w:spacing w:after="60"/>
+      </w:pPr>
+      <w:r>
+        <w:rPr>
+          <w:rFonts w:ascii="Calibri" w:cs="Calibri" w:eastAsia="Calibri" w:hAnsi="Calibri"/>
+        </w:rPr>
+        <w:t xml:space="preserve">Verantwortlich der jeweilig unterstellten Mitarbeiter</w:t>
+      </w:r>
+    </w:p>
+    <w:p>
+      <w:pPr>
+        <w:pStyle w:val="ListParagraph"/>
+        <w:numPr>
+          <w:ilvl w:val="0"/>
+          <w:numId w:val="2"/>
+        </w:numPr>
+        <w:spacing w:after="60"/>
+      </w:pPr>
+      <w:r>
+        <w:rPr>
+          <w:rFonts w:ascii="Calibri" w:cs="Calibri" w:eastAsia="Calibri" w:hAnsi="Calibri"/>
+        </w:rPr>
+        <w:t xml:space="preserve">Einleiten von Korrekturmaßnahmen in Absprache mit QMB</w:t>
       </w:r>
     </w:p>
     <w:p>
@@ -720,7 +379,7 @@
         <w:rPr>
           <w:rFonts w:ascii="Calibri" w:cs="Calibri" w:eastAsia="Calibri" w:hAnsi="Calibri"/>
         </w:rPr>
-        <w:t xml:space="preserve">Schulungsplanung der Schichtführer u. Einsteller</w:t>
+        <w:t xml:space="preserve">Schulungsplanung der Schichtführer u Einsteller</w:t>
       </w:r>
     </w:p>
     <w:p>
@@ -1897,216 +1556,6 @@
           <w:rFonts w:ascii="Calibri" w:cs="Calibri" w:eastAsia="Calibri" w:hAnsi="Calibri"/>
         </w:rPr>
         <w:t xml:space="preserve">Erneute Freigabe nach Produktionsunterbrechung</w:t>
-      </w:r>
-    </w:p>
-    <w:p>
-      <w:pPr>
-        <w:spacing w:after="60" w:before="200"/>
-      </w:pPr>
-      <w:r>
-        <w:rPr>
-          <w:rFonts w:ascii="Calibri" w:cs="Calibri" w:eastAsia="Calibri" w:hAnsi="Calibri"/>
-          <w:b/>
-          <w:bCs/>
-          <w:color w:val="8A6D00"/>
-          <w:sz w:val="22"/>
-          <w:szCs w:val="22"/>
-        </w:rPr>
-        <w:t xml:space="preserve">7.5.3.9a QS – Qualitätssicherung Produktion [NEU – Entwurf, Nummerierung vorläufig]</w:t>
-      </w:r>
-    </w:p>
-    <w:p>
-      <w:pPr>
-        <w:spacing w:after="100"/>
-      </w:pPr>
-      <w:r>
-        <w:rPr>
-          <w:rFonts w:ascii="Calibri" w:cs="Calibri" w:eastAsia="Calibri" w:hAnsi="Calibri"/>
-          <w:i/>
-          <w:iCs/>
-          <w:sz w:val="20"/>
-          <w:szCs w:val="20"/>
-        </w:rPr>
-        <w:t xml:space="preserve">Bewusst außerhalb der Produktionsabteilung angesiedelt (4-Augen-Prinzip zwischen Produktions- und Qualitätsseite). Entwurf auf Basis von notes/OFFENE_ROLLEN.md – noch nicht im Detail mit Alexander abgestimmt.</w:t>
-      </w:r>
-    </w:p>
-    <w:p>
-      <w:pPr>
-        <w:spacing w:after="60" w:before="160"/>
-      </w:pPr>
-      <w:r>
-        <w:rPr>
-          <w:rFonts w:ascii="Calibri" w:cs="Calibri" w:eastAsia="Calibri" w:hAnsi="Calibri"/>
-          <w:b/>
-          <w:bCs/>
-          <w:i/>
-          <w:iCs/>
-          <w:sz w:val="21"/>
-          <w:szCs w:val="21"/>
-        </w:rPr>
-        <w:t xml:space="preserve">Verantwortung</w:t>
-      </w:r>
-    </w:p>
-    <w:p>
-      <w:pPr>
-        <w:pStyle w:val="ListParagraph"/>
-        <w:numPr>
-          <w:ilvl w:val="0"/>
-          <w:numId w:val="2"/>
-        </w:numPr>
-        <w:spacing w:after="60"/>
-      </w:pPr>
-      <w:r>
-        <w:rPr>
-          <w:rFonts w:ascii="Calibri" w:cs="Calibri" w:eastAsia="Calibri" w:hAnsi="Calibri"/>
-        </w:rPr>
-        <w:t xml:space="preserve">Vertretung des Produktionsleiters im Bereich Qualität (1 von 3 Vertretungsbereichen: Organisation/Personal, Technik, Qualität)</w:t>
-      </w:r>
-    </w:p>
-    <w:p>
-      <w:pPr>
-        <w:pStyle w:val="ListParagraph"/>
-        <w:numPr>
-          <w:ilvl w:val="0"/>
-          <w:numId w:val="2"/>
-        </w:numPr>
-        <w:spacing w:after="60"/>
-      </w:pPr>
-      <w:r>
-        <w:rPr>
-          <w:rFonts w:ascii="Calibri" w:cs="Calibri" w:eastAsia="Calibri" w:hAnsi="Calibri"/>
-        </w:rPr>
-        <w:t xml:space="preserve">Organisatorisch übergeordnet gegenüber den PQB (Qualitätsprüfer/in, Rolle 7.5.3.9), welche schichtbezogen aufgeteilt sind</w:t>
-      </w:r>
-    </w:p>
-    <w:p>
-      <w:pPr>
-        <w:spacing w:after="60" w:before="160"/>
-      </w:pPr>
-      <w:r>
-        <w:rPr>
-          <w:rFonts w:ascii="Calibri" w:cs="Calibri" w:eastAsia="Calibri" w:hAnsi="Calibri"/>
-          <w:b/>
-          <w:bCs/>
-          <w:i/>
-          <w:iCs/>
-          <w:sz w:val="21"/>
-          <w:szCs w:val="21"/>
-        </w:rPr>
-        <w:t xml:space="preserve">Aufgaben</w:t>
-      </w:r>
-    </w:p>
-    <w:p>
-      <w:pPr>
-        <w:pStyle w:val="ListParagraph"/>
-        <w:numPr>
-          <w:ilvl w:val="0"/>
-          <w:numId w:val="2"/>
-        </w:numPr>
-        <w:spacing w:after="60"/>
-      </w:pPr>
-      <w:r>
-        <w:rPr>
-          <w:rFonts w:ascii="Calibri" w:cs="Calibri" w:eastAsia="Calibri" w:hAnsi="Calibri"/>
-        </w:rPr>
-        <w:t xml:space="preserve">Korrespondenzfunktion zur Produktionsleitung auf Gesamtebene (analog: QMB ↔ Schichtführer/Teamleiter auf Schicht-/Team-Ebene)</w:t>
-      </w:r>
-    </w:p>
-    <w:p>
-      <w:pPr>
-        <w:pStyle w:val="ListParagraph"/>
-        <w:numPr>
-          <w:ilvl w:val="0"/>
-          <w:numId w:val="2"/>
-        </w:numPr>
-        <w:spacing w:after="60"/>
-      </w:pPr>
-      <w:r>
-        <w:rPr>
-          <w:rFonts w:ascii="Calibri" w:cs="Calibri" w:eastAsia="Calibri" w:hAnsi="Calibri"/>
-        </w:rPr>
-        <w:t xml:space="preserve">Vertretung des Produktionsleiters in allen qualitätsrelevanten Fragen: fehlerhafte Teile im Haus, Reklamationen, Sperren, Nacharbeit, Maschinen abstellen/stoppen</w:t>
-      </w:r>
-    </w:p>
-    <w:p>
-      <w:pPr>
-        <w:pStyle w:val="ListParagraph"/>
-        <w:numPr>
-          <w:ilvl w:val="0"/>
-          <w:numId w:val="2"/>
-        </w:numPr>
-        <w:spacing w:after="60"/>
-      </w:pPr>
-      <w:r>
-        <w:rPr>
-          <w:rFonts w:ascii="Calibri" w:cs="Calibri" w:eastAsia="Calibri" w:hAnsi="Calibri"/>
-        </w:rPr>
-        <w:t xml:space="preserve">Feststellen von Korrekturmaßnahmenbedarf und Meldung an die Produktionsleitung</w:t>
-      </w:r>
-    </w:p>
-    <w:p>
-      <w:pPr>
-        <w:pStyle w:val="ListParagraph"/>
-        <w:numPr>
-          <w:ilvl w:val="0"/>
-          <w:numId w:val="2"/>
-        </w:numPr>
-        <w:spacing w:after="60"/>
-      </w:pPr>
-      <w:r>
-        <w:rPr>
-          <w:rFonts w:ascii="Calibri" w:cs="Calibri" w:eastAsia="Calibri" w:hAnsi="Calibri"/>
-        </w:rPr>
-        <w:t xml:space="preserve">Prüfung und Freigabe nach Wirksamkeitsnachweis (z.B.: Entsperren von Teilen/Prozessen), nachdem die Produktionsleitung die konkrete Maßnahme festgelegt hat</w:t>
-      </w:r>
-    </w:p>
-    <w:p>
-      <w:pPr>
-        <w:spacing w:after="60" w:before="160"/>
-      </w:pPr>
-      <w:r>
-        <w:rPr>
-          <w:rFonts w:ascii="Calibri" w:cs="Calibri" w:eastAsia="Calibri" w:hAnsi="Calibri"/>
-          <w:b/>
-          <w:bCs/>
-          <w:i/>
-          <w:iCs/>
-          <w:sz w:val="21"/>
-          <w:szCs w:val="21"/>
-        </w:rPr>
-        <w:t xml:space="preserve">Kompetenzen</w:t>
-      </w:r>
-    </w:p>
-    <w:p>
-      <w:pPr>
-        <w:pStyle w:val="ListParagraph"/>
-        <w:numPr>
-          <w:ilvl w:val="0"/>
-          <w:numId w:val="2"/>
-        </w:numPr>
-        <w:spacing w:after="60"/>
-      </w:pPr>
-      <w:r>
-        <w:rPr>
-          <w:rFonts w:ascii="Calibri" w:cs="Calibri" w:eastAsia="Calibri" w:hAnsi="Calibri"/>
-        </w:rPr>
-        <w:t xml:space="preserve">Entscheidungsbefugnis über Freigabe/Entsperren von Teilen und Prozessen nach Wirksamkeitsprüfung</w:t>
-      </w:r>
-    </w:p>
-    <w:p>
-      <w:pPr>
-        <w:pStyle w:val="ListParagraph"/>
-        <w:numPr>
-          <w:ilvl w:val="0"/>
-          <w:numId w:val="2"/>
-        </w:numPr>
-        <w:spacing w:after="60"/>
-      </w:pPr>
-      <w:r>
-        <w:rPr>
-          <w:rFonts w:ascii="Calibri" w:cs="Calibri" w:eastAsia="Calibri" w:hAnsi="Calibri"/>
-        </w:rPr>
-        <w:t xml:space="preserve">Koordinierende Befugnis gegenüber den PQB (schichtübergreifend)</w:t>
       </w:r>
     </w:p>
     <w:p>

</xml_diff>

<commit_message>
Verfahrensanweisung 7V-5-1 behält AKV-Überarbeitung als Basis
Die Verfahrensanweisung bleibt die fortlaufend aktualisierte Basis und
behält ihre Inhalte (AKV-Überarbeitung Produktionsleiter, Themenblöcke
1-5). Separate Stellenbeschreibungen werden zusätzlich daraus abgeleitet,
ersetzen die Verfahrensanweisung aber nicht.

Co-Authored-By: Claude Sonnet 5 <noreply@anthropic.com>
Claude-Session: https://claude.ai/code/session_01RGUMW1xe7QmP9yunCbCqHi
</commit_message>
<xml_diff>
--- a/working/7V-5-1_Auftragsabwicklung_Produktion_ENTWURF.docx
+++ b/working/7V-5-1_Auftragsabwicklung_Produktion_ENTWURF.docx
@@ -139,39 +139,24 @@
           <w:sz w:val="22"/>
           <w:szCs w:val="22"/>
         </w:rPr>
-        <w:t xml:space="preserve">7.5.3.1 Aufgaben des Produktionsleiters</w:t>
-      </w:r>
-    </w:p>
-    <w:p>
-      <w:pPr>
-        <w:pStyle w:val="ListParagraph"/>
-        <w:numPr>
-          <w:ilvl w:val="0"/>
-          <w:numId w:val="2"/>
-        </w:numPr>
-        <w:spacing w:after="60"/>
-      </w:pPr>
-      <w:r>
-        <w:rPr>
-          <w:rFonts w:ascii="Calibri" w:cs="Calibri" w:eastAsia="Calibri" w:hAnsi="Calibri"/>
-        </w:rPr>
-        <w:t xml:space="preserve">Auftragsbesprechung mit LVK, Verwaltung der Produktionsplanung</w:t>
-      </w:r>
-    </w:p>
-    <w:p>
-      <w:pPr>
-        <w:pStyle w:val="ListParagraph"/>
-        <w:numPr>
-          <w:ilvl w:val="0"/>
-          <w:numId w:val="2"/>
-        </w:numPr>
-        <w:spacing w:after="60"/>
-      </w:pPr>
-      <w:r>
-        <w:rPr>
-          <w:rFonts w:ascii="Calibri" w:cs="Calibri" w:eastAsia="Calibri" w:hAnsi="Calibri"/>
-        </w:rPr>
-        <w:t xml:space="preserve">Produktionsbesprechung mit Abteilungsleitern</w:t>
+        <w:t xml:space="preserve">7.5.3.1 Produktionsleiter (Aufgaben, Kompetenzen, Verantwortung)</w:t>
+      </w:r>
+    </w:p>
+    <w:p>
+      <w:pPr>
+        <w:spacing w:after="60" w:before="220"/>
+      </w:pPr>
+      <w:r>
+        <w:rPr>
+          <w:rFonts w:ascii="Calibri" w:cs="Calibri" w:eastAsia="Calibri" w:hAnsi="Calibri"/>
+          <w:b/>
+          <w:bCs/>
+          <w:i/>
+          <w:iCs/>
+          <w:sz w:val="21"/>
+          <w:szCs w:val="21"/>
+        </w:rPr>
+        <w:t xml:space="preserve">Verantwortung</w:t>
       </w:r>
     </w:p>
     <w:p>
@@ -203,39 +188,395 @@
         <w:rPr>
           <w:rFonts w:ascii="Calibri" w:cs="Calibri" w:eastAsia="Calibri" w:hAnsi="Calibri"/>
         </w:rPr>
-        <w:t xml:space="preserve">Personalplanung</w:t>
-      </w:r>
-    </w:p>
-    <w:p>
-      <w:pPr>
-        <w:pStyle w:val="ListParagraph"/>
-        <w:numPr>
-          <w:ilvl w:val="0"/>
-          <w:numId w:val="2"/>
-        </w:numPr>
-        <w:spacing w:after="60"/>
-      </w:pPr>
-      <w:r>
-        <w:rPr>
-          <w:rFonts w:ascii="Calibri" w:cs="Calibri" w:eastAsia="Calibri" w:hAnsi="Calibri"/>
-        </w:rPr>
-        <w:t xml:space="preserve">Verantwortlich der jeweilig unterstellten Mitarbeiter</w:t>
-      </w:r>
-    </w:p>
-    <w:p>
-      <w:pPr>
-        <w:pStyle w:val="ListParagraph"/>
-        <w:numPr>
-          <w:ilvl w:val="0"/>
-          <w:numId w:val="2"/>
-        </w:numPr>
-        <w:spacing w:after="60"/>
-      </w:pPr>
-      <w:r>
-        <w:rPr>
-          <w:rFonts w:ascii="Calibri" w:cs="Calibri" w:eastAsia="Calibri" w:hAnsi="Calibri"/>
-        </w:rPr>
-        <w:t xml:space="preserve">Einleiten von Korrekturmaßnahmen in Absprache mit QMB</w:t>
+        <w:t xml:space="preserve">Personalverantwortung für die Mitarbeiter der Produktion inkl. Werkzeugbau und Instandhaltung</w:t>
+      </w:r>
+    </w:p>
+    <w:p>
+      <w:pPr>
+        <w:pStyle w:val="ListParagraph"/>
+        <w:numPr>
+          <w:ilvl w:val="0"/>
+          <w:numId w:val="2"/>
+        </w:numPr>
+        <w:spacing w:after="60"/>
+      </w:pPr>
+      <w:r>
+        <w:rPr>
+          <w:rFonts w:ascii="Calibri" w:cs="Calibri" w:eastAsia="Calibri" w:hAnsi="Calibri"/>
+        </w:rPr>
+        <w:t xml:space="preserve">Einhaltung aller relevanten Gesetze, insbesondere des Arbeitszeitgesetzes und des ArbeitnehmerInnenschutzgesetzes (ASchG)</w:t>
+      </w:r>
+    </w:p>
+    <w:p>
+      <w:pPr>
+        <w:pStyle w:val="ListParagraph"/>
+        <w:numPr>
+          <w:ilvl w:val="0"/>
+          <w:numId w:val="2"/>
+        </w:numPr>
+        <w:spacing w:after="60"/>
+      </w:pPr>
+      <w:r>
+        <w:rPr>
+          <w:rFonts w:ascii="Calibri" w:cs="Calibri" w:eastAsia="Calibri" w:hAnsi="Calibri"/>
+        </w:rPr>
+        <w:t xml:space="preserve">Disziplinarische Verantwortung bei WerkerInnen und Sachbearbeitern als Eskalationsstufe (Erstverantwortung liegt bei den jeweiligen Teamleitern, sofern im Organigramm zugeordnet)</w:t>
+      </w:r>
+    </w:p>
+    <w:p>
+      <w:pPr>
+        <w:spacing w:after="60" w:before="220"/>
+      </w:pPr>
+      <w:r>
+        <w:rPr>
+          <w:rFonts w:ascii="Calibri" w:cs="Calibri" w:eastAsia="Calibri" w:hAnsi="Calibri"/>
+          <w:b/>
+          <w:bCs/>
+          <w:i/>
+          <w:iCs/>
+          <w:sz w:val="21"/>
+          <w:szCs w:val="21"/>
+        </w:rPr>
+        <w:t xml:space="preserve">Aufgaben</w:t>
+      </w:r>
+    </w:p>
+    <w:p>
+      <w:pPr>
+        <w:pStyle w:val="ListParagraph"/>
+        <w:numPr>
+          <w:ilvl w:val="0"/>
+          <w:numId w:val="2"/>
+        </w:numPr>
+        <w:spacing w:after="60"/>
+      </w:pPr>
+      <w:r>
+        <w:rPr>
+          <w:rFonts w:ascii="Calibri" w:cs="Calibri" w:eastAsia="Calibri" w:hAnsi="Calibri"/>
+        </w:rPr>
+        <w:t xml:space="preserve">Teilnahme an der Kapazitäts- und Planungsabstimmung Produktion/Logistik (aktuell: wöchentliches Meeting KPLI)</w:t>
+      </w:r>
+    </w:p>
+    <w:p>
+      <w:pPr>
+        <w:pStyle w:val="ListParagraph"/>
+        <w:numPr>
+          <w:ilvl w:val="0"/>
+          <w:numId w:val="2"/>
+        </w:numPr>
+        <w:spacing w:after="60"/>
+      </w:pPr>
+      <w:r>
+        <w:rPr>
+          <w:rFonts w:ascii="Calibri" w:cs="Calibri" w:eastAsia="Calibri" w:hAnsi="Calibri"/>
+        </w:rPr>
+        <w:t xml:space="preserve">Kontrolle/Prüfung der von der Rolle „Produktionsplanung“ erstellten Pläne</w:t>
+      </w:r>
+    </w:p>
+    <w:p>
+      <w:pPr>
+        <w:pStyle w:val="ListParagraph"/>
+        <w:numPr>
+          <w:ilvl w:val="0"/>
+          <w:numId w:val="2"/>
+        </w:numPr>
+        <w:spacing w:after="60"/>
+      </w:pPr>
+      <w:r>
+        <w:rPr>
+          <w:rFonts w:ascii="Calibri" w:cs="Calibri" w:eastAsia="Calibri" w:hAnsi="Calibri"/>
+        </w:rPr>
+        <w:t xml:space="preserve">Mitwirkung bei der Umsetzung kurzfristiger, ungeplanter Kapazitätsmaßnahmen (z.B.: Einsatz alternativer Anlagen, zusätzliche Schichten)</w:t>
+      </w:r>
+    </w:p>
+    <w:p>
+      <w:pPr>
+        <w:pStyle w:val="ListParagraph"/>
+        <w:numPr>
+          <w:ilvl w:val="0"/>
+          <w:numId w:val="2"/>
+        </w:numPr>
+        <w:spacing w:after="60"/>
+      </w:pPr>
+      <w:r>
+        <w:rPr>
+          <w:rFonts w:ascii="Calibri" w:cs="Calibri" w:eastAsia="Calibri" w:hAnsi="Calibri"/>
+        </w:rPr>
+        <w:t xml:space="preserve">Weiterentwicklung der Planungsmethodik und der eingesetzten Systeme</w:t>
+      </w:r>
+    </w:p>
+    <w:p>
+      <w:pPr>
+        <w:pStyle w:val="ListParagraph"/>
+        <w:numPr>
+          <w:ilvl w:val="0"/>
+          <w:numId w:val="2"/>
+        </w:numPr>
+        <w:spacing w:after="60"/>
+      </w:pPr>
+      <w:r>
+        <w:rPr>
+          <w:rFonts w:ascii="Calibri" w:cs="Calibri" w:eastAsia="Calibri" w:hAnsi="Calibri"/>
+        </w:rPr>
+        <w:t xml:space="preserve">Leitung der IKK (Interdisziplinäre Koordinationsrunde Kernprozesse) mit den Bereichen Produktion, Logistik, Produkt-/Projekttechnik, Business Development und Qualitätsmanagement: Top-Down Vorbereitung auf anstehende externe Themen (z.B.: Audits, neue Kundenprojekte/Werkzeuge, TISAX-Einführung); Bottom-Up Ableitung verallgemeinerter, systemischer Maßnahmen aus aktuellen operativen Problemen (Reklamationen, Werkzeug-/Ablaufschwierigkeiten, Ausschuss); Fokus auf den Kernprozess der Leistungserbringung inkl. vorgelagertem Vorserienprozess</w:t>
+      </w:r>
+    </w:p>
+    <w:p>
+      <w:pPr>
+        <w:pStyle w:val="ListParagraph"/>
+        <w:numPr>
+          <w:ilvl w:val="0"/>
+          <w:numId w:val="2"/>
+        </w:numPr>
+        <w:spacing w:after="60"/>
+      </w:pPr>
+      <w:r>
+        <w:rPr>
+          <w:rFonts w:ascii="Calibri" w:cs="Calibri" w:eastAsia="Calibri" w:hAnsi="Calibri"/>
+        </w:rPr>
+        <w:t xml:space="preserve">Sicherstellung des wirtschaftlichen Einsatzes von Personal und Ressourcen (laufende Steuerung/Überwachung im operativen Betrieb)</w:t>
+      </w:r>
+    </w:p>
+    <w:p>
+      <w:pPr>
+        <w:pStyle w:val="ListParagraph"/>
+        <w:numPr>
+          <w:ilvl w:val="0"/>
+          <w:numId w:val="2"/>
+        </w:numPr>
+        <w:spacing w:after="60"/>
+      </w:pPr>
+      <w:r>
+        <w:rPr>
+          <w:rFonts w:ascii="Calibri" w:cs="Calibri" w:eastAsia="Calibri" w:hAnsi="Calibri"/>
+        </w:rPr>
+        <w:t xml:space="preserve">Personalanforderung</w:t>
+      </w:r>
+    </w:p>
+    <w:p>
+      <w:pPr>
+        <w:pStyle w:val="ListParagraph"/>
+        <w:numPr>
+          <w:ilvl w:val="0"/>
+          <w:numId w:val="2"/>
+        </w:numPr>
+        <w:spacing w:after="60"/>
+      </w:pPr>
+      <w:r>
+        <w:rPr>
+          <w:rFonts w:ascii="Calibri" w:cs="Calibri" w:eastAsia="Calibri" w:hAnsi="Calibri"/>
+        </w:rPr>
+        <w:t xml:space="preserve">Führung von Mitarbeitergesprächen</w:t>
+      </w:r>
+    </w:p>
+    <w:p>
+      <w:pPr>
+        <w:pStyle w:val="ListParagraph"/>
+        <w:numPr>
+          <w:ilvl w:val="0"/>
+          <w:numId w:val="2"/>
+        </w:numPr>
+        <w:spacing w:after="60"/>
+      </w:pPr>
+      <w:r>
+        <w:rPr>
+          <w:rFonts w:ascii="Calibri" w:cs="Calibri" w:eastAsia="Calibri" w:hAnsi="Calibri"/>
+        </w:rPr>
+        <w:t xml:space="preserve">Bildungsbedarfsermittlung</w:t>
+      </w:r>
+    </w:p>
+    <w:p>
+      <w:pPr>
+        <w:pStyle w:val="ListParagraph"/>
+        <w:numPr>
+          <w:ilvl w:val="0"/>
+          <w:numId w:val="2"/>
+        </w:numPr>
+        <w:spacing w:after="60"/>
+      </w:pPr>
+      <w:r>
+        <w:rPr>
+          <w:rFonts w:ascii="Calibri" w:cs="Calibri" w:eastAsia="Calibri" w:hAnsi="Calibri"/>
+        </w:rPr>
+        <w:t xml:space="preserve">Sicherstellung der produktionsrelevanten Schulungen</w:t>
+      </w:r>
+    </w:p>
+    <w:p>
+      <w:pPr>
+        <w:pStyle w:val="ListParagraph"/>
+        <w:numPr>
+          <w:ilvl w:val="0"/>
+          <w:numId w:val="2"/>
+        </w:numPr>
+        <w:spacing w:after="60"/>
+      </w:pPr>
+      <w:r>
+        <w:rPr>
+          <w:rFonts w:ascii="Calibri" w:cs="Calibri" w:eastAsia="Calibri" w:hAnsi="Calibri"/>
+        </w:rPr>
+        <w:t xml:space="preserve">Mitwirkung an der Einführung geeigneter (flexibler) Arbeitszeitmodelle (gemeinsam mit HR)</w:t>
+      </w:r>
+    </w:p>
+    <w:p>
+      <w:pPr>
+        <w:pStyle w:val="ListParagraph"/>
+        <w:numPr>
+          <w:ilvl w:val="0"/>
+          <w:numId w:val="2"/>
+        </w:numPr>
+        <w:spacing w:after="60"/>
+      </w:pPr>
+      <w:r>
+        <w:rPr>
+          <w:rFonts w:ascii="Calibri" w:cs="Calibri" w:eastAsia="Calibri" w:hAnsi="Calibri"/>
+        </w:rPr>
+        <w:t xml:space="preserve">Sicherstellung der Urlaubsplanung</w:t>
+      </w:r>
+    </w:p>
+    <w:p>
+      <w:pPr>
+        <w:pStyle w:val="ListParagraph"/>
+        <w:numPr>
+          <w:ilvl w:val="0"/>
+          <w:numId w:val="2"/>
+        </w:numPr>
+        <w:spacing w:after="60"/>
+      </w:pPr>
+      <w:r>
+        <w:rPr>
+          <w:rFonts w:ascii="Calibri" w:cs="Calibri" w:eastAsia="Calibri" w:hAnsi="Calibri"/>
+        </w:rPr>
+        <w:t xml:space="preserve">Entscheidung über Art und Umsetzung von Korrekturmaßnahmen bei durch QS festgestelltem Handlungsbedarf (gesamtheitliche Ebene)</w:t>
+      </w:r>
+    </w:p>
+    <w:p>
+      <w:pPr>
+        <w:spacing w:after="60" w:before="220"/>
+      </w:pPr>
+      <w:r>
+        <w:rPr>
+          <w:rFonts w:ascii="Calibri" w:cs="Calibri" w:eastAsia="Calibri" w:hAnsi="Calibri"/>
+          <w:b/>
+          <w:bCs/>
+          <w:i/>
+          <w:iCs/>
+          <w:sz w:val="21"/>
+          <w:szCs w:val="21"/>
+        </w:rPr>
+        <w:t xml:space="preserve">Kompetenzen</w:t>
+      </w:r>
+    </w:p>
+    <w:p>
+      <w:pPr>
+        <w:pStyle w:val="ListParagraph"/>
+        <w:numPr>
+          <w:ilvl w:val="0"/>
+          <w:numId w:val="2"/>
+        </w:numPr>
+        <w:spacing w:after="60"/>
+      </w:pPr>
+      <w:r>
+        <w:rPr>
+          <w:rFonts w:ascii="Calibri" w:cs="Calibri" w:eastAsia="Calibri" w:hAnsi="Calibri"/>
+        </w:rPr>
+        <w:t xml:space="preserve">Freigabe-/Entscheidungsbefugnis über die Produktionsplanung (Kontrollfunktion gegenüber der Rolle Produktionsplanung)</w:t>
+      </w:r>
+    </w:p>
+    <w:p>
+      <w:pPr>
+        <w:pStyle w:val="ListParagraph"/>
+        <w:numPr>
+          <w:ilvl w:val="0"/>
+          <w:numId w:val="2"/>
+        </w:numPr>
+        <w:spacing w:after="60"/>
+      </w:pPr>
+      <w:r>
+        <w:rPr>
+          <w:rFonts w:ascii="Calibri" w:cs="Calibri" w:eastAsia="Calibri" w:hAnsi="Calibri"/>
+        </w:rPr>
+        <w:t xml:space="preserve">Entscheidungsbefugnis bei ungeplanten Kapazitätskonflikten (z.B.: Freigabe alternativer Anlagen, Anordnung zusätzlicher Schichten)</w:t>
+      </w:r>
+    </w:p>
+    <w:p>
+      <w:pPr>
+        <w:pStyle w:val="ListParagraph"/>
+        <w:numPr>
+          <w:ilvl w:val="0"/>
+          <w:numId w:val="2"/>
+        </w:numPr>
+        <w:spacing w:after="60"/>
+      </w:pPr>
+      <w:r>
+        <w:rPr>
+          <w:rFonts w:ascii="Calibri" w:cs="Calibri" w:eastAsia="Calibri" w:hAnsi="Calibri"/>
+        </w:rPr>
+        <w:t xml:space="preserve">Entscheidungsbefugnis über die aus der IKK abgeleiteten Maßnahmen</w:t>
+      </w:r>
+    </w:p>
+    <w:p>
+      <w:pPr>
+        <w:pStyle w:val="ListParagraph"/>
+        <w:numPr>
+          <w:ilvl w:val="0"/>
+          <w:numId w:val="2"/>
+        </w:numPr>
+        <w:spacing w:after="60"/>
+      </w:pPr>
+      <w:r>
+        <w:rPr>
+          <w:rFonts w:ascii="Calibri" w:cs="Calibri" w:eastAsia="Calibri" w:hAnsi="Calibri"/>
+        </w:rPr>
+        <w:t xml:space="preserve">Entscheidung über Einstellung/Kündigung</w:t>
+      </w:r>
+    </w:p>
+    <w:p>
+      <w:pPr>
+        <w:pStyle w:val="ListParagraph"/>
+        <w:numPr>
+          <w:ilvl w:val="0"/>
+          <w:numId w:val="2"/>
+        </w:numPr>
+        <w:spacing w:after="60"/>
+      </w:pPr>
+      <w:r>
+        <w:rPr>
+          <w:rFonts w:ascii="Calibri" w:cs="Calibri" w:eastAsia="Calibri" w:hAnsi="Calibri"/>
+        </w:rPr>
+        <w:t xml:space="preserve">Disziplinarische Maßnahmen bei WerkerInnen/Sachbearbeitern (als Eskalationsinstanz – Teamleiter sind primär zuständig, wo zugeordnet)</w:t>
+      </w:r>
+    </w:p>
+    <w:p>
+      <w:pPr>
+        <w:pStyle w:val="ListParagraph"/>
+        <w:numPr>
+          <w:ilvl w:val="0"/>
+          <w:numId w:val="2"/>
+        </w:numPr>
+        <w:spacing w:after="60"/>
+      </w:pPr>
+      <w:r>
+        <w:rPr>
+          <w:rFonts w:ascii="Calibri" w:cs="Calibri" w:eastAsia="Calibri" w:hAnsi="Calibri"/>
+        </w:rPr>
+        <w:t xml:space="preserve">Entscheidungsbefugnis über die konkrete Maßnahmenwahl bei Korrekturmaßnahmen</w:t>
+      </w:r>
+    </w:p>
+    <w:p>
+      <w:pPr>
+        <w:spacing w:after="60" w:before="220"/>
+      </w:pPr>
+      <w:r>
+        <w:rPr>
+          <w:rFonts w:ascii="Calibri" w:cs="Calibri" w:eastAsia="Calibri" w:hAnsi="Calibri"/>
+          <w:b/>
+          <w:bCs/>
+          <w:i/>
+          <w:iCs/>
+          <w:color w:val="8A6D00"/>
+          <w:sz w:val="21"/>
+          <w:szCs w:val="21"/>
+        </w:rPr>
+        <w:t xml:space="preserve">Noch offen – Diskussion ausständig (Version k, unverändert)</w:t>
       </w:r>
     </w:p>
     <w:p>
@@ -379,7 +720,7 @@
         <w:rPr>
           <w:rFonts w:ascii="Calibri" w:cs="Calibri" w:eastAsia="Calibri" w:hAnsi="Calibri"/>
         </w:rPr>
-        <w:t xml:space="preserve">Schulungsplanung der Schichtführer u Einsteller</w:t>
+        <w:t xml:space="preserve">Schulungsplanung der Schichtführer u. Einsteller</w:t>
       </w:r>
     </w:p>
     <w:p>

</xml_diff>